<commit_message>
Verify report against downloaded papers; fix claims; add reference 24
</commit_message>
<xml_diff>
--- a/report/Phase1_Report.docx
+++ b/report/Phase1_Report.docx
@@ -64,7 +64,7 @@
           <w:i w:val="0"/>
           <w:sz w:val="20"/>
         </w:rPr>
-        <w:t>ML-DSA (FIPS 204) is the NIST-standardised lattice-based digital signature, but it was designed for a single signer. Splitting the signing key among several parties, so that no single device holds the key, is hard because ML-DSA's rejection sampling and rounding steps do not combine well with secret sharing. In 2026 NIST opened a First Call for multi-party threshold schemes (IR 8214C), and four proposals aim to produce signatures that verify under an unmodified ML-DSA verifier: Mithril, Quorus, SplitForge/Trilithium and TALUS. This report surveys twenty-three papers and specifications covering these schemes, their predecessors, and the cryptanalytic tools (integer learning with errors, integer linear programming, regression) used to attack lattice signatures through leakage. The survey shows that earlier versions of TALUS fall to two practical key-recovery attacks, while no public attack on the other three exists, largely because they have not been systematically tested. We formulate four concrete open problems and propose a reusable leakage-testing harness that simulates each scheme's public transcripts, including aborted attempts, and runs a battery of statistical key-recovery tests against them.</w:t>
+        <w:t>ML-DSA (FIPS 204) is the NIST-standardised lattice-based digital signature, but it was designed for a single signer. Splitting the signing key among several parties, so that no single device holds the key, is hard because ML-DSA's rejection sampling and rounding steps do not combine well with secret sharing. In 2026 NIST opened a First Call for multi-party threshold schemes (IR 8214C), and four proposals aim to produce signatures that verify under an unmodified ML-DSA verifier: Mithril, Quorus, SplitForge/Trilithium and TALUS. This report surveys twenty-four papers and specifications covering these schemes, their predecessors, and the cryptanalytic tools (integer learning with errors, integer linear programming, regression) used to attack lattice signatures through leakage. The survey shows that earlier versions of TALUS fall to two practical key-recovery attacks, while no public attack on the other three exists, largely because they have not been systematically tested. We formulate four concrete open problems and propose a reusable leakage-testing harness that simulates each scheme's public transcripts, including aborted attempts, and runs a battery of statistical key-recovery tests against them.</w:t>
       </w:r>
     </w:p>
     <w:p>
@@ -970,7 +970,7 @@
           <w:i w:val="0"/>
           <w:sz w:val="20"/>
         </w:rPr>
-        <w:t>Dilithium [2] introduced the signing structure above, and FIPS 204 [1] standardised it as ML-DSA with parameter sets ML-DSA-44/65/87 at NIST security categories 2/3/5. Threshold signatures for lattices were first built with heavy tools such as threshold homomorphic encryption: Gür, Katz and Silde [16] give a two-round scheme from threshold HE. Threshold Raccoon [14] (Eurocrypt 2024) takes a lighter route using only symmetric primitives and simple lattice operations, with one-time additive masks that stop partial signing keys leaking through partial signatures; however its signatures are not ML-DSA signatures. Del Pino, Espitau, Niot and Prest [15] extend short-share distributed key generation with identifiable aborts and a detector for adversarial short-vector correlations (this preliminary version has since been withdrawn in favour of a later paper). The decisive shift is toward schemes whose output verifies under the unmodified FIPS 204 verifier, because deployed certificates, hardware and pinned keys cannot change.</w:t>
+        <w:t>Dilithium [2] introduced the signing structure above, and FIPS 204 [1] standardised it as ML-DSA with parameter sets ML-DSA-44/65/87 at NIST security categories 2/3/5. Threshold signatures for lattices were first built with heavy tools such as threshold homomorphic encryption: Gür, Katz and Silde [16] give a two-round scheme from threshold HE. Threshold Raccoon [14] (Eurocrypt 2024) takes a lighter route using only symmetric primitives and simple lattice operations, with one-time additive masks that stop partial signing keys leaking through partial signatures; however its signatures are not ML-DSA signatures. Del Pino and Niot [24] give a compact Raccoon-based threshold signature that is limited to 2^64 signatures and about 8 parties. Del Pino, Espitau, Niot and Prest [15] extend short-share distributed key generation with identifiable aborts and a detector for adversarial short-vector correlations (this preliminary version has since been withdrawn in favour of a later paper). The decisive shift is toward schemes whose output verifies under the unmodified FIPS 204 verifier, because deployed certificates, hardware and pinned keys cannot change.</w:t>
       </w:r>
     </w:p>
     <w:p>
@@ -1031,7 +1031,7 @@
           <w:i w:val="0"/>
           <w:sz w:val="20"/>
         </w:rPr>
-        <w:t xml:space="preserve"> [4,5,6,7] (PQShield, Brave, Bristol) is the first practical ML-DSA-compatible threshold scheme. It uses replicated secret sharing with short shares, so shares stay small enough for ML-DSA's norm bounds, and performs rejection sampling locally per party with hyperball sampling, avoiding a global abort MPC. Communication is about 1 MB per participant for up to six parties, with Go implementations; the security argument is a game-based reduction in the random oracle model to MLWE and ML-DSA unforgeability under static corruption of up to T−1 parties. There are no identifiable aborts, and its parameters target a per-attempt success probability of 1/2 rather than ML-DSA's roughly 1/4, so the accepted-response distribution differs from FIPS 204. The earlier version [5] was superseded by [4].</w:t>
+        <w:t xml:space="preserve"> [4,5,6,7] (PQShield, Brave, Bristol) is the first practical ML-DSA-compatible threshold scheme. It uses replicated secret sharing with short shares, so shares stay small enough for ML-DSA's norm bounds, and performs rejection sampling locally per party with hyperball sampling, avoiding a global abort MPC. Communication is about 1 MB per participant for up to six parties, with Go implementations; the security argument is a game-based reduction in the random oracle model to MLWE and ML-DSA unforgeability under static corruption of up to T−1 parties. There are no identifiable aborts, and its parameters target a per-attempt success probability of 1/2 rather than ML-DSA's roughly 1/4, so the accepted-response distribution differs from FIPS 204. The earlier version [5] was superseded by [4], which appears at USENIX Security 2026; the preview writeup [7] notes that up to 8 parties remains practical, that no synchronised broadcast channel is needed, and that the Go implementation uses floating point for hyperball sampling.</w:t>
       </w:r>
     </w:p>
     <w:p>
@@ -1054,7 +1054,7 @@
           <w:i w:val="0"/>
           <w:sz w:val="20"/>
         </w:rPr>
-        <w:t xml:space="preserve"> [8] (J.P. Morgan) modifies ML-DSA signing to be MPC-friendly while keeping FIPS 204 verification and signature sizes, and provides MPC protocols for honest-majority settings with about 100 KB online communication per party per rejection-sampling round. It supports many parties (up to 64 in the preview writeup) and is proven secure in the universal composability framework. A distinguishing choice is that rejected attempts release (w1, c, ⊥) and the proof claims this is simulatable.</w:t>
+        <w:t xml:space="preserve"> [8] (J.P. Morgan) modifies ML-DSA signing to be MPC-friendly while keeping FIPS 204 verification and signature sizes, and provides MPC protocols for honest-majority settings with about 150 KB online communication per party per rejection-sampling round (0.31–0.59 MB per successful signature, 16 or 29 online rounds depending on the variant) and appears at USENIX Security 2026. It tolerates fewer than n/2 corruptions, supports up to 63 parties in its benchmarks and is proven secure in the universal composability framework. Its MPC-friendly variant draws the nonce uniformly, adds a small noise term e_w to w, removes the signing loop and always outputs w1 even when (z, h) is rejected; this is exactly what lets the Fiat–Shamir hash be computed in the clear and what the proof of simulatability of rejected partial signatures relies on.</w:t>
       </w:r>
     </w:p>
     <w:p>
@@ -1077,7 +1077,7 @@
           <w:i w:val="0"/>
           <w:sz w:val="20"/>
         </w:rPr>
-        <w:t xml:space="preserve"> [9] (Cybernetica) targets two parties, a server and a phone, plus a correlated randomness provider (CRP). It proves security against a malicious server or phone in the UC model, uses an actively secure comparison protocol and a new rounding protocol, and has a Rust implementation. It needs about 14 rounds per attempt and relies on a heuristic that a rejected partial signature can be simulated as uniform.</w:t>
+        <w:t xml:space="preserve"> [9] (Cybernetica) targets two parties, a server and a phone, plus a correlated randomness provider (CRP). It proves security against a malicious server or phone in the UC model, uses an actively secure comparison protocol and a new rounding protocol, and has a Rust implementation. Key generation takes 3 rounds and each signing attempt 14. It is part of Cybernetica's SplitKey submission [9], is secure against one malicious party among server, phone and CRP, and the writeup concedes that a malicious CRP can mount selective-disclosure attacks that the authors consider harmless for the intended use. It relies on a heuristic that a rejected partial signature can be simulated as uniform.</w:t>
       </w:r>
     </w:p>
     <w:p>
@@ -1100,7 +1100,7 @@
           <w:i w:val="0"/>
           <w:sz w:val="20"/>
         </w:rPr>
-        <w:t xml:space="preserve"> [10,11] (Codebat) introduces the Boundary Clearance Condition (BCC): for a constant fraction of nonces (31.7% at ML-DSA-65) the vector s2 provably cannot push w across a rounding boundary, so rejection checks can be enforced offline on preprocessed nonces. This yields a TEE-assisted one-round profile and a distributed MPC profile with two online rounds. The same paper proves a lower bound: any FIPS-exact scheme revealing a summed (Irwin–Hall) nonce admits key recovery after about 2^30 signatures. TALUS builds on Kao's Shamir nonce DKG [12], where the signing nonce is itself a Shamir secret sharing, with pairwise-cancelling PRF masks and claimed nonce-share min-entropy above 5× the key entropy for signing sets up to 17.</w:t>
+        <w:t xml:space="preserve"> [10,11] (Codebat) introduces the Boundary Clearance Condition (BCC): for a constant fraction of nonces (31.7% at ML-DSA-65, 43.2% at -44, 39.1% at -87) the vector s2 provably cannot push w across a rounding boundary, so rejection checks can be enforced offline on preprocessed nonces. This yields a TEE-assisted one-round variant (described in v0.22 only as a contrasting example, not proposed for the threshold setting) and a distributed MPC profile, the proposed system, with two online rounds. The same paper proves a lower bound: any FIPS-exact scheme revealing a summed (Irwin–Hall) nonce admits key recovery after about 2^30 signatures. TALUS builds on Kao's Shamir nonce DKG [12], where the signing nonce is itself a Shamir secret sharing, with pairwise-cancelling PRF masks and claimed nonce-share min-entropy above 5× the key entropy for signing sets up to 17.</w:t>
       </w:r>
     </w:p>
     <w:p>
@@ -2369,7 +2369,7 @@
           <w:i w:val="0"/>
           <w:sz w:val="20"/>
         </w:rPr>
-        <w:t>The Mithril line began as a poster [6] and a preliminary ePrint [5] covering both ML-DSA and an enhanced Raccoon with identifiable aborts (up to 64 parties); the latter was later split into two papers, one of which is [4]. Kao's predecessor [12] is not itself a Call submission but shows the same patterns: its fully distributed profile P2 broadcasts masked commitments, and the paper's own remarks show an exposed λ_h·A·y_h yields y_h and then the key; masks hide these only when |S∖C| ≥ 2, and with |S| = T and T−1 corrupted parties inside S, |S∖C| = 1. This is a hypothesis from our reading and needs confirmation. Its Irwin–Hall nonce-loss bound is also only non-vacuous for q_s &lt; 16,000, whereas [10] later proves an attack near 2^30.</w:t>
+        <w:t>The Mithril line began as a poster [6] and a preliminary ePrint [5] covering both ML-DSA and an enhanced Raccoon with identifiable aborts (up to 64 parties); the latter was later split into two papers, one of which is [4]. Kao's predecessor [12] is not itself a Call submission but shows the same patterns: its fully distributed profile P2 broadcasts masked commitments, and the paper's own remarks show an exposed λ_h·A·y_h yields y_h and then the key; masks hide these only when |S∖C| ≥ 2. The paper discloses this: at T = N with N−1 corruptions, mask hiding does not hold in P2, yet its Table 1 still claims dishonest-majority unforgeability (tolerating N−1 corruptions) with complete UC proofs against static adversaries. Whether the loss of mask hiding can be turned into key recovery, which would contradict that claim, is the open question we formulate as P4. The paper's Irwin–Hall analysis bounds the total loss by 0.013·q_s bits, which exceeds a 128-bit margin after about 10^4 sessions, consistent with [10] later proving an attack near 2^30.</w:t>
       </w:r>
     </w:p>
     <w:p>
@@ -7806,6 +7806,184 @@
           </w:p>
         </w:tc>
       </w:tr>
+      <w:tr>
+        <w:tc>
+          <w:tcPr>
+            <w:tcW w:type="dxa" w:w="1791"/>
+          </w:tcPr>
+          <w:p>
+            <w:pPr>
+              <w:spacing w:after="0"/>
+            </w:pPr>
+            <w:r/>
+            <w:r>
+              <w:rPr>
+                <w:rFonts w:ascii="Times New Roman" w:hAnsi="Times New Roman"/>
+                <w:b w:val="0"/>
+                <w:i w:val="0"/>
+                <w:sz w:val="16"/>
+              </w:rPr>
+              <w:t>[24] Finally!</w:t>
+            </w:r>
+          </w:p>
+        </w:tc>
+        <w:tc>
+          <w:tcPr>
+            <w:tcW w:type="dxa" w:w="478"/>
+          </w:tcPr>
+          <w:p>
+            <w:pPr>
+              <w:spacing w:after="0"/>
+            </w:pPr>
+            <w:r/>
+            <w:r>
+              <w:rPr>
+                <w:rFonts w:ascii="Times New Roman" w:hAnsi="Times New Roman"/>
+                <w:b w:val="0"/>
+                <w:i w:val="0"/>
+                <w:sz w:val="16"/>
+              </w:rPr>
+              <w:t>2025</w:t>
+            </w:r>
+          </w:p>
+        </w:tc>
+        <w:tc>
+          <w:tcPr>
+            <w:tcW w:type="dxa" w:w="478"/>
+          </w:tcPr>
+          <w:p>
+            <w:pPr>
+              <w:spacing w:after="0"/>
+            </w:pPr>
+            <w:r/>
+            <w:r>
+              <w:rPr>
+                <w:rFonts w:ascii="Times New Roman" w:hAnsi="Times New Roman"/>
+                <w:b w:val="0"/>
+                <w:i w:val="0"/>
+                <w:sz w:val="16"/>
+              </w:rPr>
+              <w:t>M</w:t>
+            </w:r>
+          </w:p>
+        </w:tc>
+        <w:tc>
+          <w:tcPr>
+            <w:tcW w:type="dxa" w:w="358"/>
+          </w:tcPr>
+          <w:p>
+            <w:pPr>
+              <w:spacing w:after="0"/>
+            </w:pPr>
+            <w:r/>
+            <w:r>
+              <w:rPr>
+                <w:rFonts w:ascii="Times New Roman" w:hAnsi="Times New Roman"/>
+                <w:b w:val="0"/>
+                <w:i w:val="0"/>
+                <w:sz w:val="16"/>
+              </w:rPr>
+              <w:t>x</w:t>
+            </w:r>
+          </w:p>
+        </w:tc>
+        <w:tc>
+          <w:tcPr>
+            <w:tcW w:type="dxa" w:w="358"/>
+          </w:tcPr>
+          <w:p>
+            <w:pPr>
+              <w:spacing w:after="0"/>
+            </w:pPr>
+            <w:r/>
+            <w:r>
+              <w:rPr>
+                <w:rFonts w:ascii="Times New Roman" w:hAnsi="Times New Roman"/>
+                <w:b w:val="0"/>
+                <w:i w:val="0"/>
+                <w:sz w:val="16"/>
+              </w:rPr>
+            </w:r>
+          </w:p>
+        </w:tc>
+        <w:tc>
+          <w:tcPr>
+            <w:tcW w:type="dxa" w:w="358"/>
+          </w:tcPr>
+          <w:p>
+            <w:pPr>
+              <w:spacing w:after="0"/>
+            </w:pPr>
+            <w:r/>
+            <w:r>
+              <w:rPr>
+                <w:rFonts w:ascii="Times New Roman" w:hAnsi="Times New Roman"/>
+                <w:b w:val="0"/>
+                <w:i w:val="0"/>
+                <w:sz w:val="16"/>
+              </w:rPr>
+            </w:r>
+          </w:p>
+        </w:tc>
+        <w:tc>
+          <w:tcPr>
+            <w:tcW w:type="dxa" w:w="358"/>
+          </w:tcPr>
+          <w:p>
+            <w:pPr>
+              <w:spacing w:after="0"/>
+            </w:pPr>
+            <w:r/>
+            <w:r>
+              <w:rPr>
+                <w:rFonts w:ascii="Times New Roman" w:hAnsi="Times New Roman"/>
+                <w:b w:val="0"/>
+                <w:i w:val="0"/>
+                <w:sz w:val="16"/>
+              </w:rPr>
+              <w:t>x</w:t>
+            </w:r>
+          </w:p>
+        </w:tc>
+        <w:tc>
+          <w:tcPr>
+            <w:tcW w:type="dxa" w:w="358"/>
+          </w:tcPr>
+          <w:p>
+            <w:pPr>
+              <w:spacing w:after="0"/>
+            </w:pPr>
+            <w:r/>
+            <w:r>
+              <w:rPr>
+                <w:rFonts w:ascii="Times New Roman" w:hAnsi="Times New Roman"/>
+                <w:b w:val="0"/>
+                <w:i w:val="0"/>
+                <w:sz w:val="16"/>
+              </w:rPr>
+            </w:r>
+          </w:p>
+        </w:tc>
+        <w:tc>
+          <w:tcPr>
+            <w:tcW w:type="dxa" w:w="358"/>
+          </w:tcPr>
+          <w:p>
+            <w:pPr>
+              <w:spacing w:after="0"/>
+            </w:pPr>
+            <w:r/>
+            <w:r>
+              <w:rPr>
+                <w:rFonts w:ascii="Times New Roman" w:hAnsi="Times New Roman"/>
+                <w:b w:val="0"/>
+                <w:i w:val="0"/>
+                <w:sz w:val="16"/>
+              </w:rPr>
+            </w:r>
+          </w:p>
+        </w:tc>
+      </w:tr>
     </w:tbl>
     <w:p>
       <w:pPr>
@@ -7823,7 +8001,7 @@
           <w:i w:val="0"/>
           <w:sz w:val="20"/>
         </w:rPr>
-        <w:t>Of the 23 sources, 13 are rated central (H), 5 supporting (M) and 5 background (L). Fifteen were published in 2025 or 2026, and 21 of 23 are from 2018 or later. The sources marked AT are the evidence base for the estimators in Section III.</w:t>
+        <w:t>Of the 24 sources, 13 are rated central (H), 6 supporting (M) and 5 background (L). Sixteen were published in 2025 or 2026, and 22 of 24 are from 2018 or later. The sources marked AT are the evidence base for the estimators in Section III.</w:t>
       </w:r>
     </w:p>
     <w:p>
@@ -8701,7 +8879,7 @@
           <w:i w:val="0"/>
           <w:sz w:val="20"/>
         </w:rPr>
-        <w:t>P4 (Confirm or refute Kao's P2 claim).</w:t>
+        <w:t>P4 (Kao's P2 profile).</w:t>
       </w:r>
       <w:r>
         <w:rPr>
@@ -8710,7 +8888,7 @@
           <w:i w:val="0"/>
           <w:sz w:val="20"/>
         </w:rPr>
-        <w:t xml:space="preserve"> Decide whether the masked-commitment argument fails at |S∖C| = 1, which would be a one-signature key recovery for any |S| = T with T−1 corruptions, and whether the Feldman-style DKG commitments show the A·s1,i pattern broken in [13].</w:t>
+        <w:t xml:space="preserve"> The paper [12] discloses that mask hiding fails at |S∖C| = 1 yet claims dishonest-majority unforgeability. Decide whether this failure yields key recovery, which would be a one-signature key recovery for any |S| = T with T−1 corruptions, and whether the Feldman-style DKG commitments show the A·s1,i pattern broken in [13].</w:t>
       </w:r>
     </w:p>
     <w:p>
@@ -8900,7 +9078,7 @@
           <w:i w:val="0"/>
           <w:sz w:val="20"/>
         </w:rPr>
-        <w:t xml:space="preserve"> Each signature supplies a sample (c, b) with b = −c·s′ + e, where c has τ coefficients of ±1 and e is the noise. Stacking N samples gives an overdetermined integer linear system whose ordinary least-squares solution has per-coordinate error variance about Var(e)/(N·τ/n) in the normalised ring representation. For uniform noise on [−γ2, γ2] with Var(e) ≈ γ2²/3, rounding recovers an entry of s′ correctly with overwhelming probability once the standard deviation falls below a fraction of 1/2 times the bound on |s′|; this reproduces the order N ≈ 4γ2²/(3τ) quoted in [13]. Our first experiment checks this scaling on reduced parameters, where the signature counts are small enough to run end to end.</w:t>
+        <w:t xml:space="preserve"> Each signature supplies a sample (c, b) with b = −c·s′ + e, where c has τ coefficients of ±1 and e is the noise. Stacking N samples gives an overdetermined integer linear system whose ordinary least-squares solution has per-coefficient error variance about σ_e²/(N·τ), because the denominator concentrates at N·τ and the numerator has variance N·τ·σ_e². For uniform noise on [−γ2, γ2] with σ_e² ≈ γ2²/3, nearest-integer rounding recovers a coefficient once the standard deviation σ_e/√(N·τ) drops below 1/2; this gives N ≈ 4γ2²/(3τ) as derived in [13]. Our first experiment checks this scaling on reduced parameters, where the signature counts are small enough to run end to end.</w:t>
       </w:r>
     </w:p>
     <w:p>
@@ -9754,7 +9932,7 @@
           <w:i w:val="0"/>
           <w:sz w:val="20"/>
         </w:rPr>
-        <w:t>Threshold ML-DSA is moving from research to standardisation, and the single published break of an early TALUS version shows how easily thresholding can leak a key through commitments or removed rejection checks. The survey of twenty-three sources identifies three schemes without public attacks only because they are untested, one scheme whose security now rests on a signing cap with an uncertain margin, and a toolbox (ILWE, ILP, robust regression) mature enough to test them. We formalised four open problems and proposed a leakage-testing harness as a reusable contribution. Phase 2 will implement the harness, reproduce the TALUS attack, and run the estimators on the remaining schemes.</w:t>
+        <w:t>Threshold ML-DSA is moving from research to standardisation, and the single published break of an early TALUS version shows how easily thresholding can leak a key through commitments or removed rejection checks. The survey of twenty-four sources identifies three schemes without public attacks only because they are untested, one scheme whose security now rests on a signing cap with an uncertain margin, and a toolbox (ILWE, ILP, robust regression) mature enough to test them. We formalised four open problems and proposed a leakage-testing harness as a reusable contribution. Phase 2 will implement the harness, reproduce the TALUS attack, and run the estimators on the remaining schemes.</w:t>
       </w:r>
     </w:p>
     <w:p>
@@ -9985,7 +10163,7 @@
           <w:i/>
           <w:sz w:val="16"/>
         </w:rPr>
-        <w:t>IACR ePrint 2026/013, 2026.</w:t>
+        <w:t>in Proc. USENIX Security Symp., 2026 (full version: IACR ePrint 2026/013).</w:t>
       </w:r>
     </w:p>
     <w:p>
@@ -10051,7 +10229,7 @@
           <w:i w:val="0"/>
           <w:sz w:val="16"/>
         </w:rPr>
-        <w:t xml:space="preserve">[7] Mithril team, “Mithril: Efficient threshold ML-DSA from secret sharing with short shares,” </w:t>
+        <w:t xml:space="preserve">[7] S. Celi, G. Delerue, R. del Pino, T. Espitau, G. Niot, and T. Prest, “Mithril: Efficient threshold ML-DSA from secret sharing with short shares,” </w:t>
       </w:r>
       <w:r>
         <w:rPr>
@@ -10060,7 +10238,7 @@
           <w:i/>
           <w:sz w:val="16"/>
         </w:rPr>
-        <w:t>NIST MPTC First Call preview writeup PW01, 2026.</w:t>
+        <w:t>NIST MPTC First Call preview writeup v1.0, Jan. 2026.</w:t>
       </w:r>
     </w:p>
     <w:p>
@@ -10085,7 +10263,7 @@
           <w:i/>
           <w:sz w:val="16"/>
         </w:rPr>
-        <w:t>IACR ePrint 2025/1163, 2025.</w:t>
+        <w:t>in Proc. USENIX Security Symp., 2026 (full version: IACR ePrint 2025/1163).</w:t>
       </w:r>
     </w:p>
     <w:p>
@@ -10110,7 +10288,7 @@
           <w:i/>
           <w:sz w:val="16"/>
         </w:rPr>
-        <w:t>IACR ePrint 2025/675, 2025.</w:t>
+        <w:t>IACR ePrint 2025/675, 2025; see also SplitForge, SplitKey preview writeup v0.1, NIST MPTC, Jan. 2026.</w:t>
       </w:r>
     </w:p>
     <w:p>
@@ -10151,7 +10329,7 @@
           <w:i w:val="0"/>
           <w:sz w:val="16"/>
         </w:rPr>
-        <w:t xml:space="preserve">[11] TALUS team, “TALUS preview writeup v0.22,” </w:t>
+        <w:t xml:space="preserve">[11] L. Kao and R. Chang, “TALUS: FIPS-204-exact threshold ML-DSA via boundary clearance (preview writeup v0.22),” </w:t>
       </w:r>
       <w:r>
         <w:rPr>
@@ -10460,7 +10638,32 @@
           <w:i/>
           <w:sz w:val="16"/>
         </w:rPr>
-        <w:t>in Proc. SAC 2020, LNCS 12804, 2020.</w:t>
+        <w:t>in Proc. SAC 2020, LNCS 12804, 2021, pp. 34–65.</w:t>
+      </w:r>
+    </w:p>
+    <w:p>
+      <w:pPr>
+        <w:spacing w:after="20"/>
+        <w:ind w:left="432" w:hanging="432"/>
+        <w:jc w:val="both"/>
+      </w:pPr>
+      <w:r>
+        <w:rPr>
+          <w:rFonts w:ascii="Times New Roman" w:hAnsi="Times New Roman"/>
+          <w:b w:val="0"/>
+          <w:i w:val="0"/>
+          <w:sz w:val="16"/>
+        </w:rPr>
+        <w:t xml:space="preserve">[24] R. del Pino and G. Niot, “Finally! A compact lattice-based threshold signature,” </w:t>
+      </w:r>
+      <w:r>
+        <w:rPr>
+          <w:rFonts w:ascii="Times New Roman" w:hAnsi="Times New Roman"/>
+          <w:b w:val="0"/>
+          <w:i/>
+          <w:sz w:val="16"/>
+        </w:rPr>
+        <w:t>in Proc. PKC 2025, Part III, LNCS 15676, 2025, pp. 169–199.</w:t>
       </w:r>
     </w:p>
     <w:sectPr>

</xml_diff>

<commit_message>
Second pass: Mithril query bound and Trilithium MLWR assumption; refine P2 and P3
</commit_message>
<xml_diff>
--- a/report/Phase1_Report.docx
+++ b/report/Phase1_Report.docx
@@ -1031,7 +1031,7 @@
           <w:i w:val="0"/>
           <w:sz w:val="20"/>
         </w:rPr>
-        <w:t xml:space="preserve"> [4,5,6,7] (PQShield, Brave, Bristol) is the first practical ML-DSA-compatible threshold scheme. It uses replicated secret sharing with short shares, so shares stay small enough for ML-DSA's norm bounds, and performs rejection sampling locally per party with hyperball sampling, avoiding a global abort MPC. Communication is about 1 MB per participant for up to six parties, with Go implementations; the security argument is a game-based reduction in the random oracle model to MLWE and ML-DSA unforgeability under static corruption of up to T−1 parties. There are no identifiable aborts, and its parameters target a per-attempt success probability of 1/2 rather than ML-DSA's roughly 1/4, so the accepted-response distribution differs from FIPS 204. The earlier version [5] was superseded by [4], which appears at USENIX Security 2026; the preview writeup [7] notes that up to 8 parties remains practical, that no synchronised broadcast channel is needed, and that the Go implementation uses floating point for hyperball sampling.</w:t>
+        <w:t xml:space="preserve"> [4,5,6,7] (PQShield, Brave, Bristol) is the first practical ML-DSA-compatible threshold scheme. It uses replicated secret sharing with short shares, so shares stay small enough for ML-DSA's norm bounds, and performs rejection sampling locally per party with hyperball sampling, avoiding a global abort MPC. Communication is about 1 MB per participant for up to six parties, with Go implementations; the security argument is a game-based reduction in the random oracle model to MLWE and ML-DSA unforgeability under static corruption of up to T−1 parties. There are no identifiable aborts, and its parameters target a per-attempt success probability of 1/2 rather than ML-DSA's roughly 1/4, so the accepted-response distribution differs from FIPS 204. Its proof uses Rényi divergence and therefore covers only Q_s = 2^50 signing queries, with K parallel repetitions per attempt to amplify the success probability. The earlier version [5] was superseded by [4], which appears at USENIX Security 2026; the preview writeup [7] notes that up to 8 parties remains practical, that no synchronised broadcast channel is needed, and that the Go implementation uses floating point for hyperball sampling.</w:t>
       </w:r>
     </w:p>
     <w:p>
@@ -1077,7 +1077,7 @@
           <w:i w:val="0"/>
           <w:sz w:val="20"/>
         </w:rPr>
-        <w:t xml:space="preserve"> [9] (Cybernetica) targets two parties, a server and a phone, plus a correlated randomness provider (CRP). It proves security against a malicious server or phone in the UC model, uses an actively secure comparison protocol and a new rounding protocol, and has a Rust implementation. Key generation takes 3 rounds and each signing attempt 14. It is part of Cybernetica's SplitKey submission [9], is secure against one malicious party among server, phone and CRP, and the writeup concedes that a malicious CRP can mount selective-disclosure attacks that the authors consider harmless for the intended use. It relies on a heuristic that a rejected partial signature can be simulated as uniform.</w:t>
+        <w:t xml:space="preserve"> [9] (Cybernetica) targets two parties, a server and a phone, plus a correlated randomness provider (CRP). It proves security against a malicious server or phone in the UC model, uses an actively secure comparison protocol and a new rounding protocol, and has a Rust implementation. Key generation takes 3 rounds and each signing attempt 14. It is part of Cybernetica's SplitKey submission [9], is secure against one malicious party among server, phone and CRP, and the writeup concedes that a malicious CRP can mount selective-disclosure attacks that the authors consider harmless for the intended use. It publishes the high bits w_H even for rejected attempts, and its security argument for this rests on an MLWR-type assumption that the paper itself calls non-standard for ML-DSA parameters (Quorus [8] describes the same point as a heuristic that a rejected partial signature can be simulated as uniform).</w:t>
       </w:r>
     </w:p>
     <w:p>
@@ -2520,7 +2520,7 @@
           <w:i w:val="0"/>
           <w:sz w:val="20"/>
         </w:rPr>
-        <w:t xml:space="preserve"> (success probability 1/2) and its a posteriori key-sharing hint loss (7–12 bits reported) lack independent re-derivation at q_s = 2^64.</w:t>
+        <w:t xml:space="preserve"> (success probability 1/2) and its a posteriori key-sharing hint loss (7–12 bits reported) lack independent re-derivation; the proof covers only Q_s = 2^50 signing queries, below the 2^64 usually assumed for signatures.</w:t>
       </w:r>
     </w:p>
     <w:p>
@@ -2649,7 +2649,7 @@
           <w:i w:val="0"/>
           <w:sz w:val="20"/>
         </w:rPr>
-        <w:t xml:space="preserve"> (i) The accepted-response distribution: with success probability 1/2 per attempt instead of about 1/4, the nonce distribution and rejection region differ from FIPS 204, so the Renyi or Fisher-information loss at q_s = 2^64 must be computed concretely. (ii) A posteriori key sharing: the adversary obtains a noisy hint on the existing ML-DSA secret, which the authors quantify as a 7–12 bit loss; this should be re-derived for the exact share subset held by T−1 corrupted parties. (iii) Adaptive corruption is argued heuristically with a loss of at most 5 bits for N ≤ 6, a proof gap rather than an attack. (iv) Selective aborts: with no identifiable aborts, corrupted parties can abort after seeing honest contributions, so aborted-attempt transcripts must be checked. (v) Implementation: the Go proof of concept uses floating point for hyperball sampling, so sampler bias and timing leakage are plausible, and a fixed-point C reference is planned.</w:t>
+        <w:t xml:space="preserve"> (i) The accepted-response distribution: with success probability 1/2 per attempt instead of about 1/4, the nonce distribution and rejection region differ from FIPS 204, so the Renyi or Fisher-information loss must be computed concretely beyond the proven Q_s = 2^50 up to the 2^64 queries NIST typically assumes for signatures. (ii) A posteriori key sharing: the adversary obtains a noisy hint on the existing ML-DSA secret, which the authors quantify as a 7–12 bit loss; this should be re-derived for the exact share subset held by T−1 corrupted parties. (iii) Adaptive corruption is argued heuristically with a loss of at most 5 bits for N ≤ 6, a proof gap rather than an attack. (iv) Selective aborts: with no identifiable aborts, corrupted parties can abort after seeing honest contributions, so aborted-attempt transcripts must be checked. (v) Implementation: the Go proof of concept uses floating point for hyperball sampling, so sampler bias and timing leakage are plausible, and a fixed-point C reference is planned.</w:t>
       </w:r>
     </w:p>
     <w:p>
@@ -2695,7 +2695,7 @@
           <w:i w:val="0"/>
           <w:sz w:val="20"/>
         </w:rPr>
-        <w:t xml:space="preserve"> The statement that a rejected partial signature can be simulated as uniform is heuristic and is the most attackable claim: the distribution of rejected partial responses may depend on s1 or s2. The rejection-check result is declassified to both parties, so the number of bits about c·s2 revealed per attempt should be bounded. The correlated randomness provider is a trusted third party, so what it can learn from its own correlated values matters, and the scheme is two-party only (2-of-2).</w:t>
+        <w:t xml:space="preserve"> The paper publishes w_H even in rejected runs and states openly that this needs an MLWR-type assumption, noting that related work either adds a noise term (as Quorus does), introduces a rejected-decisional assumption, or treats the question as open. This is the most attackable claim. Because the nonce y is fresh in every attempt, each published w_H is an LWR-style sample under a new secret, so any accumulation of information about s1 or s2 must come through the rejection events. The rejection-check result is declassified to both parties, so the bits revealed about c·s2 per attempt should be bounded. The correlated randomness provider is a trusted third party that, per the writeup, can mount selective-disclosure attacks the authors consider harmless, and the scheme is two-party only (2-of-2).</w:t>
       </w:r>
     </w:p>
     <w:p>
@@ -8842,7 +8842,7 @@
           <w:i w:val="0"/>
           <w:sz w:val="20"/>
         </w:rPr>
-        <w:t xml:space="preserve"> Compute the Fisher information I about s1 carried by one accepted response z under Mithril's hyperball sampling and 1/2 acceptance, derive the attack wall ≈ 4/(I·τ), and check it exceeds 2^64. Also re-derive the hardness loss of the a posteriori key-sharing hint using the exact share subset held by T−1 corrupted parties, with the lattice estimator.</w:t>
+        <w:t xml:space="preserve"> Compute the Fisher information I about s1 carried by one accepted response z under Mithril's hyperball sampling and 1/2 acceptance, derive the attack wall ≈ 4/(I·τ), and compare it with the proven Q_s = 2^50 and the 2^64 usually assumed. Also re-derive the hardness loss of the a posteriori key-sharing hint using the exact share subset held by T−1 corrupted parties, with the lattice estimator.</w:t>
       </w:r>
     </w:p>
     <w:p>
@@ -8865,7 +8865,7 @@
           <w:i w:val="0"/>
           <w:sz w:val="20"/>
         </w:rPr>
-        <w:t xml:space="preserve"> Test whether the distribution of rejected-attempt transcripts, (w1, c, ⊥) in Quorus and rejected partial responses in Trilithium, depends on s1 or s2. A positive result would invalidate the simulatability claim or heuristic; the declassified rejection-check bit in Trilithium should be quantified in bits per attempt about c·s2.</w:t>
+        <w:t xml:space="preserve"> Both schemes release the high bits w_H and the challenge c for rejected attempts. Quorus adds a noise term e_w to w so that this is provably simulatable, while Trilithium keeps unmodified ML-DSA and relies on an MLWR-type assumption. Test whether the rejected-attempt transcripts, together with the accept or reject bit, carry any dependence on s1 or s2, using regression and ILP-style tests, and quantify the hardness of the underlying rounding instances with the lattice estimator. A positive result in Trilithium would show the assumption fails at ML-DSA parameters; a null result bounds it. The rejection bit declassified in Trilithium should also be quantified in bits per attempt about c·s2.</w:t>
       </w:r>
     </w:p>
     <w:p>
@@ -8911,7 +8911,7 @@
           <w:i w:val="0"/>
           <w:sz w:val="20"/>
         </w:rPr>
-        <w:t xml:space="preserve"> For each problem we state what would count as a result. For P1 we hypothesise that a bounded-noise estimator needs at least an order of magnitude fewer signatures than least squares, and the criterion is a recovered key (checked against the public key) at a sample count below 2^16. For P2 we hypothesise that the Fisher information per signature is small enough that the wall exceeds 2^64, so a null result is the expected outcome and the criterion is a numerical bound with its derivation. For P3 we hypothesise that Quorus's reveal-on-reject is simulatable as claimed while Trilithium's rejected-partial heuristic may only hold approximately, and the criterion is a statistical test with a stated false-positive rate and sample budget. For P4 we hypothesise, from the algebra in [12], that the P2 profile fails at |S∖C| = 1, and the criterion is either an explicit recovery procedure on a toy instance or a precise reason why the masks still hide the commitments. Stating these in advance keeps the project from drifting into whatever happens to be easy to measure.</w:t>
+        <w:t xml:space="preserve"> For each problem we state what would count as a result. For P1 we hypothesise that a bounded-noise estimator needs at least an order of magnitude fewer signatures than least squares, and the criterion is a recovered key (checked against the public key) at a sample count below 2^16. For P2 we hypothesise that the Fisher information per signature is small enough that the wall exceeds 2^64 (well above the proven 2^50), so a null result is the expected outcome and the criterion is a numerical bound with its derivation. For P3 we hypothesise that Quorus's reveal-on-reject is simulatable as claimed because of the added noise, while Trilithium's MLWR-type assumption may only hold approximately, and the criterion is a statistical test with a stated false-positive rate and sample budget. For P4 we hypothesise, from the algebra in [12], that the P2 profile fails at |S∖C| = 1, and the criterion is either an explicit recovery procedure on a toy instance or a precise reason why the masks still hide the commitments. Stating these in advance keeps the project from drifting into whatever happens to be easy to measure.</w:t>
       </w:r>
     </w:p>
     <w:p>
@@ -9147,7 +9147,7 @@
           <w:i w:val="0"/>
           <w:sz w:val="20"/>
         </w:rPr>
-        <w:t xml:space="preserve"> For a scheme whose accepted responses have density f_s(z) depending on the secret s through a location shift c·s, the Fisher information I about s per signature determines the Cramér–Rao lower bound on any unbiased estimator’s variance. Following the argument in [10], key recovery requires on the order of 4/(I·τ) signatures; we compute I numerically from the exact acceptance region and sampling distribution of each scheme rather than relying on a Gaussian approximation, and report the resulting wall in bits to compare with q_s = 2^64.</w:t>
+        <w:t xml:space="preserve"> For a scheme whose accepted responses have density f_s(z) depending on the secret s through a location shift c·s, the Fisher information I about s per signature determines the Cramér–Rao lower bound on any unbiased estimator’s variance. Following the argument in [10], key recovery requires on the order of 4/(I·τ) signatures; we compute I numerically from the exact acceptance region and sampling distribution of each scheme rather than relying on a Gaussian approximation, and report the resulting wall in bits to compare with the proven 2^50 and the assumed 2^64.</w:t>
       </w:r>
     </w:p>
     <w:p>

</xml_diff>

<commit_message>
Read main bodies of core papers; correct P1, P3, P4 and attack-surface text
</commit_message>
<xml_diff>
--- a/report/Phase1_Report.docx
+++ b/report/Phase1_Report.docx
@@ -1031,7 +1031,7 @@
           <w:i w:val="0"/>
           <w:sz w:val="20"/>
         </w:rPr>
-        <w:t xml:space="preserve"> [4,5,6,7] (PQShield, Brave, Bristol) is the first practical ML-DSA-compatible threshold scheme. It uses replicated secret sharing with short shares, so shares stay small enough for ML-DSA's norm bounds, and performs rejection sampling locally per party with hyperball sampling, avoiding a global abort MPC. Communication is about 1 MB per participant for up to six parties, with Go implementations; the security argument is a game-based reduction in the random oracle model to MLWE and ML-DSA unforgeability under static corruption of up to T−1 parties. There are no identifiable aborts, and its parameters target a per-attempt success probability of 1/2 rather than ML-DSA's roughly 1/4, so the accepted-response distribution differs from FIPS 204. Its proof uses Rényi divergence and therefore covers only Q_s = 2^50 signing queries, with K parallel repetitions per attempt to amplify the success probability. The earlier version [5] was superseded by [4], which appears at USENIX Security 2026; the preview writeup [7] notes that up to 8 parties remains practical, that no synchronised broadcast channel is needed, and that the Go implementation uses floating point for hyperball sampling.</w:t>
+        <w:t xml:space="preserve"> [4,5,6,7] (PQShield, Brave, Bristol) is the first practical ML-DSA-compatible threshold scheme. It uses replicated secret sharing with short shares, so shares stay small enough for ML-DSA's norm bounds, and performs rejection sampling locally per party with hyperball sampling, avoiding a global abort MPC. Communication is about 1 MB per participant for up to six parties, with Go implementations; the security argument is a game-based reduction in the random oracle model to MLWE and ML-DSA unforgeability under static corruption of up to T−1 parties. There are no identifiable aborts, and its parameters target a per-attempt success probability of 1/2 rather than ML-DSA's roughly 1/4, so the accepted-response distribution differs from FIPS 204. Each party publishes a full MLWE-sample commitment (so the Gaussian-elimination attack on bare A·x does not apply) and responses are rejection-sampled over hyperballs. Its proof uses Rényi divergence and therefore covers only Q_s = 2^50 signing queries, with K parallel repetitions per attempt to amplify the success probability. The earlier version [5] was superseded by [4], which appears at USENIX Security 2026; the preview writeup [7] notes that up to 8 parties remains practical, that no synchronised broadcast channel is needed, and that the Go implementation uses floating point for hyperball sampling.</w:t>
       </w:r>
     </w:p>
     <w:p>
@@ -1077,7 +1077,7 @@
           <w:i w:val="0"/>
           <w:sz w:val="20"/>
         </w:rPr>
-        <w:t xml:space="preserve"> [9] (Cybernetica) targets two parties, a server and a phone, plus a correlated randomness provider (CRP). It proves security against a malicious server or phone in the UC model, uses an actively secure comparison protocol and a new rounding protocol, and has a Rust implementation. Key generation takes 3 rounds and each signing attempt 14. It is part of Cybernetica's SplitKey submission [9], is secure against one malicious party among server, phone and CRP, and the writeup concedes that a malicious CRP can mount selective-disclosure attacks that the authors consider harmless for the intended use. It publishes the high bits w_H even for rejected attempts, and its security argument for this rests on an MLWR-type assumption that the paper itself calls non-standard for ML-DSA parameters (Quorus [8] describes the same point as a heuristic that a rejected partial signature can be simulated as uniform).</w:t>
+        <w:t xml:space="preserve"> [9] (Cybernetica) targets two parties, a server and a phone, plus a correlated randomness provider (CRP). It proves security against a malicious server or phone in the UC model, uses an actively secure comparison protocol and a new rounding protocol, and has a Rust implementation. Key generation takes 3 rounds and each signing attempt 14; the protocol is given both for unmodified ML-DSA and for the Quorus-style variant with a CRP-supplied noise term e_w. It is part of Cybernetica's SplitKey submission [9], is secure against one malicious party among server, phone and CRP, and the writeup concedes that a malicious CRP can mount selective-disclosure attacks that the authors consider harmless for the intended use. It publishes the high bits w_H even for rejected attempts, and its security argument for this rests on an MLWR-type assumption that the paper itself calls non-standard for ML-DSA parameters (Quorus [8] describes the same point as a heuristic that a rejected partial signature can be simulated as uniform).</w:t>
       </w:r>
     </w:p>
     <w:p>
@@ -1100,7 +1100,7 @@
           <w:i w:val="0"/>
           <w:sz w:val="20"/>
         </w:rPr>
-        <w:t xml:space="preserve"> [10,11] (Codebat) introduces the Boundary Clearance Condition (BCC): for a constant fraction of nonces (31.7% at ML-DSA-65, 43.2% at -44, 39.1% at -87) the vector s2 provably cannot push w across a rounding boundary, so rejection checks can be enforced offline on preprocessed nonces. This yields a TEE-assisted one-round variant (described in v0.22 only as a contrasting example, not proposed for the threshold setting) and a distributed MPC profile, the proposed system, with two online rounds. The same paper proves a lower bound: any FIPS-exact scheme revealing a summed (Irwin–Hall) nonce admits key recovery after about 2^30 signatures. TALUS builds on Kao's Shamir nonce DKG [12], where the signing nonce is itself a Shamir secret sharing, with pairwise-cancelling PRF masks and claimed nonce-share min-entropy above 5× the key entropy for signing sets up to 17.</w:t>
+        <w:t xml:space="preserve"> [10,11] (Codebat) introduces the Boundary Clearance Condition (BCC): for a constant fraction of nonces (31.7% at ML-DSA-65, 43.2% at -44, 39.1% at -87) the vector s2 provably cannot push w across a rounding boundary, so rejection checks can be enforced offline on preprocessed nonces. This yields a TEE-assisted one-round variant (described in v0.22 only as a contrasting example, not proposed for the threshold setting) and a distributed MPC profile, the proposed system, with two online rounds. The paper states that its cap-based shield for the s2 channel is model-supported rather than proven. The same paper proves a lower bound: any FIPS-exact scheme revealing a summed (Irwin–Hall) nonce admits key recovery after about 2^30 signatures. TALUS builds on Kao's Shamir nonce DKG [12], where the signing nonce is itself a Shamir secret sharing, with pairwise-cancelling PRF masks and claimed nonce-share min-entropy above 5× the key entropy for signing sets up to 17.</w:t>
       </w:r>
     </w:p>
     <w:p>
@@ -2369,7 +2369,7 @@
           <w:i w:val="0"/>
           <w:sz w:val="20"/>
         </w:rPr>
-        <w:t>The Mithril line began as a poster [6] and a preliminary ePrint [5] covering both ML-DSA and an enhanced Raccoon with identifiable aborts (up to 64 parties); the latter was later split into two papers, one of which is [4]. Kao's predecessor [12] is not itself a Call submission but shows the same patterns: its fully distributed profile P2 broadcasts masked commitments, and the paper's own remarks show an exposed λ_h·A·y_h yields y_h and then the key; masks hide these only when |S∖C| ≥ 2. The paper discloses this: at T = N with N−1 corruptions, mask hiding does not hold in P2, yet its Table 1 still claims dishonest-majority unforgeability (tolerating N−1 corruptions) with complete UC proofs against static adversaries. Whether the loss of mask hiding can be turned into key recovery, which would contradict that claim, is the open question we formulate as P4. The paper's Irwin–Hall analysis bounds the total loss by 0.013·q_s bits, which exceeds a 128-bit margin after about 10^4 sessions, consistent with [10] later proving an attack near 2^30.</w:t>
+        <w:t>The Mithril line began as a poster [6] and a preliminary ePrint [5] covering both ML-DSA and an enhanced Raccoon with identifiable aborts (up to 64 parties); the latter was later split into two papers, one of which is [4]. Kao's predecessor [12] is not itself a Call submission but shows the same patterns: its fully distributed profile P2 broadcasts masked commitments, and the paper's own remarks show an exposed λ_h·A·y_h yields y_h and then the key; masks hide these only when |S∖C| ≥ 2. The paper discloses this: at T = N with N−1 corruptions, mask hiding does not hold in P2, yet its Table 1 still claims dishonest-majority unforgeability (tolerating N−1 corruptions) with complete UC proofs against static adversaries. Whether the loss of mask hiding can be turned into key recovery, which would contradict that claim, is the open question we formulate as P4. Its Irwin–Hall analysis bounds the security loss by 0.013 bits per signing query, with the proved bound stated as non-vacuous for q_s &lt; 16,000, whereas [10] later proves a passive attack near 2^30 signatures for any scheme revealing such a summed nonce.</w:t>
       </w:r>
     </w:p>
     <w:p>
@@ -2588,20 +2588,6 @@
     </w:p>
     <w:p>
       <w:pPr>
-        <w:jc w:val="both"/>
-      </w:pPr>
-      <w:r>
-        <w:rPr>
-          <w:rFonts w:ascii="Times New Roman" w:hAnsi="Times New Roman"/>
-          <w:b w:val="0"/>
-          <w:i w:val="0"/>
-          <w:sz w:val="20"/>
-        </w:rPr>
-        <w:t>Deployment realities amplify this. A threshold signature that verifies under standard FIPS 204 can be dropped into existing PKI, code-signing and TLS stacks unchanged, which is the main appeal of all four designs. But a key that must be rotated every 2^13 signatures (TALUS) or a signer that is limited to six parties (Mithril) restricts the settings in which these are practical, and tests that expose a larger margin would materially change which designs are viable.</w:t>
-      </w:r>
-    </w:p>
-    <w:p>
-      <w:pPr>
         <w:keepNext/>
         <w:spacing w:before="100" w:after="40"/>
       </w:pPr>
@@ -8819,7 +8805,7 @@
           <w:i w:val="0"/>
           <w:sz w:val="20"/>
         </w:rPr>
-        <w:t xml:space="preserve"> Given the post-BCC noise e = LowBits(w) restricted to (−γ2+β, γ2−β), find the minimum number of signatures q* at which an optimised estimator recovers s′ = s2 − t0, and compare q* with the cap (2^13–2^14) and the uniqueness wall (2^15–2^16). Sharp noise edges carry more information per sample than variance alone, so bounded-noise estimators, ILP and lattice reduction should beat least squares. Either outcome is informative: q* below the cap breaks the design; q* above it gives a concrete security margin.</w:t>
+        <w:t xml:space="preserve"> The authors [10] already price the s2 channel: below an integer-uniqueness wall q_uniq ≈ 2^15.2/2^16.4/2^16.2 the noisy observations O = r0 + c(t0 − s2) cannot by themselves determine s2, and the cap of 2^13–2^14 sits about two bits below it. Because the public key already determines s2, protection is computational: they model a syndrome meet-in-the-middle at cost 2^{H/2} with residual entropy H ≥ 502 (about 2^160), but the only proven floor is about 2^58/2^49 at ML-DSA-65/87 (below 128 bits), and ML-DSA-44 has no public cokernel (k = ℓ). Problem P1 is therefore to measure the true cost of recovering s′ given at most 2^14 sharp-edged observations, with bounded-noise estimators, ILP and hint-integrating lattice estimators, and to compare it with the modelled and proven figures. A cost well below 2^128 at the cap would break the design; a cost near the model would give independent support for it.</w:t>
       </w:r>
     </w:p>
     <w:p>
@@ -8856,7 +8842,7 @@
           <w:i w:val="0"/>
           <w:sz w:val="20"/>
         </w:rPr>
-        <w:t>P3 (Rejected-attempt leakage in Quorus and Trilithium).</w:t>
+        <w:t>P3 (Rejected-attempt leakage in Quorus, Trilithium and Mithril).</w:t>
       </w:r>
       <w:r>
         <w:rPr>
@@ -8865,7 +8851,7 @@
           <w:i w:val="0"/>
           <w:sz w:val="20"/>
         </w:rPr>
-        <w:t xml:space="preserve"> Both schemes release the high bits w_H and the challenge c for rejected attempts. Quorus adds a noise term e_w to w so that this is provably simulatable, while Trilithium keeps unmodified ML-DSA and relies on an MLWR-type assumption. Test whether the rejected-attempt transcripts, together with the accept or reject bit, carry any dependence on s1 or s2, using regression and ILP-style tests, and quantify the hardness of the underlying rounding instances with the lattice estimator. A positive result in Trilithium would show the assumption fails at ML-DSA parameters; a null result bounds it. The rejection bit declassified in Trilithium should also be quantified in bits per attempt about c·s2.</w:t>
+        <w:t xml:space="preserve"> Quorus and Trilithium release the high bits w_H and the challenge c for rejected attempts, and Mithril releases each party's full commitment w_i = [A|I]·r_i (a complete MLWE sample, not a bare A·x) even when its partial response is rejected. Quorus adds a noise term e_w to w so that this is provably simulatable, while Trilithium keeps unmodified ML-DSA and relies on an MLWR-type assumption. Test whether the rejected-attempt transcripts, together with the accept or reject bit, carry any dependence on s1 or s2, using regression and ILP-style tests, and quantify the hardness of the underlying rounding instances with the lattice estimator. A positive result in Trilithium would show the assumption fails at ML-DSA parameters; a null result bounds it. The rejection bit declassified in Trilithium should also be quantified in bits per attempt about c·s2.</w:t>
       </w:r>
     </w:p>
     <w:p>
@@ -8888,7 +8874,7 @@
           <w:i w:val="0"/>
           <w:sz w:val="20"/>
         </w:rPr>
-        <w:t xml:space="preserve"> The paper [12] discloses that mask hiding fails at |S∖C| = 1 yet claims dishonest-majority unforgeability. Decide whether this failure yields key recovery, which would be a one-signature key recovery for any |S| = T with T−1 corruptions, and whether the Feldman-style DKG commitments show the A·s1,i pattern broken in [13].</w:t>
+        <w:t xml:space="preserve"> The paper [12] states that in profile P2 the broadcast commitments are hidden only when |S∖C| ≥ 2, and its own Remark 15 argues that an exposed λ_h·A·y_h gives y_h by linear algebra and then s_{1,h} = c⁻¹(z_h − y_h). With |S| = T and T−1 corrupted parties inside S we have |S∖C| = 1, so by the paper's own argument the key would fall, yet Table 1 credits P2 with dishonest-majority unforgeability. Decide whether P2 is secure only for |S| ≥ T+1, and whether the Feldman-style DKG commitments show the A·s1,i pattern broken in [13] (the paper itself uses a trusted dealer for key generation).</w:t>
       </w:r>
     </w:p>
     <w:p>
@@ -8911,7 +8897,7 @@
           <w:i w:val="0"/>
           <w:sz w:val="20"/>
         </w:rPr>
-        <w:t xml:space="preserve"> For each problem we state what would count as a result. For P1 we hypothesise that a bounded-noise estimator needs at least an order of magnitude fewer signatures than least squares, and the criterion is a recovered key (checked against the public key) at a sample count below 2^16. For P2 we hypothesise that the Fisher information per signature is small enough that the wall exceeds 2^64 (well above the proven 2^50), so a null result is the expected outcome and the criterion is a numerical bound with its derivation. For P3 we hypothesise that Quorus's reveal-on-reject is simulatable as claimed because of the added noise, while Trilithium's MLWR-type assumption may only hold approximately, and the criterion is a statistical test with a stated false-positive rate and sample budget. For P4 we hypothesise, from the algebra in [12], that the P2 profile fails at |S∖C| = 1, and the criterion is either an explicit recovery procedure on a toy instance or a precise reason why the masks still hide the commitments. Stating these in advance keeps the project from drifting into whatever happens to be easy to measure.</w:t>
+        <w:t xml:space="preserve"> For each problem we state what would count as a result. For P1 we hypothesise that a hint-aware estimators beat the least-squares sample estimate by a wide margin, and the criterion is a measured work cost for recovering s′ at 2^14 observations, checked by recovering the key against the public key at reduced parameters. For P2 we hypothesise that the Fisher information per signature is small enough that the wall exceeds 2^64 (well above the proven 2^50), so a null result is the expected outcome and the criterion is a numerical bound with its derivation. For P3 we hypothesise that Quorus's reveal-on-reject is simulatable as claimed because of the added noise, while Trilithium's MLWR-type assumption may only hold approximately, and the criterion is a statistical test with a stated false-positive rate and sample budget. For P4 we hypothesise, from the algebra in [12], that the P2 profile fails at |S∖C| = 1, and the criterion is either an explicit recovery procedure on a toy instance or a precise reason why the masks still hide the commitments. Stating these in advance keeps the project from drifting into whatever happens to be easy to measure.</w:t>
       </w:r>
     </w:p>
     <w:p>

</xml_diff>

<commit_message>
Add first harness code, ILWE scaling experiment, update report and docs
</commit_message>
<xml_diff>
--- a/report/Phase1_Report.docx
+++ b/report/Phase1_Report.docx
@@ -902,7 +902,7 @@
           <w:i w:val="0"/>
           <w:sz w:val="20"/>
         </w:rPr>
-        <w:t xml:space="preserve"> Sources were collected in three passes. First, the submissions page of the NIST First Call gave the four proposals and their preview writeups. Second, each proposal's ePrint or arXiv entry and its listed predecessors were followed, which produced the Mithril, Quorus, Trilithium, TALUS and Kao papers and the withdrawn preliminary versions. Third, searches for “Dilithium rejected signatures ILP”, “ILWE”, and “threshold lattice signatures” on ePrint, TCHES and proceedings of EUROCRYPT and ASIACRYPT surfaced the cryptanalytic literature. Inclusion required that a source either define a threshold ML-DSA construction, attack one, or supply a technique used by such an attack. Abstracts and metadata of 18 sources were verified online on 1 October 2026; five classical references are cited from memory and flagged for re-verification. The selection is deliberately weighted toward 2024–2026 because the area did not exist as a field before 2024.</w:t>
+        <w:t xml:space="preserve"> Sources were collected in three passes. First, the submissions page of the NIST First Call gave the four proposals and their preview writeups. Second, each proposal's ePrint or arXiv entry and its listed predecessors were followed, which produced the Mithril, Quorus, Trilithium, TALUS and Kao papers and the withdrawn preliminary versions. Third, searches for “Dilithium rejected signatures ILP”, “ILWE”, and “threshold lattice signatures” on ePrint, TCHES and proceedings of EUROCRYPT and ASIACRYPT surfaced the cryptanalytic literature. Inclusion required that a source either define a threshold ML-DSA construction, attack one, or supply a technique used by such an attack. Metadata of 22 of the 24 references were verified online by 1 October 2026; the two classical references (Shamir [21], Feldman [22]) are cited from memory and flagged for re-verification. The selection is deliberately weighted toward 2024–2026 because the area did not exist as a field before 2024.</w:t>
       </w:r>
     </w:p>
     <w:p>
@@ -925,7 +925,7 @@
           <w:i w:val="0"/>
           <w:sz w:val="20"/>
         </w:rPr>
-        <w:t xml:space="preserve"> This is a literature-and-specification assessment. Mithril, Quorus and Trilithium were studied through their abstracts, preview writeups and the descriptions in later papers; no implementation code was run and no experiments have been performed yet. Hypotheses below are labelled as such.</w:t>
+        <w:t xml:space="preserve"> This is a literature-and-specification assessment. Mithril, Quorus and Trilithium were studied through their abstracts, preview writeups and the descriptions in later papers; no scheme implementation code was run. The only experiment so far is a small simulation of the ILWE least-squares estimator on synthetic TALUS-style data (Section 3.5); it was not run against any scheme's reference code. Hypotheses below are labelled as such.</w:t>
       </w:r>
     </w:p>
     <w:p>
@@ -9268,6 +9268,29 @@
           <w:i w:val="0"/>
           <w:sz w:val="20"/>
         </w:rPr>
+        <w:t>Preliminary result.</w:t>
+      </w:r>
+      <w:r>
+        <w:rPr>
+          <w:rFonts w:ascii="Times New Roman" w:hAnsi="Times New Roman"/>
+          <w:b w:val="0"/>
+          <w:i w:val="0"/>
+          <w:sz w:val="20"/>
+        </w:rPr>
+        <w:t xml:space="preserve"> A first harness (18 unit tests) simulates b = −c·s + e, e = LowBits(w), for ML-DSA-44 and recovers s by least squares. Measured error matches γ2/√(3τN) within 3% (N = 5,000 to 160,000). Extrapolating, rounding all 1,024 coefficients of s2 needs about 3.6×10^9 signatures (50% success), roughly 12 times the 4γ2²/(3τ) formula. This model ignores t0, bounded noise and lattice reduction and does not reproduce Niot's derivation [13]; read the formula as an order of magnitude.</w:t>
+      </w:r>
+    </w:p>
+    <w:p>
+      <w:pPr>
+        <w:jc w:val="both"/>
+      </w:pPr>
+      <w:r>
+        <w:rPr>
+          <w:rFonts w:ascii="Times New Roman" w:hAnsi="Times New Roman"/>
+          <w:b/>
+          <w:i w:val="0"/>
+          <w:sz w:val="20"/>
+        </w:rPr>
         <w:t>Expected outcomes and risks.</w:t>
       </w:r>
       <w:r>
@@ -10010,30 +10033,7 @@
           <w:i w:val="0"/>
           <w:sz w:val="20"/>
         </w:rPr>
-        <w:t xml:space="preserve"> Phase 2 is organised so that each milestone has a pass/fail test. M1: the primitives reproduce FIPS 204 known-answer vectors for all three parameter sets. M2: a deliberately leaky scheme (publishing A·s1) is broken in one signature by the Gaussian-elimination estimator. M3: the TALUS-without-check simulator is broken by least squares at a sample count within a factor of two of the formula in Table I, at reduced parameters. M4: the bounded-noise estimator beats least squares by the stated margin or the report explains why not. M5 and M6: simulators for Mithril, Quorus and Trilithium produce transcripts that follow the specifications, as checked by an independent reading of each paper. M7: the written results state, for each scheme, either an attack or a bound. Failing M1 or M2 stops the project until fixed, because later results would be untrustworthy; failing M4 is itself an informative outcome. This staging also gives an early signal if the schedule slips.</w:t>
-      </w:r>
-    </w:p>
-    <w:p>
-      <w:pPr>
-        <w:jc w:val="both"/>
-      </w:pPr>
-      <w:r>
-        <w:rPr>
-          <w:rFonts w:ascii="Times New Roman" w:hAnsi="Times New Roman"/>
-          <w:b/>
-          <w:i w:val="0"/>
-          <w:sz w:val="20"/>
-        </w:rPr>
-        <w:t>Future directions.</w:t>
-      </w:r>
-      <w:r>
-        <w:rPr>
-          <w:rFonts w:ascii="Times New Roman" w:hAnsi="Times New Roman"/>
-          <w:b w:val="0"/>
-          <w:i w:val="0"/>
-          <w:sz w:val="20"/>
-        </w:rPr>
-        <w:t xml:space="preserve"> Beyond Phase 2, three extensions are natural. The first is adaptive corruption, which Mithril argues heuristically and which would require simulators that let the adversary choose whom to corrupt after seeing partial transcripts. The second is proactive security, where shares are refreshed periodically; this interacts with TALUS's per-key cap and could turn key rotation into share rotation without changing the public key. The third is a formal treatment of statistical leakage across rejected attempts, giving a theorem that bounds the information an adversary gains from aborted transcripts as a function of the acceptance probability, which would replace today's heuristics with a proof.</w:t>
+        <w:t xml:space="preserve"> Phase 2 is organised so that each milestone has a pass/fail test. M1: the primitives reproduce FIPS 204 known-answer vectors for all three parameter sets. M2: a deliberately leaky scheme (publishing A·s1) is broken in one signature by the Gaussian-elimination estimator. M3: the TALUS-without-check simulator is broken by least squares at a sample count that matches the measured error law γ₂/√(3τN); a preliminary run shows that rounding every coefficient of s2 needs about 12 times the Table I formula for ML-DSA-44, so M3 must explain this gap, at reduced parameters. M4: the bounded-noise estimator beats least squares by the stated margin or the report explains why not. M5 and M6: simulators for Mithril, Quorus and Trilithium produce transcripts that follow the specifications, as checked by an independent reading of each paper. M7: the written results state, for each scheme, either an attack or a bound. Failing M1 or M2 stops the project until fixed, because later results would be untrustworthy; failing M4 is itself an informative outcome. This staging also gives an early signal if the schedule slips.</w:t>
       </w:r>
     </w:p>
     <w:p>

</xml_diff>

<commit_message>
Phase 2 report update: 14-16 Oct results, success-vs-N figure, recent-work survey
- Table IX now gives whole-secret 95% points with ILP; other TALUS routes, Mithril Go transcripts and corrected bound, Kao P2 at full size added
- Fig. 3: success rate vs N (least squares, edge, edge+ILP, whole secret), script experiments/talus_success_plot.py
- Five terms defined at first use; factor-12 least-squares gap explained
- New survey section on recent work with nine verified sources [26]-[34]; matrix now 33 sources
- Withdrawn ePrints marked background only
- Title changed to Phase 2 Report; student IDs unified; contribution table split; graphicspath works on Overleaf
</commit_message>
<xml_diff>
--- a/report/Phase1_Report.docx
+++ b/report/Phase1_Report.docx
@@ -27,7 +27,7 @@
           <w:i w:val="0"/>
           <w:sz w:val="20"/>
         </w:rPr>
-        <w:t>Phase 1 Report (revised, with Phase 2 results) – Cryptography, BITS Pilani, Dubai Campus</w:t>
+        <w:t>Phase 2 Report – Cryptography, BITS Pilani, Dubai Campus</w:t>
       </w:r>
     </w:p>
     <w:p>
@@ -41,7 +41,7 @@
           <w:i/>
           <w:sz w:val="20"/>
         </w:rPr>
-        <w:t>Ashmit Dhown (f20230205) · Srivathsa H Honyal (f20230198)</w:t>
+        <w:t>Ashmit Dhown 2023A7PS0205U · Srivathsa H Honyal 2023A7PS0198U</w:t>
       </w:r>
     </w:p>
     <w:p>
@@ -64,7 +64,7 @@
           <w:i w:val="0"/>
           <w:sz w:val="20"/>
         </w:rPr>
-        <w:t>ML-DSA (FIPS 204) is the NIST-standardised lattice-based digital signature, designed for a single signer. Splitting its key among several parties is hard because rejection sampling and rounding do not combine well with secret sharing. NIST's 2026 First Call for multi-party threshold schemes (IR 8214C) has four proposals whose signatures verify under an unmodified ML-DSA verifier: Mithril, Quorus, SplitForge/Trilithium and TALUS. We survey twenty-four sources on these schemes and on leakage attacks against lattice signatures, and make the TALUS per-key signing cap our core problem. A leakage-testing harness built in Phase 2 (ML-DSA passing 81 NIST ACVP vectors, scheme views, least-squares, bounded-noise and integer-programming estimators) recovers the TALUS s2 channel secret of one ML-DSA-44 ring element from about 7×10^4 signatures (2^16.1), which is 3.1 bits above the cap and 0.9 bits above the authors' uniqueness wall in our channel model: a thinner margin, not a break. Controls give 9/9 recoveries on a leaky variant and 0/18 false keys on genuine ML-DSA. Along the way we reproduce both published attacks on an early TALUS version and find a parameter-proof gap in Mithril and a one-signature key exposure in a predecessor design; the latter two await coordinated disclosure.</w:t>
+        <w:t>ML-DSA (FIPS 204) is the NIST-standardised lattice-based digital signature, designed for a single signer. Splitting its key among several parties is hard because rejection sampling and rounding do not combine well with secret sharing. NIST's 2026 First Call for multi-party threshold schemes (IR 8214C) has four proposals whose signatures verify under an unmodified ML-DSA verifier: Mithril, Quorus, SplitForge/Trilithium and TALUS. We survey thirty-three sources on these schemes and on leakage attacks against lattice signatures, and make the TALUS per-key signing cap our core problem. A leakage-testing harness built in Phase 2 (ML-DSA passing 81 NIST ACVP vectors, scheme views, least-squares, bounded-noise and integer-programming estimators) recovers the whole TALUS s2 channel secret of ML-DSA-44 in 18/20 trials at 7×10^4 signatures (2^16.1); for 95% success it needs about 3.1 bits (ML-DSA-44) and 3.5 bits (-65, -87) more than the cap allows and about 1 bit more than the authors' uniqueness wall, in our channel model: a thin margin, not a break. Controls give 9/9 recoveries on a leaky variant and 0/18 false keys on genuine ML-DSA. Along the way we reproduce both published attacks on an early TALUS version, find a parameter-proof gap in Mithril (whose real Go transcripts show no s2 leak) and demonstrate a one-signature key exposure in a predecessor design at full ML-DSA size; the latter two await coordinated disclosure.</w:t>
       </w:r>
     </w:p>
     <w:p>
@@ -872,7 +872,7 @@
           <w:i w:val="0"/>
           <w:sz w:val="20"/>
         </w:rPr>
-        <w:t xml:space="preserve"> Sources came from the First Call submissions page, the proposals' ePrint/arXiv entries and their predecessors, and searches of ePrint, TCHES, EUROCRYPT and ASIACRYPT (“Dilithium rejected signatures ILP”, “ILWE”, “threshold lattice signatures”). A source was kept if it defines, attacks or supplies a technique against a threshold ML-DSA design. Metadata of all references were verified online (Shamir [21] and Feldman [22] against Crossref).</w:t>
+        <w:t xml:space="preserve"> Sources came from the First Call submissions page, the proposals' ePrint/arXiv entries and their predecessors, and searches of ePrint, TCHES, EUROCRYPT and ASIACRYPT (“Dilithium rejected signatures ILP”, “ILWE”, “threshold lattice signatures”). A source was kept if it defines, attacks or supplies a technique against a threshold ML-DSA design. Metadata of all references were verified online (Shamir [21] and Feldman [22] against Crossref). For Phase 2 the search was repeated in October 2026 (ePrint 2024–2026 and the NIST call's preview writeups), adding nine sources [26]–[34] (Section II-F).</w:t>
       </w:r>
     </w:p>
     <w:p>
@@ -895,7 +895,7 @@
           <w:i w:val="0"/>
           <w:sz w:val="20"/>
         </w:rPr>
-        <w:t xml:space="preserve"> Quorus [8] and Trilithium [9] were read in full; Mithril [4] in full except Appendices D, E and most of G; Kao [12] main text and Appendices B–O. Our own harness code was run (Section IV); the schemes' reference code was not, except the Mithril authors' parameter script. Every TALUS number relies on our channel model, because the v0.22 writeup does not list the values released per signature. Results are labelled as measured, derived or hypothesis.</w:t>
+        <w:t xml:space="preserve"> Quorus [8], Trilithium [9] and Mithril [4] were read in full (Mithril Appendices D, E and G at the level of the proof hybrids); Kao [12] main text and Appendices B–O. Our own harness code was run (Section IV); of the schemes' reference code only Mithril's parameter script and Go signing code were run. Every TALUS number relies on our channel model, because the v0.22 writeup does not list the values released per signature. Results are labelled as measured, derived or hypothesis.</w:t>
       </w:r>
     </w:p>
     <w:p>
@@ -1070,7 +1070,7 @@
           <w:i w:val="0"/>
           <w:sz w:val="20"/>
         </w:rPr>
-        <w:t xml:space="preserve"> [9] (Cybernetica) targets a server and a phone plus a correlated randomness provider (CRP). It is UC-secure against one malicious party among the three, takes 14 rounds per signing attempt, and publishes the high bits w_H even for rejected attempts, justified by an MLWR-type assumption that the paper itself calls non-standard for ML-DSA parameters. It uses an actively secure comparison protocol and a new rounding protocol, has a Rust implementation, is given both for unmodified ML-DSA and for a Quorus-style variant with CRP-supplied noise e_w, and is part of Cybernetica's SplitKey submission. The writeup concedes that a malicious CRP can mount selective-disclosure attacks that the authors consider harmless for the intended use.</w:t>
+        <w:t xml:space="preserve"> [9] (Cybernetica) targets a server and a phone plus a correlated randomness provider (CRP). It is UC-secure against one malicious party among the three, takes 14 rounds per signing attempt, and publishes the high bits w_H even for rejected attempts, justified by an MLWR-type assumption (Module Learning With Rounding: like MLWE, but the random noise is replaced by deterministic rounding) that the paper itself calls non-standard for ML-DSA parameters. It uses an actively secure comparison protocol and a new rounding protocol, has a Rust implementation, is given both for unmodified ML-DSA and for a Quorus-style variant with CRP-supplied noise e_w, and is part of Cybernetica's SplitKey submission. The writeup concedes that a malicious CRP can mount selective-disclosure attacks that the authors consider harmless for the intended use.</w:t>
       </w:r>
     </w:p>
     <w:p>
@@ -1093,7 +1093,7 @@
           <w:i w:val="0"/>
           <w:sz w:val="20"/>
         </w:rPr>
-        <w:t xml:space="preserve"> [10,11] (Codebat) introduces the Boundary Clearance Condition (BCC): for a constant fraction of nonces (43.2%, 31.7% and 39.1% at ML-DSA-44/65/87) s2 provably cannot push w across a rounding boundary, so rejection can be done offline on preprocessed nonces, giving a two-round distributed MPC profile. The paper states that its cap-based shield for the s2 channel is model-supported rather than proven, and proves that any FIPS-exact scheme revealing a summed (Irwin–Hall) nonce admits key recovery after about 2^30 signatures. A TEE-assisted one-round variant appears in v0.22 only as a contrasting example. TALUS builds on Kao's Shamir nonce DKG [12], where the signing nonce is itself Shamir-shared with pairwise-cancelling PRF masks and claimed nonce-share min-entropy above 5× the key entropy for signing sets up to 17.</w:t>
+        <w:t xml:space="preserve"> [10,11] (Codebat) introduces the Boundary Clearance Condition (BCC): for a constant fraction of nonces (43.2%, 31.7% and 39.1% at ML-DSA-44/65/87) s2 provably cannot push w across a rounding boundary, so rejection can be done offline on preprocessed nonces, giving a two-round distributed MPC profile. The paper states that its cap-based shield for the s2 channel is model-supported rather than proven, and proves that any FIPS-exact scheme revealing a summed (Irwin–Hall) nonce admits key recovery after about 2^30 signatures. A one-round variant assisted by a TEE (trusted execution environment, a hardware-isolated enclave trusted to keep secrets) appears in v0.22 only as a contrasting example. TALUS builds on Kao's Shamir nonce DKG [12], where the signing nonce is itself Shamir-shared with pairwise-cancelling PRF masks and claimed nonce-share min-entropy above 5× the key entropy for signing sets up to 17.</w:t>
       </w:r>
     </w:p>
     <w:p>
@@ -2239,7 +2239,7 @@
           <w:i w:val="0"/>
           <w:sz w:val="20"/>
         </w:rPr>
-        <w:t xml:space="preserve"> Working in the NTT domain, A splits into 256 independent k×ℓ matrices over Z_q, one per slot. Each is left-invertible unless an event of probability about 1/q occurs, which is the origin of the 2^-15 and 2^-38 bounds, so any observer solves the system slot by slot and obtains s1,i exactly; shortness is irrelevant because no lattice problem arises. With k = ℓ = 1 the commitment is just a·s mod q, and dividing by a recovers s. The reasoning “discrete-log commitments hide, so lattice ones should” fails because g^x hides x only since discrete logarithms are hard, whereas A·x is a linear map and linear maps are easy to undo.</w:t>
+        <w:t xml:space="preserve"> The number-theoretic transform (NTT) is the modular analogue of the FFT: it turns a product of polynomials in R_q into 256 independent products of numbers mod q, one per slot. Working in the NTT domain, A splits into 256 independent k×ℓ matrices over Z_q, one per slot. Each is left-invertible unless an event of probability about 1/q occurs, which is the origin of the 2^-15 and 2^-38 bounds, so any observer solves the system slot by slot and obtains s1,i exactly; shortness is irrelevant because no lattice problem arises. With k = ℓ = 1 the commitment is just a·s mod q, and dividing by a recovers s. The reasoning “discrete-log commitments hide, so lattice ones should” fails because g^x hides x only since discrete logarithms are hard, whereas A·x is a linear map and linear maps are easy to undo.</w:t>
       </w:r>
     </w:p>
     <w:p>
@@ -2404,7 +2404,91 @@
           <w:i/>
           <w:sz w:val="20"/>
         </w:rPr>
-        <w:t>F. Gap analysis and comparison</w:t>
+        <w:t>F. Recent work, 2024–2026 (added in Phase 2)</w:t>
+      </w:r>
+    </w:p>
+    <w:p>
+      <w:pPr>
+        <w:jc w:val="both"/>
+      </w:pPr>
+      <w:r>
+        <w:rPr>
+          <w:rFonts w:ascii="Times New Roman" w:hAnsi="Times New Roman"/>
+          <w:b/>
+          <w:i w:val="0"/>
+          <w:sz w:val="20"/>
+        </w:rPr>
+        <w:t>Lattice threshold designs that drop ML-DSA compatibility.</w:t>
+      </w:r>
+      <w:r>
+        <w:rPr>
+          <w:rFonts w:ascii="Times New Roman" w:hAnsi="Times New Roman"/>
+          <w:b w:val="0"/>
+          <w:i w:val="0"/>
+          <w:sz w:val="20"/>
+        </w:rPr>
+        <w:t xml:space="preserve"> Espitau, Katsumata and Takemure [27] give a two-round lattice threshold signature under a new algebraic one-more MLWE assumption, with signatures of about 11 KB even for 1024 signers. Ringtail [26] reaches two rounds from standard LWE, with a message-independent first round, 13.4 KB signatures and 10.5 KB of online communication at 1024 parties, and was run across 8 countries. Their authors have joined in Tanuki [28], a Raccoon-based two-round scheme announced for the same NIST call; its signatures are not ML-DSA signatures, so it lies outside our four targets. These schemes show the price of FIPS 204 compatibility: giving it up buys fewer rounds and thousands of parties. TOPCOAT [29], from the Cybernetica group behind Trilithium, is an earlier two-party Dilithium protocol with public-key compression and fewer rounds, based on MLWE and MSIS.</w:t>
+      </w:r>
+    </w:p>
+    <w:p>
+      <w:pPr>
+        <w:jc w:val="both"/>
+      </w:pPr>
+      <w:r>
+        <w:rPr>
+          <w:rFonts w:ascii="Times New Roman" w:hAnsi="Times New Roman"/>
+          <w:b/>
+          <w:i w:val="0"/>
+          <w:sz w:val="20"/>
+        </w:rPr>
+        <w:t>Follow-ups to the ML-DSA proposals.</w:t>
+      </w:r>
+      <w:r>
+        <w:rPr>
+          <w:rFonts w:ascii="Times New Roman" w:hAnsi="Times New Roman"/>
+          <w:b w:val="0"/>
+          <w:i w:val="0"/>
+          <w:sz w:val="20"/>
+        </w:rPr>
+        <w:t xml:space="preserve"> Rambaud, Roth and Urban [30] turn Mithril into a “threshold signatures as a service” variant, ML-DSaaS, that merges its first two rounds into one message-independent round and reports a two to three times faster online phase. A preprint by Meng [31], posted on 20 October 2026 after our experiments, studies fault-induced nonce repetition: if a party's device is made to reuse its nonce sample across sessions, the revealed per-party responses expose that party's share. It reports exact key recovery on Mithril, classifies Quorus as immune because per-party responses are never revealed, TALUS as exposed only if one-time preprocessing is skipped, and Trilithium as fault-fragile. This is a physical fault model, outside our transcript-only threat model; we read only its abstract page and have not reproduced it.</w:t>
+      </w:r>
+    </w:p>
+    <w:p>
+      <w:pPr>
+        <w:jc w:val="both"/>
+      </w:pPr>
+      <w:r>
+        <w:rPr>
+          <w:rFonts w:ascii="Times New Roman" w:hAnsi="Times New Roman"/>
+          <w:b/>
+          <w:i w:val="0"/>
+          <w:sz w:val="20"/>
+        </w:rPr>
+        <w:t>Better leakage estimators for ML-DSA.</w:t>
+      </w:r>
+      <w:r>
+        <w:rPr>
+          <w:rFonts w:ascii="Times New Roman" w:hAnsi="Times New Roman"/>
+          <w:b w:val="0"/>
+          <w:i w:val="0"/>
+          <w:sz w:val="20"/>
+        </w:rPr>
+        <w:t xml:space="preserve"> Two 2026 preprints sharpen the toolbox of Section II-D for single-signer ML-DSA when one bit of the nonce leaks per signature: Schubert et al. [32] replace linear regression by constraint satisfaction with hill climbing and need 37–68× fewer relations (5,000–35,000), and Paskarbeit et al. [33] estimate the bit-error rate of noisy leakage and cut the relations needed by 20–44%. Both support the lesson of our P1 result: estimators that use the exact structure of the leakage beat plain least squares by orders of magnitude. Finally, HAETAE [34] is the main other Fiat–Shamir-with-aborts signature built on hyperball sampling; Section V-B uses it as a check on Mithril's intersection bound.</w:t>
+      </w:r>
+    </w:p>
+    <w:p>
+      <w:pPr>
+        <w:keepNext/>
+        <w:spacing w:before="100" w:after="40"/>
+      </w:pPr>
+      <w:r>
+        <w:rPr>
+          <w:rFonts w:ascii="Times New Roman" w:hAnsi="Times New Roman"/>
+          <w:b w:val="0"/>
+          <w:i/>
+          <w:sz w:val="20"/>
+        </w:rPr>
+        <w:t>G. Gap analysis and comparison</w:t>
       </w:r>
     </w:p>
     <w:p>
@@ -2587,7 +2671,7 @@
           <w:i/>
           <w:sz w:val="20"/>
         </w:rPr>
-        <w:t>G. A reusable attack checklist</w:t>
+        <w:t>H. A reusable attack checklist</w:t>
       </w:r>
     </w:p>
     <w:p>
@@ -3343,7 +3427,7 @@
           <w:i/>
           <w:sz w:val="20"/>
         </w:rPr>
-        <w:t>H. Literature matrix</w:t>
+        <w:t>I. Literature matrix</w:t>
       </w:r>
     </w:p>
     <w:p>
@@ -3357,7 +3441,7 @@
           <w:i w:val="0"/>
           <w:sz w:val="20"/>
         </w:rPr>
-        <w:t>Table V rates each surveyed source for relevance (H central, M supporting, L background) and marks its themes: TS threshold signatures, MD ML-DSA compatible, AT attack or leakage, SS secret sharing or MPC, RS rejection sampling, ST standard. Ref. [25], added in Phase 2 for the Mithril finding, is not part of the survey matrix.</w:t>
+        <w:t>Table V rates each surveyed source for relevance (H central, M supporting, L background) and marks its themes: TS threshold signatures, MD ML-DSA compatible, AT attack or leakage, SS secret sharing or MPC, RS rejection sampling, ST standard. Rows [26]–[34] were added in Phase 2 (Section II-F). Ref. [25], added in Phase 2 for the Mithril finding, is not part of the survey matrix.</w:t>
       </w:r>
     </w:p>
     <w:p>
@@ -3382,7 +3466,7 @@
           <w:i w:val="0"/>
           <w:sz w:val="16"/>
         </w:rPr>
-        <w:t>Literature matrix of the 24 surveyed sources</w:t>
+        <w:t>Literature matrix of the 33 surveyed sources</w:t>
       </w:r>
     </w:p>
     <w:tbl>
@@ -4366,7 +4450,7 @@
                 <w:i w:val="0"/>
                 <w:sz w:val="16"/>
               </w:rPr>
-              <w:t>M</w:t>
+              <w:t>L</w:t>
             </w:r>
           </w:p>
         </w:tc>
@@ -7865,6 +7949,1615 @@
                 <w:i w:val="0"/>
                 <w:sz w:val="16"/>
               </w:rPr>
+            </w:r>
+          </w:p>
+        </w:tc>
+        <w:tc>
+          <w:tcPr>
+            <w:tcW w:type="dxa" w:w="358"/>
+          </w:tcPr>
+          <w:p>
+            <w:pPr>
+              <w:spacing w:after="0"/>
+            </w:pPr>
+            <w:r/>
+            <w:r>
+              <w:rPr>
+                <w:rFonts w:ascii="Times New Roman" w:hAnsi="Times New Roman"/>
+                <w:b w:val="0"/>
+                <w:i w:val="0"/>
+                <w:sz w:val="16"/>
+              </w:rPr>
+            </w:r>
+          </w:p>
+        </w:tc>
+      </w:tr>
+      <w:tr>
+        <w:tc>
+          <w:tcPr>
+            <w:tcW w:type="dxa" w:w="1791"/>
+          </w:tcPr>
+          <w:p>
+            <w:pPr>
+              <w:spacing w:after="0"/>
+            </w:pPr>
+            <w:r/>
+            <w:r>
+              <w:rPr>
+                <w:rFonts w:ascii="Times New Roman" w:hAnsi="Times New Roman"/>
+                <w:b w:val="0"/>
+                <w:i w:val="0"/>
+                <w:sz w:val="16"/>
+              </w:rPr>
+              <w:t>[26] Ringtail</w:t>
+            </w:r>
+          </w:p>
+        </w:tc>
+        <w:tc>
+          <w:tcPr>
+            <w:tcW w:type="dxa" w:w="478"/>
+          </w:tcPr>
+          <w:p>
+            <w:pPr>
+              <w:spacing w:after="0"/>
+            </w:pPr>
+            <w:r/>
+            <w:r>
+              <w:rPr>
+                <w:rFonts w:ascii="Times New Roman" w:hAnsi="Times New Roman"/>
+                <w:b w:val="0"/>
+                <w:i w:val="0"/>
+                <w:sz w:val="16"/>
+              </w:rPr>
+              <w:t>2025</w:t>
+            </w:r>
+          </w:p>
+        </w:tc>
+        <w:tc>
+          <w:tcPr>
+            <w:tcW w:type="dxa" w:w="478"/>
+          </w:tcPr>
+          <w:p>
+            <w:pPr>
+              <w:spacing w:after="0"/>
+            </w:pPr>
+            <w:r/>
+            <w:r>
+              <w:rPr>
+                <w:rFonts w:ascii="Times New Roman" w:hAnsi="Times New Roman"/>
+                <w:b w:val="0"/>
+                <w:i w:val="0"/>
+                <w:sz w:val="16"/>
+              </w:rPr>
+              <w:t>M</w:t>
+            </w:r>
+          </w:p>
+        </w:tc>
+        <w:tc>
+          <w:tcPr>
+            <w:tcW w:type="dxa" w:w="358"/>
+          </w:tcPr>
+          <w:p>
+            <w:pPr>
+              <w:spacing w:after="0"/>
+            </w:pPr>
+            <w:r/>
+            <w:r>
+              <w:rPr>
+                <w:rFonts w:ascii="Times New Roman" w:hAnsi="Times New Roman"/>
+                <w:b w:val="0"/>
+                <w:i w:val="0"/>
+                <w:sz w:val="16"/>
+              </w:rPr>
+              <w:t>x</w:t>
+            </w:r>
+          </w:p>
+        </w:tc>
+        <w:tc>
+          <w:tcPr>
+            <w:tcW w:type="dxa" w:w="358"/>
+          </w:tcPr>
+          <w:p>
+            <w:pPr>
+              <w:spacing w:after="0"/>
+            </w:pPr>
+            <w:r/>
+            <w:r>
+              <w:rPr>
+                <w:rFonts w:ascii="Times New Roman" w:hAnsi="Times New Roman"/>
+                <w:b w:val="0"/>
+                <w:i w:val="0"/>
+                <w:sz w:val="16"/>
+              </w:rPr>
+            </w:r>
+          </w:p>
+        </w:tc>
+        <w:tc>
+          <w:tcPr>
+            <w:tcW w:type="dxa" w:w="358"/>
+          </w:tcPr>
+          <w:p>
+            <w:pPr>
+              <w:spacing w:after="0"/>
+            </w:pPr>
+            <w:r/>
+            <w:r>
+              <w:rPr>
+                <w:rFonts w:ascii="Times New Roman" w:hAnsi="Times New Roman"/>
+                <w:b w:val="0"/>
+                <w:i w:val="0"/>
+                <w:sz w:val="16"/>
+              </w:rPr>
+            </w:r>
+          </w:p>
+        </w:tc>
+        <w:tc>
+          <w:tcPr>
+            <w:tcW w:type="dxa" w:w="358"/>
+          </w:tcPr>
+          <w:p>
+            <w:pPr>
+              <w:spacing w:after="0"/>
+            </w:pPr>
+            <w:r/>
+            <w:r>
+              <w:rPr>
+                <w:rFonts w:ascii="Times New Roman" w:hAnsi="Times New Roman"/>
+                <w:b w:val="0"/>
+                <w:i w:val="0"/>
+                <w:sz w:val="16"/>
+              </w:rPr>
+              <w:t>x</w:t>
+            </w:r>
+          </w:p>
+        </w:tc>
+        <w:tc>
+          <w:tcPr>
+            <w:tcW w:type="dxa" w:w="358"/>
+          </w:tcPr>
+          <w:p>
+            <w:pPr>
+              <w:spacing w:after="0"/>
+            </w:pPr>
+            <w:r/>
+            <w:r>
+              <w:rPr>
+                <w:rFonts w:ascii="Times New Roman" w:hAnsi="Times New Roman"/>
+                <w:b w:val="0"/>
+                <w:i w:val="0"/>
+                <w:sz w:val="16"/>
+              </w:rPr>
+            </w:r>
+          </w:p>
+        </w:tc>
+        <w:tc>
+          <w:tcPr>
+            <w:tcW w:type="dxa" w:w="358"/>
+          </w:tcPr>
+          <w:p>
+            <w:pPr>
+              <w:spacing w:after="0"/>
+            </w:pPr>
+            <w:r/>
+            <w:r>
+              <w:rPr>
+                <w:rFonts w:ascii="Times New Roman" w:hAnsi="Times New Roman"/>
+                <w:b w:val="0"/>
+                <w:i w:val="0"/>
+                <w:sz w:val="16"/>
+              </w:rPr>
+            </w:r>
+          </w:p>
+        </w:tc>
+      </w:tr>
+      <w:tr>
+        <w:tc>
+          <w:tcPr>
+            <w:tcW w:type="dxa" w:w="1791"/>
+          </w:tcPr>
+          <w:p>
+            <w:pPr>
+              <w:spacing w:after="0"/>
+            </w:pPr>
+            <w:r/>
+            <w:r>
+              <w:rPr>
+                <w:rFonts w:ascii="Times New Roman" w:hAnsi="Times New Roman"/>
+                <w:b w:val="0"/>
+                <w:i w:val="0"/>
+                <w:sz w:val="16"/>
+              </w:rPr>
+              <w:t>[27] AOM-MLWE TS</w:t>
+            </w:r>
+          </w:p>
+        </w:tc>
+        <w:tc>
+          <w:tcPr>
+            <w:tcW w:type="dxa" w:w="478"/>
+          </w:tcPr>
+          <w:p>
+            <w:pPr>
+              <w:spacing w:after="0"/>
+            </w:pPr>
+            <w:r/>
+            <w:r>
+              <w:rPr>
+                <w:rFonts w:ascii="Times New Roman" w:hAnsi="Times New Roman"/>
+                <w:b w:val="0"/>
+                <w:i w:val="0"/>
+                <w:sz w:val="16"/>
+              </w:rPr>
+              <w:t>2024</w:t>
+            </w:r>
+          </w:p>
+        </w:tc>
+        <w:tc>
+          <w:tcPr>
+            <w:tcW w:type="dxa" w:w="478"/>
+          </w:tcPr>
+          <w:p>
+            <w:pPr>
+              <w:spacing w:after="0"/>
+            </w:pPr>
+            <w:r/>
+            <w:r>
+              <w:rPr>
+                <w:rFonts w:ascii="Times New Roman" w:hAnsi="Times New Roman"/>
+                <w:b w:val="0"/>
+                <w:i w:val="0"/>
+                <w:sz w:val="16"/>
+              </w:rPr>
+              <w:t>M</w:t>
+            </w:r>
+          </w:p>
+        </w:tc>
+        <w:tc>
+          <w:tcPr>
+            <w:tcW w:type="dxa" w:w="358"/>
+          </w:tcPr>
+          <w:p>
+            <w:pPr>
+              <w:spacing w:after="0"/>
+            </w:pPr>
+            <w:r/>
+            <w:r>
+              <w:rPr>
+                <w:rFonts w:ascii="Times New Roman" w:hAnsi="Times New Roman"/>
+                <w:b w:val="0"/>
+                <w:i w:val="0"/>
+                <w:sz w:val="16"/>
+              </w:rPr>
+              <w:t>x</w:t>
+            </w:r>
+          </w:p>
+        </w:tc>
+        <w:tc>
+          <w:tcPr>
+            <w:tcW w:type="dxa" w:w="358"/>
+          </w:tcPr>
+          <w:p>
+            <w:pPr>
+              <w:spacing w:after="0"/>
+            </w:pPr>
+            <w:r/>
+            <w:r>
+              <w:rPr>
+                <w:rFonts w:ascii="Times New Roman" w:hAnsi="Times New Roman"/>
+                <w:b w:val="0"/>
+                <w:i w:val="0"/>
+                <w:sz w:val="16"/>
+              </w:rPr>
+            </w:r>
+          </w:p>
+        </w:tc>
+        <w:tc>
+          <w:tcPr>
+            <w:tcW w:type="dxa" w:w="358"/>
+          </w:tcPr>
+          <w:p>
+            <w:pPr>
+              <w:spacing w:after="0"/>
+            </w:pPr>
+            <w:r/>
+            <w:r>
+              <w:rPr>
+                <w:rFonts w:ascii="Times New Roman" w:hAnsi="Times New Roman"/>
+                <w:b w:val="0"/>
+                <w:i w:val="0"/>
+                <w:sz w:val="16"/>
+              </w:rPr>
+            </w:r>
+          </w:p>
+        </w:tc>
+        <w:tc>
+          <w:tcPr>
+            <w:tcW w:type="dxa" w:w="358"/>
+          </w:tcPr>
+          <w:p>
+            <w:pPr>
+              <w:spacing w:after="0"/>
+            </w:pPr>
+            <w:r/>
+            <w:r>
+              <w:rPr>
+                <w:rFonts w:ascii="Times New Roman" w:hAnsi="Times New Roman"/>
+                <w:b w:val="0"/>
+                <w:i w:val="0"/>
+                <w:sz w:val="16"/>
+              </w:rPr>
+              <w:t>x</w:t>
+            </w:r>
+          </w:p>
+        </w:tc>
+        <w:tc>
+          <w:tcPr>
+            <w:tcW w:type="dxa" w:w="358"/>
+          </w:tcPr>
+          <w:p>
+            <w:pPr>
+              <w:spacing w:after="0"/>
+            </w:pPr>
+            <w:r/>
+            <w:r>
+              <w:rPr>
+                <w:rFonts w:ascii="Times New Roman" w:hAnsi="Times New Roman"/>
+                <w:b w:val="0"/>
+                <w:i w:val="0"/>
+                <w:sz w:val="16"/>
+              </w:rPr>
+            </w:r>
+          </w:p>
+        </w:tc>
+        <w:tc>
+          <w:tcPr>
+            <w:tcW w:type="dxa" w:w="358"/>
+          </w:tcPr>
+          <w:p>
+            <w:pPr>
+              <w:spacing w:after="0"/>
+            </w:pPr>
+            <w:r/>
+            <w:r>
+              <w:rPr>
+                <w:rFonts w:ascii="Times New Roman" w:hAnsi="Times New Roman"/>
+                <w:b w:val="0"/>
+                <w:i w:val="0"/>
+                <w:sz w:val="16"/>
+              </w:rPr>
+            </w:r>
+          </w:p>
+        </w:tc>
+      </w:tr>
+      <w:tr>
+        <w:tc>
+          <w:tcPr>
+            <w:tcW w:type="dxa" w:w="1791"/>
+          </w:tcPr>
+          <w:p>
+            <w:pPr>
+              <w:spacing w:after="0"/>
+            </w:pPr>
+            <w:r/>
+            <w:r>
+              <w:rPr>
+                <w:rFonts w:ascii="Times New Roman" w:hAnsi="Times New Roman"/>
+                <w:b w:val="0"/>
+                <w:i w:val="0"/>
+                <w:sz w:val="16"/>
+              </w:rPr>
+              <w:t>[28] Tanuki PW</w:t>
+            </w:r>
+          </w:p>
+        </w:tc>
+        <w:tc>
+          <w:tcPr>
+            <w:tcW w:type="dxa" w:w="478"/>
+          </w:tcPr>
+          <w:p>
+            <w:pPr>
+              <w:spacing w:after="0"/>
+            </w:pPr>
+            <w:r/>
+            <w:r>
+              <w:rPr>
+                <w:rFonts w:ascii="Times New Roman" w:hAnsi="Times New Roman"/>
+                <w:b w:val="0"/>
+                <w:i w:val="0"/>
+                <w:sz w:val="16"/>
+              </w:rPr>
+              <w:t>2026</w:t>
+            </w:r>
+          </w:p>
+        </w:tc>
+        <w:tc>
+          <w:tcPr>
+            <w:tcW w:type="dxa" w:w="478"/>
+          </w:tcPr>
+          <w:p>
+            <w:pPr>
+              <w:spacing w:after="0"/>
+            </w:pPr>
+            <w:r/>
+            <w:r>
+              <w:rPr>
+                <w:rFonts w:ascii="Times New Roman" w:hAnsi="Times New Roman"/>
+                <w:b w:val="0"/>
+                <w:i w:val="0"/>
+                <w:sz w:val="16"/>
+              </w:rPr>
+              <w:t>M</w:t>
+            </w:r>
+          </w:p>
+        </w:tc>
+        <w:tc>
+          <w:tcPr>
+            <w:tcW w:type="dxa" w:w="358"/>
+          </w:tcPr>
+          <w:p>
+            <w:pPr>
+              <w:spacing w:after="0"/>
+            </w:pPr>
+            <w:r/>
+            <w:r>
+              <w:rPr>
+                <w:rFonts w:ascii="Times New Roman" w:hAnsi="Times New Roman"/>
+                <w:b w:val="0"/>
+                <w:i w:val="0"/>
+                <w:sz w:val="16"/>
+              </w:rPr>
+              <w:t>x</w:t>
+            </w:r>
+          </w:p>
+        </w:tc>
+        <w:tc>
+          <w:tcPr>
+            <w:tcW w:type="dxa" w:w="358"/>
+          </w:tcPr>
+          <w:p>
+            <w:pPr>
+              <w:spacing w:after="0"/>
+            </w:pPr>
+            <w:r/>
+            <w:r>
+              <w:rPr>
+                <w:rFonts w:ascii="Times New Roman" w:hAnsi="Times New Roman"/>
+                <w:b w:val="0"/>
+                <w:i w:val="0"/>
+                <w:sz w:val="16"/>
+              </w:rPr>
+            </w:r>
+          </w:p>
+        </w:tc>
+        <w:tc>
+          <w:tcPr>
+            <w:tcW w:type="dxa" w:w="358"/>
+          </w:tcPr>
+          <w:p>
+            <w:pPr>
+              <w:spacing w:after="0"/>
+            </w:pPr>
+            <w:r/>
+            <w:r>
+              <w:rPr>
+                <w:rFonts w:ascii="Times New Roman" w:hAnsi="Times New Roman"/>
+                <w:b w:val="0"/>
+                <w:i w:val="0"/>
+                <w:sz w:val="16"/>
+              </w:rPr>
+            </w:r>
+          </w:p>
+        </w:tc>
+        <w:tc>
+          <w:tcPr>
+            <w:tcW w:type="dxa" w:w="358"/>
+          </w:tcPr>
+          <w:p>
+            <w:pPr>
+              <w:spacing w:after="0"/>
+            </w:pPr>
+            <w:r/>
+            <w:r>
+              <w:rPr>
+                <w:rFonts w:ascii="Times New Roman" w:hAnsi="Times New Roman"/>
+                <w:b w:val="0"/>
+                <w:i w:val="0"/>
+                <w:sz w:val="16"/>
+              </w:rPr>
+              <w:t>x</w:t>
+            </w:r>
+          </w:p>
+        </w:tc>
+        <w:tc>
+          <w:tcPr>
+            <w:tcW w:type="dxa" w:w="358"/>
+          </w:tcPr>
+          <w:p>
+            <w:pPr>
+              <w:spacing w:after="0"/>
+            </w:pPr>
+            <w:r/>
+            <w:r>
+              <w:rPr>
+                <w:rFonts w:ascii="Times New Roman" w:hAnsi="Times New Roman"/>
+                <w:b w:val="0"/>
+                <w:i w:val="0"/>
+                <w:sz w:val="16"/>
+              </w:rPr>
+            </w:r>
+          </w:p>
+        </w:tc>
+        <w:tc>
+          <w:tcPr>
+            <w:tcW w:type="dxa" w:w="358"/>
+          </w:tcPr>
+          <w:p>
+            <w:pPr>
+              <w:spacing w:after="0"/>
+            </w:pPr>
+            <w:r/>
+            <w:r>
+              <w:rPr>
+                <w:rFonts w:ascii="Times New Roman" w:hAnsi="Times New Roman"/>
+                <w:b w:val="0"/>
+                <w:i w:val="0"/>
+                <w:sz w:val="16"/>
+              </w:rPr>
+              <w:t>x</w:t>
+            </w:r>
+          </w:p>
+        </w:tc>
+      </w:tr>
+      <w:tr>
+        <w:tc>
+          <w:tcPr>
+            <w:tcW w:type="dxa" w:w="1791"/>
+          </w:tcPr>
+          <w:p>
+            <w:pPr>
+              <w:spacing w:after="0"/>
+            </w:pPr>
+            <w:r/>
+            <w:r>
+              <w:rPr>
+                <w:rFonts w:ascii="Times New Roman" w:hAnsi="Times New Roman"/>
+                <w:b w:val="0"/>
+                <w:i w:val="0"/>
+                <w:sz w:val="16"/>
+              </w:rPr>
+              <w:t>[29] TOPCOAT</w:t>
+            </w:r>
+          </w:p>
+        </w:tc>
+        <w:tc>
+          <w:tcPr>
+            <w:tcW w:type="dxa" w:w="478"/>
+          </w:tcPr>
+          <w:p>
+            <w:pPr>
+              <w:spacing w:after="0"/>
+            </w:pPr>
+            <w:r/>
+            <w:r>
+              <w:rPr>
+                <w:rFonts w:ascii="Times New Roman" w:hAnsi="Times New Roman"/>
+                <w:b w:val="0"/>
+                <w:i w:val="0"/>
+                <w:sz w:val="16"/>
+              </w:rPr>
+              <w:t>2024</w:t>
+            </w:r>
+          </w:p>
+        </w:tc>
+        <w:tc>
+          <w:tcPr>
+            <w:tcW w:type="dxa" w:w="478"/>
+          </w:tcPr>
+          <w:p>
+            <w:pPr>
+              <w:spacing w:after="0"/>
+            </w:pPr>
+            <w:r/>
+            <w:r>
+              <w:rPr>
+                <w:rFonts w:ascii="Times New Roman" w:hAnsi="Times New Roman"/>
+                <w:b w:val="0"/>
+                <w:i w:val="0"/>
+                <w:sz w:val="16"/>
+              </w:rPr>
+              <w:t>M</w:t>
+            </w:r>
+          </w:p>
+        </w:tc>
+        <w:tc>
+          <w:tcPr>
+            <w:tcW w:type="dxa" w:w="358"/>
+          </w:tcPr>
+          <w:p>
+            <w:pPr>
+              <w:spacing w:after="0"/>
+            </w:pPr>
+            <w:r/>
+            <w:r>
+              <w:rPr>
+                <w:rFonts w:ascii="Times New Roman" w:hAnsi="Times New Roman"/>
+                <w:b w:val="0"/>
+                <w:i w:val="0"/>
+                <w:sz w:val="16"/>
+              </w:rPr>
+              <w:t>x</w:t>
+            </w:r>
+          </w:p>
+        </w:tc>
+        <w:tc>
+          <w:tcPr>
+            <w:tcW w:type="dxa" w:w="358"/>
+          </w:tcPr>
+          <w:p>
+            <w:pPr>
+              <w:spacing w:after="0"/>
+            </w:pPr>
+            <w:r/>
+            <w:r>
+              <w:rPr>
+                <w:rFonts w:ascii="Times New Roman" w:hAnsi="Times New Roman"/>
+                <w:b w:val="0"/>
+                <w:i w:val="0"/>
+                <w:sz w:val="16"/>
+              </w:rPr>
+              <w:t>x</w:t>
+            </w:r>
+          </w:p>
+        </w:tc>
+        <w:tc>
+          <w:tcPr>
+            <w:tcW w:type="dxa" w:w="358"/>
+          </w:tcPr>
+          <w:p>
+            <w:pPr>
+              <w:spacing w:after="0"/>
+            </w:pPr>
+            <w:r/>
+            <w:r>
+              <w:rPr>
+                <w:rFonts w:ascii="Times New Roman" w:hAnsi="Times New Roman"/>
+                <w:b w:val="0"/>
+                <w:i w:val="0"/>
+                <w:sz w:val="16"/>
+              </w:rPr>
+            </w:r>
+          </w:p>
+        </w:tc>
+        <w:tc>
+          <w:tcPr>
+            <w:tcW w:type="dxa" w:w="358"/>
+          </w:tcPr>
+          <w:p>
+            <w:pPr>
+              <w:spacing w:after="0"/>
+            </w:pPr>
+            <w:r/>
+            <w:r>
+              <w:rPr>
+                <w:rFonts w:ascii="Times New Roman" w:hAnsi="Times New Roman"/>
+                <w:b w:val="0"/>
+                <w:i w:val="0"/>
+                <w:sz w:val="16"/>
+              </w:rPr>
+              <w:t>x</w:t>
+            </w:r>
+          </w:p>
+        </w:tc>
+        <w:tc>
+          <w:tcPr>
+            <w:tcW w:type="dxa" w:w="358"/>
+          </w:tcPr>
+          <w:p>
+            <w:pPr>
+              <w:spacing w:after="0"/>
+            </w:pPr>
+            <w:r/>
+            <w:r>
+              <w:rPr>
+                <w:rFonts w:ascii="Times New Roman" w:hAnsi="Times New Roman"/>
+                <w:b w:val="0"/>
+                <w:i w:val="0"/>
+                <w:sz w:val="16"/>
+              </w:rPr>
+              <w:t>x</w:t>
+            </w:r>
+          </w:p>
+        </w:tc>
+        <w:tc>
+          <w:tcPr>
+            <w:tcW w:type="dxa" w:w="358"/>
+          </w:tcPr>
+          <w:p>
+            <w:pPr>
+              <w:spacing w:after="0"/>
+            </w:pPr>
+            <w:r/>
+            <w:r>
+              <w:rPr>
+                <w:rFonts w:ascii="Times New Roman" w:hAnsi="Times New Roman"/>
+                <w:b w:val="0"/>
+                <w:i w:val="0"/>
+                <w:sz w:val="16"/>
+              </w:rPr>
+            </w:r>
+          </w:p>
+        </w:tc>
+      </w:tr>
+      <w:tr>
+        <w:tc>
+          <w:tcPr>
+            <w:tcW w:type="dxa" w:w="1791"/>
+          </w:tcPr>
+          <w:p>
+            <w:pPr>
+              <w:spacing w:after="0"/>
+            </w:pPr>
+            <w:r/>
+            <w:r>
+              <w:rPr>
+                <w:rFonts w:ascii="Times New Roman" w:hAnsi="Times New Roman"/>
+                <w:b w:val="0"/>
+                <w:i w:val="0"/>
+                <w:sz w:val="16"/>
+              </w:rPr>
+              <w:t>[30] ML-DSaaS</w:t>
+            </w:r>
+          </w:p>
+        </w:tc>
+        <w:tc>
+          <w:tcPr>
+            <w:tcW w:type="dxa" w:w="478"/>
+          </w:tcPr>
+          <w:p>
+            <w:pPr>
+              <w:spacing w:after="0"/>
+            </w:pPr>
+            <w:r/>
+            <w:r>
+              <w:rPr>
+                <w:rFonts w:ascii="Times New Roman" w:hAnsi="Times New Roman"/>
+                <w:b w:val="0"/>
+                <w:i w:val="0"/>
+                <w:sz w:val="16"/>
+              </w:rPr>
+              <w:t>2026</w:t>
+            </w:r>
+          </w:p>
+        </w:tc>
+        <w:tc>
+          <w:tcPr>
+            <w:tcW w:type="dxa" w:w="478"/>
+          </w:tcPr>
+          <w:p>
+            <w:pPr>
+              <w:spacing w:after="0"/>
+            </w:pPr>
+            <w:r/>
+            <w:r>
+              <w:rPr>
+                <w:rFonts w:ascii="Times New Roman" w:hAnsi="Times New Roman"/>
+                <w:b w:val="0"/>
+                <w:i w:val="0"/>
+                <w:sz w:val="16"/>
+              </w:rPr>
+              <w:t>H</w:t>
+            </w:r>
+          </w:p>
+        </w:tc>
+        <w:tc>
+          <w:tcPr>
+            <w:tcW w:type="dxa" w:w="358"/>
+          </w:tcPr>
+          <w:p>
+            <w:pPr>
+              <w:spacing w:after="0"/>
+            </w:pPr>
+            <w:r/>
+            <w:r>
+              <w:rPr>
+                <w:rFonts w:ascii="Times New Roman" w:hAnsi="Times New Roman"/>
+                <w:b w:val="0"/>
+                <w:i w:val="0"/>
+                <w:sz w:val="16"/>
+              </w:rPr>
+              <w:t>x</w:t>
+            </w:r>
+          </w:p>
+        </w:tc>
+        <w:tc>
+          <w:tcPr>
+            <w:tcW w:type="dxa" w:w="358"/>
+          </w:tcPr>
+          <w:p>
+            <w:pPr>
+              <w:spacing w:after="0"/>
+            </w:pPr>
+            <w:r/>
+            <w:r>
+              <w:rPr>
+                <w:rFonts w:ascii="Times New Roman" w:hAnsi="Times New Roman"/>
+                <w:b w:val="0"/>
+                <w:i w:val="0"/>
+                <w:sz w:val="16"/>
+              </w:rPr>
+              <w:t>x</w:t>
+            </w:r>
+          </w:p>
+        </w:tc>
+        <w:tc>
+          <w:tcPr>
+            <w:tcW w:type="dxa" w:w="358"/>
+          </w:tcPr>
+          <w:p>
+            <w:pPr>
+              <w:spacing w:after="0"/>
+            </w:pPr>
+            <w:r/>
+            <w:r>
+              <w:rPr>
+                <w:rFonts w:ascii="Times New Roman" w:hAnsi="Times New Roman"/>
+                <w:b w:val="0"/>
+                <w:i w:val="0"/>
+                <w:sz w:val="16"/>
+              </w:rPr>
+            </w:r>
+          </w:p>
+        </w:tc>
+        <w:tc>
+          <w:tcPr>
+            <w:tcW w:type="dxa" w:w="358"/>
+          </w:tcPr>
+          <w:p>
+            <w:pPr>
+              <w:spacing w:after="0"/>
+            </w:pPr>
+            <w:r/>
+            <w:r>
+              <w:rPr>
+                <w:rFonts w:ascii="Times New Roman" w:hAnsi="Times New Roman"/>
+                <w:b w:val="0"/>
+                <w:i w:val="0"/>
+                <w:sz w:val="16"/>
+              </w:rPr>
+              <w:t>x</w:t>
+            </w:r>
+          </w:p>
+        </w:tc>
+        <w:tc>
+          <w:tcPr>
+            <w:tcW w:type="dxa" w:w="358"/>
+          </w:tcPr>
+          <w:p>
+            <w:pPr>
+              <w:spacing w:after="0"/>
+            </w:pPr>
+            <w:r/>
+            <w:r>
+              <w:rPr>
+                <w:rFonts w:ascii="Times New Roman" w:hAnsi="Times New Roman"/>
+                <w:b w:val="0"/>
+                <w:i w:val="0"/>
+                <w:sz w:val="16"/>
+              </w:rPr>
+              <w:t>x</w:t>
+            </w:r>
+          </w:p>
+        </w:tc>
+        <w:tc>
+          <w:tcPr>
+            <w:tcW w:type="dxa" w:w="358"/>
+          </w:tcPr>
+          <w:p>
+            <w:pPr>
+              <w:spacing w:after="0"/>
+            </w:pPr>
+            <w:r/>
+            <w:r>
+              <w:rPr>
+                <w:rFonts w:ascii="Times New Roman" w:hAnsi="Times New Roman"/>
+                <w:b w:val="0"/>
+                <w:i w:val="0"/>
+                <w:sz w:val="16"/>
+              </w:rPr>
+            </w:r>
+          </w:p>
+        </w:tc>
+      </w:tr>
+      <w:tr>
+        <w:tc>
+          <w:tcPr>
+            <w:tcW w:type="dxa" w:w="1791"/>
+          </w:tcPr>
+          <w:p>
+            <w:pPr>
+              <w:spacing w:after="0"/>
+            </w:pPr>
+            <w:r/>
+            <w:r>
+              <w:rPr>
+                <w:rFonts w:ascii="Times New Roman" w:hAnsi="Times New Roman"/>
+                <w:b w:val="0"/>
+                <w:i w:val="0"/>
+                <w:sz w:val="16"/>
+              </w:rPr>
+              <w:t>[31] Fault nonce rep.</w:t>
+            </w:r>
+          </w:p>
+        </w:tc>
+        <w:tc>
+          <w:tcPr>
+            <w:tcW w:type="dxa" w:w="478"/>
+          </w:tcPr>
+          <w:p>
+            <w:pPr>
+              <w:spacing w:after="0"/>
+            </w:pPr>
+            <w:r/>
+            <w:r>
+              <w:rPr>
+                <w:rFonts w:ascii="Times New Roman" w:hAnsi="Times New Roman"/>
+                <w:b w:val="0"/>
+                <w:i w:val="0"/>
+                <w:sz w:val="16"/>
+              </w:rPr>
+              <w:t>2026</w:t>
+            </w:r>
+          </w:p>
+        </w:tc>
+        <w:tc>
+          <w:tcPr>
+            <w:tcW w:type="dxa" w:w="478"/>
+          </w:tcPr>
+          <w:p>
+            <w:pPr>
+              <w:spacing w:after="0"/>
+            </w:pPr>
+            <w:r/>
+            <w:r>
+              <w:rPr>
+                <w:rFonts w:ascii="Times New Roman" w:hAnsi="Times New Roman"/>
+                <w:b w:val="0"/>
+                <w:i w:val="0"/>
+                <w:sz w:val="16"/>
+              </w:rPr>
+              <w:t>H</w:t>
+            </w:r>
+          </w:p>
+        </w:tc>
+        <w:tc>
+          <w:tcPr>
+            <w:tcW w:type="dxa" w:w="358"/>
+          </w:tcPr>
+          <w:p>
+            <w:pPr>
+              <w:spacing w:after="0"/>
+            </w:pPr>
+            <w:r/>
+            <w:r>
+              <w:rPr>
+                <w:rFonts w:ascii="Times New Roman" w:hAnsi="Times New Roman"/>
+                <w:b w:val="0"/>
+                <w:i w:val="0"/>
+                <w:sz w:val="16"/>
+              </w:rPr>
+              <w:t>x</w:t>
+            </w:r>
+          </w:p>
+        </w:tc>
+        <w:tc>
+          <w:tcPr>
+            <w:tcW w:type="dxa" w:w="358"/>
+          </w:tcPr>
+          <w:p>
+            <w:pPr>
+              <w:spacing w:after="0"/>
+            </w:pPr>
+            <w:r/>
+            <w:r>
+              <w:rPr>
+                <w:rFonts w:ascii="Times New Roman" w:hAnsi="Times New Roman"/>
+                <w:b w:val="0"/>
+                <w:i w:val="0"/>
+                <w:sz w:val="16"/>
+              </w:rPr>
+              <w:t>x</w:t>
+            </w:r>
+          </w:p>
+        </w:tc>
+        <w:tc>
+          <w:tcPr>
+            <w:tcW w:type="dxa" w:w="358"/>
+          </w:tcPr>
+          <w:p>
+            <w:pPr>
+              <w:spacing w:after="0"/>
+            </w:pPr>
+            <w:r/>
+            <w:r>
+              <w:rPr>
+                <w:rFonts w:ascii="Times New Roman" w:hAnsi="Times New Roman"/>
+                <w:b w:val="0"/>
+                <w:i w:val="0"/>
+                <w:sz w:val="16"/>
+              </w:rPr>
+              <w:t>x</w:t>
+            </w:r>
+          </w:p>
+        </w:tc>
+        <w:tc>
+          <w:tcPr>
+            <w:tcW w:type="dxa" w:w="358"/>
+          </w:tcPr>
+          <w:p>
+            <w:pPr>
+              <w:spacing w:after="0"/>
+            </w:pPr>
+            <w:r/>
+            <w:r>
+              <w:rPr>
+                <w:rFonts w:ascii="Times New Roman" w:hAnsi="Times New Roman"/>
+                <w:b w:val="0"/>
+                <w:i w:val="0"/>
+                <w:sz w:val="16"/>
+              </w:rPr>
+            </w:r>
+          </w:p>
+        </w:tc>
+        <w:tc>
+          <w:tcPr>
+            <w:tcW w:type="dxa" w:w="358"/>
+          </w:tcPr>
+          <w:p>
+            <w:pPr>
+              <w:spacing w:after="0"/>
+            </w:pPr>
+            <w:r/>
+            <w:r>
+              <w:rPr>
+                <w:rFonts w:ascii="Times New Roman" w:hAnsi="Times New Roman"/>
+                <w:b w:val="0"/>
+                <w:i w:val="0"/>
+                <w:sz w:val="16"/>
+              </w:rPr>
+            </w:r>
+          </w:p>
+        </w:tc>
+        <w:tc>
+          <w:tcPr>
+            <w:tcW w:type="dxa" w:w="358"/>
+          </w:tcPr>
+          <w:p>
+            <w:pPr>
+              <w:spacing w:after="0"/>
+            </w:pPr>
+            <w:r/>
+            <w:r>
+              <w:rPr>
+                <w:rFonts w:ascii="Times New Roman" w:hAnsi="Times New Roman"/>
+                <w:b w:val="0"/>
+                <w:i w:val="0"/>
+                <w:sz w:val="16"/>
+              </w:rPr>
+            </w:r>
+          </w:p>
+        </w:tc>
+      </w:tr>
+      <w:tr>
+        <w:tc>
+          <w:tcPr>
+            <w:tcW w:type="dxa" w:w="1791"/>
+          </w:tcPr>
+          <w:p>
+            <w:pPr>
+              <w:spacing w:after="0"/>
+            </w:pPr>
+            <w:r/>
+            <w:r>
+              <w:rPr>
+                <w:rFonts w:ascii="Times New Roman" w:hAnsi="Times New Roman"/>
+                <w:b w:val="0"/>
+                <w:i w:val="0"/>
+                <w:sz w:val="16"/>
+              </w:rPr>
+              <w:t>[32] Descent</w:t>
+            </w:r>
+          </w:p>
+        </w:tc>
+        <w:tc>
+          <w:tcPr>
+            <w:tcW w:type="dxa" w:w="478"/>
+          </w:tcPr>
+          <w:p>
+            <w:pPr>
+              <w:spacing w:after="0"/>
+            </w:pPr>
+            <w:r/>
+            <w:r>
+              <w:rPr>
+                <w:rFonts w:ascii="Times New Roman" w:hAnsi="Times New Roman"/>
+                <w:b w:val="0"/>
+                <w:i w:val="0"/>
+                <w:sz w:val="16"/>
+              </w:rPr>
+              <w:t>2026</w:t>
+            </w:r>
+          </w:p>
+        </w:tc>
+        <w:tc>
+          <w:tcPr>
+            <w:tcW w:type="dxa" w:w="478"/>
+          </w:tcPr>
+          <w:p>
+            <w:pPr>
+              <w:spacing w:after="0"/>
+            </w:pPr>
+            <w:r/>
+            <w:r>
+              <w:rPr>
+                <w:rFonts w:ascii="Times New Roman" w:hAnsi="Times New Roman"/>
+                <w:b w:val="0"/>
+                <w:i w:val="0"/>
+                <w:sz w:val="16"/>
+              </w:rPr>
+              <w:t>M</w:t>
+            </w:r>
+          </w:p>
+        </w:tc>
+        <w:tc>
+          <w:tcPr>
+            <w:tcW w:type="dxa" w:w="358"/>
+          </w:tcPr>
+          <w:p>
+            <w:pPr>
+              <w:spacing w:after="0"/>
+            </w:pPr>
+            <w:r/>
+            <w:r>
+              <w:rPr>
+                <w:rFonts w:ascii="Times New Roman" w:hAnsi="Times New Roman"/>
+                <w:b w:val="0"/>
+                <w:i w:val="0"/>
+                <w:sz w:val="16"/>
+              </w:rPr>
+            </w:r>
+          </w:p>
+        </w:tc>
+        <w:tc>
+          <w:tcPr>
+            <w:tcW w:type="dxa" w:w="358"/>
+          </w:tcPr>
+          <w:p>
+            <w:pPr>
+              <w:spacing w:after="0"/>
+            </w:pPr>
+            <w:r/>
+            <w:r>
+              <w:rPr>
+                <w:rFonts w:ascii="Times New Roman" w:hAnsi="Times New Roman"/>
+                <w:b w:val="0"/>
+                <w:i w:val="0"/>
+                <w:sz w:val="16"/>
+              </w:rPr>
+              <w:t>x</w:t>
+            </w:r>
+          </w:p>
+        </w:tc>
+        <w:tc>
+          <w:tcPr>
+            <w:tcW w:type="dxa" w:w="358"/>
+          </w:tcPr>
+          <w:p>
+            <w:pPr>
+              <w:spacing w:after="0"/>
+            </w:pPr>
+            <w:r/>
+            <w:r>
+              <w:rPr>
+                <w:rFonts w:ascii="Times New Roman" w:hAnsi="Times New Roman"/>
+                <w:b w:val="0"/>
+                <w:i w:val="0"/>
+                <w:sz w:val="16"/>
+              </w:rPr>
+              <w:t>x</w:t>
+            </w:r>
+          </w:p>
+        </w:tc>
+        <w:tc>
+          <w:tcPr>
+            <w:tcW w:type="dxa" w:w="358"/>
+          </w:tcPr>
+          <w:p>
+            <w:pPr>
+              <w:spacing w:after="0"/>
+            </w:pPr>
+            <w:r/>
+            <w:r>
+              <w:rPr>
+                <w:rFonts w:ascii="Times New Roman" w:hAnsi="Times New Roman"/>
+                <w:b w:val="0"/>
+                <w:i w:val="0"/>
+                <w:sz w:val="16"/>
+              </w:rPr>
+            </w:r>
+          </w:p>
+        </w:tc>
+        <w:tc>
+          <w:tcPr>
+            <w:tcW w:type="dxa" w:w="358"/>
+          </w:tcPr>
+          <w:p>
+            <w:pPr>
+              <w:spacing w:after="0"/>
+            </w:pPr>
+            <w:r/>
+            <w:r>
+              <w:rPr>
+                <w:rFonts w:ascii="Times New Roman" w:hAnsi="Times New Roman"/>
+                <w:b w:val="0"/>
+                <w:i w:val="0"/>
+                <w:sz w:val="16"/>
+              </w:rPr>
+              <w:t>x</w:t>
+            </w:r>
+          </w:p>
+        </w:tc>
+        <w:tc>
+          <w:tcPr>
+            <w:tcW w:type="dxa" w:w="358"/>
+          </w:tcPr>
+          <w:p>
+            <w:pPr>
+              <w:spacing w:after="0"/>
+            </w:pPr>
+            <w:r/>
+            <w:r>
+              <w:rPr>
+                <w:rFonts w:ascii="Times New Roman" w:hAnsi="Times New Roman"/>
+                <w:b w:val="0"/>
+                <w:i w:val="0"/>
+                <w:sz w:val="16"/>
+              </w:rPr>
+            </w:r>
+          </w:p>
+        </w:tc>
+      </w:tr>
+      <w:tr>
+        <w:tc>
+          <w:tcPr>
+            <w:tcW w:type="dxa" w:w="1791"/>
+          </w:tcPr>
+          <w:p>
+            <w:pPr>
+              <w:spacing w:after="0"/>
+            </w:pPr>
+            <w:r/>
+            <w:r>
+              <w:rPr>
+                <w:rFonts w:ascii="Times New Roman" w:hAnsi="Times New Roman"/>
+                <w:b w:val="0"/>
+                <w:i w:val="0"/>
+                <w:sz w:val="16"/>
+              </w:rPr>
+              <w:t>[33] Noisy leakage</w:t>
+            </w:r>
+          </w:p>
+        </w:tc>
+        <w:tc>
+          <w:tcPr>
+            <w:tcW w:type="dxa" w:w="478"/>
+          </w:tcPr>
+          <w:p>
+            <w:pPr>
+              <w:spacing w:after="0"/>
+            </w:pPr>
+            <w:r/>
+            <w:r>
+              <w:rPr>
+                <w:rFonts w:ascii="Times New Roman" w:hAnsi="Times New Roman"/>
+                <w:b w:val="0"/>
+                <w:i w:val="0"/>
+                <w:sz w:val="16"/>
+              </w:rPr>
+              <w:t>2026</w:t>
+            </w:r>
+          </w:p>
+        </w:tc>
+        <w:tc>
+          <w:tcPr>
+            <w:tcW w:type="dxa" w:w="478"/>
+          </w:tcPr>
+          <w:p>
+            <w:pPr>
+              <w:spacing w:after="0"/>
+            </w:pPr>
+            <w:r/>
+            <w:r>
+              <w:rPr>
+                <w:rFonts w:ascii="Times New Roman" w:hAnsi="Times New Roman"/>
+                <w:b w:val="0"/>
+                <w:i w:val="0"/>
+                <w:sz w:val="16"/>
+              </w:rPr>
+              <w:t>M</w:t>
+            </w:r>
+          </w:p>
+        </w:tc>
+        <w:tc>
+          <w:tcPr>
+            <w:tcW w:type="dxa" w:w="358"/>
+          </w:tcPr>
+          <w:p>
+            <w:pPr>
+              <w:spacing w:after="0"/>
+            </w:pPr>
+            <w:r/>
+            <w:r>
+              <w:rPr>
+                <w:rFonts w:ascii="Times New Roman" w:hAnsi="Times New Roman"/>
+                <w:b w:val="0"/>
+                <w:i w:val="0"/>
+                <w:sz w:val="16"/>
+              </w:rPr>
+            </w:r>
+          </w:p>
+        </w:tc>
+        <w:tc>
+          <w:tcPr>
+            <w:tcW w:type="dxa" w:w="358"/>
+          </w:tcPr>
+          <w:p>
+            <w:pPr>
+              <w:spacing w:after="0"/>
+            </w:pPr>
+            <w:r/>
+            <w:r>
+              <w:rPr>
+                <w:rFonts w:ascii="Times New Roman" w:hAnsi="Times New Roman"/>
+                <w:b w:val="0"/>
+                <w:i w:val="0"/>
+                <w:sz w:val="16"/>
+              </w:rPr>
+              <w:t>x</w:t>
+            </w:r>
+          </w:p>
+        </w:tc>
+        <w:tc>
+          <w:tcPr>
+            <w:tcW w:type="dxa" w:w="358"/>
+          </w:tcPr>
+          <w:p>
+            <w:pPr>
+              <w:spacing w:after="0"/>
+            </w:pPr>
+            <w:r/>
+            <w:r>
+              <w:rPr>
+                <w:rFonts w:ascii="Times New Roman" w:hAnsi="Times New Roman"/>
+                <w:b w:val="0"/>
+                <w:i w:val="0"/>
+                <w:sz w:val="16"/>
+              </w:rPr>
+              <w:t>x</w:t>
+            </w:r>
+          </w:p>
+        </w:tc>
+        <w:tc>
+          <w:tcPr>
+            <w:tcW w:type="dxa" w:w="358"/>
+          </w:tcPr>
+          <w:p>
+            <w:pPr>
+              <w:spacing w:after="0"/>
+            </w:pPr>
+            <w:r/>
+            <w:r>
+              <w:rPr>
+                <w:rFonts w:ascii="Times New Roman" w:hAnsi="Times New Roman"/>
+                <w:b w:val="0"/>
+                <w:i w:val="0"/>
+                <w:sz w:val="16"/>
+              </w:rPr>
+            </w:r>
+          </w:p>
+        </w:tc>
+        <w:tc>
+          <w:tcPr>
+            <w:tcW w:type="dxa" w:w="358"/>
+          </w:tcPr>
+          <w:p>
+            <w:pPr>
+              <w:spacing w:after="0"/>
+            </w:pPr>
+            <w:r/>
+            <w:r>
+              <w:rPr>
+                <w:rFonts w:ascii="Times New Roman" w:hAnsi="Times New Roman"/>
+                <w:b w:val="0"/>
+                <w:i w:val="0"/>
+                <w:sz w:val="16"/>
+              </w:rPr>
+              <w:t>x</w:t>
+            </w:r>
+          </w:p>
+        </w:tc>
+        <w:tc>
+          <w:tcPr>
+            <w:tcW w:type="dxa" w:w="358"/>
+          </w:tcPr>
+          <w:p>
+            <w:pPr>
+              <w:spacing w:after="0"/>
+            </w:pPr>
+            <w:r/>
+            <w:r>
+              <w:rPr>
+                <w:rFonts w:ascii="Times New Roman" w:hAnsi="Times New Roman"/>
+                <w:b w:val="0"/>
+                <w:i w:val="0"/>
+                <w:sz w:val="16"/>
+              </w:rPr>
+            </w:r>
+          </w:p>
+        </w:tc>
+      </w:tr>
+      <w:tr>
+        <w:tc>
+          <w:tcPr>
+            <w:tcW w:type="dxa" w:w="1791"/>
+          </w:tcPr>
+          <w:p>
+            <w:pPr>
+              <w:spacing w:after="0"/>
+            </w:pPr>
+            <w:r/>
+            <w:r>
+              <w:rPr>
+                <w:rFonts w:ascii="Times New Roman" w:hAnsi="Times New Roman"/>
+                <w:b w:val="0"/>
+                <w:i w:val="0"/>
+                <w:sz w:val="16"/>
+              </w:rPr>
+              <w:t>[34] HAETAE</w:t>
+            </w:r>
+          </w:p>
+        </w:tc>
+        <w:tc>
+          <w:tcPr>
+            <w:tcW w:type="dxa" w:w="478"/>
+          </w:tcPr>
+          <w:p>
+            <w:pPr>
+              <w:spacing w:after="0"/>
+            </w:pPr>
+            <w:r/>
+            <w:r>
+              <w:rPr>
+                <w:rFonts w:ascii="Times New Roman" w:hAnsi="Times New Roman"/>
+                <w:b w:val="0"/>
+                <w:i w:val="0"/>
+                <w:sz w:val="16"/>
+              </w:rPr>
+              <w:t>2024</w:t>
+            </w:r>
+          </w:p>
+        </w:tc>
+        <w:tc>
+          <w:tcPr>
+            <w:tcW w:type="dxa" w:w="478"/>
+          </w:tcPr>
+          <w:p>
+            <w:pPr>
+              <w:spacing w:after="0"/>
+            </w:pPr>
+            <w:r/>
+            <w:r>
+              <w:rPr>
+                <w:rFonts w:ascii="Times New Roman" w:hAnsi="Times New Roman"/>
+                <w:b w:val="0"/>
+                <w:i w:val="0"/>
+                <w:sz w:val="16"/>
+              </w:rPr>
+              <w:t>L</w:t>
+            </w:r>
+          </w:p>
+        </w:tc>
+        <w:tc>
+          <w:tcPr>
+            <w:tcW w:type="dxa" w:w="358"/>
+          </w:tcPr>
+          <w:p>
+            <w:pPr>
+              <w:spacing w:after="0"/>
+            </w:pPr>
+            <w:r/>
+            <w:r>
+              <w:rPr>
+                <w:rFonts w:ascii="Times New Roman" w:hAnsi="Times New Roman"/>
+                <w:b w:val="0"/>
+                <w:i w:val="0"/>
+                <w:sz w:val="16"/>
+              </w:rPr>
+            </w:r>
+          </w:p>
+        </w:tc>
+        <w:tc>
+          <w:tcPr>
+            <w:tcW w:type="dxa" w:w="358"/>
+          </w:tcPr>
+          <w:p>
+            <w:pPr>
+              <w:spacing w:after="0"/>
+            </w:pPr>
+            <w:r/>
+            <w:r>
+              <w:rPr>
+                <w:rFonts w:ascii="Times New Roman" w:hAnsi="Times New Roman"/>
+                <w:b w:val="0"/>
+                <w:i w:val="0"/>
+                <w:sz w:val="16"/>
+              </w:rPr>
+            </w:r>
+          </w:p>
+        </w:tc>
+        <w:tc>
+          <w:tcPr>
+            <w:tcW w:type="dxa" w:w="358"/>
+          </w:tcPr>
+          <w:p>
+            <w:pPr>
+              <w:spacing w:after="0"/>
+            </w:pPr>
+            <w:r/>
+            <w:r>
+              <w:rPr>
+                <w:rFonts w:ascii="Times New Roman" w:hAnsi="Times New Roman"/>
+                <w:b w:val="0"/>
+                <w:i w:val="0"/>
+                <w:sz w:val="16"/>
+              </w:rPr>
+            </w:r>
+          </w:p>
+        </w:tc>
+        <w:tc>
+          <w:tcPr>
+            <w:tcW w:type="dxa" w:w="358"/>
+          </w:tcPr>
+          <w:p>
+            <w:pPr>
+              <w:spacing w:after="0"/>
+            </w:pPr>
+            <w:r/>
+            <w:r>
+              <w:rPr>
+                <w:rFonts w:ascii="Times New Roman" w:hAnsi="Times New Roman"/>
+                <w:b w:val="0"/>
+                <w:i w:val="0"/>
+                <w:sz w:val="16"/>
+              </w:rPr>
+            </w:r>
+          </w:p>
+        </w:tc>
+        <w:tc>
+          <w:tcPr>
+            <w:tcW w:type="dxa" w:w="358"/>
+          </w:tcPr>
+          <w:p>
+            <w:pPr>
+              <w:spacing w:after="0"/>
+            </w:pPr>
+            <w:r/>
+            <w:r>
+              <w:rPr>
+                <w:rFonts w:ascii="Times New Roman" w:hAnsi="Times New Roman"/>
+                <w:b w:val="0"/>
+                <w:i w:val="0"/>
+                <w:sz w:val="16"/>
+              </w:rPr>
+              <w:t>x</w:t>
             </w:r>
           </w:p>
         </w:tc>
@@ -7905,7 +9598,7 @@
           <w:i w:val="0"/>
           <w:sz w:val="20"/>
         </w:rPr>
-        <w:t>Of the 24 sources, 13 are central, 6 supporting and 5 background; sixteen appeared in 2025 or 2026, and 22 of 24 in 2018 or later. The sources marked AT are the evidence base for the estimators in Section IV.</w:t>
+        <w:t>Of the 33 sources, 15 are central, 11 supporting and 7 background (the two withdrawn ePrints [5], [15] are background only; no claim rests on them); twenty-two appeared in 2025 or 2026, and 31 of 33 in 2018 or later. The sources marked AT are the evidence base for the estimators in Section IV.</w:t>
       </w:r>
     </w:p>
     <w:p>
@@ -7943,7 +9636,7 @@
           <w:i/>
           <w:sz w:val="20"/>
         </w:rPr>
-        <w:t>I. Attack surface: Phase 1 hypotheses and verdicts after full reading</w:t>
+        <w:t>J. Attack surface: Phase 1 hypotheses and verdicts after full reading</w:t>
       </w:r>
     </w:p>
     <w:p>
@@ -7980,7 +9673,7 @@
           <w:i w:val="0"/>
           <w:sz w:val="20"/>
         </w:rPr>
-        <w:t xml:space="preserve"> (i) Accepted-response loss beyond 2^50: confirmed as a proof gap; the published parameters give Q_s = 2^26–2^37 under the paper's own theorem (Section V-B). (ii) Hint loss of 7–12 bits: revised; our lattice-estimator rerun gives up to 23.9 bits for ML-DSA-65. (iii) Adaptive corruption and (iv) selective aborts: not examined further. (v) Floating-point sampler: not tested (Go code not run).</w:t>
+        <w:t xml:space="preserve"> (i) Accepted-response loss beyond 2^50: confirmed as a proof gap; the published parameters give Q_s = 2^26–2^37 under the paper's own theorem (Section V-B). (ii) Hint loss of 7–12 bits: revised; our lattice-estimator rerun gives up to 23.9 bits for ML-DSA-65. (iii) Adaptive corruption and (iv) selective aborts: not examined further. (v) Floating-point sampler: the Go code was run; its transcripts show no s2 leak (Section V-B), but the sampler itself was not audited.</w:t>
       </w:r>
     </w:p>
     <w:p>
@@ -8067,7 +9760,7 @@
           <w:i w:val="0"/>
           <w:sz w:val="20"/>
         </w:rPr>
-        <w:t xml:space="preserve"> hypothesis strengthened to a key exposure (Section V-C).</w:t>
+        <w:t xml:space="preserve"> hypothesis strengthened to a key exposure, demonstrated at full ML-DSA size (Section V-C).</w:t>
       </w:r>
     </w:p>
     <w:p>
@@ -8357,7 +10050,7 @@
                 <w:i w:val="0"/>
                 <w:sz w:val="16"/>
               </w:rPr>
-              <w:t>Sessions observed; signatures used; N* = N giving 99% success</w:t>
+              <w:t>Sessions observed; signatures used; N* = N giving 95% success</w:t>
             </w:r>
           </w:p>
         </w:tc>
@@ -8832,7 +10525,7 @@
           <w:i w:val="0"/>
           <w:sz w:val="20"/>
         </w:rPr>
-        <w:t xml:space="preserve"> Given observations b_j = −c_j·s′ + e_j with e_j confined to the BCC interval, find the number of signatures N* at which s′ is recovered (and checked against the public key) with probability 0.99, for each parameter set, and compare log2 N* with the cap and the wall. A value below the cap is a break; above it, log2 N* minus log2 cap is the margin in bits. </w:t>
+        <w:t xml:space="preserve"> Given observations b_j = −c_j·s′ + e_j with e_j confined to the BCC interval, find the number of signatures N* at which s′ is recovered (and checked against the public key) with probability 0.95, for each parameter set, and compare log2 N* with the cap and the wall. A value below the cap is a break; above it, log2 N* minus log2 cap is the margin in bits. </w:t>
       </w:r>
       <w:r>
         <w:rPr>
@@ -9215,7 +10908,7 @@
           <w:i w:val="0"/>
           <w:sz w:val="20"/>
         </w:rPr>
-        <w:t xml:space="preserve"> Every experiment reports signatures used, recovered fraction, cost and parameter set. N* is the smallest N with success ≥ 0.99 over the stated trials (interpolated between grid points). Recovery is verified against ground truth, so partial correlations are never counted as breaks. Internal threats (primitive bugs, estimator over-fitting) are addressed by the ACVP vectors and by many random keys; external threats (our simulator differing from the real protocol, parameters changing before the packages) remain and are why every TALUS number is labelled as model-based; a negative result is phrased only as a bound on what was tried.</w:t>
+        <w:t xml:space="preserve"> Every experiment reports signatures used, recovered fraction, cost and parameter set. N* is where a logistic fit to the success counts (20 trials per N, Clopper–Pearson intervals) reaches 0.95. Recovery is verified against ground truth, so partial correlations are never counted as breaks. Internal threats (primitive bugs, estimator over-fitting) are addressed by the ACVP vectors and by many random keys; external threats (our simulator differing from the real protocol, parameters changing before the packages) remain and are why every TALUS number is labelled as model-based; a negative result is phrased only as a bound on what was tried.</w:t>
       </w:r>
     </w:p>
     <w:p>
@@ -10049,7 +11742,7 @@
           <w:i w:val="0"/>
           <w:sz w:val="16"/>
         </w:rPr>
-        <w:t>TALUS cap margins, ML-DSA-44/65/87, n = 256 (per ring element)</w:t>
+        <w:t>TALUS cap margins, n = 256, edge estimator with ILP finishing (whole-secret 95% point)</w:t>
       </w:r>
     </w:p>
     <w:tbl>
@@ -10069,7 +11762,7 @@
       <w:tr>
         <w:tc>
           <w:tcPr>
-            <w:tcW w:type="dxa" w:w="1288"/>
+            <w:tcW w:type="dxa" w:w="942"/>
             <w:shd w:val="clear" w:color="auto" w:fill="D9D9D9"/>
           </w:tcPr>
           <w:p>
@@ -10090,7 +11783,7 @@
         </w:tc>
         <w:tc>
           <w:tcPr>
-            <w:tcW w:type="dxa" w:w="515"/>
+            <w:tcW w:type="dxa" w:w="471"/>
             <w:shd w:val="clear" w:color="auto" w:fill="D9D9D9"/>
           </w:tcPr>
           <w:p>
@@ -10111,7 +11804,7 @@
         </w:tc>
         <w:tc>
           <w:tcPr>
-            <w:tcW w:type="dxa" w:w="601"/>
+            <w:tcW w:type="dxa" w:w="565"/>
             <w:shd w:val="clear" w:color="auto" w:fill="D9D9D9"/>
           </w:tcPr>
           <w:p>
@@ -10132,7 +11825,7 @@
         </w:tc>
         <w:tc>
           <w:tcPr>
-            <w:tcW w:type="dxa" w:w="1203"/>
+            <w:tcW w:type="dxa" w:w="847"/>
             <w:shd w:val="clear" w:color="auto" w:fill="D9D9D9"/>
           </w:tcPr>
           <w:p>
@@ -10147,13 +11840,13 @@
                 <w:i w:val="0"/>
                 <w:sz w:val="16"/>
               </w:rPr>
-              <w:t>Measured N*</w:t>
-            </w:r>
-          </w:p>
-        </w:tc>
-        <w:tc>
-          <w:tcPr>
-            <w:tcW w:type="dxa" w:w="429"/>
+              <w:t>Element 95%</w:t>
+            </w:r>
+          </w:p>
+        </w:tc>
+        <w:tc>
+          <w:tcPr>
+            <w:tcW w:type="dxa" w:w="1130"/>
             <w:shd w:val="clear" w:color="auto" w:fill="D9D9D9"/>
           </w:tcPr>
           <w:p>
@@ -10168,13 +11861,13 @@
                 <w:i w:val="0"/>
                 <w:sz w:val="16"/>
               </w:rPr>
-              <w:t>log2</w:t>
-            </w:r>
-          </w:p>
-        </w:tc>
-        <w:tc>
-          <w:tcPr>
-            <w:tcW w:type="dxa" w:w="859"/>
+              <w:t>Whole s2 95%</w:t>
+            </w:r>
+          </w:p>
+        </w:tc>
+        <w:tc>
+          <w:tcPr>
+            <w:tcW w:type="dxa" w:w="942"/>
             <w:shd w:val="clear" w:color="auto" w:fill="D9D9D9"/>
           </w:tcPr>
           <w:p>
@@ -10197,27 +11890,27 @@
       <w:tr>
         <w:tc>
           <w:tcPr>
-            <w:tcW w:type="dxa" w:w="1288"/>
-          </w:tcPr>
-          <w:p>
-            <w:pPr>
-              <w:spacing w:after="0"/>
-            </w:pPr>
-            <w:r/>
-            <w:r>
-              <w:rPr>
-                <w:rFonts w:ascii="Times New Roman" w:hAnsi="Times New Roman"/>
-                <w:b w:val="0"/>
-                <w:i w:val="0"/>
-                <w:sz w:val="16"/>
-              </w:rPr>
-              <w:t>-44 edge</w:t>
-            </w:r>
-          </w:p>
-        </w:tc>
-        <w:tc>
-          <w:tcPr>
-            <w:tcW w:type="dxa" w:w="515"/>
+            <w:tcW w:type="dxa" w:w="942"/>
+          </w:tcPr>
+          <w:p>
+            <w:pPr>
+              <w:spacing w:after="0"/>
+            </w:pPr>
+            <w:r/>
+            <w:r>
+              <w:rPr>
+                <w:rFonts w:ascii="Times New Roman" w:hAnsi="Times New Roman"/>
+                <w:b w:val="0"/>
+                <w:i w:val="0"/>
+                <w:sz w:val="16"/>
+              </w:rPr>
+              <w:t>ML-DSA-44</w:t>
+            </w:r>
+          </w:p>
+        </w:tc>
+        <w:tc>
+          <w:tcPr>
+            <w:tcW w:type="dxa" w:w="471"/>
           </w:tcPr>
           <w:p>
             <w:pPr>
@@ -10237,7 +11930,7 @@
         </w:tc>
         <w:tc>
           <w:tcPr>
-            <w:tcW w:type="dxa" w:w="601"/>
+            <w:tcW w:type="dxa" w:w="565"/>
           </w:tcPr>
           <w:p>
             <w:pPr>
@@ -10257,61 +11950,61 @@
         </w:tc>
         <w:tc>
           <w:tcPr>
-            <w:tcW w:type="dxa" w:w="1203"/>
-          </w:tcPr>
-          <w:p>
-            <w:pPr>
-              <w:spacing w:after="0"/>
-            </w:pPr>
-            <w:r/>
-            <w:r>
-              <w:rPr>
-                <w:rFonts w:ascii="Times New Roman" w:hAnsi="Times New Roman"/>
-                <w:b w:val="0"/>
-                <w:i w:val="0"/>
-                <w:sz w:val="16"/>
-              </w:rPr>
-              <w:t>1.45e5 (20 tr.)</w:t>
-            </w:r>
-          </w:p>
-        </w:tc>
-        <w:tc>
-          <w:tcPr>
-            <w:tcW w:type="dxa" w:w="429"/>
-          </w:tcPr>
-          <w:p>
-            <w:pPr>
-              <w:spacing w:after="0"/>
-            </w:pPr>
-            <w:r/>
-            <w:r>
-              <w:rPr>
-                <w:rFonts w:ascii="Times New Roman" w:hAnsi="Times New Roman"/>
-                <w:b w:val="0"/>
-                <w:i w:val="0"/>
-                <w:sz w:val="16"/>
-              </w:rPr>
-              <w:t>17.1</w:t>
-            </w:r>
-          </w:p>
-        </w:tc>
-        <w:tc>
-          <w:tcPr>
-            <w:tcW w:type="dxa" w:w="859"/>
-          </w:tcPr>
-          <w:p>
-            <w:pPr>
-              <w:spacing w:after="0"/>
-            </w:pPr>
-            <w:r/>
-            <w:r>
-              <w:rPr>
-                <w:rFonts w:ascii="Times New Roman" w:hAnsi="Times New Roman"/>
-                <w:b w:val="0"/>
-                <w:i w:val="0"/>
-                <w:sz w:val="16"/>
-              </w:rPr>
-              <w:t>4.1 / 1.9</w:t>
+            <w:tcW w:type="dxa" w:w="847"/>
+          </w:tcPr>
+          <w:p>
+            <w:pPr>
+              <w:spacing w:after="0"/>
+            </w:pPr>
+            <w:r/>
+            <w:r>
+              <w:rPr>
+                <w:rFonts w:ascii="Times New Roman" w:hAnsi="Times New Roman"/>
+                <w:b w:val="0"/>
+                <w:i w:val="0"/>
+                <w:sz w:val="16"/>
+              </w:rPr>
+              <w:t>2^16.01</w:t>
+            </w:r>
+          </w:p>
+        </w:tc>
+        <w:tc>
+          <w:tcPr>
+            <w:tcW w:type="dxa" w:w="1130"/>
+          </w:tcPr>
+          <w:p>
+            <w:pPr>
+              <w:spacing w:after="0"/>
+            </w:pPr>
+            <w:r/>
+            <w:r>
+              <w:rPr>
+                <w:rFonts w:ascii="Times New Roman" w:hAnsi="Times New Roman"/>
+                <w:b w:val="0"/>
+                <w:i w:val="0"/>
+                <w:sz w:val="16"/>
+              </w:rPr>
+              <w:t>2^16.09 (run)</w:t>
+            </w:r>
+          </w:p>
+        </w:tc>
+        <w:tc>
+          <w:tcPr>
+            <w:tcW w:type="dxa" w:w="942"/>
+          </w:tcPr>
+          <w:p>
+            <w:pPr>
+              <w:spacing w:after="0"/>
+            </w:pPr>
+            <w:r/>
+            <w:r>
+              <w:rPr>
+                <w:rFonts w:ascii="Times New Roman" w:hAnsi="Times New Roman"/>
+                <w:b w:val="0"/>
+                <w:i w:val="0"/>
+                <w:sz w:val="16"/>
+              </w:rPr>
+              <w:t>3.1 / 0.9</w:t>
             </w:r>
           </w:p>
         </w:tc>
@@ -10319,121 +12012,121 @@
       <w:tr>
         <w:tc>
           <w:tcPr>
-            <w:tcW w:type="dxa" w:w="1288"/>
-          </w:tcPr>
-          <w:p>
-            <w:pPr>
-              <w:spacing w:after="0"/>
-            </w:pPr>
-            <w:r/>
-            <w:r>
-              <w:rPr>
-                <w:rFonts w:ascii="Times New Roman" w:hAnsi="Times New Roman"/>
-                <w:b w:val="0"/>
-                <w:i w:val="0"/>
-                <w:sz w:val="16"/>
-              </w:rPr>
-              <w:t>-44 edge+ILP</w:t>
-            </w:r>
-          </w:p>
-        </w:tc>
-        <w:tc>
-          <w:tcPr>
-            <w:tcW w:type="dxa" w:w="515"/>
-          </w:tcPr>
-          <w:p>
-            <w:pPr>
-              <w:spacing w:after="0"/>
-            </w:pPr>
-            <w:r/>
-            <w:r>
-              <w:rPr>
-                <w:rFonts w:ascii="Times New Roman" w:hAnsi="Times New Roman"/>
-                <w:b w:val="0"/>
-                <w:i w:val="0"/>
-                <w:sz w:val="16"/>
-              </w:rPr>
-              <w:t>2^13</w:t>
-            </w:r>
-          </w:p>
-        </w:tc>
-        <w:tc>
-          <w:tcPr>
-            <w:tcW w:type="dxa" w:w="601"/>
-          </w:tcPr>
-          <w:p>
-            <w:pPr>
-              <w:spacing w:after="0"/>
-            </w:pPr>
-            <w:r/>
-            <w:r>
-              <w:rPr>
-                <w:rFonts w:ascii="Times New Roman" w:hAnsi="Times New Roman"/>
-                <w:b w:val="0"/>
-                <w:i w:val="0"/>
-                <w:sz w:val="16"/>
-              </w:rPr>
-              <w:t>2^15.2</w:t>
-            </w:r>
-          </w:p>
-        </w:tc>
-        <w:tc>
-          <w:tcPr>
-            <w:tcW w:type="dxa" w:w="1203"/>
-          </w:tcPr>
-          <w:p>
-            <w:pPr>
-              <w:spacing w:after="0"/>
-            </w:pPr>
-            <w:r/>
-            <w:r>
-              <w:rPr>
-                <w:rFonts w:ascii="Times New Roman" w:hAnsi="Times New Roman"/>
-                <w:b w:val="0"/>
-                <w:i w:val="0"/>
-                <w:sz w:val="16"/>
-              </w:rPr>
-              <w:t>7e4 (8/8)</w:t>
-            </w:r>
-          </w:p>
-        </w:tc>
-        <w:tc>
-          <w:tcPr>
-            <w:tcW w:type="dxa" w:w="429"/>
-          </w:tcPr>
-          <w:p>
-            <w:pPr>
-              <w:spacing w:after="0"/>
-            </w:pPr>
-            <w:r/>
-            <w:r>
-              <w:rPr>
-                <w:rFonts w:ascii="Times New Roman" w:hAnsi="Times New Roman"/>
-                <w:b w:val="0"/>
-                <w:i w:val="0"/>
-                <w:sz w:val="16"/>
-              </w:rPr>
-              <w:t>16.1</w:t>
-            </w:r>
-          </w:p>
-        </w:tc>
-        <w:tc>
-          <w:tcPr>
-            <w:tcW w:type="dxa" w:w="859"/>
-          </w:tcPr>
-          <w:p>
-            <w:pPr>
-              <w:spacing w:after="0"/>
-            </w:pPr>
-            <w:r/>
-            <w:r>
-              <w:rPr>
-                <w:rFonts w:ascii="Times New Roman" w:hAnsi="Times New Roman"/>
-                <w:b w:val="0"/>
-                <w:i w:val="0"/>
-                <w:sz w:val="16"/>
-              </w:rPr>
-              <w:t>3.1 / 0.9</w:t>
+            <w:tcW w:type="dxa" w:w="942"/>
+          </w:tcPr>
+          <w:p>
+            <w:pPr>
+              <w:spacing w:after="0"/>
+            </w:pPr>
+            <w:r/>
+            <w:r>
+              <w:rPr>
+                <w:rFonts w:ascii="Times New Roman" w:hAnsi="Times New Roman"/>
+                <w:b w:val="0"/>
+                <w:i w:val="0"/>
+                <w:sz w:val="16"/>
+              </w:rPr>
+              <w:t>ML-DSA-65</w:t>
+            </w:r>
+          </w:p>
+        </w:tc>
+        <w:tc>
+          <w:tcPr>
+            <w:tcW w:type="dxa" w:w="471"/>
+          </w:tcPr>
+          <w:p>
+            <w:pPr>
+              <w:spacing w:after="0"/>
+            </w:pPr>
+            <w:r/>
+            <w:r>
+              <w:rPr>
+                <w:rFonts w:ascii="Times New Roman" w:hAnsi="Times New Roman"/>
+                <w:b w:val="0"/>
+                <w:i w:val="0"/>
+                <w:sz w:val="16"/>
+              </w:rPr>
+              <w:t>2^14</w:t>
+            </w:r>
+          </w:p>
+        </w:tc>
+        <w:tc>
+          <w:tcPr>
+            <w:tcW w:type="dxa" w:w="565"/>
+          </w:tcPr>
+          <w:p>
+            <w:pPr>
+              <w:spacing w:after="0"/>
+            </w:pPr>
+            <w:r/>
+            <w:r>
+              <w:rPr>
+                <w:rFonts w:ascii="Times New Roman" w:hAnsi="Times New Roman"/>
+                <w:b w:val="0"/>
+                <w:i w:val="0"/>
+                <w:sz w:val="16"/>
+              </w:rPr>
+              <w:t>2^16.4</w:t>
+            </w:r>
+          </w:p>
+        </w:tc>
+        <w:tc>
+          <w:tcPr>
+            <w:tcW w:type="dxa" w:w="847"/>
+          </w:tcPr>
+          <w:p>
+            <w:pPr>
+              <w:spacing w:after="0"/>
+            </w:pPr>
+            <w:r/>
+            <w:r>
+              <w:rPr>
+                <w:rFonts w:ascii="Times New Roman" w:hAnsi="Times New Roman"/>
+                <w:b w:val="0"/>
+                <w:i w:val="0"/>
+                <w:sz w:val="16"/>
+              </w:rPr>
+              <w:t>2^17.40</w:t>
+            </w:r>
+          </w:p>
+        </w:tc>
+        <w:tc>
+          <w:tcPr>
+            <w:tcW w:type="dxa" w:w="1130"/>
+          </w:tcPr>
+          <w:p>
+            <w:pPr>
+              <w:spacing w:after="0"/>
+            </w:pPr>
+            <w:r/>
+            <w:r>
+              <w:rPr>
+                <w:rFonts w:ascii="Times New Roman" w:hAnsi="Times New Roman"/>
+                <w:b w:val="0"/>
+                <w:i w:val="0"/>
+                <w:sz w:val="16"/>
+              </w:rPr>
+              <w:t>2^17.51 (extr.)</w:t>
+            </w:r>
+          </w:p>
+        </w:tc>
+        <w:tc>
+          <w:tcPr>
+            <w:tcW w:type="dxa" w:w="942"/>
+          </w:tcPr>
+          <w:p>
+            <w:pPr>
+              <w:spacing w:after="0"/>
+            </w:pPr>
+            <w:r/>
+            <w:r>
+              <w:rPr>
+                <w:rFonts w:ascii="Times New Roman" w:hAnsi="Times New Roman"/>
+                <w:b w:val="0"/>
+                <w:i w:val="0"/>
+                <w:sz w:val="16"/>
+              </w:rPr>
+              <w:t>3.5 / 1.1</w:t>
             </w:r>
           </w:p>
         </w:tc>
@@ -10441,27 +12134,27 @@
       <w:tr>
         <w:tc>
           <w:tcPr>
-            <w:tcW w:type="dxa" w:w="1288"/>
-          </w:tcPr>
-          <w:p>
-            <w:pPr>
-              <w:spacing w:after="0"/>
-            </w:pPr>
-            <w:r/>
-            <w:r>
-              <w:rPr>
-                <w:rFonts w:ascii="Times New Roman" w:hAnsi="Times New Roman"/>
-                <w:b w:val="0"/>
-                <w:i w:val="0"/>
-                <w:sz w:val="16"/>
-              </w:rPr>
-              <w:t>-65 edge</w:t>
-            </w:r>
-          </w:p>
-        </w:tc>
-        <w:tc>
-          <w:tcPr>
-            <w:tcW w:type="dxa" w:w="515"/>
+            <w:tcW w:type="dxa" w:w="942"/>
+          </w:tcPr>
+          <w:p>
+            <w:pPr>
+              <w:spacing w:after="0"/>
+            </w:pPr>
+            <w:r/>
+            <w:r>
+              <w:rPr>
+                <w:rFonts w:ascii="Times New Roman" w:hAnsi="Times New Roman"/>
+                <w:b w:val="0"/>
+                <w:i w:val="0"/>
+                <w:sz w:val="16"/>
+              </w:rPr>
+              <w:t>ML-DSA-87</w:t>
+            </w:r>
+          </w:p>
+        </w:tc>
+        <w:tc>
+          <w:tcPr>
+            <w:tcW w:type="dxa" w:w="471"/>
           </w:tcPr>
           <w:p>
             <w:pPr>
@@ -10481,129 +12174,7 @@
         </w:tc>
         <w:tc>
           <w:tcPr>
-            <w:tcW w:type="dxa" w:w="601"/>
-          </w:tcPr>
-          <w:p>
-            <w:pPr>
-              <w:spacing w:after="0"/>
-            </w:pPr>
-            <w:r/>
-            <w:r>
-              <w:rPr>
-                <w:rFonts w:ascii="Times New Roman" w:hAnsi="Times New Roman"/>
-                <w:b w:val="0"/>
-                <w:i w:val="0"/>
-                <w:sz w:val="16"/>
-              </w:rPr>
-              <w:t>2^16.4</w:t>
-            </w:r>
-          </w:p>
-        </w:tc>
-        <w:tc>
-          <w:tcPr>
-            <w:tcW w:type="dxa" w:w="1203"/>
-          </w:tcPr>
-          <w:p>
-            <w:pPr>
-              <w:spacing w:after="0"/>
-            </w:pPr>
-            <w:r/>
-            <w:r>
-              <w:rPr>
-                <w:rFonts w:ascii="Times New Roman" w:hAnsi="Times New Roman"/>
-                <w:b w:val="0"/>
-                <w:i w:val="0"/>
-                <w:sz w:val="16"/>
-              </w:rPr>
-              <w:t>3.58e5 (20 tr.)</w:t>
-            </w:r>
-          </w:p>
-        </w:tc>
-        <w:tc>
-          <w:tcPr>
-            <w:tcW w:type="dxa" w:w="429"/>
-          </w:tcPr>
-          <w:p>
-            <w:pPr>
-              <w:spacing w:after="0"/>
-            </w:pPr>
-            <w:r/>
-            <w:r>
-              <w:rPr>
-                <w:rFonts w:ascii="Times New Roman" w:hAnsi="Times New Roman"/>
-                <w:b w:val="0"/>
-                <w:i w:val="0"/>
-                <w:sz w:val="16"/>
-              </w:rPr>
-              <w:t>18.4</w:t>
-            </w:r>
-          </w:p>
-        </w:tc>
-        <w:tc>
-          <w:tcPr>
-            <w:tcW w:type="dxa" w:w="859"/>
-          </w:tcPr>
-          <w:p>
-            <w:pPr>
-              <w:spacing w:after="0"/>
-            </w:pPr>
-            <w:r/>
-            <w:r>
-              <w:rPr>
-                <w:rFonts w:ascii="Times New Roman" w:hAnsi="Times New Roman"/>
-                <w:b w:val="0"/>
-                <w:i w:val="0"/>
-                <w:sz w:val="16"/>
-              </w:rPr>
-              <w:t>4.4 / 2.0</w:t>
-            </w:r>
-          </w:p>
-        </w:tc>
-      </w:tr>
-      <w:tr>
-        <w:tc>
-          <w:tcPr>
-            <w:tcW w:type="dxa" w:w="1288"/>
-          </w:tcPr>
-          <w:p>
-            <w:pPr>
-              <w:spacing w:after="0"/>
-            </w:pPr>
-            <w:r/>
-            <w:r>
-              <w:rPr>
-                <w:rFonts w:ascii="Times New Roman" w:hAnsi="Times New Roman"/>
-                <w:b w:val="0"/>
-                <w:i w:val="0"/>
-                <w:sz w:val="16"/>
-              </w:rPr>
-              <w:t>-87 edge</w:t>
-            </w:r>
-          </w:p>
-        </w:tc>
-        <w:tc>
-          <w:tcPr>
-            <w:tcW w:type="dxa" w:w="515"/>
-          </w:tcPr>
-          <w:p>
-            <w:pPr>
-              <w:spacing w:after="0"/>
-            </w:pPr>
-            <w:r/>
-            <w:r>
-              <w:rPr>
-                <w:rFonts w:ascii="Times New Roman" w:hAnsi="Times New Roman"/>
-                <w:b w:val="0"/>
-                <w:i w:val="0"/>
-                <w:sz w:val="16"/>
-              </w:rPr>
-              <w:t>2^14</w:t>
-            </w:r>
-          </w:p>
-        </w:tc>
-        <w:tc>
-          <w:tcPr>
-            <w:tcW w:type="dxa" w:w="601"/>
+            <w:tcW w:type="dxa" w:w="565"/>
           </w:tcPr>
           <w:p>
             <w:pPr>
@@ -10623,61 +12194,61 @@
         </w:tc>
         <w:tc>
           <w:tcPr>
-            <w:tcW w:type="dxa" w:w="1203"/>
-          </w:tcPr>
-          <w:p>
-            <w:pPr>
-              <w:spacing w:after="0"/>
-            </w:pPr>
-            <w:r/>
-            <w:r>
-              <w:rPr>
-                <w:rFonts w:ascii="Times New Roman" w:hAnsi="Times New Roman"/>
-                <w:b w:val="0"/>
-                <w:i w:val="0"/>
-                <w:sz w:val="16"/>
-              </w:rPr>
-              <w:t>3.69e5 (20 tr.)</w:t>
-            </w:r>
-          </w:p>
-        </w:tc>
-        <w:tc>
-          <w:tcPr>
-            <w:tcW w:type="dxa" w:w="429"/>
-          </w:tcPr>
-          <w:p>
-            <w:pPr>
-              <w:spacing w:after="0"/>
-            </w:pPr>
-            <w:r/>
-            <w:r>
-              <w:rPr>
-                <w:rFonts w:ascii="Times New Roman" w:hAnsi="Times New Roman"/>
-                <w:b w:val="0"/>
-                <w:i w:val="0"/>
-                <w:sz w:val="16"/>
-              </w:rPr>
-              <w:t>18.5</w:t>
-            </w:r>
-          </w:p>
-        </w:tc>
-        <w:tc>
-          <w:tcPr>
-            <w:tcW w:type="dxa" w:w="859"/>
-          </w:tcPr>
-          <w:p>
-            <w:pPr>
-              <w:spacing w:after="0"/>
-            </w:pPr>
-            <w:r/>
-            <w:r>
-              <w:rPr>
-                <w:rFonts w:ascii="Times New Roman" w:hAnsi="Times New Roman"/>
-                <w:b w:val="0"/>
-                <w:i w:val="0"/>
-                <w:sz w:val="16"/>
-              </w:rPr>
-              <w:t>4.5 / 2.3</w:t>
+            <w:tcW w:type="dxa" w:w="847"/>
+          </w:tcPr>
+          <w:p>
+            <w:pPr>
+              <w:spacing w:after="0"/>
+            </w:pPr>
+            <w:r/>
+            <w:r>
+              <w:rPr>
+                <w:rFonts w:ascii="Times New Roman" w:hAnsi="Times New Roman"/>
+                <w:b w:val="0"/>
+                <w:i w:val="0"/>
+                <w:sz w:val="16"/>
+              </w:rPr>
+              <w:t>2^17.30</w:t>
+            </w:r>
+          </w:p>
+        </w:tc>
+        <w:tc>
+          <w:tcPr>
+            <w:tcW w:type="dxa" w:w="1130"/>
+          </w:tcPr>
+          <w:p>
+            <w:pPr>
+              <w:spacing w:after="0"/>
+            </w:pPr>
+            <w:r/>
+            <w:r>
+              <w:rPr>
+                <w:rFonts w:ascii="Times New Roman" w:hAnsi="Times New Roman"/>
+                <w:b w:val="0"/>
+                <w:i w:val="0"/>
+                <w:sz w:val="16"/>
+              </w:rPr>
+              <w:t>2^17.51 (extr.)</w:t>
+            </w:r>
+          </w:p>
+        </w:tc>
+        <w:tc>
+          <w:tcPr>
+            <w:tcW w:type="dxa" w:w="942"/>
+          </w:tcPr>
+          <w:p>
+            <w:pPr>
+              <w:spacing w:after="0"/>
+            </w:pPr>
+            <w:r/>
+            <w:r>
+              <w:rPr>
+                <w:rFonts w:ascii="Times New Roman" w:hAnsi="Times New Roman"/>
+                <w:b w:val="0"/>
+                <w:i w:val="0"/>
+                <w:sz w:val="16"/>
+              </w:rPr>
+              <w:t>3.5 / 1.3</w:t>
             </w:r>
           </w:p>
         </w:tc>
@@ -10690,6 +12261,48 @@
     </w:p>
     <w:p>
       <w:pPr>
+        <w:keepNext/>
+        <w:spacing w:after="20"/>
+        <w:jc w:val="center"/>
+      </w:pPr>
+      <w:r>
+        <w:drawing>
+          <wp:inline xmlns:a="http://schemas.openxmlformats.org/drawingml/2006/main" xmlns:pic="http://schemas.openxmlformats.org/drawingml/2006/picture">
+            <wp:extent cx="2926080" cy="2173659"/>
+            <wp:docPr id="3" name="Picture 3"/>
+            <wp:cNvGraphicFramePr>
+              <a:graphicFrameLocks noChangeAspect="1"/>
+            </wp:cNvGraphicFramePr>
+            <a:graphic>
+              <a:graphicData uri="http://schemas.openxmlformats.org/drawingml/2006/picture">
+                <pic:pic>
+                  <pic:nvPicPr>
+                    <pic:cNvPr id="0" name="talus_success_vs_N.png"/>
+                    <pic:cNvPicPr/>
+                  </pic:nvPicPr>
+                  <pic:blipFill>
+                    <a:blip r:embed="rId11"/>
+                    <a:stretch>
+                      <a:fillRect/>
+                    </a:stretch>
+                  </pic:blipFill>
+                  <pic:spPr>
+                    <a:xfrm>
+                      <a:off x="0" y="0"/>
+                      <a:ext cx="2926080" cy="2173659"/>
+                    </a:xfrm>
+                    <a:prstGeom prst="rect"/>
+                  </pic:spPr>
+                </pic:pic>
+              </a:graphicData>
+            </a:graphic>
+          </wp:inline>
+        </w:drawing>
+      </w:r>
+    </w:p>
+    <w:p>
+      <w:pPr>
+        <w:spacing w:after="100"/>
         <w:jc w:val="both"/>
       </w:pPr>
       <w:r>
@@ -10697,9 +12310,82 @@
           <w:rFonts w:ascii="Times New Roman" w:hAnsi="Times New Roman"/>
           <w:b w:val="0"/>
           <w:i w:val="0"/>
+          <w:sz w:val="16"/>
+        </w:rPr>
+        <w:t xml:space="preserve">Fig. 3. </w:t>
+      </w:r>
+      <w:r>
+        <w:rPr>
+          <w:rFonts w:ascii="Times New Roman" w:hAnsi="Times New Roman"/>
+          <w:b w:val="0"/>
+          <w:i w:val="0"/>
+          <w:sz w:val="16"/>
+        </w:rPr>
+        <w:t>Key-recovery success against signatures N on the TALUS s2 channel, ML-DSA-44, n = 256, 20 trials per point. Grey: least squares (seed 2026), 0/20 everywhere; blue: edge estimator with rounding (seed 2026); orange: edge with ILP finishing (seed 2041); green: whole secret, all k = 4 elements, edge with ILP (seed 2081). Dashed: the authors' cap and uniqueness wall.</w:t>
+      </w:r>
+    </w:p>
+    <w:p>
+      <w:pPr>
+        <w:jc w:val="both"/>
+      </w:pPr>
+      <w:r>
+        <w:rPr>
+          <w:rFonts w:ascii="Times New Roman" w:hAnsi="Times New Roman"/>
+          <w:b/>
+          <w:i w:val="0"/>
           <w:sz w:val="20"/>
         </w:rPr>
-        <w:t xml:space="preserve">For ML-DSA-44 the full secret (all k = 4 elements) was recovered in 20/20 trials at 1.46×10^5. With the ILP finishing step (seed 2032, 8 trials per point) success was 1/8 at 5×10^4, 5/8 at 6×10^4, 8/8 at 7×10^4 and 32/32 from 8×10^4 to 1.45×10^5, where plain rounding gave 0/8 at 8×10^4. For -65 and -87 (seed 2026 for the dense runs) the full secret was checked with 300 trials (seed 2028): 299/300 elements at 2^18.47 and 300/300 at 2^18.53, so by a union bound the full-secret success is at least about 91% and 92% (95% confidence). With ILP (4 trials per point, seed 2032) -65 needs about 2^17.45 (4/4; 3.45 bits above the cap, 1.05 above the wall) and -87 at most 2^17.18 (4/4 at the lowest N tried; 3.18 and 0.98). </w:t>
+        <w:t>Superiority over the baseline (Fig. 3).</w:t>
+      </w:r>
+      <w:r>
+        <w:rPr>
+          <w:rFonts w:ascii="Times New Roman" w:hAnsi="Times New Roman"/>
+          <w:b w:val="0"/>
+          <w:i w:val="0"/>
+          <w:sz w:val="20"/>
+        </w:rPr>
+        <w:t xml:space="preserve"> On the same transcripts least squares, the estimator behind Niot's attack (1), recovers nothing up to 2^17.8 signatures and needs about 2^31.7 in our model. The edge estimator reaches 100% at 2^17.2, and ILP finishing moves the curve about a further 1.1 bits left, to 95% at 2^16.0 for one element. That is a gain of about 2^15.7 (roughly 5×10^4 times fewer signatures) over the baseline, from using the known hard edges of the noise instead of averaging them away. The whole-secret curve sits only about 0.1 bit to the right of the one-element curve.</w:t>
+      </w:r>
+    </w:p>
+    <w:p>
+      <w:pPr>
+        <w:jc w:val="both"/>
+      </w:pPr>
+      <w:r>
+        <w:rPr>
+          <w:rFonts w:ascii="Times New Roman" w:hAnsi="Times New Roman"/>
+          <w:b/>
+          <w:i w:val="0"/>
+          <w:sz w:val="20"/>
+        </w:rPr>
+        <w:t>Statistics.</w:t>
+      </w:r>
+      <w:r>
+        <w:rPr>
+          <w:rFonts w:ascii="Times New Roman" w:hAnsi="Times New Roman"/>
+          <w:b w:val="0"/>
+          <w:i w:val="0"/>
+          <w:sz w:val="20"/>
+        </w:rPr>
+        <w:t xml:space="preserve"> Each point uses 20 independent trials (seed 2041, 120 s ILP limit) with a logistic fit to the success counts. One ring element: ML-DSA-44 0/20 at 2^15.61, 11/20 at 2^15.87, 19/20 at 2^15.99, 20/20 from 2^16.10; -65 16/20 at 2^17.29, 20/20 at 2^17.71; -87 18/20 at 2^17.18, 20/20 at 2^17.49. </w:t>
+      </w:r>
+      <w:r>
+        <w:rPr>
+          <w:rFonts w:ascii="Times New Roman" w:hAnsi="Times New Roman"/>
+          <w:b/>
+          <w:i w:val="0"/>
+          <w:sz w:val="20"/>
+        </w:rPr>
+        <w:t>Whole secret.</w:t>
+      </w:r>
+      <w:r>
+        <w:rPr>
+          <w:rFonts w:ascii="Times New Roman" w:hAnsi="Times New Roman"/>
+          <w:b w:val="0"/>
+          <w:i w:val="0"/>
+          <w:sz w:val="20"/>
+        </w:rPr>
+        <w:t xml:space="preserve"> An attacker needs all k elements from the same signatures; assuming independence, 95% whole-secret success needs p_elem^k = 0.95, where p_elem is the success rate for one element. For ML-DSA-44 we ran it (seed 2081, 20 whole secrets per N): 3/20 at 2^15.92, 15/20 at 2^16.01, 18/20 at 2^16.10, inside the intervals of the predicted 0.26/0.77/0.90, so the -65/-87 extrapolations are trustworthy. Without ILP (plain rounding) the points sit about 1 bit higher (ML-DSA-44 N*99 = 1.45×10^5). </w:t>
       </w:r>
       <w:r>
         <w:rPr>
@@ -10717,7 +12403,7 @@
           <w:i w:val="0"/>
           <w:sz w:val="20"/>
         </w:rPr>
-        <w:t xml:space="preserve"> On real ML-DSA-44 signing without the r0 check the estimator recovered the key in 9/9 runs (3 keys × N = 2, 4, 8×10^5); on genuine ML-DSA it returned the key for 0/18 keys (15 of them from seed 2027), only the public-equivalent −t0, so the false-positive rate is below about 15% at 95% confidence. </w:t>
+        <w:t xml:space="preserve"> On real ML-DSA-44 signing without the r0 check (the second rejection check of Section I, on r0 = LowBits(w − c·s2)) the estimator recovered the key in 9/9 runs (3 keys × N = 2, 4, 8×10^5); on genuine ML-DSA it returned the key for 0/18 keys (15 of them from seed 2027), only the public-equivalent −t0, so the false-positive rate is below about 15% at 95% confidence. </w:t>
       </w:r>
       <w:r>
         <w:rPr>
@@ -10735,7 +12421,30 @@
           <w:i w:val="0"/>
           <w:sz w:val="20"/>
         </w:rPr>
-        <w:t xml:space="preserve"> no break; the margin above the cap is 3–4.5 bits and above the authors' wall only about 1–2 bits, thinner than the 12–15 bits suggested by (1).</w:t>
+        <w:t xml:space="preserve"> no break; the margin above the cap is about 3–3.5 bits and above the authors' wall only about 1 bit, much thinner than the 12–15 bits suggested by (1).</w:t>
+      </w:r>
+    </w:p>
+    <w:p>
+      <w:pPr>
+        <w:jc w:val="both"/>
+      </w:pPr>
+      <w:r>
+        <w:rPr>
+          <w:rFonts w:ascii="Times New Roman" w:hAnsi="Times New Roman"/>
+          <w:b/>
+          <w:i w:val="0"/>
+          <w:sz w:val="20"/>
+        </w:rPr>
+        <w:t>Other attack routes on the cap, all closed.</w:t>
+      </w:r>
+      <w:r>
+        <w:rPr>
+          <w:rFonts w:ascii="Times New Roman" w:hAnsi="Times New Roman"/>
+          <w:b w:val="0"/>
+          <w:i w:val="0"/>
+          <w:sz w:val="20"/>
+        </w:rPr>
+        <w:t xml:space="preserve"> (a) Key rotation is a fresh key generation (v0.22 Sec. 2.3), not a share refresh, so leakage does not carry over. (b) Rejected attempts stay offline; the rare online failures add at most about 0.03 bits. (c) A corrupt insider subtracts its own nonce shares, but at least T honest shares remain in the MPC profile; the insider wall is 2^24.8–2^29.7, 12–16 bits above the cap, and a simulation with two honest shares (n = 8) shows maximum likelihood needs 1.5–2× the formula, so the formula favours the attacker. (Only the non-proposed TEE variant falls below the cap, from T = 7, as the authors concede.) (d) A corrupt coordinator sees an out-of-box value once per 2^33.1/2^35.5/2^37.3 sessions by our exact convolution, within one bit of the authors' figures. (e) Below the wall the estimate is only a soft hint (43% of coefficients right at the cap); used in a lattice attack it lowers the ML-DSA-44 key-recovery cost from 2^123.8 to 2^120.6, so no lattice finish under the cap.</w:t>
       </w:r>
     </w:p>
     <w:p>
@@ -10758,7 +12467,7 @@
           <w:i w:val="0"/>
           <w:sz w:val="20"/>
         </w:rPr>
-        <w:t xml:space="preserve"> We first ran the edge estimator on reduced rings (n = 8 to 128, 10–20 trials per point, ML-DSA-44 numbers). Per-element N* flattened around 1–2×10^5 (n = 64: 2.8×10^5; n = 128: 1.9×10^5) instead of falling toward the cap, which is why the full-size runs above were then made denser. At n = 64 the harder target s2 − t0 needed the same N* as s2, and plain LowBits noise behaved like BCC noise. Relative to plain least squares (about 3.6×10^9 in our model) the edge estimator is worth about four orders of magnitude, yet it stops 3–4.5 bits short of the cap. The theory module explains the shape: for one coefficient alone the uniform-noise error falls like 1/N exactly (checked by Monte Carlo), and when all 256 coefficients are solved jointly a fitted coupling constant (about 0.76·τ^0.42) accounts for the real N* sitting 1.5–2 bits above the single-coefficient formula. ILP finishing lowers the 50% point by 1.0×, 1.1×, 1.1× and 1.5× at n = 8, 16, 32 and 64, consistent with the roughly 2× at n = 256.</w:t>
+        <w:t xml:space="preserve"> We first ran the edge estimator on reduced rings (n = 8 to 128, 10–20 trials per point, ML-DSA-44 numbers). Per-element N* flattened around 1–2×10^5 (n = 64: 2.8×10^5; n = 128: 1.9×10^5) instead of falling toward the cap, which is why the full-size runs above were then made denser. At n = 64 the harder target s2 − t0 needed the same N* as s2, and plain LowBits noise behaved like BCC noise. Relative to plain least squares (about 3.6×10^9 in our model) the edge estimator is worth about four orders of magnitude, yet without ILP it stays 4–4.5 bits above the cap. The least-squares figure is about 12 times estimate (1) (3.1×10^8) for a simple reason: (1) only asks that the typical per-coefficient error fall to 1/2, whereas rounding all 256 coefficients correctly at once needs the error about 3.5 standard deviations inside 1/2, and since error shrinks like 1/√N this costs a factor of about 3.5² ≈ 12 in N. The theory module explains the shape: for one coefficient alone the uniform-noise error falls like 1/N exactly (checked by Monte Carlo), and when all 256 coefficients are solved jointly a fitted coupling constant (about 0.76·τ^0.42) accounts for the real N* sitting 1.5–2 bits above the single-coefficient formula. ILP finishing lowers the 50% point by 1.0×, 1.1×, 1.1× and 1.5× at n = 8, 16, 32 and 64, consistent with the roughly 2× at n = 256.</w:t>
       </w:r>
     </w:p>
     <w:p>
@@ -10781,7 +12490,7 @@
           <w:i w:val="0"/>
           <w:sz w:val="20"/>
         </w:rPr>
-        <w:t xml:space="preserve"> (i) The channel model (independent uniform noise on the BCC interval, no wrap-around, no use of the hint) is our reading of TALUS, not quoted from the specification. (ii) The ILP figure is per ring element with 8 trials per point. (iii) Lattice reduction and better use of hints were not tried, so N* is an upper bound on what an attacker needs. (iv) Our wall and cap figures are the authors'; we did not re-derive the wall.</w:t>
+        <w:t xml:space="preserve"> (i) The channel model (independent uniform noise on the BCC interval, no wrap-around, no use of the hint) is our reading of TALUS, not quoted from the specification. (ii) The whole-secret run is ML-DSA-44 only; -65/-87 are extrapolated. (iii) The hint h was not used separately and the lattice estimate is a Python core-SVP model (core-SVP counts only the cost of the single shortest-vector search inside lattice reduction, the usual conservative way to price lattice attacks), so N* is an upper bound on what an attacker needs. (iv) Our wall and cap figures are the authors'; we did not re-derive the wall.</w:t>
       </w:r>
     </w:p>
     <w:p>
@@ -10842,7 +12551,25 @@
           <w:i w:val="0"/>
           <w:sz w:val="20"/>
         </w:rPr>
-        <w:t xml:space="preserve"> Theorem 3.2 of [4] bounds the number of safe queries through a hyperball-intersection lemma taken from the ePrint full version of Devevey et al. [25] (App. A.6). That bound uses exponent n−1 where a correct cylinder argument gives (n−1)/2; for ML-DSA-44 it gives 2^-50.1 where the exact value is 2^-33.5 (reproduced with the authors' own Sage parameter script). With the published parameters the theorem then covers Q_s = 2^26–2^37 rather than 2^50. Under the typical norm distribution (heuristic, not a proof) most sets still reach 2^50, some fall up to about 3 bits short; corrected parameters need 1.3× to 8.5× more parallel repetitions K. The faulty bound is ePrint-only (the ASIACRYPT version states only the exact formula), and among 13 citing works we checked only Mithril uses it; HAETAE, the other main hyperball scheme, evaluates the exact incomplete-Beta value numerically and is unaffected. Seen from the other side, reaching 2^50 with the published radii would require the norm bound B in the proof to sit only 0–7 standard deviations above the mean norm of c·s, whereas the proof needs an overwhelming bound (the paper's footnote says about 13). This is a proof gap, not an attack: exceeding the bound slightly enlarges a Rényi-divergence budget and does not obviously reveal s. </w:t>
+        <w:t xml:space="preserve"> Theorem 3.2 of [4] bounds the number of safe queries through a hyperball-intersection lemma taken from the ePrint full version of Devevey et al. [25] (App. A.6). That bound uses exponent n−1 where a correct cylinder argument gives (n−1)/2; for ML-DSA-44 it gives 2^-50.1 where the exact value is 2^-33.5 (reproduced with the authors' own Sage parameter script). With the published parameters the theorem then covers Q_s = 2^26–2^37 rather than 2^50. Under the typical norm distribution (heuristic, not a proof) most sets still reach 2^50, some fall up to about 3 bits short; corrected parameters need 1.3× to 8.5× more parallel repetitions K. The faulty bound is ePrint-only (the ASIACRYPT version states only the exact formula), and among 13 citing works we checked only Mithril uses it; HAETAE [34], the other main hyperball scheme, evaluates the exact incomplete-Beta value numerically and is unaffected. Seen from the other side, reaching 2^50 with the published radii would require the norm bound B in the proof to sit only 0–7 standard deviations above the mean norm of c·s, whereas the proof needs an overwhelming bound (the paper's footnote says about 13). This is a proof gap, not an attack: exceeding the bound slightly enlarges a Rényi-divergence budget and does not obviously reveal s. We wrote a corrected bound with proof (exponent (n−1)/2, within 0.04 bits of the exact value at Mithril sizes; 320 test points, 0 violations, while the printed bound fails at 149). </w:t>
+      </w:r>
+      <w:r>
+        <w:rPr>
+          <w:rFonts w:ascii="Times New Roman" w:hAnsi="Times New Roman"/>
+          <w:b/>
+          <w:i w:val="0"/>
+          <w:sz w:val="20"/>
+        </w:rPr>
+        <w:t>Real transcripts.</w:t>
+      </w:r>
+      <w:r>
+        <w:rPr>
+          <w:rFonts w:ascii="Times New Roman" w:hAnsi="Times New Roman"/>
+          <w:b w:val="0"/>
+          <w:i w:val="0"/>
+          <w:sz w:val="20"/>
+        </w:rPr>
+        <w:t xml:space="preserve"> Running the authors' Go signing code (ML-DSA-44, (T, N) = (2, 3), 110,000 slots, 39,461 with no party rejecting) and regressing the leftover of A·z − c·t − w on −c·s2 gives slope 0.004 ± 0.10 (1 would mean an s2 leak): accepted responses do not depend on s2, only the public-equivalent c·t0 remains, and we corrected our Mithril view accordingly. </w:t>
       </w:r>
       <w:r>
         <w:rPr>
@@ -11301,7 +13028,25 @@
           <w:i w:val="0"/>
           <w:sz w:val="20"/>
         </w:rPr>
-        <w:t>The paper's own text (Fig. 1b, Remark 11, App. M.1) has every party broadcast W_i, and its pairwise masks cancel (Lemma 1), so Σ W_i = A·y is public; Gaussian elimination gives y and then s1 = c⁻¹(z − y) from a single P2 signature, for any |S∖C|. The proof of Corollary 5 itself calls this value the public broadcast, and no later appendix changes it. Confirmed by algebra and a toy implementation; the author's code is not public. The toy (ring size 8, real q) also checks the narrower Phase 1 hypothesis: with all but one signer corrupted, the honest party's mask can be stripped and λ_h·A·y_h inverted, while with two honest signers this route fails, as the paper says; the sum route above, however, works whatever the number of honest parties. Two further points: Corollary 6 claims the full threshold-signature functionality without the |H| ≥ 2 condition that its Simulator 17 needs, and the key-generation commitment t(i) = A·s1(i) + s2(i) carries the noise s2(i), so the bare A·s1,i pattern broken in TALUS does not recur there.</w:t>
+        <w:t xml:space="preserve">The paper's own text (Fig. 1b, Remark 11, App. M.1) has every party broadcast W_i, and its pairwise masks cancel (Lemma 1), so Σ W_i = A·y is public; Gaussian elimination gives y and then s1 = c⁻¹(z − y) from a single P2 signature, for any |S∖C|. The proof of Corollary 5 itself calls this value the public broadcast, and no later appendix changes it. </w:t>
+      </w:r>
+      <w:r>
+        <w:rPr>
+          <w:rFonts w:ascii="Times New Roman" w:hAnsi="Times New Roman"/>
+          <w:b/>
+          <w:i w:val="0"/>
+          <w:sz w:val="20"/>
+        </w:rPr>
+        <w:t>Demonstrated at full size:</w:t>
+      </w:r>
+      <w:r>
+        <w:rPr>
+          <w:rFonts w:ascii="Times New Roman" w:hAnsi="Times New Roman"/>
+          <w:b w:val="0"/>
+          <w:i w:val="0"/>
+          <w:sz w:val="20"/>
+        </w:rPr>
+        <w:t xml:space="preserve"> in our re-implementation at real ML-DSA-44/65/87 sizes the combined signatures pass the standard verifier and s1 was recovered exactly from one signature for 15/15 keys per set; withholding a single W_i drops this to 0/15, so the attack really uses the sum. The author's code is not public, and our rejection checks run in the clear rather than in the paper's MPC. The earlier toy (ring size 8, real q) also checks the narrower Phase 1 hypothesis: with all but one signer corrupted, the honest party's mask can be stripped and λ_h·A·y_h inverted, while with two honest signers this route fails, as the paper says; the sum route above, however, works whatever the number of honest parties. Two further points: Corollary 6 claims the full threshold-signature functionality without the |H| ≥ 2 condition that its Simulator 17 needs, and the key-generation commitment t(i) = A·s1(i) + s2(i) carries the noise s2(i), so the bare A·s1,i pattern broken in TALUS does not recur there.</w:t>
       </w:r>
     </w:p>
     <w:p>
@@ -11330,7 +13075,7 @@
           <w:i w:val="0"/>
           <w:sz w:val="20"/>
         </w:rPr>
-        <w:t>Our Quorus implementation produced 0 of 272,664 signatures failing FIPS 204 verification. No statistical leak is possible by construction at the level of single coefficients; a lattice-level distinguisher was not run. For Trilithium, exact enumeration at n = 4 and Monte Carlo at n = 8 (2×10^8 samples × 3 trials) show the gap between rejected w_H and the simulator shrinking with γ1 and n (branch 2: 3×10^-5 to 7×10^-7 at n = 8). Paper errata, not attacks: Quorus Functionality 6 uses the bound γ2−β−η where every other place uses γ2−β (PDF p. 32), and Lemma 8 has a wrong normalising constant; Trilithium's simulation of unsuccessful signing (p. 24) leaves the gap noted in Section II-I.</w:t>
+        <w:t>Our Quorus implementation produced 0 of 272,664 signatures failing FIPS 204 verification. No statistical leak is possible by construction at the level of single coefficients; a lattice-level distinguisher was not run. For Trilithium, exact enumeration at n = 4 and Monte Carlo at n = 8 (2×10^8 samples × 3 trials) show the gap between rejected w_H and the simulator shrinking with γ1 and n (branch 2: 3×10^-5 to 7×10^-7 at n = 8). Paper errata, not attacks: Quorus Functionality 6 uses the bound γ2−β−η where every other place uses γ2−β (PDF p. 32), and Lemma 8 prints the denominator 2(β+1)δ+1 instead of (2β+1)δ+1 (exhaustive check: printed probabilities sum to 0.84–0.95); Trilithium's simulation of unsuccessful signing (p. 24) leaves the gap noted in Section II-J.</w:t>
       </w:r>
     </w:p>
     <w:p>
@@ -11444,7 +13189,7 @@
           <w:i w:val="0"/>
           <w:sz w:val="20"/>
         </w:rPr>
-        <w:t xml:space="preserve"> An end-to-end TALUS-cap margin tool: given transcripts produced by the TALUS reference code (packages expected from March 2027) through a scheme view, it runs the bounded-noise estimator with ILP finishing, reports N* and the margin in bits against the cap and the wall, and runs the positive and negative controls automatically, so a reported margin is never quoted without them. Concretely it will (i) replace our channel model by the released values of the real code, (ii) extend ILP finishing to the full secret and to ML-DSA-65/87, and (iii) rerun the Mithril parameter check on the submitted parameters. Success means reproducing Table IX on real transcripts, or explaining any difference, with each margin reported together with its controls. Until packages appear, the prototype runs on our TALUS view, so the demonstration does not depend on the release date. The demonstration will be a single command that takes a transcript file and a parameter set and prints the margin table with its controls, trial counts and seeds; the stretch goals continue alongside it (a lattice-level distinguisher for rejected transcripts, the Go signing code of Mithril, and disclosure to the Kao and Mithril authors).</w:t>
+        <w:t xml:space="preserve"> An end-to-end TALUS-cap margin tool: given transcripts produced by the TALUS reference code (packages expected from March 2027) through a scheme view, it runs the bounded-noise estimator with ILP finishing, reports N* and the margin in bits against the cap and the wall, and runs the positive and negative controls automatically, so a reported margin is never quoted without them. Concretely it will (i) replace our channel model by the released values of the real code, (ii) run the whole-secret ILP for ML-DSA-65/87 instead of extrapolating, and (iii) rerun the Mithril parameter check on the submitted parameters. Success means reproducing Table IX on real transcripts, or explaining any difference, with each margin reported together with its controls. Until packages appear, the prototype runs on our TALUS view, so the demonstration does not depend on the release date. The demonstration will be a single command that takes a transcript file and a parameter set and prints the margin table with its controls, trial counts and seeds; the stretch goals continue alongside it (a lattice-level distinguisher for rejected transcripts, and disclosure to the Kao and Mithril authors).</w:t>
       </w:r>
     </w:p>
     <w:p>
@@ -11543,7 +13288,7 @@
                 <w:i w:val="0"/>
                 <w:sz w:val="16"/>
               </w:rPr>
-              <w:t>Status (13 Oct 2026)</w:t>
+              <w:t>Status (29 Oct 2026)</w:t>
             </w:r>
           </w:p>
         </w:tc>
@@ -11667,7 +13412,7 @@
                 <w:i w:val="0"/>
                 <w:sz w:val="16"/>
               </w:rPr>
-              <w:t>Done for per-element N*; ILP only -44</w:t>
+              <w:t>Done: 20 trials/point; whole secret run for -44</w:t>
             </w:r>
           </w:p>
         </w:tc>
@@ -11729,7 +13474,7 @@
                 <w:i w:val="0"/>
                 <w:sz w:val="16"/>
               </w:rPr>
-              <w:t>Done: proof gap; hint table</w:t>
+              <w:t>Done: proof gap, corrected bound; Go transcripts</w:t>
             </w:r>
           </w:p>
         </w:tc>
@@ -11853,7 +13598,7 @@
                 <w:i w:val="0"/>
                 <w:sz w:val="16"/>
               </w:rPr>
-              <w:t>Done: key exposure confirmed in text</w:t>
+              <w:t>Done: key from one signature at full size</w:t>
             </w:r>
           </w:p>
         </w:tc>
@@ -11915,7 +13660,7 @@
                 <w:i w:val="0"/>
                 <w:sz w:val="16"/>
               </w:rPr>
-              <w:t>Phase 3; only Mithril script run so far</w:t>
+              <w:t>Phase 3; Mithril script and Go code run so far</w:t>
             </w:r>
           </w:p>
         </w:tc>
@@ -11960,7 +13705,7 @@
           <w:i w:val="0"/>
           <w:sz w:val="20"/>
         </w:rPr>
-        <w:t xml:space="preserve"> (RQ1) Which threshold ML-DSA designs exist? Four First-Call proposals, differing in corruption model, party count and rounds (Table II). (RQ2) Which are broken? Earlier TALUS versions, by two attacks that we reproduced; Kao's P2 profile exposes the key from one signature by the paper's own text. (RQ3) Which techniques work? Linear inversion of published A·x, nonce-leak recovery, and for the TALUS channel a bounded-noise estimator with ILP finishing, about four orders of magnitude better than least squares. (RQ4) Where is the evidence thinnest? The TALUS cap margin (now measured at 3–4.5 bits above the cap), Mithril's parameter-proof accounting, and the untested lattice-level question for rejected transcripts in Quorus and Trilithium.</w:t>
+        <w:t xml:space="preserve"> (RQ1) Which threshold ML-DSA designs exist? Four First-Call proposals, differing in corruption model, party count and rounds (Table II). (RQ2) Which are broken? Earlier TALUS versions, by two attacks that we reproduced; Kao's P2 profile exposes the key from one signature by the paper's own text. (RQ3) Which techniques work? Linear inversion of published A·x, nonce-leak recovery, and for the TALUS channel a bounded-noise estimator with ILP finishing, about four orders of magnitude better than least squares. (RQ4) Where is the evidence thinnest? The TALUS cap margin (now measured at about 3–3.5 bits above the cap), Mithril's parameter-proof accounting, and the untested lattice-level question for rejected transcripts in Quorus and Trilithium.</w:t>
       </w:r>
     </w:p>
     <w:p>
@@ -11983,7 +13728,7 @@
           <w:i w:val="0"/>
           <w:sz w:val="20"/>
         </w:rPr>
-        <w:t xml:space="preserve"> Three methodological points carry over to Phase 3. First, controls change conclusions: without the negative control the estimator's output −t0 on genuine ML-DSA could have been mistaken for leakage. Second, reduced-size runs can mislead in either direction (the ML-DSA-87 shortcut at n = 64 overstated the margin, and ILP gains grow with n), so only full-size numbers are quoted. Third, reading the papers in full revised two of our own Phase 1 statements (Trilithium releases w_H, not a partial signature; uniformity holds per coefficient only), which is why every hypothesis in Section II-I now carries a verdict.</w:t>
+        <w:t xml:space="preserve"> Three methodological points carry over to Phase 3. First, controls change conclusions: without the negative control the estimator's output −t0 on genuine ML-DSA could have been mistaken for leakage. Second, reduced-size runs can mislead in either direction (the ML-DSA-87 shortcut at n = 64 overstated the margin, and ILP gains grow with n), so only full-size numbers are quoted. Third, reading the papers in full revised two of our own Phase 1 statements (Trilithium releases w_H, not a partial signature; uniformity holds per coefficient only), which is why every hypothesis in Section II-J now carries a verdict.</w:t>
       </w:r>
     </w:p>
     <w:p>
@@ -12052,7 +13797,7 @@
           <w:i w:val="0"/>
           <w:sz w:val="20"/>
         </w:rPr>
-        <w:t xml:space="preserve"> The survey of twenty-four sources showed that threshold ML-DSA designs fail when patterns from discrete-log protocols are imported, and that three of the four proposals had not been tested. Phase 2 built and validated a harness and measured the core quantity: the TALUS cap holds in our model, but by 3–4.5 bits above the cap and only about 1–2 bits above the authors' wall, much less than least squares suggests. Secondary findings are a proof-parameter gap in Mithril, a key exposure in Kao's P2 profile, and errata in Quorus and Trilithium, with disclosure to the authors to follow before any public posting.</w:t>
+        <w:t xml:space="preserve"> The survey of thirty-three sources showed that threshold ML-DSA designs fail when patterns from discrete-log protocols are imported, and that three of the four proposals had not been tested. Phase 2 built and validated a harness and measured the core quantity: the TALUS cap holds in our model, but by only about 3–3.5 bits for the whole secret and about 1 bit above the authors' wall, much less than least squares suggests; insider, coordinator, rotation and lattice-finish routes do not lower it. Secondary findings are a proof-parameter gap in Mithril, a key exposure in Kao's P2 profile, and errata in Quorus and Trilithium, with disclosure to the authors to follow before any public posting.</w:t>
       </w:r>
     </w:p>
     <w:p>
@@ -12694,6 +14439,231 @@
           <w:sz w:val="16"/>
         </w:rPr>
         <w:t>in Proc. ASIACRYPT 2022, LNCS 13794, pp. 34–64, 2022 (full version: IACR ePrint 2022/1249).</w:t>
+      </w:r>
+    </w:p>
+    <w:p>
+      <w:pPr>
+        <w:spacing w:after="20"/>
+        <w:ind w:left="432" w:hanging="432"/>
+        <w:jc w:val="both"/>
+      </w:pPr>
+      <w:r>
+        <w:rPr>
+          <w:rFonts w:ascii="Times New Roman" w:hAnsi="Times New Roman"/>
+          <w:b w:val="0"/>
+          <w:i w:val="0"/>
+          <w:sz w:val="16"/>
+        </w:rPr>
+        <w:t xml:space="preserve">[26] C. Boschini, D. Kaviani, R. W. F. Lai, G. Malavolta, A. Takahashi, and M. Tibouchi, “Ringtail: Practical two-round threshold signatures from learning with errors,” </w:t>
+      </w:r>
+      <w:r>
+        <w:rPr>
+          <w:rFonts w:ascii="Times New Roman" w:hAnsi="Times New Roman"/>
+          <w:b w:val="0"/>
+          <w:i/>
+          <w:sz w:val="16"/>
+        </w:rPr>
+        <w:t>in Proc. IEEE Symp. Security and Privacy, 2025, doi:10.1109/SP61157.2025.00070 (IACR ePrint 2024/1113).</w:t>
+      </w:r>
+    </w:p>
+    <w:p>
+      <w:pPr>
+        <w:spacing w:after="20"/>
+        <w:ind w:left="432" w:hanging="432"/>
+        <w:jc w:val="both"/>
+      </w:pPr>
+      <w:r>
+        <w:rPr>
+          <w:rFonts w:ascii="Times New Roman" w:hAnsi="Times New Roman"/>
+          <w:b w:val="0"/>
+          <w:i w:val="0"/>
+          <w:sz w:val="16"/>
+        </w:rPr>
+        <w:t xml:space="preserve">[27] T. Espitau, S. Katsumata, and K. Takemure, “Two-round threshold signature from algebraic one-more learning with errors,” </w:t>
+      </w:r>
+      <w:r>
+        <w:rPr>
+          <w:rFonts w:ascii="Times New Roman" w:hAnsi="Times New Roman"/>
+          <w:b w:val="0"/>
+          <w:i/>
+          <w:sz w:val="16"/>
+        </w:rPr>
+        <w:t>in Proc. CRYPTO 2024, Part VII, pp. 387–424; J. Cryptol., vol. 38, no. 4, 2025 (IACR ePrint 2024/496).</w:t>
+      </w:r>
+    </w:p>
+    <w:p>
+      <w:pPr>
+        <w:spacing w:after="20"/>
+        <w:ind w:left="432" w:hanging="432"/>
+        <w:jc w:val="both"/>
+      </w:pPr>
+      <w:r>
+        <w:rPr>
+          <w:rFonts w:ascii="Times New Roman" w:hAnsi="Times New Roman"/>
+          <w:b w:val="0"/>
+          <w:i w:val="0"/>
+          <w:sz w:val="16"/>
+        </w:rPr>
+        <w:t xml:space="preserve">[28] C. Boschini, T. Espitau, A. Kaiser, S. Katsumata, D. Kaviani, R. W. F. Lai, G. Malavolta, T. Prest, P. Schwabe, A. Takahashi, K. Takemure, and M. Tibouchi, “Tanuki: Two-round threshold signatures from lattices,” </w:t>
+      </w:r>
+      <w:r>
+        <w:rPr>
+          <w:rFonts w:ascii="Times New Roman" w:hAnsi="Times New Roman"/>
+          <w:b w:val="0"/>
+          <w:i/>
+          <w:sz w:val="16"/>
+        </w:rPr>
+        <w:t>NIST MPTC First Call preview writeup v0.1, Jan. 2026.</w:t>
+      </w:r>
+    </w:p>
+    <w:p>
+      <w:pPr>
+        <w:spacing w:after="20"/>
+        <w:ind w:left="432" w:hanging="432"/>
+        <w:jc w:val="both"/>
+      </w:pPr>
+      <w:r>
+        <w:rPr>
+          <w:rFonts w:ascii="Times New Roman" w:hAnsi="Times New Roman"/>
+          <w:b w:val="0"/>
+          <w:i w:val="0"/>
+          <w:sz w:val="16"/>
+        </w:rPr>
+        <w:t xml:space="preserve">[29] N. Snetkov, J. Vakarjuk, and P. Laud, “TOPCOAT: towards practical two-party Crystals-Dilithium,” </w:t>
+      </w:r>
+      <w:r>
+        <w:rPr>
+          <w:rFonts w:ascii="Times New Roman" w:hAnsi="Times New Roman"/>
+          <w:b w:val="0"/>
+          <w:i/>
+          <w:sz w:val="16"/>
+        </w:rPr>
+        <w:t>Discover Computing, vol. 27, no. 1, art. 18, 2024, doi:10.1007/s10791-024-09449-2.</w:t>
+      </w:r>
+    </w:p>
+    <w:p>
+      <w:pPr>
+        <w:spacing w:after="20"/>
+        <w:ind w:left="432" w:hanging="432"/>
+        <w:jc w:val="both"/>
+      </w:pPr>
+      <w:r>
+        <w:rPr>
+          <w:rFonts w:ascii="Times New Roman" w:hAnsi="Times New Roman"/>
+          <w:b w:val="0"/>
+          <w:i w:val="0"/>
+          <w:sz w:val="16"/>
+        </w:rPr>
+        <w:t xml:space="preserve">[30] M. Rambaud, S. Roth, and A. Urban, “Threshold signatures as-a-service: Achieving threshold ML-DSA in one online round,” </w:t>
+      </w:r>
+      <w:r>
+        <w:rPr>
+          <w:rFonts w:ascii="Times New Roman" w:hAnsi="Times New Roman"/>
+          <w:b w:val="0"/>
+          <w:i/>
+          <w:sz w:val="16"/>
+        </w:rPr>
+        <w:t>IACR ePrint 2026/814, Apr. 2026.</w:t>
+      </w:r>
+    </w:p>
+    <w:p>
+      <w:pPr>
+        <w:spacing w:after="20"/>
+        <w:ind w:left="432" w:hanging="432"/>
+        <w:jc w:val="both"/>
+      </w:pPr>
+      <w:r>
+        <w:rPr>
+          <w:rFonts w:ascii="Times New Roman" w:hAnsi="Times New Roman"/>
+          <w:b w:val="0"/>
+          <w:i w:val="0"/>
+          <w:sz w:val="16"/>
+        </w:rPr>
+        <w:t xml:space="preserve">[31] Y. Meng, “Fault-induced nonce repetition in threshold lattice signatures: A reveal-structure criterion, cross-scheme analysis, and detection boundaries,” </w:t>
+      </w:r>
+      <w:r>
+        <w:rPr>
+          <w:rFonts w:ascii="Times New Roman" w:hAnsi="Times New Roman"/>
+          <w:b w:val="0"/>
+          <w:i/>
+          <w:sz w:val="16"/>
+        </w:rPr>
+        <w:t>IACR ePrint 2026/2566, Oct. 2026.</w:t>
+      </w:r>
+    </w:p>
+    <w:p>
+      <w:pPr>
+        <w:spacing w:after="20"/>
+        <w:ind w:left="432" w:hanging="432"/>
+        <w:jc w:val="both"/>
+      </w:pPr>
+      <w:r>
+        <w:rPr>
+          <w:rFonts w:ascii="Times New Roman" w:hAnsi="Times New Roman"/>
+          <w:b w:val="0"/>
+          <w:i w:val="0"/>
+          <w:sz w:val="16"/>
+        </w:rPr>
+        <w:t xml:space="preserve">[32] C. Schubert, N. J. Müller, J.-P. Seifert, and M. Margraf, “Descent into broken trust: Uncovering ML-DSA subkeys with scarce leakage and local optimization,” </w:t>
+      </w:r>
+      <w:r>
+        <w:rPr>
+          <w:rFonts w:ascii="Times New Roman" w:hAnsi="Times New Roman"/>
+          <w:b w:val="0"/>
+          <w:i/>
+          <w:sz w:val="16"/>
+        </w:rPr>
+        <w:t>IACR ePrint 2026/472, Mar. 2026.</w:t>
+      </w:r>
+    </w:p>
+    <w:p>
+      <w:pPr>
+        <w:spacing w:after="20"/>
+        <w:ind w:left="432" w:hanging="432"/>
+        <w:jc w:val="both"/>
+      </w:pPr>
+      <w:r>
+        <w:rPr>
+          <w:rFonts w:ascii="Times New Roman" w:hAnsi="Times New Roman"/>
+          <w:b w:val="0"/>
+          <w:i w:val="0"/>
+          <w:sz w:val="16"/>
+        </w:rPr>
+        <w:t xml:space="preserve">[33] N. Paskarbeit, C. Schubert, M. Margraf, and J.-P. Seifert, “Statistical inference from noisy randomness leakage for ML-DSA attacks,” </w:t>
+      </w:r>
+      <w:r>
+        <w:rPr>
+          <w:rFonts w:ascii="Times New Roman" w:hAnsi="Times New Roman"/>
+          <w:b w:val="0"/>
+          <w:i/>
+          <w:sz w:val="16"/>
+        </w:rPr>
+        <w:t>IACR ePrint 2026/1712, Aug. 2026.</w:t>
+      </w:r>
+    </w:p>
+    <w:p>
+      <w:pPr>
+        <w:spacing w:after="20"/>
+        <w:ind w:left="432" w:hanging="432"/>
+        <w:jc w:val="both"/>
+      </w:pPr>
+      <w:r>
+        <w:rPr>
+          <w:rFonts w:ascii="Times New Roman" w:hAnsi="Times New Roman"/>
+          <w:b w:val="0"/>
+          <w:i w:val="0"/>
+          <w:sz w:val="16"/>
+        </w:rPr>
+        <w:t xml:space="preserve">[34] J. H. Cheon, H. Choe, J. Devevey, T. Güneysu, D. Hong, M. Krausz, G. Land, M. Möller, D. Stehlé, and M. Yi, “HAETAE: Shorter lattice-based Fiat–Shamir signatures,” </w:t>
+      </w:r>
+      <w:r>
+        <w:rPr>
+          <w:rFonts w:ascii="Times New Roman" w:hAnsi="Times New Roman"/>
+          <w:b w:val="0"/>
+          <w:i/>
+          <w:sz w:val="16"/>
+        </w:rPr>
+        <w:t>IACR Trans. Cryptogr. Hardw. Embed. Syst., vol. 2024, no. 3, pp. 25–75, 2024.</w:t>
       </w:r>
     </w:p>
     <w:sectPr>

</xml_diff>

<commit_message>
Phase 2 report: introduction and proposed-solution framing, results tables and figures from saved data
- Introduction states 2026 context, the proposed method and its measured gain; Section IV titled Proposed Solution
- Table X controls, Table XI TALUS insider walls, Table XII Mithril Q_s over 45 sets, Table XIV Kao P2 attack steps
- Fig. 4 ring-size ladder, Fig. 5 Trilithium gap vs n (experiments/report_extras.py, no new runs)
- Wording fixes: controls recover one ring element; TEE below cap from T = 7/11/9
- Overleaf package updated with all five figures
</commit_message>
<xml_diff>
--- a/report/Phase1_Report.docx
+++ b/report/Phase1_Report.docx
@@ -849,7 +849,7 @@
           <w:i w:val="0"/>
           <w:sz w:val="20"/>
         </w:rPr>
-        <w:t xml:space="preserve"> NIST's First Call (IR 8214C) [3] expects preliminary packages from late 2026 and full packages not before March 2027, so scrutiny is most useful now. Following the Phase 1 review, the core problem is the TALUS signing cap (P1); the Mithril, rejected-attempt and Kao questions (P2–P4) are stretch goals. We give (i) a survey of the four proposals and the attack toolbox, (ii) the problem formulation, (iii) a working leakage-testing harness (Fig. 1) and (iv) its Phase 2 results with trial counts and seeds.</w:t>
+        <w:t xml:space="preserve"> NIST's First Call (IR 8214C) [3] expects preliminary packages from late 2026 and full packages not before March 2027, so scrutiny is most useful now. The year has already shown why: in July 2026 Niot [13] recovered keys from earlier TALUS versions, and TALUS v0.22 [11] answered with a per-key signing cap whose safety margin had not been measured independently. Following the Phase 1 review, the core problem is that cap (P1); the Mithril, rejected-attempt and Kao questions (P2–P4) are stretch goals. We give (i) a survey of the four proposals, the attack toolbox and recent work, (ii) the problem formulation, (iii) our proposed solution, a leakage-testing harness (Fig. 1) whose bounded-noise estimator with integer-programming finishing uses the hard edges of the TALUS noise, and (iv) simulation results with trial counts and seeds showing that it needs about 5×10^4 times fewer signatures than the least-squares baseline, yet still stays about 3 bits above the cap.</w:t>
       </w:r>
     </w:p>
     <w:p>
@@ -10674,7 +10674,7 @@
           <w:i w:val="0"/>
           <w:sz w:val="20"/>
         </w:rPr>
-        <w:t>IV. THE LEAKAGE-TESTING HARNESS</w:t>
+        <w:t>IV. PROPOSED SOLUTION: THE LEAKAGE-TESTING HARNESS</w:t>
       </w:r>
     </w:p>
     <w:p>
@@ -12403,7 +12403,7 @@
           <w:i w:val="0"/>
           <w:sz w:val="20"/>
         </w:rPr>
-        <w:t xml:space="preserve"> On real ML-DSA-44 signing without the r0 check (the second rejection check of Section I, on r0 = LowBits(w − c·s2)) the estimator recovered the key in 9/9 runs (3 keys × N = 2, 4, 8×10^5); on genuine ML-DSA it returned the key for 0/18 keys (15 of them from seed 2027), only the public-equivalent −t0, so the false-positive rate is below about 15% at 95% confidence. </w:t>
+        <w:t xml:space="preserve"> On real ML-DSA-44 signing without the r0 check (the second rejection check of Section I, on r0 = LowBits(w − c·s2)) the estimator recovered the secret element s2 − t0 (one ring element) in 9/9 runs (3 keys × N = 2, 4, 8×10^5); on genuine ML-DSA it returned it for 0/18 keys (15 of them from seed 2027), only the public-equivalent −t0, so the false-positive rate is below about 15% at 95% confidence (Table X). </w:t>
       </w:r>
       <w:r>
         <w:rPr>
@@ -12426,6 +12426,769 @@
     </w:p>
     <w:p>
       <w:pPr>
+        <w:keepNext/>
+        <w:spacing w:after="40"/>
+        <w:jc w:val="center"/>
+      </w:pPr>
+      <w:r>
+        <w:rPr>
+          <w:rFonts w:ascii="Times New Roman" w:hAnsi="Times New Roman"/>
+          <w:b w:val="0"/>
+          <w:i w:val="0"/>
+          <w:sz w:val="16"/>
+        </w:rPr>
+        <w:t xml:space="preserve">TABLE X. </w:t>
+      </w:r>
+      <w:r>
+        <w:rPr>
+          <w:rFonts w:ascii="Times New Roman" w:hAnsi="Times New Roman"/>
+          <w:b w:val="0"/>
+          <w:i w:val="0"/>
+          <w:sz w:val="16"/>
+        </w:rPr>
+        <w:t>Controls and end-to-end check: same estimator settings in every run; time is the GPU estimator per run</w:t>
+      </w:r>
+    </w:p>
+    <w:tbl>
+      <w:tblPr>
+        <w:tblStyle w:val="TableGrid"/>
+        <w:tblW w:type="auto" w:w="0"/>
+        <w:tblLook w:firstColumn="1" w:firstRow="1" w:lastColumn="0" w:lastRow="0" w:noHBand="0" w:noVBand="1" w:val="04A0"/>
+      </w:tblPr>
+      <w:tblGrid>
+        <w:gridCol w:w="1393"/>
+        <w:gridCol w:w="1393"/>
+        <w:gridCol w:w="1393"/>
+        <w:gridCol w:w="1393"/>
+        <w:gridCol w:w="1393"/>
+        <w:gridCol w:w="1393"/>
+        <w:gridCol w:w="1393"/>
+      </w:tblGrid>
+      <w:tr>
+        <w:tc>
+          <w:tcPr>
+            <w:tcW w:type="dxa" w:w="1411"/>
+            <w:shd w:val="clear" w:color="auto" w:fill="D9D9D9"/>
+          </w:tcPr>
+          <w:p>
+            <w:pPr>
+              <w:spacing w:after="0"/>
+            </w:pPr>
+            <w:r/>
+            <w:r>
+              <w:rPr>
+                <w:rFonts w:ascii="Times New Roman" w:hAnsi="Times New Roman"/>
+                <w:b/>
+                <w:i w:val="0"/>
+                <w:sz w:val="16"/>
+              </w:rPr>
+              <w:t>Run (ML-DSA-44, one element)</w:t>
+            </w:r>
+          </w:p>
+        </w:tc>
+        <w:tc>
+          <w:tcPr>
+            <w:tcW w:type="dxa" w:w="373"/>
+            <w:shd w:val="clear" w:color="auto" w:fill="D9D9D9"/>
+          </w:tcPr>
+          <w:p>
+            <w:pPr>
+              <w:spacing w:after="0"/>
+            </w:pPr>
+            <w:r/>
+            <w:r>
+              <w:rPr>
+                <w:rFonts w:ascii="Times New Roman" w:hAnsi="Times New Roman"/>
+                <w:b/>
+                <w:i w:val="0"/>
+                <w:sz w:val="16"/>
+              </w:rPr>
+              <w:t>Seed</w:t>
+            </w:r>
+          </w:p>
+        </w:tc>
+        <w:tc>
+          <w:tcPr>
+            <w:tcW w:type="dxa" w:w="788"/>
+            <w:shd w:val="clear" w:color="auto" w:fill="D9D9D9"/>
+          </w:tcPr>
+          <w:p>
+            <w:pPr>
+              <w:spacing w:after="0"/>
+            </w:pPr>
+            <w:r/>
+            <w:r>
+              <w:rPr>
+                <w:rFonts w:ascii="Times New Roman" w:hAnsi="Times New Roman"/>
+                <w:b/>
+                <w:i w:val="0"/>
+                <w:sz w:val="16"/>
+              </w:rPr>
+              <w:t>Keys × N</w:t>
+            </w:r>
+          </w:p>
+        </w:tc>
+        <w:tc>
+          <w:tcPr>
+            <w:tcW w:type="dxa" w:w="705"/>
+            <w:shd w:val="clear" w:color="auto" w:fill="D9D9D9"/>
+          </w:tcPr>
+          <w:p>
+            <w:pPr>
+              <w:spacing w:after="0"/>
+            </w:pPr>
+            <w:r/>
+            <w:r>
+              <w:rPr>
+                <w:rFonts w:ascii="Times New Roman" w:hAnsi="Times New Roman"/>
+                <w:b/>
+                <w:i w:val="0"/>
+                <w:sz w:val="16"/>
+              </w:rPr>
+              <w:t>Edge: secret</w:t>
+            </w:r>
+          </w:p>
+        </w:tc>
+        <w:tc>
+          <w:tcPr>
+            <w:tcW w:type="dxa" w:w="539"/>
+            <w:shd w:val="clear" w:color="auto" w:fill="D9D9D9"/>
+          </w:tcPr>
+          <w:p>
+            <w:pPr>
+              <w:spacing w:after="0"/>
+            </w:pPr>
+            <w:r/>
+            <w:r>
+              <w:rPr>
+                <w:rFonts w:ascii="Times New Roman" w:hAnsi="Times New Roman"/>
+                <w:b/>
+                <w:i w:val="0"/>
+                <w:sz w:val="16"/>
+              </w:rPr>
+              <w:t>Edge: −t0</w:t>
+            </w:r>
+          </w:p>
+        </w:tc>
+        <w:tc>
+          <w:tcPr>
+            <w:tcW w:type="dxa" w:w="539"/>
+            <w:shd w:val="clear" w:color="auto" w:fill="D9D9D9"/>
+          </w:tcPr>
+          <w:p>
+            <w:pPr>
+              <w:spacing w:after="0"/>
+            </w:pPr>
+            <w:r/>
+            <w:r>
+              <w:rPr>
+                <w:rFonts w:ascii="Times New Roman" w:hAnsi="Times New Roman"/>
+                <w:b/>
+                <w:i w:val="0"/>
+                <w:sz w:val="16"/>
+              </w:rPr>
+              <w:t>LS: secret</w:t>
+            </w:r>
+          </w:p>
+        </w:tc>
+        <w:tc>
+          <w:tcPr>
+            <w:tcW w:type="dxa" w:w="539"/>
+            <w:shd w:val="clear" w:color="auto" w:fill="D9D9D9"/>
+          </w:tcPr>
+          <w:p>
+            <w:pPr>
+              <w:spacing w:after="0"/>
+            </w:pPr>
+            <w:r/>
+            <w:r>
+              <w:rPr>
+                <w:rFonts w:ascii="Times New Roman" w:hAnsi="Times New Roman"/>
+                <w:b/>
+                <w:i w:val="0"/>
+                <w:sz w:val="16"/>
+              </w:rPr>
+              <w:t>Time</w:t>
+            </w:r>
+          </w:p>
+        </w:tc>
+      </w:tr>
+      <w:tr>
+        <w:tc>
+          <w:tcPr>
+            <w:tcW w:type="dxa" w:w="1411"/>
+          </w:tcPr>
+          <w:p>
+            <w:pPr>
+              <w:spacing w:after="0"/>
+            </w:pPr>
+            <w:r/>
+            <w:r>
+              <w:rPr>
+                <w:rFonts w:ascii="Times New Roman" w:hAnsi="Times New Roman"/>
+                <w:b w:val="0"/>
+                <w:i w:val="0"/>
+                <w:sz w:val="16"/>
+              </w:rPr>
+              <w:t>Positive: no r0 check</w:t>
+            </w:r>
+          </w:p>
+        </w:tc>
+        <w:tc>
+          <w:tcPr>
+            <w:tcW w:type="dxa" w:w="373"/>
+          </w:tcPr>
+          <w:p>
+            <w:pPr>
+              <w:spacing w:after="0"/>
+            </w:pPr>
+            <w:r/>
+            <w:r>
+              <w:rPr>
+                <w:rFonts w:ascii="Times New Roman" w:hAnsi="Times New Roman"/>
+                <w:b w:val="0"/>
+                <w:i w:val="0"/>
+                <w:sz w:val="16"/>
+              </w:rPr>
+              <w:t>2026</w:t>
+            </w:r>
+          </w:p>
+        </w:tc>
+        <w:tc>
+          <w:tcPr>
+            <w:tcW w:type="dxa" w:w="788"/>
+          </w:tcPr>
+          <w:p>
+            <w:pPr>
+              <w:spacing w:after="0"/>
+            </w:pPr>
+            <w:r/>
+            <w:r>
+              <w:rPr>
+                <w:rFonts w:ascii="Times New Roman" w:hAnsi="Times New Roman"/>
+                <w:b w:val="0"/>
+                <w:i w:val="0"/>
+                <w:sz w:val="16"/>
+              </w:rPr>
+              <w:t>3 × {2,4,8}e5</w:t>
+            </w:r>
+          </w:p>
+        </w:tc>
+        <w:tc>
+          <w:tcPr>
+            <w:tcW w:type="dxa" w:w="705"/>
+          </w:tcPr>
+          <w:p>
+            <w:pPr>
+              <w:spacing w:after="0"/>
+            </w:pPr>
+            <w:r/>
+            <w:r>
+              <w:rPr>
+                <w:rFonts w:ascii="Times New Roman" w:hAnsi="Times New Roman"/>
+                <w:b w:val="0"/>
+                <w:i w:val="0"/>
+                <w:sz w:val="16"/>
+              </w:rPr>
+              <w:t>9/9</w:t>
+            </w:r>
+          </w:p>
+        </w:tc>
+        <w:tc>
+          <w:tcPr>
+            <w:tcW w:type="dxa" w:w="539"/>
+          </w:tcPr>
+          <w:p>
+            <w:pPr>
+              <w:spacing w:after="0"/>
+            </w:pPr>
+            <w:r/>
+            <w:r>
+              <w:rPr>
+                <w:rFonts w:ascii="Times New Roman" w:hAnsi="Times New Roman"/>
+                <w:b w:val="0"/>
+                <w:i w:val="0"/>
+                <w:sz w:val="16"/>
+              </w:rPr>
+              <w:t>0/9</w:t>
+            </w:r>
+          </w:p>
+        </w:tc>
+        <w:tc>
+          <w:tcPr>
+            <w:tcW w:type="dxa" w:w="539"/>
+          </w:tcPr>
+          <w:p>
+            <w:pPr>
+              <w:spacing w:after="0"/>
+            </w:pPr>
+            <w:r/>
+            <w:r>
+              <w:rPr>
+                <w:rFonts w:ascii="Times New Roman" w:hAnsi="Times New Roman"/>
+                <w:b w:val="0"/>
+                <w:i w:val="0"/>
+                <w:sz w:val="16"/>
+              </w:rPr>
+              <w:t>0/9</w:t>
+            </w:r>
+          </w:p>
+        </w:tc>
+        <w:tc>
+          <w:tcPr>
+            <w:tcW w:type="dxa" w:w="539"/>
+          </w:tcPr>
+          <w:p>
+            <w:pPr>
+              <w:spacing w:after="0"/>
+            </w:pPr>
+            <w:r/>
+            <w:r>
+              <w:rPr>
+                <w:rFonts w:ascii="Times New Roman" w:hAnsi="Times New Roman"/>
+                <w:b w:val="0"/>
+                <w:i w:val="0"/>
+                <w:sz w:val="16"/>
+              </w:rPr>
+              <w:t>49–74 s</w:t>
+            </w:r>
+          </w:p>
+        </w:tc>
+      </w:tr>
+      <w:tr>
+        <w:tc>
+          <w:tcPr>
+            <w:tcW w:type="dxa" w:w="1411"/>
+          </w:tcPr>
+          <w:p>
+            <w:pPr>
+              <w:spacing w:after="0"/>
+            </w:pPr>
+            <w:r/>
+            <w:r>
+              <w:rPr>
+                <w:rFonts w:ascii="Times New Roman" w:hAnsi="Times New Roman"/>
+                <w:b w:val="0"/>
+                <w:i w:val="0"/>
+                <w:sz w:val="16"/>
+              </w:rPr>
+              <w:t>Negative: genuine ML-DSA</w:t>
+            </w:r>
+          </w:p>
+        </w:tc>
+        <w:tc>
+          <w:tcPr>
+            <w:tcW w:type="dxa" w:w="373"/>
+          </w:tcPr>
+          <w:p>
+            <w:pPr>
+              <w:spacing w:after="0"/>
+            </w:pPr>
+            <w:r/>
+            <w:r>
+              <w:rPr>
+                <w:rFonts w:ascii="Times New Roman" w:hAnsi="Times New Roman"/>
+                <w:b w:val="0"/>
+                <w:i w:val="0"/>
+                <w:sz w:val="16"/>
+              </w:rPr>
+              <w:t>2026</w:t>
+            </w:r>
+          </w:p>
+        </w:tc>
+        <w:tc>
+          <w:tcPr>
+            <w:tcW w:type="dxa" w:w="788"/>
+          </w:tcPr>
+          <w:p>
+            <w:pPr>
+              <w:spacing w:after="0"/>
+            </w:pPr>
+            <w:r/>
+            <w:r>
+              <w:rPr>
+                <w:rFonts w:ascii="Times New Roman" w:hAnsi="Times New Roman"/>
+                <w:b w:val="0"/>
+                <w:i w:val="0"/>
+                <w:sz w:val="16"/>
+              </w:rPr>
+              <w:t>3 × {2,4,8}e5</w:t>
+            </w:r>
+          </w:p>
+        </w:tc>
+        <w:tc>
+          <w:tcPr>
+            <w:tcW w:type="dxa" w:w="705"/>
+          </w:tcPr>
+          <w:p>
+            <w:pPr>
+              <w:spacing w:after="0"/>
+            </w:pPr>
+            <w:r/>
+            <w:r>
+              <w:rPr>
+                <w:rFonts w:ascii="Times New Roman" w:hAnsi="Times New Roman"/>
+                <w:b w:val="0"/>
+                <w:i w:val="0"/>
+                <w:sz w:val="16"/>
+              </w:rPr>
+              <w:t>0/9</w:t>
+            </w:r>
+          </w:p>
+        </w:tc>
+        <w:tc>
+          <w:tcPr>
+            <w:tcW w:type="dxa" w:w="539"/>
+          </w:tcPr>
+          <w:p>
+            <w:pPr>
+              <w:spacing w:after="0"/>
+            </w:pPr>
+            <w:r/>
+            <w:r>
+              <w:rPr>
+                <w:rFonts w:ascii="Times New Roman" w:hAnsi="Times New Roman"/>
+                <w:b w:val="0"/>
+                <w:i w:val="0"/>
+                <w:sz w:val="16"/>
+              </w:rPr>
+              <w:t>9/9</w:t>
+            </w:r>
+          </w:p>
+        </w:tc>
+        <w:tc>
+          <w:tcPr>
+            <w:tcW w:type="dxa" w:w="539"/>
+          </w:tcPr>
+          <w:p>
+            <w:pPr>
+              <w:spacing w:after="0"/>
+            </w:pPr>
+            <w:r/>
+            <w:r>
+              <w:rPr>
+                <w:rFonts w:ascii="Times New Roman" w:hAnsi="Times New Roman"/>
+                <w:b w:val="0"/>
+                <w:i w:val="0"/>
+                <w:sz w:val="16"/>
+              </w:rPr>
+              <w:t>0/9</w:t>
+            </w:r>
+          </w:p>
+        </w:tc>
+        <w:tc>
+          <w:tcPr>
+            <w:tcW w:type="dxa" w:w="539"/>
+          </w:tcPr>
+          <w:p>
+            <w:pPr>
+              <w:spacing w:after="0"/>
+            </w:pPr>
+            <w:r/>
+            <w:r>
+              <w:rPr>
+                <w:rFonts w:ascii="Times New Roman" w:hAnsi="Times New Roman"/>
+                <w:b w:val="0"/>
+                <w:i w:val="0"/>
+                <w:sz w:val="16"/>
+              </w:rPr>
+              <w:t>41–58 s</w:t>
+            </w:r>
+          </w:p>
+        </w:tc>
+      </w:tr>
+      <w:tr>
+        <w:tc>
+          <w:tcPr>
+            <w:tcW w:type="dxa" w:w="1411"/>
+          </w:tcPr>
+          <w:p>
+            <w:pPr>
+              <w:spacing w:after="0"/>
+            </w:pPr>
+            <w:r/>
+            <w:r>
+              <w:rPr>
+                <w:rFonts w:ascii="Times New Roman" w:hAnsi="Times New Roman"/>
+                <w:b w:val="0"/>
+                <w:i w:val="0"/>
+                <w:sz w:val="16"/>
+              </w:rPr>
+              <w:t>Negative: genuine ML-DSA</w:t>
+            </w:r>
+          </w:p>
+        </w:tc>
+        <w:tc>
+          <w:tcPr>
+            <w:tcW w:type="dxa" w:w="373"/>
+          </w:tcPr>
+          <w:p>
+            <w:pPr>
+              <w:spacing w:after="0"/>
+            </w:pPr>
+            <w:r/>
+            <w:r>
+              <w:rPr>
+                <w:rFonts w:ascii="Times New Roman" w:hAnsi="Times New Roman"/>
+                <w:b w:val="0"/>
+                <w:i w:val="0"/>
+                <w:sz w:val="16"/>
+              </w:rPr>
+              <w:t>2027</w:t>
+            </w:r>
+          </w:p>
+        </w:tc>
+        <w:tc>
+          <w:tcPr>
+            <w:tcW w:type="dxa" w:w="788"/>
+          </w:tcPr>
+          <w:p>
+            <w:pPr>
+              <w:spacing w:after="0"/>
+            </w:pPr>
+            <w:r/>
+            <w:r>
+              <w:rPr>
+                <w:rFonts w:ascii="Times New Roman" w:hAnsi="Times New Roman"/>
+                <w:b w:val="0"/>
+                <w:i w:val="0"/>
+                <w:sz w:val="16"/>
+              </w:rPr>
+              <w:t>15 × 2e5</w:t>
+            </w:r>
+          </w:p>
+        </w:tc>
+        <w:tc>
+          <w:tcPr>
+            <w:tcW w:type="dxa" w:w="705"/>
+          </w:tcPr>
+          <w:p>
+            <w:pPr>
+              <w:spacing w:after="0"/>
+            </w:pPr>
+            <w:r/>
+            <w:r>
+              <w:rPr>
+                <w:rFonts w:ascii="Times New Roman" w:hAnsi="Times New Roman"/>
+                <w:b w:val="0"/>
+                <w:i w:val="0"/>
+                <w:sz w:val="16"/>
+              </w:rPr>
+              <w:t>0/15</w:t>
+            </w:r>
+          </w:p>
+        </w:tc>
+        <w:tc>
+          <w:tcPr>
+            <w:tcW w:type="dxa" w:w="539"/>
+          </w:tcPr>
+          <w:p>
+            <w:pPr>
+              <w:spacing w:after="0"/>
+            </w:pPr>
+            <w:r/>
+            <w:r>
+              <w:rPr>
+                <w:rFonts w:ascii="Times New Roman" w:hAnsi="Times New Roman"/>
+                <w:b w:val="0"/>
+                <w:i w:val="0"/>
+                <w:sz w:val="16"/>
+              </w:rPr>
+              <w:t>15/15</w:t>
+            </w:r>
+          </w:p>
+        </w:tc>
+        <w:tc>
+          <w:tcPr>
+            <w:tcW w:type="dxa" w:w="539"/>
+          </w:tcPr>
+          <w:p>
+            <w:pPr>
+              <w:spacing w:after="0"/>
+            </w:pPr>
+            <w:r/>
+            <w:r>
+              <w:rPr>
+                <w:rFonts w:ascii="Times New Roman" w:hAnsi="Times New Roman"/>
+                <w:b w:val="0"/>
+                <w:i w:val="0"/>
+                <w:sz w:val="16"/>
+              </w:rPr>
+              <w:t>0/15</w:t>
+            </w:r>
+          </w:p>
+        </w:tc>
+        <w:tc>
+          <w:tcPr>
+            <w:tcW w:type="dxa" w:w="539"/>
+          </w:tcPr>
+          <w:p>
+            <w:pPr>
+              <w:spacing w:after="0"/>
+            </w:pPr>
+            <w:r/>
+            <w:r>
+              <w:rPr>
+                <w:rFonts w:ascii="Times New Roman" w:hAnsi="Times New Roman"/>
+                <w:b w:val="0"/>
+                <w:i w:val="0"/>
+                <w:sz w:val="16"/>
+              </w:rPr>
+              <w:t>40–61 s</w:t>
+            </w:r>
+          </w:p>
+        </w:tc>
+      </w:tr>
+      <w:tr>
+        <w:tc>
+          <w:tcPr>
+            <w:tcW w:type="dxa" w:w="1411"/>
+          </w:tcPr>
+          <w:p>
+            <w:pPr>
+              <w:spacing w:after="0"/>
+            </w:pPr>
+            <w:r/>
+            <w:r>
+              <w:rPr>
+                <w:rFonts w:ascii="Times New Roman" w:hAnsi="Times New Roman"/>
+                <w:b w:val="0"/>
+                <w:i w:val="0"/>
+                <w:sz w:val="16"/>
+              </w:rPr>
+              <w:t>Gate B: real signing, TALUS view</w:t>
+            </w:r>
+          </w:p>
+        </w:tc>
+        <w:tc>
+          <w:tcPr>
+            <w:tcW w:type="dxa" w:w="373"/>
+          </w:tcPr>
+          <w:p>
+            <w:pPr>
+              <w:spacing w:after="0"/>
+            </w:pPr>
+            <w:r/>
+            <w:r>
+              <w:rPr>
+                <w:rFonts w:ascii="Times New Roman" w:hAnsi="Times New Roman"/>
+                <w:b w:val="0"/>
+                <w:i w:val="0"/>
+                <w:sz w:val="16"/>
+              </w:rPr>
+              <w:t>2029</w:t>
+            </w:r>
+          </w:p>
+        </w:tc>
+        <w:tc>
+          <w:tcPr>
+            <w:tcW w:type="dxa" w:w="788"/>
+          </w:tcPr>
+          <w:p>
+            <w:pPr>
+              <w:spacing w:after="0"/>
+            </w:pPr>
+            <w:r/>
+            <w:r>
+              <w:rPr>
+                <w:rFonts w:ascii="Times New Roman" w:hAnsi="Times New Roman"/>
+                <w:b w:val="0"/>
+                <w:i w:val="0"/>
+                <w:sz w:val="16"/>
+              </w:rPr>
+              <w:t>2 × {1,2,4}e5</w:t>
+            </w:r>
+          </w:p>
+        </w:tc>
+        <w:tc>
+          <w:tcPr>
+            <w:tcW w:type="dxa" w:w="705"/>
+          </w:tcPr>
+          <w:p>
+            <w:pPr>
+              <w:spacing w:after="0"/>
+            </w:pPr>
+            <w:r/>
+            <w:r>
+              <w:rPr>
+                <w:rFonts w:ascii="Times New Roman" w:hAnsi="Times New Roman"/>
+                <w:b w:val="0"/>
+                <w:i w:val="0"/>
+                <w:sz w:val="16"/>
+              </w:rPr>
+              <w:t>0/2, 2/2, 2/2</w:t>
+            </w:r>
+          </w:p>
+        </w:tc>
+        <w:tc>
+          <w:tcPr>
+            <w:tcW w:type="dxa" w:w="539"/>
+          </w:tcPr>
+          <w:p>
+            <w:pPr>
+              <w:spacing w:after="0"/>
+            </w:pPr>
+            <w:r/>
+            <w:r>
+              <w:rPr>
+                <w:rFonts w:ascii="Times New Roman" w:hAnsi="Times New Roman"/>
+                <w:b w:val="0"/>
+                <w:i w:val="0"/>
+                <w:sz w:val="16"/>
+              </w:rPr>
+              <w:t>–</w:t>
+            </w:r>
+          </w:p>
+        </w:tc>
+        <w:tc>
+          <w:tcPr>
+            <w:tcW w:type="dxa" w:w="539"/>
+          </w:tcPr>
+          <w:p>
+            <w:pPr>
+              <w:spacing w:after="0"/>
+            </w:pPr>
+            <w:r/>
+            <w:r>
+              <w:rPr>
+                <w:rFonts w:ascii="Times New Roman" w:hAnsi="Times New Roman"/>
+                <w:b w:val="0"/>
+                <w:i w:val="0"/>
+                <w:sz w:val="16"/>
+              </w:rPr>
+              <w:t>–</w:t>
+            </w:r>
+          </w:p>
+        </w:tc>
+        <w:tc>
+          <w:tcPr>
+            <w:tcW w:type="dxa" w:w="539"/>
+          </w:tcPr>
+          <w:p>
+            <w:pPr>
+              <w:spacing w:after="0"/>
+            </w:pPr>
+            <w:r/>
+            <w:r>
+              <w:rPr>
+                <w:rFonts w:ascii="Times New Roman" w:hAnsi="Times New Roman"/>
+                <w:b w:val="0"/>
+                <w:i w:val="0"/>
+                <w:sz w:val="16"/>
+              </w:rPr>
+              <w:t>46–67 s</w:t>
+            </w:r>
+          </w:p>
+        </w:tc>
+      </w:tr>
+    </w:tbl>
+    <w:p>
+      <w:pPr>
+        <w:spacing w:after="40"/>
+      </w:pPr>
+    </w:p>
+    <w:p>
+      <w:pPr>
         <w:jc w:val="both"/>
       </w:pPr>
       <w:r>
@@ -12444,8 +13207,465 @@
           <w:i w:val="0"/>
           <w:sz w:val="20"/>
         </w:rPr>
-        <w:t xml:space="preserve"> (a) Key rotation is a fresh key generation (v0.22 Sec. 2.3), not a share refresh, so leakage does not carry over. (b) Rejected attempts stay offline; the rare online failures add at most about 0.03 bits. (c) A corrupt insider subtracts its own nonce shares, but at least T honest shares remain in the MPC profile; the insider wall is 2^24.8–2^29.7, 12–16 bits above the cap, and a simulation with two honest shares (n = 8) shows maximum likelihood needs 1.5–2× the formula, so the formula favours the attacker. (Only the non-proposed TEE variant falls below the cap, from T = 7, as the authors concede.) (d) A corrupt coordinator sees an out-of-box value once per 2^33.1/2^35.5/2^37.3 sessions by our exact convolution, within one bit of the authors' figures. (e) Below the wall the estimate is only a soft hint (43% of coefficients right at the cap); used in a lattice attack it lowers the ML-DSA-44 key-recovery cost from 2^123.8 to 2^120.6, so no lattice finish under the cap.</w:t>
+        <w:t xml:space="preserve"> (a) Key rotation is a fresh key generation (v0.22 Sec. 2.3), not a share refresh, so leakage does not carry over. (b) Rejected attempts stay offline; the rare online failures add at most about 0.03 bits. (c) A corrupt insider subtracts its own nonce shares, but at least T honest shares remain in the MPC profile; the insider wall is 2^24.8–2^29.7, 12–16 bits above the cap (Table XI), and a simulation with two honest shares (n = 8) shows maximum likelihood needs 1.5–2× the formula, so the formula favours the attacker. (Only the non-proposed TEE variant falls below the cap, from T = 7, 11 and 9 for ML-DSA-44/65/87, as the authors concede.) (d) A corrupt coordinator sees an out-of-box value once per 2^33.1/2^35.5/2^37.3 sessions by our exact convolution, within one bit of the authors' figures. (e) Below the wall the estimate is only a soft hint (43% of coefficients right at the cap); used in a lattice attack it lowers the ML-DSA-44 key-recovery cost from 2^123.8 to 2^120.6, so no lattice finish under the cap.</w:t>
       </w:r>
+    </w:p>
+    <w:p>
+      <w:pPr>
+        <w:keepNext/>
+        <w:spacing w:after="40"/>
+        <w:jc w:val="center"/>
+      </w:pPr>
+      <w:r>
+        <w:rPr>
+          <w:rFonts w:ascii="Times New Roman" w:hAnsi="Times New Roman"/>
+          <w:b w:val="0"/>
+          <w:i w:val="0"/>
+          <w:sz w:val="16"/>
+        </w:rPr>
+        <w:t xml:space="preserve">TABLE XI. </w:t>
+      </w:r>
+      <w:r>
+        <w:rPr>
+          <w:rFonts w:ascii="Times New Roman" w:hAnsi="Times New Roman"/>
+          <w:b w:val="0"/>
+          <w:i w:val="0"/>
+          <w:sz w:val="16"/>
+        </w:rPr>
+        <w:t>TALUS insider walls (signatures a corrupt insider needs), rough Fisher formula; m = 2 case checked exactly</w:t>
+      </w:r>
+    </w:p>
+    <w:tbl>
+      <w:tblPr>
+        <w:tblStyle w:val="TableGrid"/>
+        <w:tblW w:type="auto" w:w="0"/>
+        <w:tblLook w:firstColumn="1" w:firstRow="1" w:lastColumn="0" w:lastRow="0" w:noHBand="0" w:noVBand="1" w:val="04A0"/>
+      </w:tblPr>
+      <w:tblGrid>
+        <w:gridCol w:w="1950"/>
+        <w:gridCol w:w="1950"/>
+        <w:gridCol w:w="1950"/>
+        <w:gridCol w:w="1950"/>
+        <w:gridCol w:w="1950"/>
+      </w:tblGrid>
+      <w:tr>
+        <w:tc>
+          <w:tcPr>
+            <w:tcW w:type="dxa" w:w="1064"/>
+            <w:shd w:val="clear" w:color="auto" w:fill="D9D9D9"/>
+          </w:tcPr>
+          <w:p>
+            <w:pPr>
+              <w:spacing w:after="0"/>
+            </w:pPr>
+            <w:r/>
+            <w:r>
+              <w:rPr>
+                <w:rFonts w:ascii="Times New Roman" w:hAnsi="Times New Roman"/>
+                <w:b/>
+                <w:i w:val="0"/>
+                <w:sz w:val="16"/>
+              </w:rPr>
+              <w:t>Set (cap)</w:t>
+            </w:r>
+          </w:p>
+        </w:tc>
+        <w:tc>
+          <w:tcPr>
+            <w:tcW w:type="dxa" w:w="1064"/>
+            <w:shd w:val="clear" w:color="auto" w:fill="D9D9D9"/>
+          </w:tcPr>
+          <w:p>
+            <w:pPr>
+              <w:spacing w:after="0"/>
+            </w:pPr>
+            <w:r/>
+            <w:r>
+              <w:rPr>
+                <w:rFonts w:ascii="Times New Roman" w:hAnsi="Times New Roman"/>
+                <w:b/>
+                <w:i w:val="0"/>
+                <w:sz w:val="16"/>
+              </w:rPr>
+              <w:t>MPC insider, T = 2..6</w:t>
+            </w:r>
+          </w:p>
+        </w:tc>
+        <w:tc>
+          <w:tcPr>
+            <w:tcW w:type="dxa" w:w="937"/>
+            <w:shd w:val="clear" w:color="auto" w:fill="D9D9D9"/>
+          </w:tcPr>
+          <w:p>
+            <w:pPr>
+              <w:spacing w:after="0"/>
+            </w:pPr>
+            <w:r/>
+            <w:r>
+              <w:rPr>
+                <w:rFonts w:ascii="Times New Roman" w:hAnsi="Times New Roman"/>
+                <w:b/>
+                <w:i w:val="0"/>
+                <w:sz w:val="16"/>
+              </w:rPr>
+              <w:t>Margin over cap</w:t>
+            </w:r>
+          </w:p>
+        </w:tc>
+        <w:tc>
+          <w:tcPr>
+            <w:tcW w:type="dxa" w:w="979"/>
+            <w:shd w:val="clear" w:color="auto" w:fill="D9D9D9"/>
+          </w:tcPr>
+          <w:p>
+            <w:pPr>
+              <w:spacing w:after="0"/>
+            </w:pPr>
+            <w:r/>
+            <w:r>
+              <w:rPr>
+                <w:rFonts w:ascii="Times New Roman" w:hAnsi="Times New Roman"/>
+                <w:b/>
+                <w:i w:val="0"/>
+                <w:sz w:val="16"/>
+              </w:rPr>
+              <w:t>TEE coalition, T = 2</w:t>
+            </w:r>
+          </w:p>
+        </w:tc>
+        <w:tc>
+          <w:tcPr>
+            <w:tcW w:type="dxa" w:w="851"/>
+            <w:shd w:val="clear" w:color="auto" w:fill="D9D9D9"/>
+          </w:tcPr>
+          <w:p>
+            <w:pPr>
+              <w:spacing w:after="0"/>
+            </w:pPr>
+            <w:r/>
+            <w:r>
+              <w:rPr>
+                <w:rFonts w:ascii="Times New Roman" w:hAnsi="Times New Roman"/>
+                <w:b/>
+                <w:i w:val="0"/>
+                <w:sz w:val="16"/>
+              </w:rPr>
+              <w:t>TEE below cap from</w:t>
+            </w:r>
+          </w:p>
+        </w:tc>
+      </w:tr>
+      <w:tr>
+        <w:tc>
+          <w:tcPr>
+            <w:tcW w:type="dxa" w:w="1064"/>
+          </w:tcPr>
+          <w:p>
+            <w:pPr>
+              <w:spacing w:after="0"/>
+            </w:pPr>
+            <w:r/>
+            <w:r>
+              <w:rPr>
+                <w:rFonts w:ascii="Times New Roman" w:hAnsi="Times New Roman"/>
+                <w:b w:val="0"/>
+                <w:i w:val="0"/>
+                <w:sz w:val="16"/>
+              </w:rPr>
+              <w:t>ML-DSA-44 (2^13)</w:t>
+            </w:r>
+          </w:p>
+        </w:tc>
+        <w:tc>
+          <w:tcPr>
+            <w:tcW w:type="dxa" w:w="1064"/>
+          </w:tcPr>
+          <w:p>
+            <w:pPr>
+              <w:spacing w:after="0"/>
+            </w:pPr>
+            <w:r/>
+            <w:r>
+              <w:rPr>
+                <w:rFonts w:ascii="Times New Roman" w:hAnsi="Times New Roman"/>
+                <w:b w:val="0"/>
+                <w:i w:val="0"/>
+                <w:sz w:val="16"/>
+              </w:rPr>
+              <w:t>2^24.8–2^26.1</w:t>
+            </w:r>
+          </w:p>
+        </w:tc>
+        <w:tc>
+          <w:tcPr>
+            <w:tcW w:type="dxa" w:w="937"/>
+          </w:tcPr>
+          <w:p>
+            <w:pPr>
+              <w:spacing w:after="0"/>
+            </w:pPr>
+            <w:r/>
+            <w:r>
+              <w:rPr>
+                <w:rFonts w:ascii="Times New Roman" w:hAnsi="Times New Roman"/>
+                <w:b w:val="0"/>
+                <w:i w:val="0"/>
+                <w:sz w:val="16"/>
+              </w:rPr>
+              <w:t>+11.8 to +13.1</w:t>
+            </w:r>
+          </w:p>
+        </w:tc>
+        <w:tc>
+          <w:tcPr>
+            <w:tcW w:type="dxa" w:w="979"/>
+          </w:tcPr>
+          <w:p>
+            <w:pPr>
+              <w:spacing w:after="0"/>
+            </w:pPr>
+            <w:r/>
+            <w:r>
+              <w:rPr>
+                <w:rFonts w:ascii="Times New Roman" w:hAnsi="Times New Roman"/>
+                <w:b w:val="0"/>
+                <w:i w:val="0"/>
+                <w:sz w:val="16"/>
+              </w:rPr>
+              <w:t>2^14.6</w:t>
+            </w:r>
+          </w:p>
+        </w:tc>
+        <w:tc>
+          <w:tcPr>
+            <w:tcW w:type="dxa" w:w="851"/>
+          </w:tcPr>
+          <w:p>
+            <w:pPr>
+              <w:spacing w:after="0"/>
+            </w:pPr>
+            <w:r/>
+            <w:r>
+              <w:rPr>
+                <w:rFonts w:ascii="Times New Roman" w:hAnsi="Times New Roman"/>
+                <w:b w:val="0"/>
+                <w:i w:val="0"/>
+                <w:sz w:val="16"/>
+              </w:rPr>
+              <w:t>T = 7</w:t>
+            </w:r>
+          </w:p>
+        </w:tc>
+      </w:tr>
+      <w:tr>
+        <w:tc>
+          <w:tcPr>
+            <w:tcW w:type="dxa" w:w="1064"/>
+          </w:tcPr>
+          <w:p>
+            <w:pPr>
+              <w:spacing w:after="0"/>
+            </w:pPr>
+            <w:r/>
+            <w:r>
+              <w:rPr>
+                <w:rFonts w:ascii="Times New Roman" w:hAnsi="Times New Roman"/>
+                <w:b w:val="0"/>
+                <w:i w:val="0"/>
+                <w:sz w:val="16"/>
+              </w:rPr>
+              <w:t>ML-DSA-65 (2^14)</w:t>
+            </w:r>
+          </w:p>
+        </w:tc>
+        <w:tc>
+          <w:tcPr>
+            <w:tcW w:type="dxa" w:w="1064"/>
+          </w:tcPr>
+          <w:p>
+            <w:pPr>
+              <w:spacing w:after="0"/>
+            </w:pPr>
+            <w:r/>
+            <w:r>
+              <w:rPr>
+                <w:rFonts w:ascii="Times New Roman" w:hAnsi="Times New Roman"/>
+                <w:b w:val="0"/>
+                <w:i w:val="0"/>
+                <w:sz w:val="16"/>
+              </w:rPr>
+              <w:t>2^28.5–2^29.7</w:t>
+            </w:r>
+          </w:p>
+        </w:tc>
+        <w:tc>
+          <w:tcPr>
+            <w:tcW w:type="dxa" w:w="937"/>
+          </w:tcPr>
+          <w:p>
+            <w:pPr>
+              <w:spacing w:after="0"/>
+            </w:pPr>
+            <w:r/>
+            <w:r>
+              <w:rPr>
+                <w:rFonts w:ascii="Times New Roman" w:hAnsi="Times New Roman"/>
+                <w:b w:val="0"/>
+                <w:i w:val="0"/>
+                <w:sz w:val="16"/>
+              </w:rPr>
+              <w:t>+14.5 to +15.7</w:t>
+            </w:r>
+          </w:p>
+        </w:tc>
+        <w:tc>
+          <w:tcPr>
+            <w:tcW w:type="dxa" w:w="979"/>
+          </w:tcPr>
+          <w:p>
+            <w:pPr>
+              <w:spacing w:after="0"/>
+            </w:pPr>
+            <w:r/>
+            <w:r>
+              <w:rPr>
+                <w:rFonts w:ascii="Times New Roman" w:hAnsi="Times New Roman"/>
+                <w:b w:val="0"/>
+                <w:i w:val="0"/>
+                <w:sz w:val="16"/>
+              </w:rPr>
+              <w:t>2^16.4</w:t>
+            </w:r>
+          </w:p>
+        </w:tc>
+        <w:tc>
+          <w:tcPr>
+            <w:tcW w:type="dxa" w:w="851"/>
+          </w:tcPr>
+          <w:p>
+            <w:pPr>
+              <w:spacing w:after="0"/>
+            </w:pPr>
+            <w:r/>
+            <w:r>
+              <w:rPr>
+                <w:rFonts w:ascii="Times New Roman" w:hAnsi="Times New Roman"/>
+                <w:b w:val="0"/>
+                <w:i w:val="0"/>
+                <w:sz w:val="16"/>
+              </w:rPr>
+              <w:t>T = 11</w:t>
+            </w:r>
+          </w:p>
+        </w:tc>
+      </w:tr>
+      <w:tr>
+        <w:tc>
+          <w:tcPr>
+            <w:tcW w:type="dxa" w:w="1064"/>
+          </w:tcPr>
+          <w:p>
+            <w:pPr>
+              <w:spacing w:after="0"/>
+            </w:pPr>
+            <w:r/>
+            <w:r>
+              <w:rPr>
+                <w:rFonts w:ascii="Times New Roman" w:hAnsi="Times New Roman"/>
+                <w:b w:val="0"/>
+                <w:i w:val="0"/>
+                <w:sz w:val="16"/>
+              </w:rPr>
+              <w:t>ML-DSA-87 (2^14)</w:t>
+            </w:r>
+          </w:p>
+        </w:tc>
+        <w:tc>
+          <w:tcPr>
+            <w:tcW w:type="dxa" w:w="1064"/>
+          </w:tcPr>
+          <w:p>
+            <w:pPr>
+              <w:spacing w:after="0"/>
+            </w:pPr>
+            <w:r/>
+            <w:r>
+              <w:rPr>
+                <w:rFonts w:ascii="Times New Roman" w:hAnsi="Times New Roman"/>
+                <w:b w:val="0"/>
+                <w:i w:val="0"/>
+                <w:sz w:val="16"/>
+              </w:rPr>
+              <w:t>2^28.2–2^29.4</w:t>
+            </w:r>
+          </w:p>
+        </w:tc>
+        <w:tc>
+          <w:tcPr>
+            <w:tcW w:type="dxa" w:w="937"/>
+          </w:tcPr>
+          <w:p>
+            <w:pPr>
+              <w:spacing w:after="0"/>
+            </w:pPr>
+            <w:r/>
+            <w:r>
+              <w:rPr>
+                <w:rFonts w:ascii="Times New Roman" w:hAnsi="Times New Roman"/>
+                <w:b w:val="0"/>
+                <w:i w:val="0"/>
+                <w:sz w:val="16"/>
+              </w:rPr>
+              <w:t>+14.2 to +15.4</w:t>
+            </w:r>
+          </w:p>
+        </w:tc>
+        <w:tc>
+          <w:tcPr>
+            <w:tcW w:type="dxa" w:w="979"/>
+          </w:tcPr>
+          <w:p>
+            <w:pPr>
+              <w:spacing w:after="0"/>
+            </w:pPr>
+            <w:r/>
+            <w:r>
+              <w:rPr>
+                <w:rFonts w:ascii="Times New Roman" w:hAnsi="Times New Roman"/>
+                <w:b w:val="0"/>
+                <w:i w:val="0"/>
+                <w:sz w:val="16"/>
+              </w:rPr>
+              <w:t>2^16.1</w:t>
+            </w:r>
+          </w:p>
+        </w:tc>
+        <w:tc>
+          <w:tcPr>
+            <w:tcW w:type="dxa" w:w="851"/>
+          </w:tcPr>
+          <w:p>
+            <w:pPr>
+              <w:spacing w:after="0"/>
+            </w:pPr>
+            <w:r/>
+            <w:r>
+              <w:rPr>
+                <w:rFonts w:ascii="Times New Roman" w:hAnsi="Times New Roman"/>
+                <w:b w:val="0"/>
+                <w:i w:val="0"/>
+                <w:sz w:val="16"/>
+              </w:rPr>
+              <w:t>T = 9</w:t>
+            </w:r>
+          </w:p>
+        </w:tc>
+      </w:tr>
+    </w:tbl>
+    <w:p>
+      <w:pPr>
+        <w:spacing w:after="40"/>
+      </w:pPr>
     </w:p>
     <w:p>
       <w:pPr>
@@ -12467,7 +13687,72 @@
           <w:i w:val="0"/>
           <w:sz w:val="20"/>
         </w:rPr>
-        <w:t xml:space="preserve"> We first ran the edge estimator on reduced rings (n = 8 to 128, 10–20 trials per point, ML-DSA-44 numbers). Per-element N* flattened around 1–2×10^5 (n = 64: 2.8×10^5; n = 128: 1.9×10^5) instead of falling toward the cap, which is why the full-size runs above were then made denser. At n = 64 the harder target s2 − t0 needed the same N* as s2, and plain LowBits noise behaved like BCC noise. Relative to plain least squares (about 3.6×10^9 in our model) the edge estimator is worth about four orders of magnitude, yet without ILP it stays 4–4.5 bits above the cap. The least-squares figure is about 12 times estimate (1) (3.1×10^8) for a simple reason: (1) only asks that the typical per-coefficient error fall to 1/2, whereas rounding all 256 coefficients correctly at once needs the error about 3.5 standard deviations inside 1/2, and since error shrinks like 1/√N this costs a factor of about 3.5² ≈ 12 in N. The theory module explains the shape: for one coefficient alone the uniform-noise error falls like 1/N exactly (checked by Monte Carlo), and when all 256 coefficients are solved jointly a fitted coupling constant (about 0.76·τ^0.42) accounts for the real N* sitting 1.5–2 bits above the single-coefficient formula. ILP finishing lowers the 50% point by 1.0×, 1.1×, 1.1× and 1.5× at n = 8, 16, 32 and 64, consistent with the roughly 2× at n = 256.</w:t>
+        <w:t xml:space="preserve"> We first ran the edge estimator on reduced rings (n = 8 to 128, 10–20 trials per point, ML-DSA-44 numbers; Fig. 4). Per-element N* flattened around 1–2×10^5 (n = 64: 2.8×10^5; n = 128: 1.9×10^5) instead of falling toward the cap, which is why the full-size runs above were then made denser. At n = 64 the harder target s2 − t0 needed the same N* as s2, and plain LowBits noise behaved like BCC noise. Relative to plain least squares (about 3.6×10^9 in our model) the edge estimator is worth about four orders of magnitude, yet without ILP it stays 4–4.5 bits above the cap. The least-squares figure is about 12 times estimate (1) (3.1×10^8) for a simple reason: (1) only asks that the typical per-coefficient error fall to 1/2, whereas rounding all 256 coefficients correctly at once needs the error about 3.5 standard deviations inside 1/2, and since error shrinks like 1/√N this costs a factor of about 3.5² ≈ 12 in N. The theory module explains the shape: for one coefficient alone the uniform-noise error falls like 1/N exactly (checked by Monte Carlo), and when all 256 coefficients are solved jointly a fitted coupling constant (about 0.76·τ^0.42) accounts for the real N* sitting 1.5–2 bits above the single-coefficient formula. ILP finishing lowers the 50% point by 1.0×, 1.1×, 1.1× and 1.5× at n = 8, 16, 32 and 64, consistent with the roughly 2× at n = 256.</w:t>
+      </w:r>
+    </w:p>
+    <w:p>
+      <w:pPr>
+        <w:keepNext/>
+        <w:spacing w:after="20"/>
+        <w:jc w:val="center"/>
+      </w:pPr>
+      <w:r>
+        <w:drawing>
+          <wp:inline xmlns:a="http://schemas.openxmlformats.org/drawingml/2006/main" xmlns:pic="http://schemas.openxmlformats.org/drawingml/2006/picture">
+            <wp:extent cx="2926080" cy="2090057"/>
+            <wp:docPr id="4" name="Picture 4"/>
+            <wp:cNvGraphicFramePr>
+              <a:graphicFrameLocks noChangeAspect="1"/>
+            </wp:cNvGraphicFramePr>
+            <a:graphic>
+              <a:graphicData uri="http://schemas.openxmlformats.org/drawingml/2006/picture">
+                <pic:pic>
+                  <pic:nvPicPr>
+                    <pic:cNvPr id="0" name="talus_ladder.png"/>
+                    <pic:cNvPicPr/>
+                  </pic:nvPicPr>
+                  <pic:blipFill>
+                    <a:blip r:embed="rId12"/>
+                    <a:stretch>
+                      <a:fillRect/>
+                    </a:stretch>
+                  </pic:blipFill>
+                  <pic:spPr>
+                    <a:xfrm>
+                      <a:off x="0" y="0"/>
+                      <a:ext cx="2926080" cy="2090057"/>
+                    </a:xfrm>
+                    <a:prstGeom prst="rect"/>
+                  </pic:spPr>
+                </pic:pic>
+              </a:graphicData>
+            </a:graphic>
+          </wp:inline>
+        </w:drawing>
+      </w:r>
+    </w:p>
+    <w:p>
+      <w:pPr>
+        <w:spacing w:after="100"/>
+        <w:jc w:val="both"/>
+      </w:pPr>
+      <w:r>
+        <w:rPr>
+          <w:rFonts w:ascii="Times New Roman" w:hAnsi="Times New Roman"/>
+          <w:b w:val="0"/>
+          <w:i w:val="0"/>
+          <w:sz w:val="16"/>
+        </w:rPr>
+        <w:t xml:space="preserve">Fig. 4. </w:t>
+      </w:r>
+      <w:r>
+        <w:rPr>
+          <w:rFonts w:ascii="Times New Roman" w:hAnsi="Times New Roman"/>
+          <w:b w:val="0"/>
+          <w:i w:val="0"/>
+          <w:sz w:val="16"/>
+        </w:rPr>
+        <w:t>Edge-estimator success (rounding, no ILP) for one ring element against N, ML-DSA-44 BCC channel, ring size n = 8 to 256 (20 or 10 trials per point as labelled; script default seed 2026). Larger rings need fewer signatures per element, so the full size n = 256 is the relevant one and toy sizes are pessimistic for the attacker.</w:t>
       </w:r>
     </w:p>
     <w:p>
@@ -12551,7 +13836,7 @@
           <w:i w:val="0"/>
           <w:sz w:val="20"/>
         </w:rPr>
-        <w:t xml:space="preserve"> Theorem 3.2 of [4] bounds the number of safe queries through a hyperball-intersection lemma taken from the ePrint full version of Devevey et al. [25] (App. A.6). That bound uses exponent n−1 where a correct cylinder argument gives (n−1)/2; for ML-DSA-44 it gives 2^-50.1 where the exact value is 2^-33.5 (reproduced with the authors' own Sage parameter script). With the published parameters the theorem then covers Q_s = 2^26–2^37 rather than 2^50. Under the typical norm distribution (heuristic, not a proof) most sets still reach 2^50, some fall up to about 3 bits short; corrected parameters need 1.3× to 8.5× more parallel repetitions K. The faulty bound is ePrint-only (the ASIACRYPT version states only the exact formula), and among 13 citing works we checked only Mithril uses it; HAETAE [34], the other main hyperball scheme, evaluates the exact incomplete-Beta value numerically and is unaffected. Seen from the other side, reaching 2^50 with the published radii would require the norm bound B in the proof to sit only 0–7 standard deviations above the mean norm of c·s, whereas the proof needs an overwhelming bound (the paper's footnote says about 13). This is a proof gap, not an attack: exceeding the bound slightly enlarges a Rényi-divergence budget and does not obviously reveal s. We wrote a corrected bound with proof (exponent (n−1)/2, within 0.04 bits of the exact value at Mithril sizes; 320 test points, 0 violations, while the printed bound fails at 149). </w:t>
+        <w:t xml:space="preserve"> Theorem 3.2 of [4] bounds the number of safe queries through a hyperball-intersection lemma taken from the ePrint full version of Devevey et al. [25] (App. A.6). That bound uses exponent n−1 where a correct cylinder argument gives (n−1)/2; for ML-DSA-44 it gives 2^-50.1 where the exact value is 2^-33.5 (reproduced with the authors' own Sage parameter script). With the published parameters the theorem then covers Q_s = 2^26–2^37 rather than 2^50. Under the typical norm distribution (heuristic, not a proof) most sets still reach 2^50, some fall up to about 3 bits short; corrected parameters need 1.3× to 8.5× more parallel repetitions K (Table XII). The faulty bound is ePrint-only (the ASIACRYPT version states only the exact formula), and among 13 citing works we checked only Mithril uses it; HAETAE [34], the other main hyperball scheme, evaluates the exact incomplete-Beta value numerically and is unaffected. Seen from the other side, reaching 2^50 with the published radii would require the norm bound B in the proof to sit only 0–7 standard deviations above the mean norm of c·s, whereas the proof needs an overwhelming bound (the paper's footnote says about 13). This is a proof gap, not an attack: exceeding the bound slightly enlarges a Rényi-divergence budget and does not obviously reveal s. We wrote a corrected bound with proof (exponent (n−1)/2, within 0.04 bits of the exact value at Mithril sizes; 320 test points, 0 violations, while the printed bound fails at 149). </w:t>
       </w:r>
       <w:r>
         <w:rPr>
@@ -12587,7 +13872,7 @@
           <w:i w:val="0"/>
           <w:sz w:val="20"/>
         </w:rPr>
-        <w:t xml:space="preserve"> With the exact share subset of T−1 parties, the lattice estimator gives losses of 4.9–7.7 (ML-DSA-44), 17.7–23.9 (-65) and 8.6–14.4 bits (-87), against the reported 7–12 (Table X).</w:t>
+        <w:t xml:space="preserve"> With the exact share subset of T−1 parties, the lattice estimator gives losses of 4.9–7.7 (ML-DSA-44), 17.7–23.9 (-65) and 8.6–14.4 bits (-87), against the reported 7–12 (Table XIII).</w:t>
       </w:r>
     </w:p>
     <w:p>
@@ -12603,7 +13888,546 @@
           <w:i w:val="0"/>
           <w:sz w:val="16"/>
         </w:rPr>
-        <w:t xml:space="preserve">TABLE X. </w:t>
+        <w:t xml:space="preserve">TABLE XII. </w:t>
+      </w:r>
+      <w:r>
+        <w:rPr>
+          <w:rFonts w:ascii="Times New Roman" w:hAnsi="Times New Roman"/>
+          <w:b w:val="0"/>
+          <w:i w:val="0"/>
+          <w:sz w:val="16"/>
+        </w:rPr>
+        <w:t>Mithril: signing queries Q_s covered, over all 45 published parameter sets (claimed 2^50); typical case is a heuristic from the empirical norm distribution; K factor is the extra parallel repetitions after correcting the lemma</w:t>
+      </w:r>
+    </w:p>
+    <w:tbl>
+      <w:tblPr>
+        <w:tblStyle w:val="TableGrid"/>
+        <w:tblW w:type="auto" w:w="0"/>
+        <w:tblLook w:firstColumn="1" w:firstRow="1" w:lastColumn="0" w:lastRow="0" w:noHBand="0" w:noVBand="1" w:val="04A0"/>
+      </w:tblPr>
+      <w:tblGrid>
+        <w:gridCol w:w="1625"/>
+        <w:gridCol w:w="1625"/>
+        <w:gridCol w:w="1625"/>
+        <w:gridCol w:w="1625"/>
+        <w:gridCol w:w="1625"/>
+        <w:gridCol w:w="1625"/>
+      </w:tblGrid>
+      <w:tr>
+        <w:tc>
+          <w:tcPr>
+            <w:tcW w:type="dxa" w:w="857"/>
+            <w:shd w:val="clear" w:color="auto" w:fill="D9D9D9"/>
+          </w:tcPr>
+          <w:p>
+            <w:pPr>
+              <w:spacing w:after="0"/>
+            </w:pPr>
+            <w:r/>
+            <w:r>
+              <w:rPr>
+                <w:rFonts w:ascii="Times New Roman" w:hAnsi="Times New Roman"/>
+                <w:b/>
+                <w:i w:val="0"/>
+                <w:sz w:val="16"/>
+              </w:rPr>
+              <w:t>Set (15 (T,N) each)</w:t>
+            </w:r>
+          </w:p>
+        </w:tc>
+        <w:tc>
+          <w:tcPr>
+            <w:tcW w:type="dxa" w:w="898"/>
+            <w:shd w:val="clear" w:color="auto" w:fill="D9D9D9"/>
+          </w:tcPr>
+          <w:p>
+            <w:pPr>
+              <w:spacing w:after="0"/>
+            </w:pPr>
+            <w:r/>
+            <w:r>
+              <w:rPr>
+                <w:rFonts w:ascii="Times New Roman" w:hAnsi="Times New Roman"/>
+                <w:b/>
+                <w:i w:val="0"/>
+                <w:sz w:val="16"/>
+              </w:rPr>
+              <w:t>Thm 3.2, paper's B</w:t>
+            </w:r>
+          </w:p>
+        </w:tc>
+        <w:tc>
+          <w:tcPr>
+            <w:tcW w:type="dxa" w:w="857"/>
+            <w:shd w:val="clear" w:color="auto" w:fill="D9D9D9"/>
+          </w:tcPr>
+          <w:p>
+            <w:pPr>
+              <w:spacing w:after="0"/>
+            </w:pPr>
+            <w:r/>
+            <w:r>
+              <w:rPr>
+                <w:rFonts w:ascii="Times New Roman" w:hAnsi="Times New Roman"/>
+                <w:b/>
+                <w:i w:val="0"/>
+                <w:sz w:val="16"/>
+              </w:rPr>
+              <w:t>Typical case</w:t>
+            </w:r>
+          </w:p>
+        </w:tc>
+        <w:tc>
+          <w:tcPr>
+            <w:tcW w:type="dxa" w:w="530"/>
+            <w:shd w:val="clear" w:color="auto" w:fill="D9D9D9"/>
+          </w:tcPr>
+          <w:p>
+            <w:pPr>
+              <w:spacing w:after="0"/>
+            </w:pPr>
+            <w:r/>
+            <w:r>
+              <w:rPr>
+                <w:rFonts w:ascii="Times New Roman" w:hAnsi="Times New Roman"/>
+                <w:b/>
+                <w:i w:val="0"/>
+                <w:sz w:val="16"/>
+              </w:rPr>
+              <w:t>Below 2^50</w:t>
+            </w:r>
+          </w:p>
+        </w:tc>
+        <w:tc>
+          <w:tcPr>
+            <w:tcW w:type="dxa" w:w="653"/>
+            <w:shd w:val="clear" w:color="auto" w:fill="D9D9D9"/>
+          </w:tcPr>
+          <w:p>
+            <w:pPr>
+              <w:spacing w:after="0"/>
+            </w:pPr>
+            <w:r/>
+            <w:r>
+              <w:rPr>
+                <w:rFonts w:ascii="Times New Roman" w:hAnsi="Times New Roman"/>
+                <w:b/>
+                <w:i w:val="0"/>
+                <w:sz w:val="16"/>
+              </w:rPr>
+              <w:t>Corrected φ</w:t>
+            </w:r>
+          </w:p>
+        </w:tc>
+        <w:tc>
+          <w:tcPr>
+            <w:tcW w:type="dxa" w:w="1102"/>
+            <w:shd w:val="clear" w:color="auto" w:fill="D9D9D9"/>
+          </w:tcPr>
+          <w:p>
+            <w:pPr>
+              <w:spacing w:after="0"/>
+            </w:pPr>
+            <w:r/>
+            <w:r>
+              <w:rPr>
+                <w:rFonts w:ascii="Times New Roman" w:hAnsi="Times New Roman"/>
+                <w:b/>
+                <w:i w:val="0"/>
+                <w:sz w:val="16"/>
+              </w:rPr>
+              <w:t>K factor, 2^50 / 2^64</w:t>
+            </w:r>
+          </w:p>
+        </w:tc>
+      </w:tr>
+      <w:tr>
+        <w:tc>
+          <w:tcPr>
+            <w:tcW w:type="dxa" w:w="857"/>
+          </w:tcPr>
+          <w:p>
+            <w:pPr>
+              <w:spacing w:after="0"/>
+            </w:pPr>
+            <w:r/>
+            <w:r>
+              <w:rPr>
+                <w:rFonts w:ascii="Times New Roman" w:hAnsi="Times New Roman"/>
+                <w:b w:val="0"/>
+                <w:i w:val="0"/>
+                <w:sz w:val="16"/>
+              </w:rPr>
+              <w:t>ML-DSA-44</w:t>
+            </w:r>
+          </w:p>
+        </w:tc>
+        <w:tc>
+          <w:tcPr>
+            <w:tcW w:type="dxa" w:w="898"/>
+          </w:tcPr>
+          <w:p>
+            <w:pPr>
+              <w:spacing w:after="0"/>
+            </w:pPr>
+            <w:r/>
+            <w:r>
+              <w:rPr>
+                <w:rFonts w:ascii="Times New Roman" w:hAnsi="Times New Roman"/>
+                <w:b w:val="0"/>
+                <w:i w:val="0"/>
+                <w:sz w:val="16"/>
+              </w:rPr>
+              <w:t>2^27.4–2^33.0</w:t>
+            </w:r>
+          </w:p>
+        </w:tc>
+        <w:tc>
+          <w:tcPr>
+            <w:tcW w:type="dxa" w:w="857"/>
+          </w:tcPr>
+          <w:p>
+            <w:pPr>
+              <w:spacing w:after="0"/>
+            </w:pPr>
+            <w:r/>
+            <w:r>
+              <w:rPr>
+                <w:rFonts w:ascii="Times New Roman" w:hAnsi="Times New Roman"/>
+                <w:b w:val="0"/>
+                <w:i w:val="0"/>
+                <w:sz w:val="16"/>
+              </w:rPr>
+              <w:t>2^46.7–2^53.5</w:t>
+            </w:r>
+          </w:p>
+        </w:tc>
+        <w:tc>
+          <w:tcPr>
+            <w:tcW w:type="dxa" w:w="530"/>
+          </w:tcPr>
+          <w:p>
+            <w:pPr>
+              <w:spacing w:after="0"/>
+            </w:pPr>
+            <w:r/>
+            <w:r>
+              <w:rPr>
+                <w:rFonts w:ascii="Times New Roman" w:hAnsi="Times New Roman"/>
+                <w:b w:val="0"/>
+                <w:i w:val="0"/>
+                <w:sz w:val="16"/>
+              </w:rPr>
+              <w:t>3</w:t>
+            </w:r>
+          </w:p>
+        </w:tc>
+        <w:tc>
+          <w:tcPr>
+            <w:tcW w:type="dxa" w:w="653"/>
+          </w:tcPr>
+          <w:p>
+            <w:pPr>
+              <w:spacing w:after="0"/>
+            </w:pPr>
+            <w:r/>
+            <w:r>
+              <w:rPr>
+                <w:rFonts w:ascii="Times New Roman" w:hAnsi="Times New Roman"/>
+                <w:b w:val="0"/>
+                <w:i w:val="0"/>
+                <w:sz w:val="16"/>
+              </w:rPr>
+              <w:t>5.27–5.64</w:t>
+            </w:r>
+          </w:p>
+        </w:tc>
+        <w:tc>
+          <w:tcPr>
+            <w:tcW w:type="dxa" w:w="1102"/>
+          </w:tcPr>
+          <w:p>
+            <w:pPr>
+              <w:spacing w:after="0"/>
+            </w:pPr>
+            <w:r/>
+            <w:r>
+              <w:rPr>
+                <w:rFonts w:ascii="Times New Roman" w:hAnsi="Times New Roman"/>
+                <w:b w:val="0"/>
+                <w:i w:val="0"/>
+                <w:sz w:val="16"/>
+              </w:rPr>
+              <w:t>1.50–3.73 / 2.00–7.16</w:t>
+            </w:r>
+          </w:p>
+        </w:tc>
+      </w:tr>
+      <w:tr>
+        <w:tc>
+          <w:tcPr>
+            <w:tcW w:type="dxa" w:w="857"/>
+          </w:tcPr>
+          <w:p>
+            <w:pPr>
+              <w:spacing w:after="0"/>
+            </w:pPr>
+            <w:r/>
+            <w:r>
+              <w:rPr>
+                <w:rFonts w:ascii="Times New Roman" w:hAnsi="Times New Roman"/>
+                <w:b w:val="0"/>
+                <w:i w:val="0"/>
+                <w:sz w:val="16"/>
+              </w:rPr>
+              <w:t>ML-DSA-65</w:t>
+            </w:r>
+          </w:p>
+        </w:tc>
+        <w:tc>
+          <w:tcPr>
+            <w:tcW w:type="dxa" w:w="898"/>
+          </w:tcPr>
+          <w:p>
+            <w:pPr>
+              <w:spacing w:after="0"/>
+            </w:pPr>
+            <w:r/>
+            <w:r>
+              <w:rPr>
+                <w:rFonts w:ascii="Times New Roman" w:hAnsi="Times New Roman"/>
+                <w:b w:val="0"/>
+                <w:i w:val="0"/>
+                <w:sz w:val="16"/>
+              </w:rPr>
+              <w:t>2^26.0–2^34.9</w:t>
+            </w:r>
+          </w:p>
+        </w:tc>
+        <w:tc>
+          <w:tcPr>
+            <w:tcW w:type="dxa" w:w="857"/>
+          </w:tcPr>
+          <w:p>
+            <w:pPr>
+              <w:spacing w:after="0"/>
+            </w:pPr>
+            <w:r/>
+            <w:r>
+              <w:rPr>
+                <w:rFonts w:ascii="Times New Roman" w:hAnsi="Times New Roman"/>
+                <w:b w:val="0"/>
+                <w:i w:val="0"/>
+                <w:sz w:val="16"/>
+              </w:rPr>
+              <w:t>2^47.4–2^56.5</w:t>
+            </w:r>
+          </w:p>
+        </w:tc>
+        <w:tc>
+          <w:tcPr>
+            <w:tcW w:type="dxa" w:w="530"/>
+          </w:tcPr>
+          <w:p>
+            <w:pPr>
+              <w:spacing w:after="0"/>
+            </w:pPr>
+            <w:r/>
+            <w:r>
+              <w:rPr>
+                <w:rFonts w:ascii="Times New Roman" w:hAnsi="Times New Roman"/>
+                <w:b w:val="0"/>
+                <w:i w:val="0"/>
+                <w:sz w:val="16"/>
+              </w:rPr>
+              <w:t>4</w:t>
+            </w:r>
+          </w:p>
+        </w:tc>
+        <w:tc>
+          <w:tcPr>
+            <w:tcW w:type="dxa" w:w="653"/>
+          </w:tcPr>
+          <w:p>
+            <w:pPr>
+              <w:spacing w:after="0"/>
+            </w:pPr>
+            <w:r/>
+            <w:r>
+              <w:rPr>
+                <w:rFonts w:ascii="Times New Roman" w:hAnsi="Times New Roman"/>
+                <w:b w:val="0"/>
+                <w:i w:val="0"/>
+                <w:sz w:val="16"/>
+              </w:rPr>
+              <w:t>5.92–6.55</w:t>
+            </w:r>
+          </w:p>
+        </w:tc>
+        <w:tc>
+          <w:tcPr>
+            <w:tcW w:type="dxa" w:w="1102"/>
+          </w:tcPr>
+          <w:p>
+            <w:pPr>
+              <w:spacing w:after="0"/>
+            </w:pPr>
+            <w:r/>
+            <w:r>
+              <w:rPr>
+                <w:rFonts w:ascii="Times New Roman" w:hAnsi="Times New Roman"/>
+                <w:b w:val="0"/>
+                <w:i w:val="0"/>
+                <w:sz w:val="16"/>
+              </w:rPr>
+              <w:t>1.60–8.53 / 2.00–23.2</w:t>
+            </w:r>
+          </w:p>
+        </w:tc>
+      </w:tr>
+      <w:tr>
+        <w:tc>
+          <w:tcPr>
+            <w:tcW w:type="dxa" w:w="857"/>
+          </w:tcPr>
+          <w:p>
+            <w:pPr>
+              <w:spacing w:after="0"/>
+            </w:pPr>
+            <w:r/>
+            <w:r>
+              <w:rPr>
+                <w:rFonts w:ascii="Times New Roman" w:hAnsi="Times New Roman"/>
+                <w:b w:val="0"/>
+                <w:i w:val="0"/>
+                <w:sz w:val="16"/>
+              </w:rPr>
+              <w:t>ML-DSA-87</w:t>
+            </w:r>
+          </w:p>
+        </w:tc>
+        <w:tc>
+          <w:tcPr>
+            <w:tcW w:type="dxa" w:w="898"/>
+          </w:tcPr>
+          <w:p>
+            <w:pPr>
+              <w:spacing w:after="0"/>
+            </w:pPr>
+            <w:r/>
+            <w:r>
+              <w:rPr>
+                <w:rFonts w:ascii="Times New Roman" w:hAnsi="Times New Roman"/>
+                <w:b w:val="0"/>
+                <w:i w:val="0"/>
+                <w:sz w:val="16"/>
+              </w:rPr>
+              <w:t>2^30.7–2^37.3</w:t>
+            </w:r>
+          </w:p>
+        </w:tc>
+        <w:tc>
+          <w:tcPr>
+            <w:tcW w:type="dxa" w:w="857"/>
+          </w:tcPr>
+          <w:p>
+            <w:pPr>
+              <w:spacing w:after="0"/>
+            </w:pPr>
+            <w:r/>
+            <w:r>
+              <w:rPr>
+                <w:rFonts w:ascii="Times New Roman" w:hAnsi="Times New Roman"/>
+                <w:b w:val="0"/>
+                <w:i w:val="0"/>
+                <w:sz w:val="16"/>
+              </w:rPr>
+              <w:t>2^53.7–2^60.6</w:t>
+            </w:r>
+          </w:p>
+        </w:tc>
+        <w:tc>
+          <w:tcPr>
+            <w:tcW w:type="dxa" w:w="530"/>
+          </w:tcPr>
+          <w:p>
+            <w:pPr>
+              <w:spacing w:after="0"/>
+            </w:pPr>
+            <w:r/>
+            <w:r>
+              <w:rPr>
+                <w:rFonts w:ascii="Times New Roman" w:hAnsi="Times New Roman"/>
+                <w:b w:val="0"/>
+                <w:i w:val="0"/>
+                <w:sz w:val="16"/>
+              </w:rPr>
+              <w:t>0</w:t>
+            </w:r>
+          </w:p>
+        </w:tc>
+        <w:tc>
+          <w:tcPr>
+            <w:tcW w:type="dxa" w:w="653"/>
+          </w:tcPr>
+          <w:p>
+            <w:pPr>
+              <w:spacing w:after="0"/>
+            </w:pPr>
+            <w:r/>
+            <w:r>
+              <w:rPr>
+                <w:rFonts w:ascii="Times New Roman" w:hAnsi="Times New Roman"/>
+                <w:b w:val="0"/>
+                <w:i w:val="0"/>
+                <w:sz w:val="16"/>
+              </w:rPr>
+              <w:t>7.09–7.66</w:t>
+            </w:r>
+          </w:p>
+        </w:tc>
+        <w:tc>
+          <w:tcPr>
+            <w:tcW w:type="dxa" w:w="1102"/>
+          </w:tcPr>
+          <w:p>
+            <w:pPr>
+              <w:spacing w:after="0"/>
+            </w:pPr>
+            <w:r/>
+            <w:r>
+              <w:rPr>
+                <w:rFonts w:ascii="Times New Roman" w:hAnsi="Times New Roman"/>
+                <w:b w:val="0"/>
+                <w:i w:val="0"/>
+                <w:sz w:val="16"/>
+              </w:rPr>
+              <w:t>1.33–3.77 / 1.67–8.35</w:t>
+            </w:r>
+          </w:p>
+        </w:tc>
+      </w:tr>
+    </w:tbl>
+    <w:p>
+      <w:pPr>
+        <w:spacing w:after="40"/>
+      </w:pPr>
+    </w:p>
+    <w:p>
+      <w:pPr>
+        <w:keepNext/>
+        <w:spacing w:after="40"/>
+        <w:jc w:val="center"/>
+      </w:pPr>
+      <w:r>
+        <w:rPr>
+          <w:rFonts w:ascii="Times New Roman" w:hAnsi="Times New Roman"/>
+          <w:b w:val="0"/>
+          <w:i w:val="0"/>
+          <w:sz w:val="16"/>
+        </w:rPr>
+        <w:t xml:space="preserve">TABLE XIII. </w:t>
       </w:r>
       <w:r>
         <w:rPr>
@@ -13046,8 +14870,345 @@
           <w:i w:val="0"/>
           <w:sz w:val="20"/>
         </w:rPr>
-        <w:t xml:space="preserve"> in our re-implementation at real ML-DSA-44/65/87 sizes the combined signatures pass the standard verifier and s1 was recovered exactly from one signature for 15/15 keys per set; withholding a single W_i drops this to 0/15, so the attack really uses the sum. The author's code is not public, and our rejection checks run in the clear rather than in the paper's MPC. The earlier toy (ring size 8, real q) also checks the narrower Phase 1 hypothesis: with all but one signer corrupted, the honest party's mask can be stripped and λ_h·A·y_h inverted, while with two honest signers this route fails, as the paper says; the sum route above, however, works whatever the number of honest parties. Two further points: Corollary 6 claims the full threshold-signature functionality without the |H| ≥ 2 condition that its Simulator 17 needs, and the key-generation commitment t(i) = A·s1(i) + s2(i) carries the noise s2(i), so the bare A·s1,i pattern broken in TALUS does not recur there.</w:t>
+        <w:t xml:space="preserve"> in our re-implementation at real ML-DSA-44/65/87 sizes the combined signatures pass the standard verifier and s1 was recovered exactly from one signature for 15/15 keys per set (Table XIV; (N, T) = (3, 2), (5, 3), (5, 5), five keys each, seed 2051, under 0.2 s per attack); withholding a single W_i drops this to 0/15, so the attack really uses the sum. The author's code is not public, and our rejection checks run in the clear rather than in the paper's MPC. The earlier toy (ring size 8, real q) also checks the narrower Phase 1 hypothesis: with all but one signer corrupted, the honest party's mask can be stripped and λ_h·A·y_h inverted, while with two honest signers this route fails, as the paper says; the sum route above, however, works whatever the number of honest parties. Two further points: Corollary 6 claims the full threshold-signature functionality without the |H| ≥ 2 condition that its Simulator 17 needs, and the key-generation commitment t(i) = A·s1(i) + s2(i) carries the noise s2(i), so the bare A·s1,i pattern broken in TALUS does not recur there.</w:t>
       </w:r>
+    </w:p>
+    <w:p>
+      <w:pPr>
+        <w:keepNext/>
+        <w:spacing w:after="40"/>
+        <w:jc w:val="center"/>
+      </w:pPr>
+      <w:r>
+        <w:rPr>
+          <w:rFonts w:ascii="Times New Roman" w:hAnsi="Times New Roman"/>
+          <w:b w:val="0"/>
+          <w:i w:val="0"/>
+          <w:sz w:val="16"/>
+        </w:rPr>
+        <w:t xml:space="preserve">TABLE XIV. </w:t>
+      </w:r>
+      <w:r>
+        <w:rPr>
+          <w:rFonts w:ascii="Times New Roman" w:hAnsi="Times New Roman"/>
+          <w:b w:val="0"/>
+          <w:i w:val="0"/>
+          <w:sz w:val="16"/>
+        </w:rPr>
+        <w:t>Kao P2 attack as run at real ML-DSA-44/65/87 size</w:t>
+      </w:r>
+    </w:p>
+    <w:tbl>
+      <w:tblPr>
+        <w:tblStyle w:val="TableGrid"/>
+        <w:tblW w:type="auto" w:w="0"/>
+        <w:tblLook w:firstColumn="1" w:firstRow="1" w:lastColumn="0" w:lastRow="0" w:noHBand="0" w:noVBand="1" w:val="04A0"/>
+      </w:tblPr>
+      <w:tblGrid>
+        <w:gridCol w:w="4874"/>
+        <w:gridCol w:w="4874"/>
+      </w:tblGrid>
+      <w:tr>
+        <w:tc>
+          <w:tcPr>
+            <w:tcW w:type="dxa" w:w="414"/>
+            <w:shd w:val="clear" w:color="auto" w:fill="D9D9D9"/>
+          </w:tcPr>
+          <w:p>
+            <w:pPr>
+              <w:spacing w:after="0"/>
+            </w:pPr>
+            <w:r/>
+            <w:r>
+              <w:rPr>
+                <w:rFonts w:ascii="Times New Roman" w:hAnsi="Times New Roman"/>
+                <w:b/>
+                <w:i w:val="0"/>
+                <w:sz w:val="16"/>
+              </w:rPr>
+              <w:t>Step</w:t>
+            </w:r>
+          </w:p>
+        </w:tc>
+        <w:tc>
+          <w:tcPr>
+            <w:tcW w:type="dxa" w:w="4482"/>
+            <w:shd w:val="clear" w:color="auto" w:fill="D9D9D9"/>
+          </w:tcPr>
+          <w:p>
+            <w:pPr>
+              <w:spacing w:after="0"/>
+            </w:pPr>
+            <w:r/>
+            <w:r>
+              <w:rPr>
+                <w:rFonts w:ascii="Times New Roman" w:hAnsi="Times New Roman"/>
+                <w:b/>
+                <w:i w:val="0"/>
+                <w:sz w:val="16"/>
+              </w:rPr>
+              <w:t>Key recovery from one P2 signature (public data only)</w:t>
+            </w:r>
+          </w:p>
+        </w:tc>
+      </w:tr>
+      <w:tr>
+        <w:tc>
+          <w:tcPr>
+            <w:tcW w:type="dxa" w:w="414"/>
+          </w:tcPr>
+          <w:p>
+            <w:pPr>
+              <w:spacing w:after="0"/>
+            </w:pPr>
+            <w:r/>
+            <w:r>
+              <w:rPr>
+                <w:rFonts w:ascii="Times New Roman" w:hAnsi="Times New Roman"/>
+                <w:b w:val="0"/>
+                <w:i w:val="0"/>
+                <w:sz w:val="16"/>
+              </w:rPr>
+              <w:t>Input</w:t>
+            </w:r>
+          </w:p>
+        </w:tc>
+        <w:tc>
+          <w:tcPr>
+            <w:tcW w:type="dxa" w:w="4482"/>
+          </w:tcPr>
+          <w:p>
+            <w:pPr>
+              <w:spacing w:after="0"/>
+            </w:pPr>
+            <w:r/>
+            <w:r>
+              <w:rPr>
+                <w:rFonts w:ascii="Times New Roman" w:hAnsi="Times New Roman"/>
+                <w:b w:val="0"/>
+                <w:i w:val="0"/>
+                <w:sz w:val="16"/>
+              </w:rPr>
+              <w:t>pk = (ρ, t1); message; signature (c̃, z, h); broadcast values W_i of the accepted attempt</w:t>
+            </w:r>
+          </w:p>
+        </w:tc>
+      </w:tr>
+      <w:tr>
+        <w:tc>
+          <w:tcPr>
+            <w:tcW w:type="dxa" w:w="414"/>
+          </w:tcPr>
+          <w:p>
+            <w:pPr>
+              <w:spacing w:after="0"/>
+            </w:pPr>
+            <w:r/>
+            <w:r>
+              <w:rPr>
+                <w:rFonts w:ascii="Times New Roman" w:hAnsi="Times New Roman"/>
+                <w:b w:val="0"/>
+                <w:i w:val="0"/>
+                <w:sz w:val="16"/>
+              </w:rPr>
+              <w:t>1</w:t>
+            </w:r>
+          </w:p>
+        </w:tc>
+        <w:tc>
+          <w:tcPr>
+            <w:tcW w:type="dxa" w:w="4482"/>
+          </w:tcPr>
+          <w:p>
+            <w:pPr>
+              <w:spacing w:after="0"/>
+            </w:pPr>
+            <w:r/>
+            <w:r>
+              <w:rPr>
+                <w:rFonts w:ascii="Times New Roman" w:hAnsi="Times New Roman"/>
+                <w:b w:val="0"/>
+                <w:i w:val="0"/>
+                <w:sz w:val="16"/>
+              </w:rPr>
+              <w:t>w ← Σ_i W_i mod q (pairwise masks cancel, so w = A·y)</w:t>
+            </w:r>
+          </w:p>
+        </w:tc>
+      </w:tr>
+      <w:tr>
+        <w:tc>
+          <w:tcPr>
+            <w:tcW w:type="dxa" w:w="414"/>
+          </w:tcPr>
+          <w:p>
+            <w:pPr>
+              <w:spacing w:after="0"/>
+            </w:pPr>
+            <w:r/>
+            <w:r>
+              <w:rPr>
+                <w:rFonts w:ascii="Times New Roman" w:hAnsi="Times New Roman"/>
+                <w:b w:val="0"/>
+                <w:i w:val="0"/>
+                <w:sz w:val="16"/>
+              </w:rPr>
+              <w:t>2</w:t>
+            </w:r>
+          </w:p>
+        </w:tc>
+        <w:tc>
+          <w:tcPr>
+            <w:tcW w:type="dxa" w:w="4482"/>
+          </w:tcPr>
+          <w:p>
+            <w:pPr>
+              <w:spacing w:after="0"/>
+            </w:pPr>
+            <w:r/>
+            <w:r>
+              <w:rPr>
+                <w:rFonts w:ascii="Times New Roman" w:hAnsi="Times New Roman"/>
+                <w:b w:val="0"/>
+                <w:i w:val="0"/>
+                <w:sz w:val="16"/>
+              </w:rPr>
+              <w:t>A ← ExpandA(ρ); move A and w to the NTT domain</w:t>
+            </w:r>
+          </w:p>
+        </w:tc>
+      </w:tr>
+      <w:tr>
+        <w:tc>
+          <w:tcPr>
+            <w:tcW w:type="dxa" w:w="414"/>
+          </w:tcPr>
+          <w:p>
+            <w:pPr>
+              <w:spacing w:after="0"/>
+            </w:pPr>
+            <w:r/>
+            <w:r>
+              <w:rPr>
+                <w:rFonts w:ascii="Times New Roman" w:hAnsi="Times New Roman"/>
+                <w:b w:val="0"/>
+                <w:i w:val="0"/>
+                <w:sz w:val="16"/>
+              </w:rPr>
+              <w:t>3</w:t>
+            </w:r>
+          </w:p>
+        </w:tc>
+        <w:tc>
+          <w:tcPr>
+            <w:tcW w:type="dxa" w:w="4482"/>
+          </w:tcPr>
+          <w:p>
+            <w:pPr>
+              <w:spacing w:after="0"/>
+            </w:pPr>
+            <w:r/>
+            <w:r>
+              <w:rPr>
+                <w:rFonts w:ascii="Times New Roman" w:hAnsi="Times New Roman"/>
+                <w:b w:val="0"/>
+                <w:i w:val="0"/>
+                <w:sz w:val="16"/>
+              </w:rPr>
+              <w:t>For each of the 256 slots solve the k×ℓ system Â_j·ŷ_j = ŵ_j (A tall, invertible w.h.p.); y ← NTT⁻¹(ŷ)</w:t>
+            </w:r>
+          </w:p>
+        </w:tc>
+      </w:tr>
+      <w:tr>
+        <w:tc>
+          <w:tcPr>
+            <w:tcW w:type="dxa" w:w="414"/>
+          </w:tcPr>
+          <w:p>
+            <w:pPr>
+              <w:spacing w:after="0"/>
+            </w:pPr>
+            <w:r/>
+            <w:r>
+              <w:rPr>
+                <w:rFonts w:ascii="Times New Roman" w:hAnsi="Times New Roman"/>
+                <w:b w:val="0"/>
+                <w:i w:val="0"/>
+                <w:sz w:val="16"/>
+              </w:rPr>
+              <w:t>4</w:t>
+            </w:r>
+          </w:p>
+        </w:tc>
+        <w:tc>
+          <w:tcPr>
+            <w:tcW w:type="dxa" w:w="4482"/>
+          </w:tcPr>
+          <w:p>
+            <w:pPr>
+              <w:spacing w:after="0"/>
+            </w:pPr>
+            <w:r/>
+            <w:r>
+              <w:rPr>
+                <w:rFonts w:ascii="Times New Roman" w:hAnsi="Times New Roman"/>
+                <w:b w:val="0"/>
+                <w:i w:val="0"/>
+                <w:sz w:val="16"/>
+              </w:rPr>
+              <w:t>c ← SampleInBall(c̃); s1 ← c⁻¹·(z − y) in R_q</w:t>
+            </w:r>
+          </w:p>
+        </w:tc>
+      </w:tr>
+      <w:tr>
+        <w:tc>
+          <w:tcPr>
+            <w:tcW w:type="dxa" w:w="414"/>
+          </w:tcPr>
+          <w:p>
+            <w:pPr>
+              <w:spacing w:after="0"/>
+            </w:pPr>
+            <w:r/>
+            <w:r>
+              <w:rPr>
+                <w:rFonts w:ascii="Times New Roman" w:hAnsi="Times New Roman"/>
+                <w:b w:val="0"/>
+                <w:i w:val="0"/>
+                <w:sz w:val="16"/>
+              </w:rPr>
+              <w:t>Check</w:t>
+            </w:r>
+          </w:p>
+        </w:tc>
+        <w:tc>
+          <w:tcPr>
+            <w:tcW w:type="dxa" w:w="4482"/>
+          </w:tcPr>
+          <w:p>
+            <w:pPr>
+              <w:spacing w:after="0"/>
+            </w:pPr>
+            <w:r/>
+            <w:r>
+              <w:rPr>
+                <w:rFonts w:ascii="Times New Roman" w:hAnsi="Times New Roman"/>
+                <w:b w:val="0"/>
+                <w:i w:val="0"/>
+                <w:sz w:val="16"/>
+              </w:rPr>
+              <w:t>s1 short (‖s1‖∞ ≤ η) and consistent with t1; result 15/15 per set, 0/15 with one W_i withheld</w:t>
+            </w:r>
+          </w:p>
+        </w:tc>
+      </w:tr>
+    </w:tbl>
+    <w:p>
+      <w:pPr>
+        <w:spacing w:after="40"/>
+      </w:pPr>
     </w:p>
     <w:p>
       <w:pPr>
@@ -13098,7 +15259,72 @@
           <w:i w:val="0"/>
           <w:sz w:val="20"/>
         </w:rPr>
-        <w:t xml:space="preserve"> The released mixture after a rejection comes from two branches: branch 3 (the z check failed) and branch 2 (z passed but the LowBits check failed). Exact enumeration at n = 4 showed a real but small gap between rejected w_H and the simulator, shrinking with γ1 (branch 3 roughly as γ1^-2.7). A branch-2 floor near 10^-4 persisted for γ1 ≥ γ2 at q = 257, 513 and 1025, so it is not a small-q artefact; it comes from the wrap-around rounding cell, and masking that cell removes it (30–65× smaller). Exact convolution for n = 2 to 6 at q = 17 shows both gaps falling with n (branch 3 by 2–3 orders of magnitude from n = 4 to 6). At n = 8 the branch-3 gap is below the Monte Carlo floor of about 10^-7. Toy sizes cannot prove anything about n = 256, but every trend points toward the assumption holding statistically; a lattice-level distinguisher remains untested. On H-F3, a server that tampers with the rejection check is detected and stopped, so the leak is bounded by the stopping time, about log2(attempts) bits, once; the issue is that the paper's simulation does not reproduce how that stopping probability depends on the real z.</w:t>
+        <w:t xml:space="preserve"> The released mixture after a rejection comes from two branches: branch 3 (the z check failed) and branch 2 (z passed but the LowBits check failed). Exact enumeration at n = 4 showed a real but small gap between rejected w_H and the simulator, shrinking with γ1 (branch 3 roughly as γ1^-2.7). A branch-2 floor near 10^-4 persisted for γ1 ≥ γ2 at q = 257, 513 and 1025, so it is not a small-q artefact; it comes from the wrap-around rounding cell, and masking that cell removes it (30–65× smaller). Exact convolution for n = 2 to 6 at q = 17 shows both gaps falling with n (branch 3 by 2–3 orders of magnitude from n = 4 to 6; Fig. 5, which also shows the trend is not monotone from n = 3 to 4). At n = 8 the branch-3 gap is below the Monte Carlo floor of about 3×10^-7. Toy sizes cannot prove anything about n = 256, but every trend points toward the assumption holding statistically; a lattice-level distinguisher remains untested. On H-F3, a server that tampers with the rejection check is detected and stopped, so the leak is bounded by the stopping time, about log2(attempts) bits, once; the issue is that the paper's simulation does not reproduce how that stopping probability depends on the real z.</w:t>
+      </w:r>
+    </w:p>
+    <w:p>
+      <w:pPr>
+        <w:keepNext/>
+        <w:spacing w:after="20"/>
+        <w:jc w:val="center"/>
+      </w:pPr>
+      <w:r>
+        <w:drawing>
+          <wp:inline xmlns:a="http://schemas.openxmlformats.org/drawingml/2006/main" xmlns:pic="http://schemas.openxmlformats.org/drawingml/2006/picture">
+            <wp:extent cx="2926080" cy="3260489"/>
+            <wp:docPr id="5" name="Picture 5"/>
+            <wp:cNvGraphicFramePr>
+              <a:graphicFrameLocks noChangeAspect="1"/>
+            </wp:cNvGraphicFramePr>
+            <a:graphic>
+              <a:graphicData uri="http://schemas.openxmlformats.org/drawingml/2006/picture">
+                <pic:pic>
+                  <pic:nvPicPr>
+                    <pic:cNvPr id="0" name="trilithium_gap.png"/>
+                    <pic:cNvPicPr/>
+                  </pic:nvPicPr>
+                  <pic:blipFill>
+                    <a:blip r:embed="rId13"/>
+                    <a:stretch>
+                      <a:fillRect/>
+                    </a:stretch>
+                  </pic:blipFill>
+                  <pic:spPr>
+                    <a:xfrm>
+                      <a:off x="0" y="0"/>
+                      <a:ext cx="2926080" cy="3260489"/>
+                    </a:xfrm>
+                    <a:prstGeom prst="rect"/>
+                  </pic:spPr>
+                </pic:pic>
+              </a:graphicData>
+            </a:graphic>
+          </wp:inline>
+        </w:drawing>
+      </w:r>
+    </w:p>
+    <w:p>
+      <w:pPr>
+        <w:spacing w:after="100"/>
+        <w:jc w:val="both"/>
+      </w:pPr>
+      <w:r>
+        <w:rPr>
+          <w:rFonts w:ascii="Times New Roman" w:hAnsi="Times New Roman"/>
+          <w:b w:val="0"/>
+          <w:i w:val="0"/>
+          <w:sz w:val="16"/>
+        </w:rPr>
+        <w:t xml:space="preserve">Fig. 5. </w:t>
+      </w:r>
+      <w:r>
+        <w:rPr>
+          <w:rFonts w:ascii="Times New Roman" w:hAnsi="Times New Roman"/>
+          <w:b w:val="0"/>
+          <w:i w:val="0"/>
+          <w:sz w:val="16"/>
+        </w:rPr>
+        <w:t>Trilithium toy model (q = 17, γ2 = 4, τ = 1): squared Hellinger distance H² between the rejected w_H distribution and the paper's simulator, per rejection branch; about 1/H² rejected attempts are needed to tell them apart. n = 2–6 exact (mean of 5 keys, seed 2026 + n); n = 8 Monte Carlo (2×10^8 samples × 3 keys, seed 2026, bias-corrected; open marker = below the sampling floor).</w:t>
       </w:r>
     </w:p>
     <w:p>
@@ -13205,7 +15431,7 @@
           <w:i w:val="0"/>
           <w:sz w:val="16"/>
         </w:rPr>
-        <w:t xml:space="preserve">TABLE XI. </w:t>
+        <w:t xml:space="preserve">TABLE XV. </w:t>
       </w:r>
       <w:r>
         <w:rPr>
@@ -13682,7 +15908,7 @@
           <w:i w:val="0"/>
           <w:sz w:val="20"/>
         </w:rPr>
-        <w:t>Table XI sets the Phase 1 plan against what Phase 2 delivered.</w:t>
+        <w:t>Table XV sets the Phase 1 plan against what Phase 2 delivered.</w:t>
       </w:r>
     </w:p>
     <w:p>

</xml_diff>

<commit_message>
Phase 2 report: plain-language pass over both versions, no content cut
</commit_message>
<xml_diff>
--- a/report/Phase1_Report.docx
+++ b/report/Phase1_Report.docx
@@ -64,7 +64,7 @@
           <w:i w:val="0"/>
           <w:sz w:val="20"/>
         </w:rPr>
-        <w:t>ML-DSA (FIPS 204) is the NIST-standardised lattice-based digital signature, designed for a single signer. Splitting its key among several parties is hard because rejection sampling and rounding do not combine well with secret sharing. NIST's 2026 First Call for multi-party threshold schemes (IR 8214C) has four proposals whose signatures verify under an unmodified ML-DSA verifier: Mithril, Quorus, SplitForge/Trilithium and TALUS. We survey thirty-three sources on these schemes and on leakage attacks against lattice signatures, and make the TALUS per-key signing cap our core problem. A leakage-testing harness built in Phase 2 (ML-DSA passing 81 NIST ACVP vectors, scheme views, least-squares, bounded-noise and integer-programming estimators) recovers the whole TALUS s2 channel secret of ML-DSA-44 in 18/20 trials at 7×10^4 signatures (2^16.1); for 95% success it needs about 3.1 bits (ML-DSA-44) and 3.5 bits (-65, -87) more than the cap allows and about 1 bit more than the authors' uniqueness wall, in our channel model: a thin margin, not a break. Controls give 9/9 recoveries on a leaky variant and 0/18 false keys on genuine ML-DSA. Along the way we reproduce both published attacks on an early TALUS version, find a parameter-proof gap in Mithril (whose real Go transcripts show no s2 leak) and demonstrate a one-signature key exposure in a predecessor design at full ML-DSA size; the latter two await coordinated disclosure.</w:t>
+        <w:t>ML-DSA (FIPS 204) is the lattice based digital signature that NIST standardised. It was designed for a single signer. Splitting its key among several parties is hard, because rejection sampling and rounding do not fit well with secret sharing. NIST's 2026 First Call for multi party threshold schemes (IR 8214C) has four proposals whose signatures pass an unchanged ML-DSA verifier. They are Mithril, Quorus, SplitForge/Trilithium and TALUS. We survey 33 sources on these schemes and on leakage attacks against lattice signatures. Our core problem is the TALUS signing cap, the limit on how many signatures one key may produce. In Phase 2 we built a leakage testing harness. It has an ML-DSA implementation that passes 81 NIST ACVP test vectors, a view of what each scheme releases, and estimators based on least squares, bounded noise and integer programming. In our model of the TALUS s2 channel it recovers the whole secret of ML-DSA-44 in 18 of 20 trials at 7×10^4 signatures (2^16.1). For 95% success it needs about 3.1 bits more than the cap allows for ML-DSA-44 and 3.5 bits more for ML-DSA-65 and ML-DSA-87. That is about 1 bit above the authors' uniqueness wall. The margin is thin, but it is not a break. As controls, the estimator recovers the secret in 9 of 9 runs on a leaky variant and returns no false key for 18 genuine ML-DSA keys. Along the way we reproduce both published attacks on an early TALUS version. We find a gap between Mithril's parameters and its proof, although its real Go transcripts show no s2 leak. We also show that a predecessor design gives away the key from one signature at full ML-DSA size. These last two findings await coordinated disclosure.</w:t>
       </w:r>
     </w:p>
     <w:p>
@@ -136,7 +136,7 @@
           <w:i w:val="0"/>
           <w:sz w:val="20"/>
         </w:rPr>
-        <w:t xml:space="preserve"> A digital signature lets a signer prove that a message came from them and was not altered. RSA and ECDSA would be broken by a large quantum computer, so NIST standardised post-quantum replacements. ML-DSA, specified in FIPS 204 [1] and derived from CRYSTALS-Dilithium [2], is the primary choice; its security rests on the lattice problems Module-LWE (learning with errors) and Module-SIS.</w:t>
+        <w:t xml:space="preserve"> A digital signature lets a signer prove that a message came from them and was not changed. A large quantum computer would break RSA and ECDSA, so NIST standardised post quantum replacements. The main one is ML-DSA, specified in FIPS 204 [1] and derived from CRYSTALS-Dilithium [2]. Its security rests on two lattice problems, Module-LWE (learning with errors) and Module-SIS.</w:t>
       </w:r>
     </w:p>
     <w:p>
@@ -159,7 +159,7 @@
           <w:i w:val="0"/>
           <w:sz w:val="20"/>
         </w:rPr>
-        <w:t xml:space="preserve"> Intuitively, the signer hides its secret inside a random-looking answer and throws the answer away whenever it might give the secret away. Formally, all arithmetic is in the ring R_q = Z_q[X]/(X^n+1): polynomials of degree below n = 256 with coefficients modulo the prime q = 8380417. A is a public k×ℓ matrix of such polynomials. The secret key is a pair of short vectors (s1, s2) whose coefficients lie in [−η, η], and the public key is t = A·s1 + s2, of which only the high part t1 is published (t = t1·2^d + t0 with d = 13 dropped bits t0). To sign, the signer samples a random nonce y with coefficients below γ1, computes w = A·y and its high bits w1 = HighBits(w), derives a challenge c = H(msg, w1), a polynomial with exactly τ coefficients equal to ±1 and the rest 0, and outputs z = y + c·s1 with a short hint h. Here ‖x‖∞ denotes the largest absolute coefficient of x, and β = τ·η bounds ‖c·s‖∞ for any secret s. Two rejection checks are applied: ‖z‖∞ &lt; γ1 − β, which hides s1, and ‖LowBits(w − c·s2)‖∞ &lt; γ2 − β, which hides s2 (γ2 is the rounding range of LowBits). If either fails the signer restarts with a fresh y. This “Fiat–Shamir with aborts” structure makes accepted signatures statistically independent of the key. Table I lists the parameter values.</w:t>
+        <w:t xml:space="preserve"> In simple terms, the signer hides its secret inside a random looking answer, and throws the answer away whenever it might give the secret away. In more detail, all arithmetic is in the ring R_q = Z_q[X]/(X^n+1). Its elements are polynomials of degree below n = 256 with coefficients modulo the prime q = 8380417. A is a public k×ℓ matrix of such polynomials. The secret key is a pair of short vectors (s1, s2) whose coefficients lie in [−η, η]. The public key is t = A·s1 + s2, and only its high part t1 is published. We write t = t1·2^d + t0, where t0 holds the d = 13 dropped low bits. To sign, the signer picks a random nonce y with coefficients below γ1. It computes w = A·y and the high bits w1 = HighBits(w). It then derives a challenge c = H(msg, w1). This is a polynomial with exactly τ coefficients equal to ±1 and the rest zero. The output is z = y + c·s1 together with a short hint h. We write ‖x‖∞ for the largest absolute coefficient of x. The number β = τ·η bounds ‖c·s‖∞ for any secret s. Two rejection checks follow. The first, ‖z‖∞ &lt; γ1 − β, hides s1. The second, ‖LowBits(w − c·s2)‖∞ &lt; γ2 − β, hides s2. Here γ2 is the rounding range of LowBits. If either check fails, the signer starts again with a fresh y. This design is called Fiat–Shamir with aborts. It makes accepted signatures statistically independent of the key. Table I lists the parameter values.</w:t>
       </w:r>
     </w:p>
     <w:p>
@@ -794,7 +794,7 @@
           <w:i w:val="0"/>
           <w:sz w:val="20"/>
         </w:rPr>
-        <w:t>Why rejection makes signatures safe.</w:t>
+        <w:t>Why rejection keeps signatures safe.</w:t>
       </w:r>
       <w:r>
         <w:rPr>
@@ -803,7 +803,7 @@
           <w:i w:val="0"/>
           <w:sz w:val="20"/>
         </w:rPr>
-        <w:t xml:space="preserve"> Picture z as a point in a box. Because y is uniform on a box of half-width γ1 and c·s1 is a small shift of at most β, every point inside the smaller box of half-width γ1 − β is equally likely whichever s1 was used; accepting only those points therefore hides s1 completely. Because c has only τ nonzero entries, anything that does leak gives the attacker one noisy linear equation with small coefficients per signature, which underlies all the sample counts below. Any threshold design that changes what is accepted, what is rejected or what else is published must re-establish this independence, and this is the property we test.</w:t>
+        <w:t xml:space="preserve"> Think of z as a point in a box. The nonce y is uniform on a box of half width γ1, and c·s1 moves it by at most β. So every point inside the smaller box of half width γ1 − β is equally likely, whatever s1 was used. Accepting only those points therefore hides s1 completely. The challenge c has only τ nonzero entries. So if anything does leak, the attacker gets one noisy linear equation with small coefficients per signature. All the sample counts in this report come from this fact. Any threshold design that changes what is accepted, what is rejected or what else is published must bring back this independence. This is the property we test.</w:t>
       </w:r>
     </w:p>
     <w:p>
@@ -817,7 +817,7 @@
           <w:i w:val="0"/>
           <w:sz w:val="20"/>
         </w:rPr>
-        <w:t>Why thresholding is hard.</w:t>
+        <w:t>Why a threshold version is hard.</w:t>
       </w:r>
       <w:r>
         <w:rPr>
@@ -826,7 +826,7 @@
           <w:i w:val="0"/>
           <w:sz w:val="20"/>
         </w:rPr>
-        <w:t xml:space="preserve"> In a (T, N) threshold scheme any T of N parties can sign and fewer than T learn nothing. Shamir secret sharing [21] hides a secret as the constant term of a random degree-(T−1) polynomial; Feldman [22] adds commitments g^{a_i} to its coefficients; threshold Schnorr schemes such as FROST [23] simply add partial signatures. ML-DSA breaks all three conveniences: shares of a short secret are not short; HighBits is not additive, so parties cannot round their own pieces of w; the s2 check needs the full secret; and the lattice analogue of a Feldman commitment, A·x, is not hiding (Section II-C). Two facts drive most attacks below. A is tall (k ≥ ℓ), so publishing A·x reveals x by Gaussian elimination. And z = y + c·s1 holds over the integers, so any leak of the nonce y gives s1 = c⁻¹(z − y).</w:t>
+        <w:t xml:space="preserve"> In a (T, N) threshold scheme, any T of the N parties can sign together, and fewer than T learn nothing. Shamir secret sharing [21] hides a secret as the constant term of a random polynomial of degree T−1. Feldman [22] adds commitments g^{a_i} to its coefficients. Threshold Schnorr schemes such as FROST [23] simply add up partial signatures. ML-DSA loses all three of these conveniences. Shares of a short secret are not short. HighBits is not additive, so parties cannot round their own pieces of w. The s2 check needs the full secret. And the lattice version of a Feldman commitment, A·x, does not hide x (Section II-C). Two facts drive most attacks below. First, A is tall (k ≥ ℓ), so anyone who sees A·x can recover x by Gaussian elimination. Second, z = y + c·s1 holds over the integers, so any leak of the nonce y gives s1 = c⁻¹(z − y).</w:t>
       </w:r>
     </w:p>
     <w:p>
@@ -840,7 +840,7 @@
           <w:i w:val="0"/>
           <w:sz w:val="20"/>
         </w:rPr>
-        <w:t>Why now, and what this report contributes.</w:t>
+        <w:t>Why now, and what this report adds.</w:t>
       </w:r>
       <w:r>
         <w:rPr>
@@ -849,7 +849,7 @@
           <w:i w:val="0"/>
           <w:sz w:val="20"/>
         </w:rPr>
-        <w:t xml:space="preserve"> NIST's First Call (IR 8214C) [3] expects preliminary packages from late 2026 and full packages not before March 2027, so scrutiny is most useful now. The year has already shown why: in July 2026 Niot [13] recovered keys from earlier TALUS versions, and TALUS v0.22 [11] answered with a per-key signing cap whose safety margin had not been measured independently. Following the Phase 1 review, the core problem is that cap (P1); the Mithril, rejected-attempt and Kao questions (P2–P4) are stretch goals. We give (i) a survey of the four proposals, the attack toolbox and recent work, (ii) the problem formulation, (iii) our proposed solution, a leakage-testing harness (Fig. 1) whose bounded-noise estimator with integer-programming finishing uses the hard edges of the TALUS noise, and (iv) simulation results with trial counts and seeds showing that it needs about 5×10^4 times fewer signatures than the least-squares baseline, yet still stays about 3 bits above the cap.</w:t>
+        <w:t xml:space="preserve"> NIST's First Call (IR 8214C) [3] expects early packages from late 2026 and full packages from March 2027, so outside checking is most useful now. This year has already shown why. In July 2026 Niot [13] recovered keys from earlier TALUS versions. TALUS v0.22 [11] answered with a limit on the number of signatures per key, and nobody had measured its safety margin independently. After the Phase 1 review, that signing cap is our core problem (P1). The Mithril, rejected attempt and Kao questions (P2 to P4) are stretch goals. The report gives four things. First, a survey of the four proposals, the attack toolbox and recent work. Second, the problem statement. Third, our proposed solution, a leakage testing harness (Fig. 1). Its main estimator uses the hard edges of the TALUS noise and finishes with integer programming. Fourth, simulation results with trial counts and seeds. They show that our method needs about 5×10^4 times fewer signatures than the least squares baseline, yet still stays about 3 bits above the cap.</w:t>
       </w:r>
     </w:p>
     <w:p>
@@ -863,7 +863,7 @@
           <w:i w:val="0"/>
           <w:sz w:val="20"/>
         </w:rPr>
-        <w:t>Survey method.</w:t>
+        <w:t>How we found the sources.</w:t>
       </w:r>
       <w:r>
         <w:rPr>
@@ -872,7 +872,7 @@
           <w:i w:val="0"/>
           <w:sz w:val="20"/>
         </w:rPr>
-        <w:t xml:space="preserve"> Sources came from the First Call submissions page, the proposals' ePrint/arXiv entries and their predecessors, and searches of ePrint, TCHES, EUROCRYPT and ASIACRYPT (“Dilithium rejected signatures ILP”, “ILWE”, “threshold lattice signatures”). A source was kept if it defines, attacks or supplies a technique against a threshold ML-DSA design. Metadata of all references were verified online (Shamir [21] and Feldman [22] against Crossref). For Phase 2 the search was repeated in October 2026 (ePrint 2024–2026 and the NIST call's preview writeups), adding nine sources [26]–[34] (Section II-F).</w:t>
+        <w:t xml:space="preserve"> We started from the First Call submissions page, the proposals' ePrint and arXiv entries and the papers they build on. We then searched ePrint, TCHES, EUROCRYPT and ASIACRYPT with queries such as “Dilithium rejected signatures ILP”, “ILWE” and “threshold lattice signatures”. We kept a source if it defines or attacks a threshold ML-DSA design, or supplies a technique against one. We checked the details of every reference online, and checked Shamir [21] and Feldman [22] against Crossref. For Phase 2 we repeated the search in October 2026 over ePrint 2024 to 2026 and the preview writeups of the NIST call. This added nine sources, [26] to [34] (Section II-F).</w:t>
       </w:r>
     </w:p>
     <w:p>
@@ -886,7 +886,7 @@
           <w:i w:val="0"/>
           <w:sz w:val="20"/>
         </w:rPr>
-        <w:t>Scope and honesty note.</w:t>
+        <w:t>What we read and ran.</w:t>
       </w:r>
       <w:r>
         <w:rPr>
@@ -895,7 +895,7 @@
           <w:i w:val="0"/>
           <w:sz w:val="20"/>
         </w:rPr>
-        <w:t xml:space="preserve"> Quorus [8], Trilithium [9] and Mithril [4] were read in full (Mithril Appendices D, E and G at the level of the proof hybrids); Kao [12] main text and Appendices B–O. Our own harness code was run (Section IV); of the schemes' reference code only Mithril's parameter script and Go signing code were run. Every TALUS number relies on our channel model, because the v0.22 writeup does not list the values released per signature. Results are labelled as measured, derived or hypothesis.</w:t>
+        <w:t xml:space="preserve"> We read Quorus [8], Trilithium [9] and Mithril [4] in full. For Mithril this includes Appendices D, E and G at the level of the proof steps. For Kao [12] we read the main text and Appendices B to O. We ran our own harness code (Section IV). Of the schemes' own code we ran only Mithril's parameter script and its Go signing code. Every TALUS number depends on our model of the channel, because the v0.22 writeup does not list the values released with each signature. We label every result as measured, derived or hypothesis.</w:t>
       </w:r>
     </w:p>
     <w:p>
@@ -940,7 +940,7 @@
           <w:i w:val="0"/>
           <w:sz w:val="20"/>
         </w:rPr>
-        <w:t>Dilithium [2] introduced the signing structure above and FIPS 204 [1] standardised it. Early lattice threshold signatures used threshold homomorphic encryption (Gür, Katz and Silde [16]); Threshold Raccoon [14] uses only symmetric primitives and one-time additive masks but does not output ML-DSA signatures; del Pino and Niot [24] give a compact Raccoon-based scheme limited to 2^64 signatures and about 8 parties. An earlier preprint on identifiable aborts [15] is withdrawn and listed for history only. The decisive shift is toward output that verifies under the unmodified FIPS 204 verifier, because deployed certificates and pinned keys cannot change.</w:t>
+        <w:t>Dilithium [2] introduced the signing method above, and FIPS 204 [1] standardised it. Early lattice threshold signatures used threshold homomorphic encryption (Gür, Katz and Silde [16]). Threshold Raccoon [14] uses only symmetric tools and one time additive masks, but its signatures are not ML-DSA signatures. Del Pino and Niot [24] give a compact scheme based on Raccoon, limited to 2^64 signatures and about 8 parties. An earlier preprint on identifiable aborts [15] has been withdrawn and is listed for history only. The big shift in recent work is toward signatures that pass the unchanged FIPS 204 verifier, because deployed certificates and pinned keys cannot change.</w:t>
       </w:r>
     </w:p>
     <w:p>
@@ -963,7 +963,7 @@
           <w:i w:val="0"/>
           <w:sz w:val="20"/>
         </w:rPr>
-        <w:t xml:space="preserve"> A hint lets the verifier recompute w1 from v = A·z − c·t1·2^d. Substituting z = y + c·s1 shows v = w − c·(s2 − t0), so v is public and carries the term c·s′ with s′ = s2 − t0. The second rejection check keeps LowBits(w) at least β away from a rounding boundary, so v reveals nothing; once the check is removed or altered, that protection disappears.</w:t>
+        <w:t xml:space="preserve"> The hint lets the verifier recompute w1 from v = A·z − c·t1·2^d. Putting in z = y + c·s1 gives v = w − c·(s2 − t0). So v is public and contains the term c·s′, with s′ = s2 − t0. The second rejection check keeps LowBits(w) at least β away from a rounding boundary, and so v reveals nothing. If the check is removed or changed, this protection is lost.</w:t>
       </w:r>
     </w:p>
     <w:p>
@@ -978,7 +978,7 @@
           <w:i/>
           <w:sz w:val="20"/>
         </w:rPr>
-        <w:t>B. The four First-Call ML-DSA proposals</w:t>
+        <w:t>B. The four First Call ML-DSA proposals</w:t>
       </w:r>
     </w:p>
     <w:p>
@@ -1001,7 +1001,7 @@
           <w:i w:val="0"/>
           <w:sz w:val="20"/>
         </w:rPr>
-        <w:t xml:space="preserve"> [4,6,7] (PQShield, Brave, Bristol; USENIX Security 2026) uses replicated secret sharing with short shares and local rejection with hyperball (Euclidean-ball) sampling, about 1 MB per participant for up to six parties, with a Go implementation. Security is a game-based reduction to MLWE and ML-DSA unforgeability under static corruption of up to T−1 parties, without identifiable aborts. Each attempt succeeds with probability about 1/2 (ML-DSA: about 1/4), with K parallel repetitions, and each party publishes a full MLWE-sample commitment, so the bare-A·x attack does not apply. The proof uses Rényi divergence and covers Q_s = 2^50 signing queries. The superseded version [5] is not relied on. The preview writeup [7] adds that up to 8 parties remain practical, that no synchronised broadcast channel is needed, and that the Go code uses floating point for hyperball sampling.</w:t>
+        <w:t xml:space="preserve"> [4,6,7] comes from PQShield, Brave and Bristol and appears at USENIX Security 2026. It uses replicated secret sharing with short shares, and each party does its own rejection using hyperball sampling (sampling from a Euclidean ball). It costs about 1 MB per participant for up to six parties and has a Go implementation. Its security proof reduces to MLWE and to the unforgeability of ML-DSA. It allows up to T−1 corrupted parties chosen in advance, without identifiable aborts. Each attempt succeeds with probability about 1/2 (ML-DSA alone has about 1/4), with K parallel repetitions. Each party publishes a full MLWE sample as its commitment, so the bare A·x attack does not apply. The proof uses Rényi divergence and covers Q_s = 2^50 signing queries. We do not rely on the older version [5]. The preview writeup [7] adds three points. Up to 8 parties remain practical, no synchronised broadcast channel is needed, and the Go code uses floating point for hyperball sampling.</w:t>
       </w:r>
     </w:p>
     <w:p>
@@ -1015,7 +1015,7 @@
           <w:i w:val="0"/>
           <w:sz w:val="20"/>
         </w:rPr>
-        <w:t>Why local rejection is delicate.</w:t>
+        <w:t>Why rejection by each party is delicate.</w:t>
       </w:r>
       <w:r>
         <w:rPr>
@@ -1024,7 +1024,7 @@
           <w:i w:val="0"/>
           <w:sz w:val="20"/>
         </w:rPr>
-        <w:t xml:space="preserve"> Single-signer ML-DSA accepts a nonce only if both checks pass, about 1/4 of the time. With N parties each holding a short additive share, the sum of their responses must land in the same box, but no party knows the sum. Mithril lets each party sample its nonce share from a hyperball, so the aggregate has a predictable norm, and decides acceptance locally. The accepted responses are then close to, but not exactly, the FIPS 204 distribution; how close is a quantitative question (problem P2), not a bug.</w:t>
+        <w:t xml:space="preserve"> A single ML-DSA signer accepts a nonce only if both checks pass, about one time in four. With N parties that each hold a short additive share, the sum of their answers must land in the same box, but no party knows the sum. Mithril lets each party draw its nonce share from a hyperball, so that the sum has a predictable size, and each party decides acceptance on its own. The accepted answers are then close to the FIPS 204 distribution, but not exactly equal to it. How close they are is a question of numbers (problem P2), not a bug.</w:t>
       </w:r>
     </w:p>
     <w:p>
@@ -1047,7 +1047,7 @@
           <w:i w:val="0"/>
           <w:sz w:val="20"/>
         </w:rPr>
-        <w:t xml:space="preserve"> [8] (J.P. Morgan; USENIX Security 2026) modifies signing to be MPC-friendly while keeping FIPS 204 verification: the nonce is uniform, a small noise term e_w is added to w, and w1 is output even when (z, h) is rejected. It tolerates fewer than n/2 corruptions, is proven in the universal composability (UC) framework, and costs about 150 KB per party per attempt (0.31–0.59 MB per signature, 16 or 29 rounds), benchmarked up to 63 parties. Always releasing w1 lets the Fiat–Shamir hash be computed in the clear; the proof that rejected partial signatures can be simulated relies on the noise e_w.</w:t>
+        <w:t xml:space="preserve"> [8] comes from J.P. Morgan and also appears at USENIX Security 2026. It changes signing so that it suits MPC (secure multi party computation), while keeping FIPS 204 verification. The nonce is uniform, a small noise term e_w is added to w, and w1 is output even when (z, h) is rejected. It tolerates fewer than n/2 corrupted parties and is proven secure in the universal composability (UC) framework. It costs about 150 KB per party per attempt, which is 0.31 to 0.59 MB per signature over 16 or 29 rounds, and was tested with up to 63 parties. Because w1 is always released, the Fiat–Shamir hash can be computed in the open. The proof that rejected partial signatures can be simulated relies on the noise e_w.</w:t>
       </w:r>
     </w:p>
     <w:p>
@@ -1061,7 +1061,7 @@
           <w:i w:val="0"/>
           <w:sz w:val="20"/>
         </w:rPr>
-        <w:t>SplitForge / Trilithium</w:t>
+        <w:t>SplitForge/Trilithium</w:t>
       </w:r>
       <w:r>
         <w:rPr>
@@ -1070,7 +1070,7 @@
           <w:i w:val="0"/>
           <w:sz w:val="20"/>
         </w:rPr>
-        <w:t xml:space="preserve"> [9] (Cybernetica) targets a server and a phone plus a correlated randomness provider (CRP). It is UC-secure against one malicious party among the three, takes 14 rounds per signing attempt, and publishes the high bits w_H even for rejected attempts, justified by an MLWR-type assumption (Module Learning With Rounding: like MLWE, but the random noise is replaced by deterministic rounding) that the paper itself calls non-standard for ML-DSA parameters. It uses an actively secure comparison protocol and a new rounding protocol, has a Rust implementation, is given both for unmodified ML-DSA and for a Quorus-style variant with CRP-supplied noise e_w, and is part of Cybernetica's SplitKey submission. The writeup concedes that a malicious CRP can mount selective-disclosure attacks that the authors consider harmless for the intended use.</w:t>
+        <w:t xml:space="preserve"> [9] comes from Cybernetica. It targets a server and a phone, helped by a correlated randomness provider (CRP). It is UC secure against one malicious party out of the three and takes 14 rounds per signing attempt. It publishes the high bits w_H even for rejected attempts. This is justified by an MLWR type assumption (Module Learning With Rounding, which is like MLWE but replaces random noise with fixed rounding). The paper itself calls this assumption non standard for ML-DSA parameters. Trilithium uses an actively secure comparison protocol and a new rounding protocol, and has a Rust implementation. It is given both for unchanged ML-DSA and for a Quorus style variant in which the CRP supplies the noise e_w. It is part of Cybernetica's SplitKey submission. The writeup admits that a malicious CRP can mount selective disclosure attacks, which the authors consider harmless for the intended use.</w:t>
       </w:r>
     </w:p>
     <w:p>
@@ -1093,7 +1093,7 @@
           <w:i w:val="0"/>
           <w:sz w:val="20"/>
         </w:rPr>
-        <w:t xml:space="preserve"> [10,11] (Codebat) introduces the Boundary Clearance Condition (BCC): for a constant fraction of nonces (43.2%, 31.7% and 39.1% at ML-DSA-44/65/87) s2 provably cannot push w across a rounding boundary, so rejection can be done offline on preprocessed nonces, giving a two-round distributed MPC profile. The paper states that its cap-based shield for the s2 channel is model-supported rather than proven, and proves that any FIPS-exact scheme revealing a summed (Irwin–Hall) nonce admits key recovery after about 2^30 signatures. A one-round variant assisted by a TEE (trusted execution environment, a hardware-isolated enclave trusted to keep secrets) appears in v0.22 only as a contrasting example. TALUS builds on Kao's Shamir nonce DKG [12], where the signing nonce is itself Shamir-shared with pairwise-cancelling PRF masks and claimed nonce-share min-entropy above 5× the key entropy for signing sets up to 17.</w:t>
+        <w:t xml:space="preserve"> [10,11] comes from Codebat. It introduces the Boundary Clearance Condition (BCC). For a fixed share of nonces (43.2%, 31.7% and 39.1% for ML-DSA-44, 65 and 87), s2 provably cannot push w across a rounding boundary. So rejection can be done offline on prepared nonces, which gives a distributed MPC version with two rounds. The paper says its cap based protection of the s2 channel is supported by a model rather than proven. It also proves that any FIPS exact scheme that reveals a summed (Irwin–Hall) nonce allows key recovery after about 2^30 signatures. A one round variant helped by a TEE (trusted execution environment, a hardware enclave trusted to keep secrets) appears in v0.22 only as a contrasting example. TALUS builds on Kao's Shamir nonce DKG [12]. There the signing nonce is itself Shamir shared, with pairwise cancelling PRF masks, and the paper claims the nonce shares keep more than five times the key's entropy for signing sets of up to 17.</w:t>
       </w:r>
     </w:p>
     <w:p>
@@ -1118,7 +1118,7 @@
           <w:i w:val="0"/>
           <w:sz w:val="16"/>
         </w:rPr>
-        <w:t>The four ML-DSA-compatible First-Call proposals</w:t>
+        <w:t>The four ML-DSA compatible First Call proposals</w:t>
       </w:r>
     </w:p>
     <w:tbl>
@@ -1699,7 +1699,7 @@
           <w:i w:val="0"/>
           <w:sz w:val="20"/>
         </w:rPr>
-        <w:t xml:space="preserve"> exploits non-hiding commitments: TALUS-MPC broadcast A·s1,i at key generation and A·ŷ in the blame phase. A is left-invertible except with probability at most 2^-15 (ML-DSA-44) or 2^-38 (-65/-87), so x = A⁺(A·x) reveals every key share and the nonce, and s1 = c⁻¹(z − y) follows from one signature. </w:t>
+        <w:t xml:space="preserve"> uses commitments that do not hide. TALUS-MPC broadcast A·s1,i during key generation and A·ŷ in the blame phase. A can be inverted from the left except with probability at most 2^-15 for ML-DSA-44 or 2^-38 for ML-DSA-65 and 87. So x = A⁺(A·x) reveals every key share and the nonce, and s1 = c⁻¹(z − y) follows from one signature. </w:t>
       </w:r>
       <w:r>
         <w:rPr>
@@ -1717,7 +1717,7 @@
           <w:i w:val="0"/>
           <w:sz w:val="20"/>
         </w:rPr>
-        <w:t xml:space="preserve"> targets the removed s2 check. Intuitively, every signature reveals a very noisy linear equation in the secret, and enough of them average the noise away. Precisely, with HighBits(w) known from the hint, the observable is b = −c·s′ + e with e = LowBits(w) roughly uniform on [−γ2, γ2]. This is integer LWE (ILWE, LWE without reduction mod q), which least squares solves [17]: the per-coefficient error is about σ_e/√(Nτ) with σ_e² ≈ γ2²/3, and rounding succeeds once this is below 1/2, so</w:t>
+        <w:t xml:space="preserve"> targets the removed s2 check. In simple terms, every signature reveals a very noisy linear equation in the secret, and enough of them average the noise away. More precisely, HighBits(w) is known from the hint, so the attacker sees b = −c·s′ + e, where e = LowBits(w) is roughly uniform on [−γ2, γ2]. This is integer LWE (ILWE), which is LWE without reduction modulo q, and least squares solves it [17]. The error per coefficient is about σ_e/√(Nτ), with σ_e² ≈ γ2²/3. Rounding works once this error is below 1/2, so the attack needs about</w:t>
       </w:r>
     </w:p>
     <w:p>
@@ -1745,7 +1745,7 @@
           <w:i w:val="0"/>
           <w:sz w:val="20"/>
         </w:rPr>
-        <w:t>about 2^28–2^31 (Table III). Niot stresses that (1) is unoptimised, and that reinstating the check is not enough because a corrupted party can bias its nonce share (e.g. y_i = 0) so the check always passes.</w:t>
+        <w:t>which is 2^28 to 2^31 (Table III). Niot stresses that (1) is not optimised. He also notes that putting the check back is not enough, because a corrupted party can bias its nonce share (for example y_i = 0) so that the check always passes.</w:t>
       </w:r>
     </w:p>
     <w:p>
@@ -2216,7 +2216,7 @@
           <w:i w:val="0"/>
           <w:sz w:val="20"/>
         </w:rPr>
-        <w:t>The authors' response (v0.22 [11]) replaces commitments by zero-knowledge well-formedness proofs and handles the s2 channel with a mandatory per-key signing cap of about 2^13/2^14/2^14 (ML-DSA-44/65/87), enforced by key rotation, against a claimed integer-uniqueness wall near 2^15.2/2^16.4/2^16.2 below which the observations cannot determine s2 by themselves. Each preprocessed nonce is bound to one quorum and erased after use. The cap is the entire defence of the s2 channel, which makes it the natural core target; it also hurts deployability, because certificates and pinned keys cannot rotate every few thousand signatures.</w:t>
+        <w:t>The authors' response, v0.22 [11], replaces the commitments with zero knowledge proofs that the values are well formed. It handles the s2 channel with a mandatory limit of about 2^13, 2^14 and 2^14 signatures per key (ML-DSA-44, 65 and 87), enforced by changing the key. The authors compare this cap with an integer uniqueness wall near 2^15.2, 2^16.4 and 2^16.2. Below the wall, they claim, the observations alone cannot pin down s2. Each prepared nonce is tied to one quorum and erased after use. The cap is the only defence of the s2 channel, so it is the natural core target. It also hurts practical use, because certificates and pinned keys cannot be replaced every few thousand signatures.</w:t>
       </w:r>
     </w:p>
     <w:p>
@@ -2230,7 +2230,7 @@
           <w:i w:val="0"/>
           <w:sz w:val="20"/>
         </w:rPr>
-        <w:t>Worked illustration of Attack 1.</w:t>
+        <w:t>Attack 1 in detail.</w:t>
       </w:r>
       <w:r>
         <w:rPr>
@@ -2239,7 +2239,7 @@
           <w:i w:val="0"/>
           <w:sz w:val="20"/>
         </w:rPr>
-        <w:t xml:space="preserve"> The number-theoretic transform (NTT) is the modular analogue of the FFT: it turns a product of polynomials in R_q into 256 independent products of numbers mod q, one per slot. Working in the NTT domain, A splits into 256 independent k×ℓ matrices over Z_q, one per slot. Each is left-invertible unless an event of probability about 1/q occurs, which is the origin of the 2^-15 and 2^-38 bounds, so any observer solves the system slot by slot and obtains s1,i exactly; shortness is irrelevant because no lattice problem arises. With k = ℓ = 1 the commitment is just a·s mod q, and dividing by a recovers s. The reasoning “discrete-log commitments hide, so lattice ones should” fails because g^x hides x only since discrete logarithms are hard, whereas A·x is a linear map and linear maps are easy to undo.</w:t>
+        <w:t xml:space="preserve"> The number theoretic transform (NTT) is the modular version of the FFT. It turns a product of polynomials in R_q into 256 separate products of numbers modulo q, one per slot. In the NTT domain, A splits into 256 separate k×ℓ matrices over Z_q, one per slot. Each one can be inverted from the left unless an event of probability about 1/q happens, and this is where the 2^-15 and 2^-38 bounds come from. So any observer solves the system slot by slot and gets s1,i exactly. Shortness plays no role, because no lattice problem is involved. With k = ℓ = 1 the commitment is just a·s mod q, and dividing by a gives back s. The tempting reasoning is that discrete log commitments hide, so lattice ones should too. It fails because g^x hides x only because discrete logarithms are hard, while A·x is a linear map, and linear maps are easy to undo.</w:t>
       </w:r>
     </w:p>
     <w:p>
@@ -2253,7 +2253,7 @@
           <w:i w:val="0"/>
           <w:sz w:val="20"/>
         </w:rPr>
-        <w:t>Worked illustration of Attack 2.</w:t>
+        <w:t>Attack 2 in detail.</w:t>
       </w:r>
       <w:r>
         <w:rPr>
@@ -2262,7 +2262,7 @@
           <w:i w:val="0"/>
           <w:sz w:val="20"/>
         </w:rPr>
-        <w:t xml:space="preserve"> Consider one coefficient of s′. A single sample b = −c·s′ + e constrains a sum of τ secret coefficients to a window about 2γ2 wide, far wider than the secret's range, so it says almost nothing. Averaging over independent challenges shrinks the uncertainty like 1/√(Nτ), and once it falls below 1/2 each coefficient can be rounded. The factor γ2²/τ in (1) shows why ML-DSA-44, with the small γ2 = (q−1)/88, is the most exposed per signature. Two points matter for P1: (1) treats the noise as Gaussian, wasting the information in its sharp edges, and it recovers s′ one coefficient at a time, whereas ILP and lattice reduction use all constraints jointly.</w:t>
+        <w:t xml:space="preserve"> Look at one coefficient of s′. A single sample b = −c·s′ + e places a sum of τ secret coefficients in a window about 2γ2 wide. This is far wider than the range of the secret, so one sample says almost nothing. Averaging over many independent challenges shrinks the uncertainty like 1/√(Nτ). Once it falls below 1/2, each coefficient can be rounded. The factor γ2²/τ in (1) shows why ML-DSA-44, with its small γ2 = (q−1)/88, leaks the most per signature. Two points matter for P1. Formula (1) treats the noise as Gaussian and so wastes the information in its sharp edges. It also recovers s′ one coefficient at a time, while integer programming and lattice reduction use all the constraints together.</w:t>
       </w:r>
     </w:p>
     <w:p>
@@ -2277,7 +2277,7 @@
           <w:i/>
           <w:sz w:val="20"/>
         </w:rPr>
-        <w:t>D. Leakage-based cryptanalysis of lattice signatures</w:t>
+        <w:t>D. Leakage attacks on lattice signatures</w:t>
       </w:r>
     </w:p>
     <w:p>
@@ -2291,7 +2291,7 @@
           <w:i w:val="0"/>
           <w:sz w:val="20"/>
         </w:rPr>
-        <w:t>Bootle et al. [17] introduced the ILWE view of linear leakage in BLISS. Zhou et al. [18] show that the challenges of rejected Dilithium signatures bound c·s from both sides and recover keys by integer linear programming (ILP). Damm et al. [19] define Concealed ILWE, where only a fraction of samples leak, and break masked Dilithium with Huber and Cauchy regression. Yates et al. [20] find least-squares attacks on captured signatures insufficient at the parameters they studied. Hence any threshold design that releases values correlated with c·s1 or c·s2 must be tested with estimators stronger than least squares: bounded-noise estimators, ILP, robust regression and lattice reduction.</w:t>
+        <w:t>Bootle et al. [17] introduced the ILWE view of linear leakage in BLISS. Zhou et al. [18] show that the challenges of rejected Dilithium signatures bound c·s from both sides, and they recover keys by integer linear programming (ILP). Damm et al. [19] define Concealed ILWE, where only some samples leak, and break masked Dilithium with Huber and Cauchy regression. Yates et al. [20] find that least squares attacks on captured signatures are not enough at the parameters they studied. So any threshold design that releases values linked to c·s1 or c·s2 must be tested with estimators stronger than least squares. These include bounded noise estimators, ILP, robust regression and lattice reduction.</w:t>
       </w:r>
     </w:p>
     <w:p>
@@ -2314,7 +2314,7 @@
           <w:i w:val="0"/>
           <w:sz w:val="20"/>
         </w:rPr>
-        <w:t xml:space="preserve"> If each of T parties adds a uniform nonce share, the aggregate follows a bell-shaped Irwin–Hall law, and z = y + c·s1 is that bell shifted by c·s1, so each signature carries a little Fisher information about s1. Kao [12] bounds the per-signature loss below 0.013 bits, but [10] proves an attack after about 2^30 signatures at ML-DSA-65; a design must make the revealed nonce exactly uniform (the claim of Quorus and Trilithium) or cap the number of signatures (TALUS).</w:t>
+        <w:t xml:space="preserve"> Suppose each of T parties adds a uniform nonce share. The total then follows a bell shaped Irwin–Hall distribution, and z = y + c·s1 is that bell moved by c·s1. So each signature carries a little Fisher information about s1. Kao [12] bounds the loss below 0.013 bits per signature, but [10] proves an attack after about 2^30 signatures at ML-DSA-65. A design must therefore either make the revealed nonce exactly uniform, as Quorus and Trilithium claim, or limit the number of signatures, as TALUS does.</w:t>
       </w:r>
     </w:p>
     <w:p>
@@ -2337,7 +2337,7 @@
           <w:i w:val="0"/>
           <w:sz w:val="20"/>
         </w:rPr>
-        <w:t xml:space="preserve"> Static corruption fixes the corrupted set before the protocol starts; adaptive corruption chooses it during execution. Dishonest-majority security (Mithril) allows T−1 corrupted signers; honest-majority security (Quorus, TALUS-MPC) requires N ≥ 2T−1. Without identifiable aborts, as in Mithril, a corrupted party can abort after seeing honest contributions and retry, so aborted transcripts join the adversary's view. The harness therefore treats the corruption model as an input, not a constant.</w:t>
+        <w:t xml:space="preserve"> With static corruption the attacker picks the corrupted parties before the protocol starts. With adaptive corruption it can pick them while the protocol runs. Dishonest majority security, as in Mithril, allows T−1 corrupted signers. Honest majority security, as in Quorus and TALUS-MPC, needs N ≥ 2T−1. Without identifiable aborts, as in Mithril, a corrupted party can abort after seeing the honest parties' messages and try again. The aborted transcripts then become part of what the attacker sees. For this reason the harness treats the corruption model as an input, not a fixed setting.</w:t>
       </w:r>
     </w:p>
     <w:p>
@@ -2360,7 +2360,7 @@
           <w:i w:val="0"/>
           <w:sz w:val="20"/>
         </w:rPr>
-        <w:t xml:space="preserve"> Masking splits secrets into shares so that no intermediate value correlates with the key, but [19] shows masking alone fails when a fraction of samples leak with low noise. Against rejection leakage the defence is to hide which check failed and to release nothing derived from a rejected response, which is why Quorus's release of (w1, c, ⊥) needs its careful simulation argument. Costs differ: masking costs time, a signing cap costs key rotation, and hiding rejected transcripts costs interaction.</w:t>
+        <w:t xml:space="preserve"> Masking splits secrets into shares so that no value in between is linked to the key. But [19] shows that masking alone fails when some samples leak with little noise. Against leakage from rejection, the defence is to hide which check failed and to release nothing computed from a rejected answer. This is why Quorus needs a careful simulation argument for releasing (w1, c, ⊥). Each defence has a cost. Masking costs time, a signing cap costs key changes, and hiding rejected transcripts costs extra interaction.</w:t>
       </w:r>
     </w:p>
     <w:p>
@@ -2375,7 +2375,7 @@
           <w:i/>
           <w:sz w:val="20"/>
         </w:rPr>
-        <w:t>E. Related and superseded work</w:t>
+        <w:t>E. Related and older work</w:t>
       </w:r>
     </w:p>
     <w:p>
@@ -2389,7 +2389,7 @@
           <w:i w:val="0"/>
           <w:sz w:val="20"/>
         </w:rPr>
-        <w:t>The Mithril line began as a poster [6] and a withdrawn preliminary ePrint [5]; all Mithril claims here come from [4] and [7]. Kao's design [12] is not a Call submission, but TALUS builds on it and it shows the same patterns. Its fully distributed profile P2 broadcasts masked commitments, and the paper's own remarks show that an exposed λ_h·A·y_h yields y_h and then the key; the masks hide these only when |S∖C| ≥ 2, that is, when at least two signers are honest. The paper concedes that at T = N with N−1 corruptions mask hiding fails in P2, yet its Table 1 still claims dishonest-majority unforgeability with UC proofs against static adversaries. Its Irwin–Hall analysis bounds the loss by 0.013 bits per signing query, stated as non-vacuous for q_s &lt; 16,000.</w:t>
+        <w:t>The Mithril line began as a poster [6] and an early ePrint that has since been withdrawn [5]. All Mithril claims here come from [4] and [7]. Kao's design [12] is not a Call submission, but TALUS builds on it and it shows the same patterns. Its fully distributed profile P2 broadcasts masked commitments. The paper's own remarks show that an exposed value λ_h·A·y_h gives y_h and then the key. The masks hide these values only when |S∖C| ≥ 2, that is, when at least two signers are honest. The paper admits that mask hiding fails in P2 at T = N with N−1 corrupted parties. Yet its Table 1 still claims unforgeability with a dishonest majority, with UC proofs against static attackers. Its Irwin–Hall analysis bounds the loss by 0.013 bits per signing query and calls this meaningful for q_s &lt; 16,000.</w:t>
       </w:r>
     </w:p>
     <w:p>
@@ -2404,7 +2404,7 @@
           <w:i/>
           <w:sz w:val="20"/>
         </w:rPr>
-        <w:t>F. Recent work, 2024–2026 (added in Phase 2)</w:t>
+        <w:t>F. Recent work from 2024 to 2026 (added in Phase 2)</w:t>
       </w:r>
     </w:p>
     <w:p>
@@ -2418,7 +2418,7 @@
           <w:i w:val="0"/>
           <w:sz w:val="20"/>
         </w:rPr>
-        <w:t>Lattice threshold designs that drop ML-DSA compatibility.</w:t>
+        <w:t>Lattice threshold designs that give up ML-DSA compatibility.</w:t>
       </w:r>
       <w:r>
         <w:rPr>
@@ -2427,7 +2427,7 @@
           <w:i w:val="0"/>
           <w:sz w:val="20"/>
         </w:rPr>
-        <w:t xml:space="preserve"> Espitau, Katsumata and Takemure [27] give a two-round lattice threshold signature under a new algebraic one-more MLWE assumption, with signatures of about 11 KB even for 1024 signers. Ringtail [26] reaches two rounds from standard LWE, with a message-independent first round, 13.4 KB signatures and 10.5 KB of online communication at 1024 parties, and was run across 8 countries. Their authors have joined in Tanuki [28], a Raccoon-based two-round scheme announced for the same NIST call; its signatures are not ML-DSA signatures, so it lies outside our four targets. These schemes show the price of FIPS 204 compatibility: giving it up buys fewer rounds and thousands of parties. TOPCOAT [29], from the Cybernetica group behind Trilithium, is an earlier two-party Dilithium protocol with public-key compression and fewer rounds, based on MLWE and MSIS.</w:t>
+        <w:t xml:space="preserve"> Espitau, Katsumata and Takemure [27] give a two round lattice threshold signature under a new assumption, algebraic one more MLWE. Its signatures are about 11 KB even for 1024 signers. Ringtail [26] reaches two rounds from standard LWE. Its first round does not depend on the message, its signatures are 13.4 KB, it needs 10.5 KB of online communication at 1024 parties, and it was run across 8 countries. These authors have joined forces in Tanuki [28], a two round scheme based on Raccoon that was announced for the same NIST call. Its signatures are not ML-DSA signatures, so it falls outside our four targets. Together these schemes show the price of FIPS 204 compatibility. Giving it up buys fewer rounds and thousands of parties. TOPCOAT [29], from the Cybernetica group behind Trilithium, is an earlier two party Dilithium protocol with public key compression and fewer rounds, based on MLWE and MSIS.</w:t>
       </w:r>
     </w:p>
     <w:p>
@@ -2441,7 +2441,7 @@
           <w:i w:val="0"/>
           <w:sz w:val="20"/>
         </w:rPr>
-        <w:t>Follow-ups to the ML-DSA proposals.</w:t>
+        <w:t>Follow ups to the ML-DSA proposals.</w:t>
       </w:r>
       <w:r>
         <w:rPr>
@@ -2450,7 +2450,7 @@
           <w:i w:val="0"/>
           <w:sz w:val="20"/>
         </w:rPr>
-        <w:t xml:space="preserve"> Rambaud, Roth and Urban [30] turn Mithril into a “threshold signatures as a service” variant, ML-DSaaS, that merges its first two rounds into one message-independent round and reports a two to three times faster online phase. A preprint by Meng [31], posted on 20 October 2026 after our experiments, studies fault-induced nonce repetition: if a party's device is made to reuse its nonce sample across sessions, the revealed per-party responses expose that party's share. It reports exact key recovery on Mithril, classifies Quorus as immune because per-party responses are never revealed, TALUS as exposed only if one-time preprocessing is skipped, and Trilithium as fault-fragile. This is a physical fault model, outside our transcript-only threat model; we read only its abstract page and have not reproduced it.</w:t>
+        <w:t xml:space="preserve"> Rambaud, Roth and Urban [30] turn Mithril into a “threshold signatures as a service” variant called ML-DSaaS. It merges the first two rounds into one round that does not depend on the message, and reports an online phase two to three times faster. A preprint by Meng [31], posted on 20 October 2026 after our experiments, studies nonce repetition caused by faults. If a party's device is forced to reuse its nonce across sessions, the responses it reveals expose its share. The preprint reports exact key recovery on Mithril. It rates Quorus as immune, because responses of single parties are never revealed. It rates TALUS as exposed only if the one time preparation is skipped, and Trilithium as fragile under faults. This is a physical fault model, outside our model in which the attacker sees only transcripts. We read only its abstract page and have not reproduced it.</w:t>
       </w:r>
     </w:p>
     <w:p>
@@ -2473,7 +2473,7 @@
           <w:i w:val="0"/>
           <w:sz w:val="20"/>
         </w:rPr>
-        <w:t xml:space="preserve"> Two 2026 preprints sharpen the toolbox of Section II-D for single-signer ML-DSA when one bit of the nonce leaks per signature: Schubert et al. [32] replace linear regression by constraint satisfaction with hill climbing and need 37–68× fewer relations (5,000–35,000), and Paskarbeit et al. [33] estimate the bit-error rate of noisy leakage and cut the relations needed by 20–44%. Both support the lesson of our P1 result: estimators that use the exact structure of the leakage beat plain least squares by orders of magnitude. Finally, HAETAE [34] is the main other Fiat–Shamir-with-aborts signature built on hyperball sampling; Section V-B uses it as a check on Mithril's intersection bound.</w:t>
+        <w:t xml:space="preserve"> Two 2026 preprints improve the toolbox of Section II-D for a single ML-DSA signer when one bit of the nonce leaks with each signature. Schubert et al. [32] replace linear regression with constraint solving and hill climbing. They need 37 to 68 times fewer relations, between 5,000 and 35,000. Paskarbeit et al. [33] estimate the bit error rate of noisy leakage and cut the relations needed by 20 to 44%. Both agree with the lesson of our P1 result. Estimators that use the exact structure of the leakage beat plain least squares by orders of magnitude. Finally, HAETAE [34] is the main other Fiat–Shamir with aborts signature built on hyperball sampling. Section V-B uses it to check Mithril's intersection bound.</w:t>
       </w:r>
     </w:p>
     <w:p>
@@ -2488,7 +2488,7 @@
           <w:i/>
           <w:sz w:val="20"/>
         </w:rPr>
-        <w:t>G. Gap analysis and comparison</w:t>
+        <w:t>G. Gaps and comparison</w:t>
       </w:r>
     </w:p>
     <w:p>
@@ -2522,7 +2522,7 @@
           <w:i w:val="0"/>
           <w:sz w:val="20"/>
         </w:rPr>
-        <w:t xml:space="preserve"> of Mithril, Quorus or Trilithium transcripts, only design-level arguments.</w:t>
+        <w:t xml:space="preserve"> of Mithril, Quorus or Trilithium transcripts. There are only arguments at the design level.</w:t>
       </w:r>
     </w:p>
     <w:p>
@@ -2547,7 +2547,7 @@
           <w:i w:val="0"/>
           <w:sz w:val="20"/>
         </w:rPr>
-        <w:t>TALUS's cap</w:t>
+        <w:t>The TALUS cap</w:t>
       </w:r>
       <w:r>
         <w:rPr>
@@ -2556,7 +2556,7 @@
           <w:i w:val="0"/>
           <w:sz w:val="20"/>
         </w:rPr>
-        <w:t xml:space="preserve"> sits about 2 bits below the authors' wall and 14–17 bits below Niot's unoptimised estimate (1); an optimised bounded-noise or ILP estimator could close this gap.</w:t>
+        <w:t xml:space="preserve"> sits about 2 bits below the authors' wall and 14 to 17 bits below Niot's unoptimised estimate (1). A better bounded noise or ILP estimator could close this gap.</w:t>
       </w:r>
     </w:p>
     <w:p>
@@ -2581,7 +2581,7 @@
           <w:i w:val="0"/>
           <w:sz w:val="20"/>
         </w:rPr>
-        <w:t>Rejected-attempt transcripts</w:t>
+        <w:t>Rejected attempt transcripts</w:t>
       </w:r>
       <w:r>
         <w:rPr>
@@ -2608,7 +2608,7 @@
           <w:i w:val="0"/>
           <w:sz w:val="20"/>
         </w:rPr>
-        <w:t xml:space="preserve"> (7–12 bits reported; proof for Q_s = 2^50 only) lack independent re-derivation.</w:t>
+        <w:t xml:space="preserve"> (7 to 12 bits reported, proof for Q_s = 2^50 only) have not been checked independently.</w:t>
       </w:r>
     </w:p>
     <w:p>
@@ -2633,7 +2633,7 @@
           <w:i w:val="0"/>
           <w:sz w:val="20"/>
         </w:rPr>
-        <w:t>Corruption-model gaps</w:t>
+        <w:t>Gaps in the corruption model.</w:t>
       </w:r>
       <w:r>
         <w:rPr>
@@ -2642,7 +2642,7 @@
           <w:i w:val="0"/>
           <w:sz w:val="20"/>
         </w:rPr>
-        <w:t>: static-only proofs, honest-majority boundaries and side conditions such as |S∖C| ≥ 2.</w:t>
+        <w:t xml:space="preserve"> Some proofs cover static corruption only, some need an honest majority, and some have side conditions such as |S∖C| ≥ 2.</w:t>
       </w:r>
     </w:p>
     <w:p>
@@ -2656,7 +2656,7 @@
           <w:i w:val="0"/>
           <w:sz w:val="20"/>
         </w:rPr>
-        <w:t>Mithril alone tolerates a dishonest majority but is limited to N ≤ 6; Quorus scales but needs an honest majority and many rounds; Trilithium covers phone-and-server with a trusted helper; TALUS minimises rounds but its s2 protection is a usage cap rather than a structural argument. Independent testing therefore adds most value where a proof contains a margin (TALUS), a heuristic (Trilithium) or a changed distribution (Mithril). Evidence quality differs as well: Mithril and Quorus have reductions in the (quantum) random oracle model, Trilithium a UC proof resting on an MLWR-type assumption, and TALUS an information-theoretic argument with a numerical margin. A margin is the one kind of evidence that can be checked directly by experiment, which is a further reason to make the TALUS cap the core problem.</w:t>
+        <w:t>Only Mithril tolerates a dishonest majority, but it is limited to N ≤ 6. Quorus scales, but needs an honest majority and many rounds. Trilithium covers a phone and a server with a trusted helper. TALUS uses the fewest rounds, but its s2 protection is a usage limit rather than a structural argument. Independent testing therefore helps most where a proof contains a margin (TALUS), a heuristic (Trilithium) or a changed distribution (Mithril). The quality of the evidence also differs. Mithril and Quorus have reductions in the (quantum) random oracle model. Trilithium has a UC proof that rests on an MLWR type assumption. TALUS has an information theoretic argument with a numerical margin. A margin is the one kind of evidence that an experiment can check directly. This is one more reason to make the TALUS cap the core problem.</w:t>
       </w:r>
     </w:p>
     <w:p>
@@ -2685,7 +2685,7 @@
           <w:i w:val="0"/>
           <w:sz w:val="20"/>
         </w:rPr>
-        <w:t>Generalising the observed attacks, Table IV lists ten questions that can be asked of any threshold ML-DSA design; they structure both the survey and the harness of Section IV.</w:t>
+        <w:t>From the attacks above, Table IV lists ten questions that can be asked of any threshold ML-DSA design. They shape both the survey and the harness of Section IV.</w:t>
       </w:r>
     </w:p>
     <w:p>
@@ -2710,7 +2710,7 @@
           <w:i w:val="0"/>
           <w:sz w:val="16"/>
         </w:rPr>
-        <w:t>Attack checklist distilled from the survey</w:t>
+        <w:t>Attack checklist drawn from the survey</w:t>
       </w:r>
     </w:p>
     <w:tbl>
@@ -3441,7 +3441,7 @@
           <w:i w:val="0"/>
           <w:sz w:val="20"/>
         </w:rPr>
-        <w:t>Table V rates each surveyed source for relevance (H central, M supporting, L background) and marks its themes: TS threshold signatures, MD ML-DSA compatible, AT attack or leakage, SS secret sharing or MPC, RS rejection sampling, ST standard. Rows [26]–[34] were added in Phase 2 (Section II-F). Ref. [25], added in Phase 2 for the Mithril finding, is not part of the survey matrix.</w:t>
+        <w:t>Table V rates each source for relevance (H central, M supporting, L background) and marks its themes. The themes are TS threshold signatures, MD ML-DSA compatible, AT attack or leakage, SS secret sharing or MPC, RS rejection sampling, and ST standard. Rows [26] to [34] were added in Phase 2 (Section II-F). Ref. [25] was added in Phase 2 for the Mithril finding and is not part of the survey matrix.</w:t>
       </w:r>
     </w:p>
     <w:p>
@@ -9598,7 +9598,7 @@
           <w:i w:val="0"/>
           <w:sz w:val="20"/>
         </w:rPr>
-        <w:t>Of the 33 sources, 15 are central, 11 supporting and 7 background (the two withdrawn ePrints [5], [15] are background only; no claim rests on them); twenty-two appeared in 2025 or 2026, and 31 of 33 in 2018 or later. The sources marked AT are the evidence base for the estimators in Section IV.</w:t>
+        <w:t>Of the 33 sources, 15 are central, 11 supporting and 7 background. The two withdrawn ePrints [5] and [15] are background only, and no claim rests on them. Twenty two sources appeared in 2025 or 2026, and 31 of the 33 in 2018 or later. The sources marked AT are the evidence base for the estimators in Section IV.</w:t>
       </w:r>
     </w:p>
     <w:p>
@@ -9621,7 +9621,7 @@
           <w:i w:val="0"/>
           <w:sz w:val="20"/>
         </w:rPr>
-        <w:t xml:space="preserve"> Do not publish any linear image of a secret or nonce under A, however it is masked, unless the mask stays hiding under the worst-case corruption allowed (checklist items 1 and 8). Treat the nonce as secret as the key, including in blame and abort procedures (item 2). Keep every single-signer rejection check or prove that the replacement leaks no more (item 3). And bound the signatures per key only with a margin that an optimised estimator, not just least squares, cannot close (item 4). The First-Call history shows these rules are easy to violate when importing discrete-log patterns.</w:t>
+        <w:t xml:space="preserve"> Do not publish any linear image of a secret or nonce under A, however it is masked, unless the mask still hides it under the worst corruption allowed (checklist items 1 and 8). Keep the nonce as secret as the key, also in blame and abort steps (item 2). Keep every single signer rejection check, or prove that the replacement leaks no more (item 3). Limit the signatures per key only with a margin that a good estimator, not just least squares, cannot close (item 4). The history of the First Call shows that these rules are easy to break when patterns from discrete log protocols are copied over.</w:t>
       </w:r>
     </w:p>
     <w:p>
@@ -9636,7 +9636,7 @@
           <w:i/>
           <w:sz w:val="20"/>
         </w:rPr>
-        <w:t>J. Attack surface: Phase 1 hypotheses and verdicts after full reading</w:t>
+        <w:t>J. Attack surface, Phase 1 hypotheses and verdicts after full reading</w:t>
       </w:r>
     </w:p>
     <w:p>
@@ -9650,7 +9650,7 @@
           <w:i w:val="0"/>
           <w:sz w:val="20"/>
         </w:rPr>
-        <w:t>Each Phase 1 hypothesis is listed with its verdict after reading the papers and running the harness (details in Section V). “Confirmed” means the paper text supports it; it does not mean an attack.</w:t>
+        <w:t>Below, each Phase 1 hypothesis is listed with its verdict after we read the papers and ran the harness. Details are in Section V. “Confirmed” means the paper text supports the hypothesis. It does not mean an attack.</w:t>
       </w:r>
     </w:p>
     <w:p>
@@ -9673,7 +9673,7 @@
           <w:i w:val="0"/>
           <w:sz w:val="20"/>
         </w:rPr>
-        <w:t xml:space="preserve"> (i) Accepted-response loss beyond 2^50: confirmed as a proof gap; the published parameters give Q_s = 2^26–2^37 under the paper's own theorem (Section V-B). (ii) Hint loss of 7–12 bits: revised; our lattice-estimator rerun gives up to 23.9 bits for ML-DSA-65. (iii) Adaptive corruption and (iv) selective aborts: not examined further. (v) Floating-point sampler: the Go code was run; its transcripts show no s2 leak (Section V-B), but the sampler itself was not audited.</w:t>
+        <w:t xml:space="preserve"> (i) Loss through accepted answers beyond 2^50 queries. Confirmed as a proof gap. Under the paper's own theorem the published parameters give Q_s = 2^26 to 2^37 (Section V-B). (ii) Hint loss of 7 to 12 bits. Revised. Our rerun of the lattice estimator gives up to 23.9 bits for ML-DSA-65. (iii) Adaptive corruption and (iv) selective aborts. Not examined further. (v) Floating point sampler. We ran the Go code, and its transcripts show no s2 leak (Section V-B). We did not audit the sampler itself.</w:t>
       </w:r>
     </w:p>
     <w:p>
@@ -9696,7 +9696,7 @@
           <w:i w:val="0"/>
           <w:sz w:val="20"/>
         </w:rPr>
-        <w:t xml:space="preserve"> (i) Reveal-on-reject is proven simulatable: confirmed, but the proof is computational (MLWE), not statistical. We also correct our own wording: A·y + e_w is uniform per coefficient, not as a whole vector, so only low-order statistical tests are ruled out. (ii) Only ⊥ is revealed: confirmed; the batched-OR step has 40-bit soundness. (iii) Building blocks: two text errors found (Section V-D), not attacks. (iv) Honest-majority boundary: narrowed; the paper treats only n = 2t+1.</w:t>
+        <w:t xml:space="preserve"> (i) Revealing values on rejection is proven to be simulatable. Confirmed, but the proof is computational (based on MLWE), not statistical. We also correct our own earlier wording. A·y + e_w is uniform for each coefficient on its own, not as a whole vector, so only simple statistical tests are ruled out. (ii) Only ⊥ is revealed. Confirmed. The batched OR step has 40 bit soundness. (iii) Building blocks. We found two text errors (Section V-D), not attacks. (iv) Honest majority boundary. Narrowed, since the paper treats only n = 2t+1.</w:t>
       </w:r>
     </w:p>
     <w:p>
@@ -9719,7 +9719,7 @@
           <w:i w:val="0"/>
           <w:sz w:val="20"/>
         </w:rPr>
-        <w:t xml:space="preserve"> (i) Revised: after rejection the released value is the commitment w_H, not a partial signature, under an explicit MLWR-type assumption. (ii) The declassified bit is one bit per attempt, as in ML-DSA retries: confirmed. (iii) A malicious server tampering with the rejection check: confirmed as a simulation gap visible in the paper's own proof text, worth at most about log2(attempts) bits once. (iv) CRP: trusted; CRP+server collusion is fatal by design.</w:t>
+        <w:t xml:space="preserve"> (i) Revised. After a rejection the released value is the commitment w_H, not a partial signature, under an explicit MLWR type assumption. (ii) One declassified bit per attempt, as in ML-DSA retries. Confirmed. (iii) A malicious server that tampers with the rejection check. Confirmed as a simulation gap that is visible in the paper's own proof. It is worth at most about log2(attempts) bits, once. (iv) The CRP is trusted, and a CRP that colludes with the server is fatal by design.</w:t>
       </w:r>
     </w:p>
     <w:p>
@@ -9742,7 +9742,7 @@
           <w:i w:val="0"/>
           <w:sz w:val="20"/>
         </w:rPr>
-        <w:t xml:space="preserve"> The cap is the whole s2 argument and the noise has sharp edges: measured in Section V-A. </w:t>
+        <w:t xml:space="preserve"> The cap is the whole s2 argument and the noise has sharp edges. We measure this in Section V-A. </w:t>
       </w:r>
       <w:r>
         <w:rPr>
@@ -9751,7 +9751,7 @@
           <w:i w:val="0"/>
           <w:sz w:val="20"/>
         </w:rPr>
-        <w:t>Kao P2:</w:t>
+        <w:t>Kao P2.</w:t>
       </w:r>
       <w:r>
         <w:rPr>
@@ -9760,7 +9760,7 @@
           <w:i w:val="0"/>
           <w:sz w:val="20"/>
         </w:rPr>
-        <w:t xml:space="preserve"> hypothesis strengthened to a key exposure, demonstrated at full ML-DSA size (Section V-C).</w:t>
+        <w:t xml:space="preserve"> The hypothesis is strengthened to a key exposure, shown at full ML-DSA size (Section V-C).</w:t>
       </w:r>
     </w:p>
     <w:p>
@@ -9805,7 +9805,7 @@
           <w:i w:val="0"/>
           <w:sz w:val="20"/>
         </w:rPr>
-        <w:t>A (T, N) threshold scheme Π has a transcript distribution Tr_Π(sk, m): everything an adversary sees while m is signed, including broadcasts, corrupted parties' state and aborted attempts. The adversary statically corrupts as many parties as the scheme allows, observes q_s signing sessions and wins by recovering the secret (s1 suffices, since s2 then follows from t). We study key recovery, which is stronger evidence than a distinguishing bias. Table VI adds the notation not defined in Section I.</w:t>
+        <w:t>A (T, N) threshold scheme Π has a transcript distribution Tr_Π(sk, m). This is everything an attacker sees while m is signed, including broadcasts, the state of corrupted parties and aborted attempts. The attacker corrupts, in advance, as many parties as the scheme allows. It watches q_s signing sessions, and it wins if it recovers the secret. Recovering s1 is enough, since s2 then follows from t. We study key recovery because it is stronger evidence than a small statistical bias. Table VI adds the notation not defined in Section I.</w:t>
       </w:r>
     </w:p>
     <w:p>
@@ -9830,7 +9830,7 @@
           <w:i w:val="0"/>
           <w:sz w:val="16"/>
         </w:rPr>
-        <w:t>Notation added for Sections III–V</w:t>
+        <w:t>Notation added for Sections III to V</w:t>
       </w:r>
     </w:p>
     <w:tbl>
@@ -10114,7 +10114,7 @@
           <w:i w:val="0"/>
           <w:sz w:val="20"/>
         </w:rPr>
-        <w:t>What each scheme publishes beyond the signature (c, z, h) decides which checklist items apply. Table VII gives it as confirmed by the full readings of Phase 2.</w:t>
+        <w:t>What each scheme publishes on top of the signature (c, z, h) decides which checklist items apply. Table VII lists it as confirmed by our full readings in Phase 2.</w:t>
       </w:r>
     </w:p>
     <w:p>
@@ -10484,7 +10484,7 @@
           <w:i/>
           <w:sz w:val="20"/>
         </w:rPr>
-        <w:t>B. Core problem P1: the TALUS signing cap</w:t>
+        <w:t>B. Core problem P1, the TALUS signing cap</w:t>
       </w:r>
     </w:p>
     <w:p>
@@ -10498,7 +10498,7 @@
           <w:i w:val="0"/>
           <w:sz w:val="20"/>
         </w:rPr>
-        <w:t>Intuition.</w:t>
+        <w:t>The idea.</w:t>
       </w:r>
       <w:r>
         <w:rPr>
@@ -10507,7 +10507,7 @@
           <w:i w:val="0"/>
           <w:sz w:val="20"/>
         </w:rPr>
-        <w:t xml:space="preserve"> TALUS removes the s2 check, so each signature leaks one noisy equation in s′, and the defence is to stop before enough equations accumulate. Because BCC confines the noise e to (−γ2+β, γ2−β), the noise has hard edges: a single sample near an edge excludes many candidate secrets, so a bounded-noise estimator can need far fewer samples than least squares, whose error falls only like 1/√N. </w:t>
+        <w:t xml:space="preserve"> TALUS removes the s2 check, so each signature leaks one noisy equation in s′. The defence is to stop before enough equations pile up. BCC keeps the noise e inside (−γ2+β, γ2−β), so the noise has hard edges. A single sample near an edge rules out many candidate secrets. So a bounded noise estimator may need far fewer samples than least squares, whose error falls only like 1/√N. </w:t>
       </w:r>
       <w:r>
         <w:rPr>
@@ -10525,7 +10525,7 @@
           <w:i w:val="0"/>
           <w:sz w:val="20"/>
         </w:rPr>
-        <w:t xml:space="preserve"> Given observations b_j = −c_j·s′ + e_j with e_j confined to the BCC interval, find the number of signatures N* at which s′ is recovered (and checked against the public key) with probability 0.95, for each parameter set, and compare log2 N* with the cap and the wall. A value below the cap is a break; above it, log2 N* minus log2 cap is the margin in bits. </w:t>
+        <w:t xml:space="preserve"> We are given observations b_j = −c_j·s′ + e_j, with each e_j inside the BCC interval. For each parameter set, find the number of signatures N* at which s′ is recovered, and checked against the public key, with probability 0.95. Then compare log2 N* with the cap and the wall. A value below the cap is a break. A value above it gives a margin of log2 N* minus log2 cap bits. </w:t>
       </w:r>
       <w:r>
         <w:rPr>
@@ -10534,7 +10534,7 @@
           <w:i w:val="0"/>
           <w:sz w:val="20"/>
         </w:rPr>
-        <w:t>Success criterion:</w:t>
+        <w:t>Success criterion.</w:t>
       </w:r>
       <w:r>
         <w:rPr>
@@ -10543,7 +10543,7 @@
           <w:i w:val="0"/>
           <w:sz w:val="20"/>
         </w:rPr>
-        <w:t xml:space="preserve"> N* with stated trials and seeds, a positive control (estimator recovers a leaky variant) and a negative control (no false keys on genuine ML-DSA).</w:t>
+        <w:t xml:space="preserve"> N* with stated trials and seeds, a positive control (the estimator recovers a leaky variant) and a negative control (no false keys on genuine ML-DSA).</w:t>
       </w:r>
     </w:p>
     <w:p>
@@ -10566,7 +10566,7 @@
           <w:i w:val="0"/>
           <w:sz w:val="20"/>
         </w:rPr>
-        <w:t xml:space="preserve"> Because the public key already determines s2, protection below the wall is computational. The authors model a syndrome meet-in-the-middle at cost 2^{H/2} with residual entropy H ≥ 502 (about 2^160), but the only proven floor is about 2^58 at ML-DSA-65 and 2^49 at -87 (below 128 bits), and ML-DSA-44 has no public cokernel (k = ℓ). Above the wall the observations alone determine s′, so an efficient estimator that succeeds there recovers the key with no lattice work; between cap and wall, safety rests on that unproven model. Hence P1 measures N* directly. </w:t>
+        <w:t xml:space="preserve"> The public key already determines s2, so below the wall the protection is computational. The authors model a meet in the middle attack on the syndrome, with cost 2^{H/2} and leftover entropy H ≥ 502 (about 2^160). But the only proven floor is about 2^58 at ML-DSA-65 and 2^49 at ML-DSA-87, which is below 128 bits. ML-DSA-44 has no public cokernel at all, since k = ℓ. Above the wall the observations alone determine s′. So an efficient estimator that works there recovers the key without any lattice work. Between the cap and the wall, safety rests on that unproven model. This is why P1 measures N* directly. </w:t>
       </w:r>
       <w:r>
         <w:rPr>
@@ -10575,7 +10575,7 @@
           <w:i w:val="0"/>
           <w:sz w:val="20"/>
         </w:rPr>
-        <w:t>Hypothesis (stated in Phase 1):</w:t>
+        <w:t>Hypothesis (stated in Phase 1).</w:t>
       </w:r>
       <w:r>
         <w:rPr>
@@ -10584,7 +10584,7 @@
           <w:i w:val="0"/>
           <w:sz w:val="20"/>
         </w:rPr>
-        <w:t xml:space="preserve"> bounded-noise and ILP estimators beat the least-squares estimate (1) by a wide margin.</w:t>
+        <w:t xml:space="preserve"> Bounded noise and ILP estimators beat the least squares estimate (1) by a wide margin.</w:t>
       </w:r>
     </w:p>
     <w:p>
@@ -10599,7 +10599,7 @@
           <w:i/>
           <w:sz w:val="20"/>
         </w:rPr>
-        <w:t>C. Stretch goals P2–P4</w:t>
+        <w:t>C. Stretch goals P2 to P4</w:t>
       </w:r>
     </w:p>
     <w:p>
@@ -10622,7 +10622,7 @@
           <w:i w:val="0"/>
           <w:sz w:val="20"/>
         </w:rPr>
-        <w:t xml:space="preserve"> Check the Q_s = 2^50 accounting and the a posteriori key-sharing hint loss for the exact share subset of T−1 corrupted parties. </w:t>
+        <w:t xml:space="preserve"> Check the Q_s = 2^50 accounting, and the hint loss from key sharing for the exact set of shares held by T−1 corrupted parties. </w:t>
       </w:r>
       <w:r>
         <w:rPr>
@@ -10640,7 +10640,7 @@
           <w:i w:val="0"/>
           <w:sz w:val="20"/>
         </w:rPr>
-        <w:t xml:space="preserve"> Test whether rejected-attempt transcripts of Quorus and Trilithium depend on s1 or s2. </w:t>
+        <w:t xml:space="preserve"> Test whether the transcripts of rejected attempts in Quorus and Trilithium depend on s1 or s2. </w:t>
       </w:r>
       <w:r>
         <w:rPr>
@@ -10658,7 +10658,7 @@
           <w:i w:val="0"/>
           <w:sz w:val="20"/>
         </w:rPr>
-        <w:t xml:space="preserve"> Decide whether the masked commitments hide y when |S∖C| = 1, as the paper's Table 1 implies. Phase 1 hypotheses were: P2, a wall above 2^64 (a null result) with the hint loss re-derived; P3, Quorus simulatable thanks to e_w while Trilithium's assumption holds only approximately; P4, failure at |S∖C| = 1. Success criteria were a numerical bound with derivation (P2), a statistical test with stated false-positive rate and sample budget (P3), and an explicit recovery on a toy instance or a reason why the masks hide (P4).</w:t>
+        <w:t xml:space="preserve"> Decide whether the masked commitments hide y when |S∖C| = 1, as the paper's Table 1 implies. Our Phase 1 hypotheses were as follows. For P2, a wall above 2^64 (no attack) with the hint loss worked out again. For P3, Quorus can be simulated thanks to e_w, while Trilithium's assumption holds only roughly. For P4, the masks fail at |S∖C| = 1. The success criteria were a numerical bound with its derivation (P2), a statistical test with a stated false positive rate and sample budget (P3), and an explicit key recovery on a toy instance or a reason why the masks hide (P4).</w:t>
       </w:r>
     </w:p>
     <w:p>
@@ -10674,7 +10674,7 @@
           <w:i w:val="0"/>
           <w:sz w:val="20"/>
         </w:rPr>
-        <w:t>IV. PROPOSED SOLUTION: THE LEAKAGE-TESTING HARNESS</w:t>
+        <w:t>IV. PROPOSED SOLUTION, A LEAKAGE TESTING HARNESS</w:t>
       </w:r>
     </w:p>
     <w:p>
@@ -10739,7 +10739,7 @@
           <w:i w:val="0"/>
           <w:sz w:val="16"/>
         </w:rPr>
-        <w:t>Harness architecture. Our ML-DSA core produces every signing attempt with its secret internals; a scheme view keeps only what that scheme releases (secrets stop there); an adapter turns the observations into pairs (c, b); the estimators never see the secret, and the experiments score them against ground truth.</w:t>
+        <w:t>Harness architecture. Our ML-DSA core produces every signing attempt with its secret internals. A scheme view keeps only what that scheme releases, so secrets stop there. An adapter turns the observations into pairs (c, b). The estimators never see the secret, and the experiments score them against the true key.</w:t>
       </w:r>
     </w:p>
     <w:p>
@@ -10762,7 +10762,7 @@
           <w:i w:val="0"/>
           <w:sz w:val="20"/>
         </w:rPr>
-        <w:t xml:space="preserve"> (1) </w:t>
+        <w:t xml:space="preserve"> The harness has three parts. (1) </w:t>
       </w:r>
       <w:r>
         <w:rPr>
@@ -10780,7 +10780,7 @@
           <w:i w:val="0"/>
           <w:sz w:val="20"/>
         </w:rPr>
-        <w:t xml:space="preserve"> (harness/mldsa): NTT, SHAKE sampling, hints and sign/verify that keeps every attempt; it matches the dilithium-py implementation byte for byte and passes 81 official NIST ACVP vectors (key generation, signing, verification) for all three parameter sets. (2) </w:t>
+        <w:t xml:space="preserve"> (harness/mldsa). It covers the NTT, SHAKE sampling, hints, and signing and verification, and it keeps every attempt. It matches the dilithium-py implementation byte for byte and passes 81 official NIST ACVP vectors for key generation, signing and verification, for all three parameter sets. (2) </w:t>
       </w:r>
       <w:r>
         <w:rPr>
@@ -10789,7 +10789,7 @@
           <w:i w:val="0"/>
           <w:sz w:val="20"/>
         </w:rPr>
-        <w:t>Scheme views</w:t>
+        <w:t>Scheme views.</w:t>
       </w:r>
       <w:r>
         <w:rPr>
@@ -10798,7 +10798,7 @@
           <w:i w:val="0"/>
           <w:sz w:val="20"/>
         </w:rPr>
-        <w:t xml:space="preserve">: plain ML-DSA (negative control), a y-leaking variant (positive control), TALUS-BCC, TALUS v0.1 and Mithril, plus stand-alone Quorus, Trilithium and Kao simulators. (3) </w:t>
+        <w:t xml:space="preserve"> Plain ML-DSA (negative control), a variant that leaks y (positive control), TALUS-BCC, TALUS v0.1 and Mithril, plus separate simulators for Quorus, Trilithium and Kao. (3) </w:t>
       </w:r>
       <w:r>
         <w:rPr>
@@ -10807,7 +10807,7 @@
           <w:i w:val="0"/>
           <w:sz w:val="20"/>
         </w:rPr>
-        <w:t>Estimators</w:t>
+        <w:t>Estimators.</w:t>
       </w:r>
       <w:r>
         <w:rPr>
@@ -10816,7 +10816,7 @@
           <w:i w:val="0"/>
           <w:sz w:val="20"/>
         </w:rPr>
-        <w:t>: least squares; a bounded-noise “edge” estimator, posed as a Chebyshev linear program (minimise the largest residual |b + c·s′|) and solved on CPU or GPU; an ILP finishing step that searches for an integer s′ consistent with every bound; and theory curves (Fisher information and Cramér–Rao bounds). Every recovery is checked against ground truth, and every run is seeded and logged.</w:t>
+        <w:t xml:space="preserve"> Least squares. A bounded noise “edge” estimator, written as a Chebyshev linear program that makes the largest residual |b + c·s′| as small as possible, and solved on CPU or GPU. An ILP finishing step that searches for an integer s′ that fits every bound. And theory curves from Fisher information and Cramér–Rao bounds. Every recovery is checked against the true key, and every run is seeded and logged.</w:t>
       </w:r>
     </w:p>
     <w:p>
@@ -10830,7 +10830,7 @@
           <w:i w:val="0"/>
           <w:sz w:val="20"/>
         </w:rPr>
-        <w:t>Estimators, with intuition.</w:t>
+        <w:t>How the estimators work.</w:t>
       </w:r>
       <w:r>
         <w:rPr>
@@ -10839,7 +10839,7 @@
           <w:i w:val="0"/>
           <w:sz w:val="20"/>
         </w:rPr>
-        <w:t xml:space="preserve"> Least squares averages: stacking N samples (c, b) gives an overdetermined integer system whose solution has per-coefficient error variance about σ_e²/(Nτ), so error falls like 1/√N. Bounded noise uses the edges: if every |e| is at most a known bound, each sample is a pair of linear inequalities |b + c·s′| ≤ bound, and the feasible region (a polytope) shrinks roughly like 1/N rather than 1/√N; the Chebyshev LP finds its centre and rounding gives s′. ILP finishing replaces that rounding by an integer search inside the polytope, in the manner of [18], which helps when a few coefficients sit near a rounding boundary. Fisher information I per signature sets the Cramér–Rao bound on any unbiased estimator's variance; key recovery then needs on the order of 4/(I·τ) signatures [10]. Robust regression (Huber, Cauchy [19]) and lattice-estimator hint accounting are kept for schemes where only a fraction of samples leak or where corrupted parties hold partial information.</w:t>
+        <w:t xml:space="preserve"> Least squares averages. Stacking N samples (c, b) gives an integer system with more equations than unknowns. Its solution has an error variance of about σ_e²/(Nτ) per coefficient, so the error falls like 1/√N. The bounded noise estimator uses the edges instead. If every |e| is at most a known bound, each sample gives a pair of linear inequalities, |b + c·s′| ≤ bound. The region that satisfies all of them is a polytope, and it shrinks roughly like 1/N rather than 1/√N. The Chebyshev linear program finds its centre, and rounding gives s′. ILP finishing replaces that rounding with an integer search inside the polytope, in the style of [18]. This helps when a few coefficients sit near a rounding boundary. The Fisher information I per signature sets the Cramér–Rao bound on the variance of any unbiased estimator. Key recovery then needs on the order of 4/(I·τ) signatures [10]. We keep robust regression (Huber, Cauchy [19]) and hint accounting with the lattice estimator for schemes where only some samples leak, or where corrupted parties hold partial information.</w:t>
       </w:r>
     </w:p>
     <w:p>
@@ -10862,7 +10862,7 @@
           <w:i w:val="0"/>
           <w:sz w:val="20"/>
         </w:rPr>
-        <w:t xml:space="preserve"> For each signing attempt the core records y, w, c, z and which check failed. The TALUS view (1) keeps only attempts whose nonce satisfies BCC, as the offline filter would; (2) drops the secret fields; (3) emits what an observer can compute, v = A·z − c·t1·2^d and the hint, together with c; the adapter then forms b = −c·s′ + e. A corrupted-coalition variant would add the corrupted parties' shares, and for schemes with aborts the view emits exactly the fields the specification says are revealed for a rejected attempt, no more. Because the estimator receives only the view's output, any key it recovers was recoverable from public data.</w:t>
+        <w:t xml:space="preserve"> For each signing attempt the core records y, w, c, z and which check failed. The TALUS view does three things. (1) It keeps only attempts whose nonce satisfies BCC, as the offline filter would. (2) It drops the secret fields. (3) It outputs what an observer can compute, v = A·z − c·t1·2^d and the hint, together with c. The adapter then forms b = −c·s′ + e. A version with a corrupted group of parties would add their shares. For schemes with aborts, the view outputs exactly the fields that the specification says a rejected attempt reveals, and nothing more. The estimator receives only the view's output, so any key it recovers could be recovered from public data.</w:t>
       </w:r>
     </w:p>
     <w:p>
@@ -10885,7 +10885,7 @@
           <w:i w:val="0"/>
           <w:sz w:val="20"/>
         </w:rPr>
-        <w:t xml:space="preserve"> Python with numpy and scipy; the linear programs use the HiGHS solver; the ring products inside the edge estimator, about 90% of its run time, run on an NVIDIA GPU with PyTorch in double precision, about 3× faster than the CPU version and checked against it. Least squares is solved exactly in one pass: after an FFT the equations for each frequency are independent, so each frequency is a single division (agreeing with an iterative solver to 10^-13). Transcripts for several trials are built in parallel processes while the GPU solves.</w:t>
+        <w:t xml:space="preserve"> The code is Python with numpy and scipy. The linear programs use the HiGHS solver. The ring products inside the edge estimator take about 90% of its run time. They run on an NVIDIA GPU with PyTorch in double precision, about three times faster than the CPU version, and we checked them against it. Least squares is solved exactly in one pass. After an FFT the equations for each frequency are independent, so each frequency needs a single division. This agrees with an iterative solver to 10^-13. Transcripts for several trials are built in parallel processes while the GPU solves.</w:t>
       </w:r>
     </w:p>
     <w:p>
@@ -10908,7 +10908,7 @@
           <w:i w:val="0"/>
           <w:sz w:val="20"/>
         </w:rPr>
-        <w:t xml:space="preserve"> Every experiment reports signatures used, recovered fraction, cost and parameter set. N* is where a logistic fit to the success counts (20 trials per N, Clopper–Pearson intervals) reaches 0.95. Recovery is verified against ground truth, so partial correlations are never counted as breaks. Internal threats (primitive bugs, estimator over-fitting) are addressed by the ACVP vectors and by many random keys; external threats (our simulator differing from the real protocol, parameters changing before the packages) remain and are why every TALUS number is labelled as model-based; a negative result is phrased only as a bound on what was tried.</w:t>
+        <w:t xml:space="preserve"> Every experiment reports the signatures used, the fraction recovered, the cost and the parameter set. N* is the point where a logistic fit to the success counts reaches 0.95. We use 20 trials per N and Clopper–Pearson intervals. Recovery is checked against the true key, so a partial match is never counted as a break. Two kinds of risk remain. Internal risks, such as bugs in the primitives or an estimator that overfits, are handled by the ACVP vectors and by many random keys. External risks, such as our simulator differing from the real protocol or parameters changing before the packages appear, remain. This is why every TALUS number is labelled as based on our model. A negative result is stated only as a bound on what we tried.</w:t>
       </w:r>
     </w:p>
     <w:p>
@@ -10922,7 +10922,7 @@
           <w:i w:val="0"/>
           <w:sz w:val="20"/>
         </w:rPr>
-        <w:t>End-to-end check (gate B).</w:t>
+        <w:t>End to end check (gate B).</w:t>
       </w:r>
       <w:r>
         <w:rPr>
@@ -10931,7 +10931,7 @@
           <w:i w:val="0"/>
           <w:sz w:val="20"/>
         </w:rPr>
-        <w:t xml:space="preserve"> Real ML-DSA-44 attempts passed through the TALUS view and the unchanged estimator recovered s′ for 2/2 keys at N = 2×10^5 and 4×10^5 accepted signatures and 0/2 at 10^5 (seed 2029), consistent with N* in Table IX.</w:t>
+        <w:t xml:space="preserve"> We passed real ML-DSA-44 attempts through the TALUS view and the unchanged estimator. It recovered s′ for 2 of 2 keys at N = 2×10^5 and 4×10^5 accepted signatures, and for 0 of 2 at 10^5 (seed 2029). This agrees with N* in Table IX.</w:t>
       </w:r>
     </w:p>
     <w:p>
@@ -10945,7 +10945,7 @@
           <w:i w:val="0"/>
           <w:sz w:val="20"/>
         </w:rPr>
-        <w:t>Least-squares calibration (Fig. 2).</w:t>
+        <w:t>Least squares calibration (Fig. 2).</w:t>
       </w:r>
       <w:r>
         <w:rPr>
@@ -10954,7 +10954,7 @@
           <w:i w:val="0"/>
           <w:sz w:val="20"/>
         </w:rPr>
-        <w:t xml:space="preserve"> To validate the simulator and the error law behind (1) we measured the least-squares error on ML-DSA-44, n = 256 (one ring element), plain LowBits noise, N ∈ {10^3, 3·10^3, 10^4, 3·10^4, 10^5, 3·10^5}, 10 trials per N, seed 2033 (generator default_rng([2033, N, trial])). The mean RMS error stays within 2% of γ2/√(3τN) at every N. Real TALUS v0.1 signatures (keys from seeds 101–103) fall on the same curve. Extrapolating, rounding every coefficient needs on the order of 10^9 signatures, so least squares alone is far from the cap; the bounded-noise estimator is what matters for P1.</w:t>
+        <w:t xml:space="preserve"> To check the simulator and the error law behind (1), we measured the least squares error on ML-DSA-44 with n = 256 (one ring element) and plain LowBits noise. We used N ∈ {10^3, 3·10^3, 10^4, 3·10^4, 10^5, 3·10^5}, 10 trials per N and seed 2033 (generator default_rng([2033, N, trial])). The mean RMS error stays within 2% of γ2/√(3τN) at every N. Real TALUS v0.1 signatures (keys from seeds 101 to 103) fall on the same curve. Extending the curve, rounding every coefficient correctly needs on the order of 10^9 signatures. So least squares alone is far from the cap, and the bounded noise estimator is what matters for P1.</w:t>
       </w:r>
     </w:p>
     <w:p>
@@ -11019,7 +11019,7 @@
           <w:i w:val="0"/>
           <w:sz w:val="16"/>
         </w:rPr>
-        <w:t>Least-squares RMS error per coefficient against signatures N (ML-DSA-44, n = 256). Blue: synthetic channel, mean and min–max over 10 trials (seed 2033); orange: real TALUS v0.1 signatures (seeds 101–103); dashed: theory γ2/√(3τN).</w:t>
+        <w:t>Least squares RMS error per coefficient against the number of signatures N (ML-DSA-44, n = 256). Blue shows the synthetic channel, with the mean and the range over 10 trials (seed 2033). Orange shows real TALUS v0.1 signatures (seeds 101 to 103). The dashed line is the theory curve γ2/√(3τN).</w:t>
       </w:r>
     </w:p>
     <w:p>
@@ -11663,7 +11663,7 @@
           <w:i w:val="0"/>
           <w:sz w:val="20"/>
         </w:rPr>
-        <w:t xml:space="preserve"> The slope −1/2 on the log–log plot is the 1/√N law; the ratio column shows no drift with N, so the Gaussian approximation of uniform LowBits noise is accurate here. An RMS error of 16 at 3×10^5 signatures is still 32 times the 1/2 needed for rounding, which is why least squares never recovered a key in any of our TALUS runs.</w:t>
+        <w:t xml:space="preserve"> The slope of −1/2 on the log scale plot is the 1/√N law. The ratio column shows no drift with N, so treating the uniform LowBits noise as Gaussian is accurate here. At 3×10^5 signatures the RMS error is still 16, which is 32 times the 1/2 needed for rounding. This is why least squares never recovered a key in any of our TALUS runs.</w:t>
       </w:r>
     </w:p>
     <w:p>
@@ -11694,7 +11694,7 @@
           <w:i/>
           <w:sz w:val="20"/>
         </w:rPr>
-        <w:t>A. P1: margin of the TALUS cap (core result)</w:t>
+        <w:t>A. P1, margin of the TALUS cap (core result)</w:t>
       </w:r>
     </w:p>
     <w:p>
@@ -11717,7 +11717,7 @@
           <w:i w:val="0"/>
           <w:sz w:val="20"/>
         </w:rPr>
-        <w:t xml:space="preserve"> We model the TALUS s2 channel as b = −c·s′ + e with e uniform on the BCC interval; the v0.22 writeup does not list per-signature released values, so this is our reading, not the specification. N* is measured per ring element (one of k) unless stated. Table IX summarises the margins.</w:t>
+        <w:t xml:space="preserve"> We model the TALUS s2 channel as b = −c·s′ + e, with e uniform on the BCC interval. The v0.22 writeup does not list the values released with each signature, so this is our reading, not the specification. Unless we say otherwise, N* is measured for one ring element out of k. Table IX sums up the margins.</w:t>
       </w:r>
     </w:p>
     <w:p>
@@ -12321,7 +12321,7 @@
           <w:i w:val="0"/>
           <w:sz w:val="16"/>
         </w:rPr>
-        <w:t>Key-recovery success against signatures N on the TALUS s2 channel, ML-DSA-44, n = 256, 20 trials per point. Grey: least squares (seed 2026), 0/20 everywhere; blue: edge estimator with rounding (seed 2026); orange: edge with ILP finishing (seed 2041); green: whole secret, all k = 4 elements, edge with ILP (seed 2081). Dashed: the authors' cap and uniqueness wall.</w:t>
+        <w:t>Key recovery success against the number of signatures N on the TALUS s2 channel, ML-DSA-44, n = 256, 20 trials per point. Grey is least squares (seed 2026), 0 of 20 everywhere. Blue is the edge estimator with rounding (seed 2026). Orange is the edge estimator with ILP finishing (seed 2041). Green is the whole secret, all k = 4 elements, edge with ILP (seed 2081). The dashed lines are the authors' cap and uniqueness wall.</w:t>
       </w:r>
     </w:p>
     <w:p>
@@ -12335,7 +12335,7 @@
           <w:i w:val="0"/>
           <w:sz w:val="20"/>
         </w:rPr>
-        <w:t>Superiority over the baseline (Fig. 3).</w:t>
+        <w:t>Why our method is better than the baseline (Fig. 3).</w:t>
       </w:r>
       <w:r>
         <w:rPr>
@@ -12344,7 +12344,7 @@
           <w:i w:val="0"/>
           <w:sz w:val="20"/>
         </w:rPr>
-        <w:t xml:space="preserve"> On the same transcripts least squares, the estimator behind Niot's attack (1), recovers nothing up to 2^17.8 signatures and needs about 2^31.7 in our model. The edge estimator reaches 100% at 2^17.2, and ILP finishing moves the curve about a further 1.1 bits left, to 95% at 2^16.0 for one element. That is a gain of about 2^15.7 (roughly 5×10^4 times fewer signatures) over the baseline, from using the known hard edges of the noise instead of averaging them away. The whole-secret curve sits only about 0.1 bit to the right of the one-element curve.</w:t>
+        <w:t xml:space="preserve"> Least squares is the estimator behind Niot's attack (1). On the same transcripts it recovers nothing up to 2^17.8 signatures, and in our model it needs about 2^31.7. The edge estimator reaches 100% at 2^17.2. ILP finishing moves the curve about 1.1 bits further left, to 95% at 2^16.0 for one element. That is a gain of about 2^15.7 over the baseline, or roughly 5×10^4 times fewer signatures. The gain comes from using the known hard edges of the noise instead of averaging them away. The whole secret curve sits only about 0.1 bit to the right of the one element curve.</w:t>
       </w:r>
     </w:p>
     <w:p>
@@ -12367,7 +12367,7 @@
           <w:i w:val="0"/>
           <w:sz w:val="20"/>
         </w:rPr>
-        <w:t xml:space="preserve"> Each point uses 20 independent trials (seed 2041, 120 s ILP limit) with a logistic fit to the success counts. One ring element: ML-DSA-44 0/20 at 2^15.61, 11/20 at 2^15.87, 19/20 at 2^15.99, 20/20 from 2^16.10; -65 16/20 at 2^17.29, 20/20 at 2^17.71; -87 18/20 at 2^17.18, 20/20 at 2^17.49. </w:t>
+        <w:t xml:space="preserve"> Each point uses 20 independent trials (seed 2041, ILP time limit 120 s), with a logistic fit to the success counts. For one ring element of ML-DSA-44 we see 0 of 20 at 2^15.61, 11 of 20 at 2^15.87, 19 of 20 at 2^15.99, and 20 of 20 from 2^16.10. ML-DSA-65 gives 16 of 20 at 2^17.29 and 20 of 20 at 2^17.71. ML-DSA-87 gives 18 of 20 at 2^17.18 and 20 of 20 at 2^17.49. </w:t>
       </w:r>
       <w:r>
         <w:rPr>
@@ -12385,7 +12385,7 @@
           <w:i w:val="0"/>
           <w:sz w:val="20"/>
         </w:rPr>
-        <w:t xml:space="preserve"> An attacker needs all k elements from the same signatures; assuming independence, 95% whole-secret success needs p_elem^k = 0.95, where p_elem is the success rate for one element. For ML-DSA-44 we ran it (seed 2081, 20 whole secrets per N): 3/20 at 2^15.92, 15/20 at 2^16.01, 18/20 at 2^16.10, inside the intervals of the predicted 0.26/0.77/0.90, so the -65/-87 extrapolations are trustworthy. Without ILP (plain rounding) the points sit about 1 bit higher (ML-DSA-44 N*99 = 1.45×10^5). </w:t>
+        <w:t xml:space="preserve"> An attacker needs all k elements from the same signatures. If the elements are independent, 95% success for the whole secret needs p_elem^k = 0.95, where p_elem is the success rate for one element. For ML-DSA-44 we ran it (seed 2081, 20 whole secrets per N). We got 3 of 20 at 2^15.92, 15 of 20 at 2^16.01 and 18 of 20 at 2^16.10. These lie inside the intervals of the predicted 0.26, 0.77 and 0.90, so the extrapolations for ML-DSA-65 and 87 can be trusted. Without ILP, with plain rounding, the points sit about 1 bit higher (for ML-DSA-44, N*99 = 1.45×10^5). </w:t>
       </w:r>
       <w:r>
         <w:rPr>
@@ -12403,7 +12403,7 @@
           <w:i w:val="0"/>
           <w:sz w:val="20"/>
         </w:rPr>
-        <w:t xml:space="preserve"> On real ML-DSA-44 signing without the r0 check (the second rejection check of Section I, on r0 = LowBits(w − c·s2)) the estimator recovered the secret element s2 − t0 (one ring element) in 9/9 runs (3 keys × N = 2, 4, 8×10^5); on genuine ML-DSA it returned it for 0/18 keys (15 of them from seed 2027), only the public-equivalent −t0, so the false-positive rate is below about 15% at 95% confidence (Table X). </w:t>
+        <w:t xml:space="preserve"> We ran real ML-DSA-44 signing without the r0 check, which is the second rejection check of Section I on r0 = LowBits(w − c·s2). The estimator recovered the secret element s2 − t0 (one ring element) in 9 of 9 runs (3 keys, each at N = 2, 4 and 8×10^5). On genuine ML-DSA it returned the secret for 0 of 18 keys (15 of them from seed 2027). It only ever returned −t0, which is already equivalent to public data. So the false positive rate is below about 15% at 95% confidence (Table X). </w:t>
       </w:r>
       <w:r>
         <w:rPr>
@@ -12412,7 +12412,7 @@
           <w:i w:val="0"/>
           <w:sz w:val="20"/>
         </w:rPr>
-        <w:t>Verdict:</w:t>
+        <w:t>Verdict.</w:t>
       </w:r>
       <w:r>
         <w:rPr>
@@ -12421,7 +12421,7 @@
           <w:i w:val="0"/>
           <w:sz w:val="20"/>
         </w:rPr>
-        <w:t xml:space="preserve"> no break; the margin above the cap is about 3–3.5 bits and above the authors' wall only about 1 bit, much thinner than the 12–15 bits suggested by (1).</w:t>
+        <w:t xml:space="preserve"> No break. The margin above the cap is about 3 to 3.5 bits, and above the authors' wall only about 1 bit. This is much thinner than the 12 to 15 bits that (1) suggests.</w:t>
       </w:r>
     </w:p>
     <w:p>
@@ -13198,7 +13198,7 @@
           <w:i w:val="0"/>
           <w:sz w:val="20"/>
         </w:rPr>
-        <w:t>Other attack routes on the cap, all closed.</w:t>
+        <w:t>Other ways to attack the cap, all closed.</w:t>
       </w:r>
       <w:r>
         <w:rPr>
@@ -13207,7 +13207,7 @@
           <w:i w:val="0"/>
           <w:sz w:val="20"/>
         </w:rPr>
-        <w:t xml:space="preserve"> (a) Key rotation is a fresh key generation (v0.22 Sec. 2.3), not a share refresh, so leakage does not carry over. (b) Rejected attempts stay offline; the rare online failures add at most about 0.03 bits. (c) A corrupt insider subtracts its own nonce shares, but at least T honest shares remain in the MPC profile; the insider wall is 2^24.8–2^29.7, 12–16 bits above the cap (Table XI), and a simulation with two honest shares (n = 8) shows maximum likelihood needs 1.5–2× the formula, so the formula favours the attacker. (Only the non-proposed TEE variant falls below the cap, from T = 7, 11 and 9 for ML-DSA-44/65/87, as the authors concede.) (d) A corrupt coordinator sees an out-of-box value once per 2^33.1/2^35.5/2^37.3 sessions by our exact convolution, within one bit of the authors' figures. (e) Below the wall the estimate is only a soft hint (43% of coefficients right at the cap); used in a lattice attack it lowers the ML-DSA-44 key-recovery cost from 2^123.8 to 2^120.6, so no lattice finish under the cap.</w:t>
+        <w:t xml:space="preserve"> (a) Changing the key is a fresh key generation (v0.22 Sec. 2.3), not a refresh of the shares, so leakage does not carry over. (b) Rejected attempts stay offline. The rare online failures add at most about 0.03 bits. (c) A corrupt insider can subtract its own nonce shares, but in the MPC version at least T honest shares remain. The insider wall is 2^24.8 to 2^29.7, which is 12 to 16 bits above the cap (Table XI). A simulation with two honest shares (n = 8) shows that maximum likelihood needs 1.5 to 2 times what the formula says, so the formula favours the attacker. Only the TEE variant, which is not proposed, falls below the cap, from T = 7, 11 and 9 for ML-DSA-44, 65 and 87, as the authors admit. (d) A corrupt coordinator sees a value outside the box once every 2^33.1, 2^35.5 and 2^37.3 sessions by our exact convolution. This is within one bit of the authors' figures. (e) Below the wall the estimate is only a soft hint, with 43% of coefficients right at the cap. Used in a lattice attack, it lowers the cost of recovering the ML-DSA-44 key from 2^123.8 to 2^120.6. So a lattice attack cannot finish the job under the cap.</w:t>
       </w:r>
     </w:p>
     <w:p>
@@ -13687,7 +13687,7 @@
           <w:i w:val="0"/>
           <w:sz w:val="20"/>
         </w:rPr>
-        <w:t xml:space="preserve"> We first ran the edge estimator on reduced rings (n = 8 to 128, 10–20 trials per point, ML-DSA-44 numbers; Fig. 4). Per-element N* flattened around 1–2×10^5 (n = 64: 2.8×10^5; n = 128: 1.9×10^5) instead of falling toward the cap, which is why the full-size runs above were then made denser. At n = 64 the harder target s2 − t0 needed the same N* as s2, and plain LowBits noise behaved like BCC noise. Relative to plain least squares (about 3.6×10^9 in our model) the edge estimator is worth about four orders of magnitude, yet without ILP it stays 4–4.5 bits above the cap. The least-squares figure is about 12 times estimate (1) (3.1×10^8) for a simple reason: (1) only asks that the typical per-coefficient error fall to 1/2, whereas rounding all 256 coefficients correctly at once needs the error about 3.5 standard deviations inside 1/2, and since error shrinks like 1/√N this costs a factor of about 3.5² ≈ 12 in N. The theory module explains the shape: for one coefficient alone the uniform-noise error falls like 1/N exactly (checked by Monte Carlo), and when all 256 coefficients are solved jointly a fitted coupling constant (about 0.76·τ^0.42) accounts for the real N* sitting 1.5–2 bits above the single-coefficient formula. ILP finishing lowers the 50% point by 1.0×, 1.1×, 1.1× and 1.5× at n = 8, 16, 32 and 64, consistent with the roughly 2× at n = 256.</w:t>
+        <w:t xml:space="preserve"> We first ran the edge estimator on smaller rings, n = 8 to 128, with 10 to 20 trials per point and ML-DSA-44 numbers (Fig. 4). N* per element levelled off around 1 to 2×10^5 (2.8×10^5 at n = 64 and 1.9×10^5 at n = 128) instead of falling toward the cap. This is why we then made the full size runs above denser. At n = 64 the harder target s2 − t0 needed the same N* as s2, and plain LowBits noise behaved like BCC noise. Compared with plain least squares (about 3.6×10^9 in our model), the edge estimator gains about four orders of magnitude. Without ILP, however, it stays 4 to 4.5 bits above the cap. The least squares figure is about 12 times estimate (1), which is 3.1×10^8, for a simple reason. Formula (1) only asks that the typical error per coefficient fall to 1/2. Rounding all 256 coefficients correctly at once needs the error to be about 3.5 standard deviations inside 1/2. Since the error shrinks like 1/√N, this costs a factor of about 3.5² ≈ 12 in N. The theory module explains the shape. For one coefficient alone, the error under uniform noise falls exactly like 1/N, which we checked by Monte Carlo. When all 256 coefficients are solved together, a fitted coupling constant of about 0.76·τ^0.42 explains why the real N* sits 1.5 to 2 bits above the single coefficient formula. ILP finishing lowers the 50% point by a factor of 1.0, 1.1, 1.1 and 1.5 at n = 8, 16, 32 and 64. This fits the factor of about 2 at n = 256.</w:t>
       </w:r>
     </w:p>
     <w:p>
@@ -13752,7 +13752,7 @@
           <w:i w:val="0"/>
           <w:sz w:val="16"/>
         </w:rPr>
-        <w:t>Edge-estimator success (rounding, no ILP) for one ring element against N, ML-DSA-44 BCC channel, ring size n = 8 to 256 (20 or 10 trials per point as labelled; script default seed 2026). Larger rings need fewer signatures per element, so the full size n = 256 is the relevant one and toy sizes are pessimistic for the attacker.</w:t>
+        <w:t>Success of the edge estimator (rounding, no ILP) for one ring element against N, ML-DSA-44 BCC channel, ring size n = 8 to 256 (20 or 10 trials per point as labelled, script default seed 2026). Larger rings need fewer signatures per element. So the full size n = 256 is the one that matters, and toy sizes make the attacker look weaker than it is.</w:t>
       </w:r>
     </w:p>
     <w:p>
@@ -13775,7 +13775,7 @@
           <w:i w:val="0"/>
           <w:sz w:val="20"/>
         </w:rPr>
-        <w:t xml:space="preserve"> (i) The channel model (independent uniform noise on the BCC interval, no wrap-around, no use of the hint) is our reading of TALUS, not quoted from the specification. (ii) The whole-secret run is ML-DSA-44 only; -65/-87 are extrapolated. (iii) The hint h was not used separately and the lattice estimate is a Python core-SVP model (core-SVP counts only the cost of the single shortest-vector search inside lattice reduction, the usual conservative way to price lattice attacks), so N* is an upper bound on what an attacker needs. (iv) Our wall and cap figures are the authors'; we did not re-derive the wall.</w:t>
+        <w:t xml:space="preserve"> (i) The channel model is our reading of TALUS, not a quote from the specification. It assumes independent uniform noise on the BCC interval, no wrap around, and no use of the hint. (ii) We ran the whole secret experiment for ML-DSA-44 only. ML-DSA-65 and 87 are extrapolated. (iii) We did not use the hint h separately, and the lattice estimate is a Python core-SVP model. Core-SVP counts only the cost of the single shortest vector search inside lattice reduction, which is the usual cautious way to price lattice attacks. So N* is an upper bound on what an attacker needs. (iv) The wall and cap figures are the authors'. We did not work out the wall again ourselves.</w:t>
       </w:r>
     </w:p>
     <w:p>
@@ -13813,7 +13813,7 @@
           <w:i w:val="0"/>
           <w:sz w:val="20"/>
         </w:rPr>
-        <w:t xml:space="preserve"> On our implementation of the arXiv v2 design [10] (ML-DSA-44, |S| = 3, keys from seeds 101–103; DKG simplified to Shamir sharing), attack 1 recovered s1 exactly from the key-generation broadcast (3/3 keys) and from one MPC signature (60/60). Attack 2 by least squares follows the theory curve up to N = 10^5 (Fig. 2) and would need about 1.2×10^9 signatures. A separate sanity run on real no-check ML-DSA-44 transcripts gave 0.97× Niot's error formula (12 runs), and on the same transcripts the edge estimator needed about 1,500× fewer signatures than his least-squares N. Simplifications: plain ML-DSA key generation followed by Shamir sharing of s1 instead of the paper's DKG, the MPC computation of w1 replaced by its correct output, and |S| = T = 3 throughout. The exercise shows why TALUS changed its design, and that our views reproduce a published break exactly.</w:t>
+        <w:t xml:space="preserve"> We implemented the arXiv v2 design [10] with ML-DSA-44, |S| = 3, keys from seeds 101 to 103, and a DKG simplified to Shamir sharing. Attack 1 recovered s1 exactly from the key generation broadcast (3 of 3 keys) and from one MPC signature (60 of 60). Attack 2 by least squares follows the theory curve up to N = 10^5 (Fig. 2) and would need about 1.2×10^9 signatures. A separate check on real ML-DSA-44 transcripts without the check gave 0.97 times Niot's error formula (12 runs). On the same transcripts the edge estimator needed about 1,500 times fewer signatures than his least squares N. Our simplifications were plain ML-DSA key generation followed by Shamir sharing of s1 instead of the paper's DKG, the MPC computation of w1 replaced by its correct output, and |S| = T = 3 throughout. The exercise shows why TALUS changed its design. It also shows that our views reproduce a published break exactly.</w:t>
       </w:r>
     </w:p>
     <w:p>
@@ -13827,7 +13827,7 @@
           <w:i w:val="0"/>
           <w:sz w:val="20"/>
         </w:rPr>
-        <w:t>Mithril proof-parameter gap (P2).</w:t>
+        <w:t>Mithril proof parameter gap (P2).</w:t>
       </w:r>
       <w:r>
         <w:rPr>
@@ -13836,7 +13836,7 @@
           <w:i w:val="0"/>
           <w:sz w:val="20"/>
         </w:rPr>
-        <w:t xml:space="preserve"> Theorem 3.2 of [4] bounds the number of safe queries through a hyperball-intersection lemma taken from the ePrint full version of Devevey et al. [25] (App. A.6). That bound uses exponent n−1 where a correct cylinder argument gives (n−1)/2; for ML-DSA-44 it gives 2^-50.1 where the exact value is 2^-33.5 (reproduced with the authors' own Sage parameter script). With the published parameters the theorem then covers Q_s = 2^26–2^37 rather than 2^50. Under the typical norm distribution (heuristic, not a proof) most sets still reach 2^50, some fall up to about 3 bits short; corrected parameters need 1.3× to 8.5× more parallel repetitions K (Table XII). The faulty bound is ePrint-only (the ASIACRYPT version states only the exact formula), and among 13 citing works we checked only Mithril uses it; HAETAE [34], the other main hyperball scheme, evaluates the exact incomplete-Beta value numerically and is unaffected. Seen from the other side, reaching 2^50 with the published radii would require the norm bound B in the proof to sit only 0–7 standard deviations above the mean norm of c·s, whereas the proof needs an overwhelming bound (the paper's footnote says about 13). This is a proof gap, not an attack: exceeding the bound slightly enlarges a Rényi-divergence budget and does not obviously reveal s. We wrote a corrected bound with proof (exponent (n−1)/2, within 0.04 bits of the exact value at Mithril sizes; 320 test points, 0 violations, while the printed bound fails at 149). </w:t>
+        <w:t xml:space="preserve"> Theorem 3.2 of [4] bounds the number of safe queries using a lemma on the intersection of hyperballs. The lemma is taken from the ePrint full version of Devevey et al. [25] (App. A.6). That bound uses the exponent n−1, where a correct cylinder argument gives (n−1)/2. For ML-DSA-44 it gives 2^-50.1, while the exact value is 2^-33.5. We reproduced this with the authors' own Sage parameter script. With the published parameters the theorem then covers Q_s = 2^26 to 2^37 queries rather than 2^50. Under the typical norm distribution, which is a heuristic and not a proof, most sets still reach 2^50, and some fall up to about 3 bits short. Corrected parameters need 1.3 to 8.5 times more parallel repetitions K (Table XII). The faulty bound appears only in the ePrint version, since the ASIACRYPT version states only the exact formula. Of 13 citing works we checked, only Mithril uses it. HAETAE [34], the other main hyperball scheme, computes the exact incomplete Beta value numerically and is not affected. Seen the other way, reaching 2^50 with the published radii would need the norm bound B in the proof to sit only 0 to 7 standard deviations above the mean norm of c·s. The proof, however, needs an overwhelming bound, and the paper's footnote says about 13. This is a proof gap, not an attack. Going slightly over the bound enlarges a Rényi divergence budget a little and does not obviously reveal s. We wrote a corrected bound with a proof. It uses the exponent (n−1)/2 and is within 0.04 bits of the exact value at Mithril sizes. It held at all 320 test points, while the printed bound failed at 149. </w:t>
       </w:r>
       <w:r>
         <w:rPr>
@@ -13854,7 +13854,7 @@
           <w:i w:val="0"/>
           <w:sz w:val="20"/>
         </w:rPr>
-        <w:t xml:space="preserve"> Running the authors' Go signing code (ML-DSA-44, (T, N) = (2, 3), 110,000 slots, 39,461 with no party rejecting) and regressing the leftover of A·z − c·t − w on −c·s2 gives slope 0.004 ± 0.10 (1 would mean an s2 leak): accepted responses do not depend on s2, only the public-equivalent c·t0 remains, and we corrected our Mithril view accordingly. </w:t>
+        <w:t xml:space="preserve"> We ran the authors' Go signing code (ML-DSA-44, (T, N) = (2, 3), 110,000 slots, of which 39,461 had no party rejecting). Regressing the leftover of A·z − c·t − w on −c·s2 gives a slope of 0.004 ± 0.10, where 1 would mean an s2 leak. So accepted answers do not depend on s2. Only c·t0 remains, which is equivalent to public data, and we corrected our Mithril view to match. </w:t>
       </w:r>
       <w:r>
         <w:rPr>
@@ -13872,7 +13872,7 @@
           <w:i w:val="0"/>
           <w:sz w:val="20"/>
         </w:rPr>
-        <w:t xml:space="preserve"> With the exact share subset of T−1 parties, the lattice estimator gives losses of 4.9–7.7 (ML-DSA-44), 17.7–23.9 (-65) and 8.6–14.4 bits (-87), against the reported 7–12 (Table XIII).</w:t>
+        <w:t xml:space="preserve"> For the exact set of shares held by T−1 parties, the lattice estimator gives losses of 4.9 to 7.7 bits (ML-DSA-44), 17.7 to 23.9 bits (ML-DSA-65) and 8.6 to 14.4 bits (ML-DSA-87), compared with the reported 7 to 12 bits (Table XIII).</w:t>
       </w:r>
     </w:p>
     <w:p>
@@ -14800,7 +14800,7 @@
           <w:i w:val="0"/>
           <w:sz w:val="20"/>
         </w:rPr>
-        <w:t>Beyond 2^50.</w:t>
+        <w:t>Beyond 2^50 queries.</w:t>
       </w:r>
       <w:r>
         <w:rPr>
@@ -14809,7 +14809,7 @@
           <w:i w:val="0"/>
           <w:sz w:val="20"/>
         </w:rPr>
-        <w:t xml:space="preserve"> Signature schemes are usually assumed to face up to 2^64 queries. For Mithril the accepted response is uniform on an intersection of balls, so the Rényi divergence has the closed form 1/(1−δ) at any order and no Fisher-information leak arises from shape alone; but at 2^64 queries every published set falls short of the proof's requirement (27–38 bits by the theorem, 3–17 bits under the typical-case heuristic), and parameters corrected for 2^64 need K larger by 1.7× to 23×. Correcting only the faulty lemma at 2^50 lowers the radius ratio φ from 7–9 to 5.3–7.7 and raises K by 1.3× to 8.5× (worst case ML-DSA-65 with (T, N) = (5, 6): from 1,200 to 10,234); communication grows with K. These figures are computed from the paper's formulas, not simulated.</w:t>
+        <w:t xml:space="preserve"> Signature schemes are usually assumed to face up to 2^64 queries. In Mithril the accepted answer is uniform on an intersection of balls. So the Rényi divergence has the closed form 1/(1−δ) at any order, and the shape alone causes no Fisher information leak. But at 2^64 queries every published set falls short of what the proof needs, by 27 to 38 bits under the theorem and by 3 to 17 bits under the typical case heuristic. Parameters corrected for 2^64 need K to be 1.7 to 23 times larger. Correcting only the faulty lemma at 2^50 lowers the radius ratio φ from 7 to 9 down to 5.3 to 7.7, and raises K by 1.3 to 8.5 times. The worst case is ML-DSA-65 with (T, N) = (5, 6), where K goes from 1,200 to 10,234. Communication grows with K. These figures are computed from the paper's formulas, not simulated.</w:t>
       </w:r>
     </w:p>
     <w:p>
@@ -14823,7 +14823,7 @@
           <w:i w:val="0"/>
           <w:sz w:val="20"/>
         </w:rPr>
-        <w:t>The Python core-SVP substitute reproduces the paper's 12 bits for ML-DSA-44 when given the paper's constant 0.74; the lattice-estimator run (Sage 10.4, rough mode) is the one we quote. Only ML-DSA-65 clearly exceeds the claimed range. Both Mithril items are accounting and proof issues: none gives an attack on the scheme.</w:t>
+        <w:t>The Python core-SVP substitute reproduces the paper's 12 bits for ML-DSA-44 when given the paper's constant 0.74. The figure we quote is from the lattice estimator run (Sage 10.4, rough mode). Only ML-DSA-65 clearly goes beyond the claimed range. Both Mithril items are accounting and proof issues, and neither gives an attack on the scheme.</w:t>
       </w:r>
     </w:p>
     <w:p>
@@ -14852,7 +14852,7 @@
           <w:i w:val="0"/>
           <w:sz w:val="20"/>
         </w:rPr>
-        <w:t xml:space="preserve">The paper's own text (Fig. 1b, Remark 11, App. M.1) has every party broadcast W_i, and its pairwise masks cancel (Lemma 1), so Σ W_i = A·y is public; Gaussian elimination gives y and then s1 = c⁻¹(z − y) from a single P2 signature, for any |S∖C|. The proof of Corollary 5 itself calls this value the public broadcast, and no later appendix changes it. </w:t>
+        <w:t xml:space="preserve">In the paper's own text (Fig. 1b, Remark 11, App. M.1), every party broadcasts W_i, and the pairwise masks cancel (Lemma 1). So Σ W_i = A·y is public. Gaussian elimination gives y, and then s1 = c⁻¹(z − y) from a single P2 signature, whatever |S∖C| is. The proof of Corollary 5 itself calls this value the public broadcast, and no later appendix changes it. </w:t>
       </w:r>
       <w:r>
         <w:rPr>
@@ -14861,7 +14861,7 @@
           <w:i w:val="0"/>
           <w:sz w:val="20"/>
         </w:rPr>
-        <w:t>Demonstrated at full size:</w:t>
+        <w:t>Shown at full size.</w:t>
       </w:r>
       <w:r>
         <w:rPr>
@@ -14870,7 +14870,7 @@
           <w:i w:val="0"/>
           <w:sz w:val="20"/>
         </w:rPr>
-        <w:t xml:space="preserve"> in our re-implementation at real ML-DSA-44/65/87 sizes the combined signatures pass the standard verifier and s1 was recovered exactly from one signature for 15/15 keys per set (Table XIV; (N, T) = (3, 2), (5, 3), (5, 5), five keys each, seed 2051, under 0.2 s per attack); withholding a single W_i drops this to 0/15, so the attack really uses the sum. The author's code is not public, and our rejection checks run in the clear rather than in the paper's MPC. The earlier toy (ring size 8, real q) also checks the narrower Phase 1 hypothesis: with all but one signer corrupted, the honest party's mask can be stripped and λ_h·A·y_h inverted, while with two honest signers this route fails, as the paper says; the sum route above, however, works whatever the number of honest parties. Two further points: Corollary 6 claims the full threshold-signature functionality without the |H| ≥ 2 condition that its Simulator 17 needs, and the key-generation commitment t(i) = A·s1(i) + s2(i) carries the noise s2(i), so the bare A·s1,i pattern broken in TALUS does not recur there.</w:t>
+        <w:t xml:space="preserve"> We re-implemented the scheme at the real ML-DSA-44, 65 and 87 sizes. The combined signatures pass the standard verifier, and we recovered s1 exactly from one signature for 15 of 15 keys per set (Table XIV). We used (N, T) = (3, 2), (5, 3) and (5, 5), five keys each, seed 2051, and each attack took under 0.2 s. Holding back a single W_i drops this to 0 of 15, so the attack really uses the sum. The author's code is not public, and our rejection checks run in the open rather than inside the paper's MPC. Our earlier toy version (ring size 8, real q) also checks the narrower Phase 1 hypothesis. With all signers but one corrupted, the honest party's mask can be removed and λ_h·A·y_h inverted. With two honest signers this route fails, as the paper says. The sum route above, however, works whatever the number of honest parties. Two more points. Corollary 6 claims the full threshold signature functionality without the condition |H| ≥ 2 that its Simulator 17 needs. And the key generation commitment t(i) = A·s1(i) + s2(i) carries the noise s2(i), so the bare A·s1,i pattern broken in TALUS does not appear there.</w:t>
       </w:r>
     </w:p>
     <w:p>
@@ -15236,7 +15236,7 @@
           <w:i w:val="0"/>
           <w:sz w:val="20"/>
         </w:rPr>
-        <w:t>Our Quorus implementation produced 0 of 272,664 signatures failing FIPS 204 verification. No statistical leak is possible by construction at the level of single coefficients; a lattice-level distinguisher was not run. For Trilithium, exact enumeration at n = 4 and Monte Carlo at n = 8 (2×10^8 samples × 3 trials) show the gap between rejected w_H and the simulator shrinking with γ1 and n (branch 2: 3×10^-5 to 7×10^-7 at n = 8). Paper errata, not attacks: Quorus Functionality 6 uses the bound γ2−β−η where every other place uses γ2−β (PDF p. 32), and Lemma 8 prints the denominator 2(β+1)δ+1 instead of (2β+1)δ+1 (exhaustive check: printed probabilities sum to 0.84–0.95); Trilithium's simulation of unsuccessful signing (p. 24) leaves the gap noted in Section II-J.</w:t>
+        <w:t>Our Quorus implementation produced 272,664 signatures, and none failed FIPS 204 verification. By construction no statistical leak is possible at the level of single coefficients. We did not run a distinguisher at the lattice level. For Trilithium we used exact enumeration at n = 4 and Monte Carlo at n = 8 (2×10^8 samples, 3 trials). Both show the gap between the rejected w_H and the simulator shrinking as γ1 and n grow. For branch 2 at n = 8 it goes from 3×10^-5 to 7×10^-7. We also found errors in the papers, which are not attacks. Quorus Functionality 6 uses the bound γ2−β−η where every other place uses γ2−β (PDF p. 32). Quorus Lemma 8 prints the denominator 2(β+1)δ+1 instead of (2β+1)δ+1. An exhaustive check shows that the printed probabilities sum to only 0.84 to 0.95. Trilithium's simulation of unsuccessful signing (p. 24) leaves the gap noted in Section II-J.</w:t>
       </w:r>
     </w:p>
     <w:p>
@@ -15259,7 +15259,7 @@
           <w:i w:val="0"/>
           <w:sz w:val="20"/>
         </w:rPr>
-        <w:t xml:space="preserve"> The released mixture after a rejection comes from two branches: branch 3 (the z check failed) and branch 2 (z passed but the LowBits check failed). Exact enumeration at n = 4 showed a real but small gap between rejected w_H and the simulator, shrinking with γ1 (branch 3 roughly as γ1^-2.7). A branch-2 floor near 10^-4 persisted for γ1 ≥ γ2 at q = 257, 513 and 1025, so it is not a small-q artefact; it comes from the wrap-around rounding cell, and masking that cell removes it (30–65× smaller). Exact convolution for n = 2 to 6 at q = 17 shows both gaps falling with n (branch 3 by 2–3 orders of magnitude from n = 4 to 6; Fig. 5, which also shows the trend is not monotone from n = 3 to 4). At n = 8 the branch-3 gap is below the Monte Carlo floor of about 3×10^-7. Toy sizes cannot prove anything about n = 256, but every trend points toward the assumption holding statistically; a lattice-level distinguisher remains untested. On H-F3, a server that tampers with the rejection check is detected and stopped, so the leak is bounded by the stopping time, about log2(attempts) bits, once; the issue is that the paper's simulation does not reproduce how that stopping probability depends on the real z.</w:t>
+        <w:t xml:space="preserve"> After a rejection, the released values come from two branches. In branch 3 the z check failed. In branch 2 the z check passed but the LowBits check failed. Exact enumeration at n = 4 showed a real but small gap between the rejected w_H and the simulator. It shrinks as γ1 grows, roughly like γ1^-2.7 for branch 3. A branch 2 floor near 10^-4 remained for γ1 ≥ γ2 at q = 257, 513 and 1025, so it is not caused by a small q. It comes from the rounding cell that wraps around, and masking that cell removes it (30 to 65 times smaller). Exact convolution for n = 2 to 6 at q = 17 shows both gaps falling as n grows. Branch 3 falls by 2 to 3 orders of magnitude from n = 4 to 6 (Fig. 5). The figure also shows that the trend is not steady from n = 3 to 4. At n = 8 the branch 3 gap is below the Monte Carlo floor of about 3×10^-7. Toy sizes cannot prove anything about n = 256, but every trend points toward the assumption holding statistically. A distinguisher at the lattice level remains untested. On the server tampering issue (H-F3), a server that tampers with the rejection check is detected and stopped. So the leak is bounded by the stopping time, about log2(attempts) bits, once. The problem is that the paper's simulation does not reproduce how that stopping probability depends on the real z.</w:t>
       </w:r>
     </w:p>
     <w:p>
@@ -15324,7 +15324,7 @@
           <w:i w:val="0"/>
           <w:sz w:val="16"/>
         </w:rPr>
-        <w:t>Trilithium toy model (q = 17, γ2 = 4, τ = 1): squared Hellinger distance H² between the rejected w_H distribution and the paper's simulator, per rejection branch; about 1/H² rejected attempts are needed to tell them apart. n = 2–6 exact (mean of 5 keys, seed 2026 + n); n = 8 Monte Carlo (2×10^8 samples × 3 keys, seed 2026, bias-corrected; open marker = below the sampling floor).</w:t>
+        <w:t>Trilithium toy model (q = 17, γ2 = 4, τ = 1). The plot shows the squared Hellinger distance H² between the rejected w_H distribution and the paper's simulator, for each rejection branch. Telling them apart needs about 1/H² rejected attempts. For n = 2 to 6 the values are exact (mean of 5 keys, seed 2026 + n). For n = 8 they come from Monte Carlo (2×10^8 samples, 3 keys, seed 2026, bias corrected). An open marker means below the sampling floor.</w:t>
       </w:r>
     </w:p>
     <w:p>
@@ -15347,7 +15347,7 @@
           <w:i w:val="0"/>
           <w:sz w:val="20"/>
         </w:rPr>
-        <w:t xml:space="preserve"> Besides the two text errors, the batched-OR protocol has statistical soundness 2^-39 (κ = 40), so about one rejected attempt in 2^39 is wrongly declared a pass and its failing, key-dependent z is opened; at roughly 10^11 signatures this is not practical, but 40-bit statistical security is lower than usual. A rough reduction (ours, not run) suggests the MLWE instance behind Theorem 2 is about as hard as ML-DSA key recovery itself.</w:t>
+        <w:t xml:space="preserve"> Apart from the two text errors, the batched OR protocol has statistical soundness 2^-39 (κ = 40). So about one rejected attempt in 2^39 is wrongly declared a pass, and its failing z, which depends on the key, is opened. At roughly 10^11 signatures this is not practical, but 40 bit statistical security is lower than usual. A rough reduction, which is ours and was not run, suggests that the MLWE instance behind Theorem 2 is about as hard as recovering the ML-DSA key itself.</w:t>
       </w:r>
     </w:p>
     <w:p>
@@ -15376,7 +15376,7 @@
           <w:i w:val="0"/>
           <w:sz w:val="20"/>
         </w:rPr>
-        <w:t>The Kao P2 and Mithril findings have not yet been reported to the authors; coordinated disclosure is pending, and both are stated here neutrally as our reading of public documents. Quorus and Trilithium items are errata.</w:t>
+        <w:t>We have not yet reported the Kao P2 and Mithril findings to the authors. Coordinated disclosure is pending, and both are stated here neutrally as our reading of public documents. The Quorus and Trilithium items are errata.</w:t>
       </w:r>
     </w:p>
     <w:p>
@@ -15406,7 +15406,7 @@
           <w:i w:val="0"/>
           <w:sz w:val="20"/>
         </w:rPr>
-        <w:t>What the Phase 3 prototype will demonstrate.</w:t>
+        <w:t>What the Phase 3 prototype will show.</w:t>
       </w:r>
       <w:r>
         <w:rPr>
@@ -15415,7 +15415,7 @@
           <w:i w:val="0"/>
           <w:sz w:val="20"/>
         </w:rPr>
-        <w:t xml:space="preserve"> An end-to-end TALUS-cap margin tool: given transcripts produced by the TALUS reference code (packages expected from March 2027) through a scheme view, it runs the bounded-noise estimator with ILP finishing, reports N* and the margin in bits against the cap and the wall, and runs the positive and negative controls automatically, so a reported margin is never quoted without them. Concretely it will (i) replace our channel model by the released values of the real code, (ii) run the whole-secret ILP for ML-DSA-65/87 instead of extrapolating, and (iii) rerun the Mithril parameter check on the submitted parameters. Success means reproducing Table IX on real transcripts, or explaining any difference, with each margin reported together with its controls. Until packages appear, the prototype runs on our TALUS view, so the demonstration does not depend on the release date. The demonstration will be a single command that takes a transcript file and a parameter set and prints the margin table with its controls, trial counts and seeds; the stretch goals continue alongside it (a lattice-level distinguisher for rejected transcripts, and disclosure to the Kao and Mithril authors).</w:t>
+        <w:t xml:space="preserve"> It will be a complete tool for measuring the TALUS cap margin. It takes transcripts produced by the TALUS reference code (packages expected from March 2027) and passes them through a scheme view. It then runs the bounded noise estimator with ILP finishing and reports N* and the margin in bits against the cap and the wall. It also runs the positive and negative controls automatically, so a margin is never reported without them. In concrete terms it will (i) replace our channel model with the values the real code releases, (ii) run the whole secret ILP for ML-DSA-65 and 87 instead of extrapolating, and (iii) rerun the Mithril parameter check on the submitted parameters. Success means reproducing Table IX on real transcripts, or explaining any difference, with each margin reported together with its controls. Until the packages appear, the prototype runs on our TALUS view, so the demonstration does not depend on the release date. The demonstration will be a single command. It takes a transcript file and a parameter set and prints the margin table with its controls, trial counts and seeds. The stretch goals continue alongside it. These are a lattice level distinguisher for rejected transcripts, and disclosure to the Kao and Mithril authors.</w:t>
       </w:r>
     </w:p>
     <w:p>
@@ -15908,7 +15908,7 @@
           <w:i w:val="0"/>
           <w:sz w:val="20"/>
         </w:rPr>
-        <w:t>Table XV sets the Phase 1 plan against what Phase 2 delivered.</w:t>
+        <w:t>Table XV compares the Phase 1 plan with what Phase 2 delivered.</w:t>
       </w:r>
     </w:p>
     <w:p>
@@ -15931,7 +15931,7 @@
           <w:i w:val="0"/>
           <w:sz w:val="20"/>
         </w:rPr>
-        <w:t xml:space="preserve"> (RQ1) Which threshold ML-DSA designs exist? Four First-Call proposals, differing in corruption model, party count and rounds (Table II). (RQ2) Which are broken? Earlier TALUS versions, by two attacks that we reproduced; Kao's P2 profile exposes the key from one signature by the paper's own text. (RQ3) Which techniques work? Linear inversion of published A·x, nonce-leak recovery, and for the TALUS channel a bounded-noise estimator with ILP finishing, about four orders of magnitude better than least squares. (RQ4) Where is the evidence thinnest? The TALUS cap margin (now measured at about 3–3.5 bits above the cap), Mithril's parameter-proof accounting, and the untested lattice-level question for rejected transcripts in Quorus and Trilithium.</w:t>
+        <w:t xml:space="preserve"> (RQ1) Which threshold ML-DSA designs exist? There are four First Call proposals. They differ in corruption model, number of parties and rounds (Table II). (RQ2) Which are broken? Earlier TALUS versions, by two attacks that we reproduced. Kao's P2 profile also exposes the key from one signature, going by the paper's own text. (RQ3) Which techniques work? Linear inversion of a published A·x, recovery from a leaked nonce, and for the TALUS channel a bounded noise estimator with ILP finishing. The last is about four orders of magnitude better than least squares. (RQ4) Where is the evidence thinnest? The TALUS cap margin, now measured at about 3 to 3.5 bits above the cap. Mithril's accounting between parameters and proof. And the untested question at the lattice level for rejected transcripts in Quorus and Trilithium.</w:t>
       </w:r>
     </w:p>
     <w:p>
@@ -15954,7 +15954,7 @@
           <w:i w:val="0"/>
           <w:sz w:val="20"/>
         </w:rPr>
-        <w:t xml:space="preserve"> Three methodological points carry over to Phase 3. First, controls change conclusions: without the negative control the estimator's output −t0 on genuine ML-DSA could have been mistaken for leakage. Second, reduced-size runs can mislead in either direction (the ML-DSA-87 shortcut at n = 64 overstated the margin, and ILP gains grow with n), so only full-size numbers are quoted. Third, reading the papers in full revised two of our own Phase 1 statements (Trilithium releases w_H, not a partial signature; uniformity holds per coefficient only), which is why every hypothesis in Section II-J now carries a verdict.</w:t>
+        <w:t xml:space="preserve"> Three points about method carry over to Phase 3. First, controls change conclusions. Without the negative control, the estimator's output −t0 on genuine ML-DSA could have been mistaken for leakage. Second, runs at reduced size can mislead in either direction. The ML-DSA-87 shortcut at n = 64 overstated the margin, and the ILP gains grow with n. So we quote only full size numbers. Third, reading the papers in full corrected two of our own Phase 1 statements. Trilithium releases w_H, not a partial signature, and uniformity holds only for each coefficient on its own. This is why every hypothesis in Section II-J now has a verdict.</w:t>
       </w:r>
     </w:p>
     <w:p>
@@ -15968,7 +15968,7 @@
           <w:i w:val="0"/>
           <w:sz w:val="20"/>
         </w:rPr>
-        <w:t>Positioning.</w:t>
+        <w:t>How this work differs from earlier work.</w:t>
       </w:r>
       <w:r>
         <w:rPr>
@@ -15977,7 +15977,7 @@
           <w:i w:val="0"/>
           <w:sz w:val="20"/>
         </w:rPr>
-        <w:t xml:space="preserve"> Earlier cryptanalysis of lattice signatures [17]–[20] targets a single signer leaking through a physical side channel. Here the leakage is logical: it is part of the protocol transcript, visible to any observer or corrupted party, and its noise distribution is known exactly from the specification. Results therefore transfer across implementations, and schemes analysed only by proof gain an independent empirical check.</w:t>
+        <w:t xml:space="preserve"> Earlier cryptanalysis of lattice signatures [17] to [20] targets a single signer that leaks through a physical side channel. Here the leakage is logical. It is part of the protocol transcript, any observer or corrupted party can see it, and its noise distribution is known exactly from the specification. So our results carry over across implementations, and schemes that were analysed only by proof gain an independent check by experiment.</w:t>
       </w:r>
     </w:p>
     <w:p>
@@ -16000,7 +16000,7 @@
           <w:i w:val="0"/>
           <w:sz w:val="20"/>
         </w:rPr>
-        <w:t xml:space="preserve"> We study only public, standardisation-stage specifications, as NIST invites. Findings about a scheme are shared with its authors before any public posting, and we distinguish confirmed key recovery, measured margins, proof gaps and errata, labelling results that rely on our simulators rather than the authors' code.</w:t>
+        <w:t xml:space="preserve"> We study only public specifications at the standardisation stage, as NIST invites. We share findings about a scheme with its authors before any public posting. We keep confirmed key recovery, measured margins, proof gaps and errata apart, and we label results that rely on our simulators rather than on the authors' code.</w:t>
       </w:r>
     </w:p>
     <w:p>
@@ -16023,7 +16023,7 @@
           <w:i w:val="0"/>
           <w:sz w:val="20"/>
         </w:rPr>
-        <w:t xml:space="preserve"> The survey of thirty-three sources showed that threshold ML-DSA designs fail when patterns from discrete-log protocols are imported, and that three of the four proposals had not been tested. Phase 2 built and validated a harness and measured the core quantity: the TALUS cap holds in our model, but by only about 3–3.5 bits for the whole secret and about 1 bit above the authors' wall, much less than least squares suggests; insider, coordinator, rotation and lattice-finish routes do not lower it. Secondary findings are a proof-parameter gap in Mithril, a key exposure in Kao's P2 profile, and errata in Quorus and Trilithium, with disclosure to the authors to follow before any public posting.</w:t>
+        <w:t xml:space="preserve"> The survey of 33 sources showed that threshold ML-DSA designs fail when patterns from discrete log protocols are copied over, and that three of the four proposals had not been tested. In Phase 2 we built and checked a harness and measured the core quantity. The TALUS cap holds in our model, but only by about 3 to 3.5 bits for the whole secret and about 1 bit above the authors' wall. This is much less than least squares suggests. Insider, coordinator, key change and lattice finishing routes do not lower it. Our other findings are a gap between Mithril's parameters and its proof, a key exposure in Kao's P2 profile, and errata in Quorus and Trilithium. We will disclose these to the authors before any public posting.</w:t>
       </w:r>
     </w:p>
     <w:p>

</xml_diff>